<commit_message>
Deploy documentation from docs-v1
</commit_message>
<xml_diff>
--- a/commonspec/downloads/commonspec.docx
+++ b/commonspec/downloads/commonspec.docx
@@ -2,7 +2,7 @@
 <file path=word/document.xml><?xml version="1.0" encoding="utf-8"?>
 <w:document xmlns:w="http://schemas.openxmlformats.org/wordprocessingml/2006/main" xmlns:m="http://schemas.openxmlformats.org/officeDocument/2006/math" xmlns:r="http://schemas.openxmlformats.org/officeDocument/2006/relationships" xmlns:o="urn:schemas-microsoft-com:office:office" xmlns:v="urn:schemas-microsoft-com:vml" xmlns:w10="urn:schemas-microsoft-com:office:word" xmlns:a="http://schemas.openxmlformats.org/drawingml/2006/main" xmlns:pic="http://schemas.openxmlformats.org/drawingml/2006/picture" xmlns:wp="http://schemas.openxmlformats.org/drawingml/2006/wordprocessingDrawing">
   <w:body>
-    <w:bookmarkStart w:id="20" w:name="SPEC"/>
+    <w:bookmarkStart w:id="9" w:name="SPEC"/>
     <w:p>
       <w:pPr>
         <w:pStyle w:val="Title"/>
@@ -11,7 +11,7 @@
         <w:t xml:space="preserve">CommonSpec Language Specification</w:t>
       </w:r>
     </w:p>
-    <w:bookmarkEnd w:id="20"/>
+    <w:bookmarkEnd w:id="9"/>
     <w:p>
       <w:pPr>
         <w:pStyle w:val="TOCHeading"/>
@@ -44,7 +44,7 @@
         <w:br w:type="page"/>
       </w:r>
     </w:p>
-    <w:bookmarkStart w:id="24" w:name="introduction"/>
+    <w:bookmarkStart w:id="13" w:name="introduction"/>
     <w:p>
       <w:pPr>
         <w:pStyle w:val="Heading1"/>
@@ -57,7 +57,7 @@
         <w:t xml:space="preserve">Introduction</w:t>
       </w:r>
     </w:p>
-    <w:bookmarkStart w:id="21" w:name="what-is-commonspec"/>
+    <w:bookmarkStart w:id="10" w:name="what-is-commonspec"/>
     <w:p>
       <w:pPr>
         <w:pStyle w:val="Heading2"/>
@@ -96,8 +96,8 @@
         <w:t xml:space="preserve">CommonSpec documents are plain text files that any Markdown editor can open. The additional constructs use existing Markdown syntax — headers, blockquotes, fenced code blocks, and inline links — so no new markup characters are introduced.</w:t>
       </w:r>
     </w:p>
-    <w:bookmarkEnd w:id="21"/>
-    <w:bookmarkStart w:id="22" w:name="design-principles"/>
+    <w:bookmarkEnd w:id="10"/>
+    <w:bookmarkStart w:id="11" w:name="design-principles"/>
     <w:p>
       <w:pPr>
         <w:pStyle w:val="Heading2"/>
@@ -182,8 +182,8 @@
         <w:t xml:space="preserve">The language syntax is fixed, but the set of valid types, attributes, and constraints is determined by the active model. The same syntax supports different domains (software requirements, test plans, technical manuals) by loading different models.</w:t>
       </w:r>
     </w:p>
-    <w:bookmarkEnd w:id="22"/>
-    <w:bookmarkStart w:id="23" w:name="notation"/>
+    <w:bookmarkEnd w:id="11"/>
+    <w:bookmarkStart w:id="12" w:name="notation"/>
     <w:p>
       <w:pPr>
         <w:pStyle w:val="Heading2"/>
@@ -212,9 +212,54 @@
           <w:numId w:val="1001"/>
         </w:numPr>
       </w:pPr>
-      <m:oMath xmlns:m="http://schemas.openxmlformats.org/officeDocument/2006/math" xmlns:w="http://schemas.openxmlformats.org/wordprocessingml/2006/main">
-        <m:r>
-          <m:t xml:space="preserve">τ,σ,α,β,ρ,ω</m:t>
+      <m:oMath>
+        <m:r>
+          <m:t>τ</m:t>
+        </m:r>
+        <m:r>
+          <m:rPr>
+            <m:sty m:val="p"/>
+          </m:rPr>
+          <m:t>,</m:t>
+        </m:r>
+        <m:r>
+          <m:t>σ</m:t>
+        </m:r>
+        <m:r>
+          <m:rPr>
+            <m:sty m:val="p"/>
+          </m:rPr>
+          <m:t>,</m:t>
+        </m:r>
+        <m:r>
+          <m:t>α</m:t>
+        </m:r>
+        <m:r>
+          <m:rPr>
+            <m:sty m:val="p"/>
+          </m:rPr>
+          <m:t>,</m:t>
+        </m:r>
+        <m:r>
+          <m:t>β</m:t>
+        </m:r>
+        <m:r>
+          <m:rPr>
+            <m:sty m:val="p"/>
+          </m:rPr>
+          <m:t>,</m:t>
+        </m:r>
+        <m:r>
+          <m:t>ρ</m:t>
+        </m:r>
+        <m:r>
+          <m:rPr>
+            <m:sty m:val="p"/>
+          </m:rPr>
+          <m:t>,</m:t>
+        </m:r>
+        <m:r>
+          <m:t>ω</m:t>
         </m:r>
       </m:oMath>
       <w:r>
@@ -232,9 +277,12 @@
           <w:numId w:val="1001"/>
         </w:numPr>
       </w:pPr>
-      <m:oMath xmlns:m="http://schemas.openxmlformats.org/officeDocument/2006/math" xmlns:w="http://schemas.openxmlformats.org/wordprocessingml/2006/main">
-        <m:r>
-          <m:t xml:space="preserve">Γ</m:t>
+      <m:oMath>
+        <m:r>
+          <m:rPr>
+            <m:sty m:val="p"/>
+          </m:rPr>
+          <m:t>Γ</m:t>
         </m:r>
       </m:oMath>
       <w:r>
@@ -252,22 +300,31 @@
           <w:numId w:val="1001"/>
         </w:numPr>
       </w:pPr>
-      <m:oMath xmlns:m="http://schemas.openxmlformats.org/officeDocument/2006/math" xmlns:w="http://schemas.openxmlformats.org/wordprocessingml/2006/main">
-        <m:r>
-          <m:t xml:space="preserve">Γ.</m:t>
+      <m:oMath>
+        <m:r>
+          <m:rPr>
+            <m:sty m:val="p"/>
+          </m:rPr>
+          <m:t>Γ</m:t>
+        </m:r>
+        <m:r>
+          <m:rPr>
+            <m:sty m:val="p"/>
+          </m:rPr>
+          <m:t>.</m:t>
         </m:r>
         <m:sSub>
-          <m:sSubPr>
-            <m:ctrlPr/>
-          </m:sSubPr>
           <m:e>
             <m:r>
-              <m:t xml:space="preserve">⊤</m:t>
+              <m:rPr>
+                <m:sty m:val="p"/>
+              </m:rPr>
+              <m:t>⊤</m:t>
             </m:r>
           </m:e>
           <m:sub>
             <m:r>
-              <m:t xml:space="preserve">X</m:t>
+              <m:t>X</m:t>
             </m:r>
           </m:sub>
         </m:sSub>
@@ -281,19 +338,19 @@
       <w:r>
         <w:t xml:space="preserve"> </w:t>
       </w:r>
-      <m:oMath xmlns:m="http://schemas.openxmlformats.org/officeDocument/2006/math" xmlns:w="http://schemas.openxmlformats.org/wordprocessingml/2006/main">
+      <m:oMath>
         <m:sSub>
-          <m:sSubPr>
-            <m:ctrlPr/>
-          </m:sSubPr>
           <m:e>
             <m:r>
-              <m:t xml:space="preserve">⊤</m:t>
+              <m:rPr>
+                <m:sty m:val="p"/>
+              </m:rPr>
+              <m:t>⊤</m:t>
             </m:r>
           </m:e>
           <m:sub>
             <m:r>
-              <m:t xml:space="preserve">S</m:t>
+              <m:t>S</m:t>
             </m:r>
           </m:sub>
         </m:sSub>
@@ -307,19 +364,19 @@
       <w:r>
         <w:t xml:space="preserve"> </w:t>
       </w:r>
-      <m:oMath xmlns:m="http://schemas.openxmlformats.org/officeDocument/2006/math" xmlns:w="http://schemas.openxmlformats.org/wordprocessingml/2006/main">
+      <m:oMath>
         <m:sSub>
-          <m:sSubPr>
-            <m:ctrlPr/>
-          </m:sSubPr>
           <m:e>
             <m:r>
-              <m:t xml:space="preserve">⊤</m:t>
+              <m:rPr>
+                <m:sty m:val="p"/>
+              </m:rPr>
+              <m:t>⊤</m:t>
             </m:r>
           </m:e>
           <m:sub>
             <m:r>
-              <m:t xml:space="preserve">O</m:t>
+              <m:t>O</m:t>
             </m:r>
           </m:sub>
         </m:sSub>
@@ -339,125 +396,148 @@
           <w:numId w:val="1001"/>
         </w:numPr>
       </w:pPr>
-      <m:oMath xmlns:m="http://schemas.openxmlformats.org/officeDocument/2006/math" xmlns:w="http://schemas.openxmlformats.org/wordprocessingml/2006/main">
-        <m:r>
-          <w:rPr/>
+      <m:oMath>
+        <m:r>
+          <m:rPr>
+            <m:scr m:val="script"/>
+            <m:sty m:val="p"/>
+          </m:rPr>
+          <m:t>X</m:t>
+        </m:r>
+      </m:oMath>
+      <w:r>
+        <w:t xml:space="preserve"> </w:t>
+      </w:r>
+      <w:r>
+        <w:t xml:space="preserve">— calligraphic letter denoting a set (e.g.,</w:t>
+      </w:r>
+      <w:r>
+        <w:t xml:space="preserve"> </w:t>
+      </w:r>
+      <m:oMath>
+        <m:r>
+          <m:rPr>
+            <m:scr m:val="script"/>
+            <m:sty m:val="p"/>
+          </m:rPr>
+          <m:t>A</m:t>
+        </m:r>
+      </m:oMath>
+      <w:r>
+        <w:t xml:space="preserve"> </w:t>
+      </w:r>
+      <w:r>
+        <w:t xml:space="preserve">for a set of attributes).</w:t>
+      </w:r>
+    </w:p>
+    <w:p>
+      <w:pPr>
+        <w:pStyle w:val="Compact"/>
+        <w:numPr>
+          <w:ilvl w:val="0"/>
+          <w:numId w:val="1001"/>
+        </w:numPr>
+      </w:pPr>
+      <m:oMath>
+        <m:r>
+          <m:rPr>
+            <m:sty m:val="p"/>
+          </m:rPr>
+          <m:t>⊆</m:t>
+        </m:r>
+      </m:oMath>
+      <w:r>
+        <w:t xml:space="preserve"> </w:t>
+      </w:r>
+      <w:r>
+        <w:t xml:space="preserve">— subset-or-equal relation.</w:t>
+      </w:r>
+    </w:p>
+    <w:p>
+      <w:pPr>
+        <w:pStyle w:val="Compact"/>
+        <w:numPr>
+          <w:ilvl w:val="0"/>
+          <w:numId w:val="1001"/>
+        </w:numPr>
+      </w:pPr>
+      <m:oMath>
+        <m:r>
+          <m:rPr>
+            <m:sty m:val="p"/>
+          </m:rPr>
+          <m:t>∪</m:t>
+        </m:r>
+      </m:oMath>
+      <w:r>
+        <w:t xml:space="preserve"> </w:t>
+      </w:r>
+      <w:r>
+        <w:t xml:space="preserve">— set union.</w:t>
+      </w:r>
+    </w:p>
+    <w:p>
+      <w:pPr>
+        <w:pStyle w:val="Compact"/>
+        <w:numPr>
+          <w:ilvl w:val="0"/>
+          <w:numId w:val="1001"/>
+        </w:numPr>
+      </w:pPr>
+      <m:oMath>
+        <m:r>
+          <m:rPr>
+            <m:sty m:val="p"/>
+          </m:rPr>
+          <m:t>⊥</m:t>
+        </m:r>
+      </m:oMath>
+      <w:r>
+        <w:t xml:space="preserve"> </w:t>
+      </w:r>
+      <w:r>
+        <w:t xml:space="preserve">— absence of a value (null / not applicable).</w:t>
+      </w:r>
+    </w:p>
+    <w:p>
+      <w:pPr>
+        <w:pStyle w:val="Compact"/>
+        <w:numPr>
+          <w:ilvl w:val="0"/>
+          <w:numId w:val="1001"/>
+        </w:numPr>
+      </w:pPr>
+      <m:oMath>
+        <m:r>
           <m:rPr>
             <m:nor/>
-            <m:sty m:val="undefined"/>
+            <m:sty m:val="p"/>
           </m:rPr>
-          <m:t xml:space="preserve">X</m:t>
+          <m:t>infer</m:t>
+        </m:r>
+        <m:r>
+          <m:rPr>
+            <m:sty m:val="p"/>
+          </m:rPr>
+          <m:t>(</m:t>
+        </m:r>
+        <m:r>
+          <m:rPr>
+            <m:sty m:val="p"/>
+          </m:rPr>
+          <m:t>…</m:t>
+        </m:r>
+        <m:r>
+          <m:rPr>
+            <m:sty m:val="p"/>
+          </m:rPr>
+          <m:t>)</m:t>
         </m:r>
       </m:oMath>
       <w:r>
         <w:t xml:space="preserve"> </w:t>
       </w:r>
       <w:r>
-        <w:t xml:space="preserve">— calligraphic letter denoting a set (e.g.,</w:t>
-      </w:r>
-      <w:r>
-        <w:t xml:space="preserve"> </w:t>
-      </w:r>
-      <m:oMath xmlns:m="http://schemas.openxmlformats.org/officeDocument/2006/math" xmlns:w="http://schemas.openxmlformats.org/wordprocessingml/2006/main">
-        <m:r>
-          <w:rPr/>
-          <m:rPr>
-            <m:nor/>
-            <m:sty m:val="undefined"/>
-          </m:rPr>
-          <m:t xml:space="preserve">A</m:t>
-        </m:r>
-      </m:oMath>
-      <w:r>
-        <w:t xml:space="preserve"> </w:t>
-      </w:r>
-      <w:r>
-        <w:t xml:space="preserve">for a set of attributes).</w:t>
-      </w:r>
-    </w:p>
-    <w:p>
-      <w:pPr>
-        <w:pStyle w:val="Compact"/>
-        <w:numPr>
-          <w:ilvl w:val="0"/>
-          <w:numId w:val="1001"/>
-        </w:numPr>
-      </w:pPr>
-      <m:oMath xmlns:m="http://schemas.openxmlformats.org/officeDocument/2006/math" xmlns:w="http://schemas.openxmlformats.org/wordprocessingml/2006/main">
-        <m:r>
-          <m:t xml:space="preserve">⊆</m:t>
-        </m:r>
-      </m:oMath>
-      <w:r>
-        <w:t xml:space="preserve"> </w:t>
-      </w:r>
-      <w:r>
-        <w:t xml:space="preserve">— subset-or-equal relation.</w:t>
-      </w:r>
-    </w:p>
-    <w:p>
-      <w:pPr>
-        <w:pStyle w:val="Compact"/>
-        <w:numPr>
-          <w:ilvl w:val="0"/>
-          <w:numId w:val="1001"/>
-        </w:numPr>
-      </w:pPr>
-      <m:oMath xmlns:m="http://schemas.openxmlformats.org/officeDocument/2006/math" xmlns:w="http://schemas.openxmlformats.org/wordprocessingml/2006/main">
-        <m:r>
-          <m:t xml:space="preserve">∪</m:t>
-        </m:r>
-      </m:oMath>
-      <w:r>
-        <w:t xml:space="preserve"> </w:t>
-      </w:r>
-      <w:r>
-        <w:t xml:space="preserve">— set union.</w:t>
-      </w:r>
-    </w:p>
-    <w:p>
-      <w:pPr>
-        <w:pStyle w:val="Compact"/>
-        <w:numPr>
-          <w:ilvl w:val="0"/>
-          <w:numId w:val="1001"/>
-        </w:numPr>
-      </w:pPr>
-      <m:oMath xmlns:m="http://schemas.openxmlformats.org/officeDocument/2006/math" xmlns:w="http://schemas.openxmlformats.org/wordprocessingml/2006/main">
-        <m:r>
-          <m:t xml:space="preserve">⊥</m:t>
-        </m:r>
-      </m:oMath>
-      <w:r>
-        <w:t xml:space="preserve"> </w:t>
-      </w:r>
-      <w:r>
-        <w:t xml:space="preserve">— absence of a value (null / not applicable).</w:t>
-      </w:r>
-    </w:p>
-    <w:p>
-      <w:pPr>
-        <w:pStyle w:val="Compact"/>
-        <w:numPr>
-          <w:ilvl w:val="0"/>
-          <w:numId w:val="1001"/>
-        </w:numPr>
-      </w:pPr>
-      <m:oMath xmlns:m="http://schemas.openxmlformats.org/officeDocument/2006/math" xmlns:w="http://schemas.openxmlformats.org/wordprocessingml/2006/main">
-        <m:r>
-          <m:rPr>
-            <m:nor/>
-          </m:rPr>
-          <m:t xml:space="preserve">infer</m:t>
-        </m:r>
-        <m:r>
-          <m:t xml:space="preserve">(…)</m:t>
-        </m:r>
-      </m:oMath>
-      <w:r>
-        <w:t xml:space="preserve"> </w:t>
-      </w:r>
-      <w:r>
         <w:t xml:space="preserve">— a function applied to its arguments.</w:t>
       </w:r>
     </w:p>
@@ -544,9 +624,9 @@
         <w:t xml:space="preserve">for comments.</w:t>
       </w:r>
     </w:p>
-    <w:bookmarkEnd w:id="23"/>
-    <w:bookmarkEnd w:id="24"/>
-    <w:bookmarkStart w:id="78" w:name="language-constructs"/>
+    <w:bookmarkEnd w:id="12"/>
+    <w:bookmarkEnd w:id="13"/>
+    <w:bookmarkStart w:id="67" w:name="language-constructs"/>
     <w:p>
       <w:pPr>
         <w:pStyle w:val="Heading1"/>
@@ -567,7 +647,7 @@
         <w:t xml:space="preserve">CommonSpec defines six constructs. Each is produced by a specific Markdown syntax pattern.</w:t>
       </w:r>
     </w:p>
-    <w:bookmarkStart w:id="25" w:name="lexical-rules"/>
+    <w:bookmarkStart w:id="14" w:name="lexical-rules"/>
     <w:p>
       <w:pPr>
         <w:pStyle w:val="Heading2"/>
@@ -1235,8 +1315,8 @@
         <w:t xml:space="preserve">.</w:t>
       </w:r>
     </w:p>
-    <w:bookmarkEnd w:id="25"/>
-    <w:bookmarkStart w:id="32" w:name="specification"/>
+    <w:bookmarkEnd w:id="14"/>
+    <w:bookmarkStart w:id="21" w:name="specification"/>
     <w:p>
       <w:pPr>
         <w:pStyle w:val="Heading2"/>
@@ -1288,7 +1368,7 @@
         <w:t xml:space="preserve">file produces exactly one specification.</w:t>
       </w:r>
     </w:p>
-    <w:bookmarkStart w:id="26" w:name="formal-definition"/>
+    <w:bookmarkStart w:id="15" w:name="formal-definition"/>
     <w:p>
       <w:pPr>
         <w:pStyle w:val="Heading3"/>
@@ -1311,76 +1391,127 @@
       <w:r>
         <w:t xml:space="preserve"> </w:t>
       </w:r>
-      <m:oMath xmlns:m="http://schemas.openxmlformats.org/officeDocument/2006/math" xmlns:w="http://schemas.openxmlformats.org/wordprocessingml/2006/main">
-        <m:r>
-          <m:t xml:space="preserve">S=</m:t>
-        </m:r>
-        <m:r>
-          <m:t xml:space="preserve">(τ,n,</m:t>
+      <m:oMath>
+        <m:r>
+          <m:t>S</m:t>
         </m:r>
         <m:r>
           <m:rPr>
-            <m:nor/>
+            <m:sty m:val="p"/>
           </m:rPr>
-          <m:t xml:space="preserve">pid</m:t>
-        </m:r>
-        <m:r>
-          <m:t xml:space="preserve">,</m:t>
-        </m:r>
-        <m:r>
-          <w:rPr/>
-          <m:rPr>
-            <m:nor/>
-            <m:sty m:val="undefined"/>
-          </m:rPr>
-          <m:t xml:space="preserve">A</m:t>
-        </m:r>
-        <m:r>
-          <m:t xml:space="preserve">,</m:t>
-        </m:r>
-        <m:r>
-          <w:rPr/>
-          <m:rPr>
-            <m:nor/>
-            <m:sty m:val="undefined"/>
-          </m:rPr>
-          <m:t xml:space="preserve">O</m:t>
-        </m:r>
-        <m:r>
-          <m:t xml:space="preserve">)</m:t>
-        </m:r>
-      </m:oMath>
-      <w:r>
-        <w:t xml:space="preserve"> </w:t>
-      </w:r>
-      <w:r>
-        <w:t xml:space="preserve">where:</w:t>
-      </w:r>
-    </w:p>
-    <w:p>
-      <w:pPr>
-        <w:pStyle w:val="Compact"/>
-        <w:numPr>
-          <w:ilvl w:val="0"/>
-          <w:numId w:val="1003"/>
-        </w:numPr>
-      </w:pPr>
-      <m:oMath xmlns:m="http://schemas.openxmlformats.org/officeDocument/2006/math" xmlns:w="http://schemas.openxmlformats.org/wordprocessingml/2006/main">
-        <m:r>
-          <m:t xml:space="preserve">τ∈Γ.</m:t>
-        </m:r>
-        <m:sSub>
-          <m:sSubPr>
-            <m:ctrlPr/>
-          </m:sSubPr>
+          <m:t>=</m:t>
+        </m:r>
+        <m:d>
+          <m:dPr>
+            <m:begChr m:val="("/>
+            <m:sepChr m:val=""/>
+            <m:endChr m:val=")"/>
+            <m:grow/>
+          </m:dPr>
           <m:e>
             <m:r>
-              <m:t xml:space="preserve">⊤</m:t>
+              <m:t>τ</m:t>
+            </m:r>
+            <m:r>
+              <m:rPr>
+                <m:sty m:val="p"/>
+              </m:rPr>
+              <m:t>,</m:t>
+            </m:r>
+            <m:r>
+              <m:t>n</m:t>
+            </m:r>
+            <m:r>
+              <m:rPr>
+                <m:sty m:val="p"/>
+              </m:rPr>
+              <m:t>,</m:t>
+            </m:r>
+            <m:r>
+              <m:rPr>
+                <m:nor/>
+                <m:sty m:val="p"/>
+              </m:rPr>
+              <m:t>pid</m:t>
+            </m:r>
+            <m:r>
+              <m:rPr>
+                <m:sty m:val="p"/>
+              </m:rPr>
+              <m:t>,</m:t>
+            </m:r>
+            <m:r>
+              <m:rPr>
+                <m:scr m:val="script"/>
+                <m:sty m:val="p"/>
+              </m:rPr>
+              <m:t>A</m:t>
+            </m:r>
+            <m:r>
+              <m:rPr>
+                <m:sty m:val="p"/>
+              </m:rPr>
+              <m:t>,</m:t>
+            </m:r>
+            <m:r>
+              <m:rPr>
+                <m:scr m:val="script"/>
+                <m:sty m:val="p"/>
+              </m:rPr>
+              <m:t>O</m:t>
+            </m:r>
+          </m:e>
+        </m:d>
+      </m:oMath>
+      <w:r>
+        <w:t xml:space="preserve"> </w:t>
+      </w:r>
+      <w:r>
+        <w:t xml:space="preserve">where:</w:t>
+      </w:r>
+    </w:p>
+    <w:p>
+      <w:pPr>
+        <w:pStyle w:val="Compact"/>
+        <w:numPr>
+          <w:ilvl w:val="0"/>
+          <w:numId w:val="1003"/>
+        </w:numPr>
+      </w:pPr>
+      <m:oMath>
+        <m:r>
+          <m:t>τ</m:t>
+        </m:r>
+        <m:r>
+          <m:rPr>
+            <m:sty m:val="p"/>
+          </m:rPr>
+          <m:t>∈</m:t>
+        </m:r>
+        <m:r>
+          <m:rPr>
+            <m:sty m:val="p"/>
+          </m:rPr>
+          <m:t>Γ</m:t>
+        </m:r>
+        <m:r>
+          <m:rPr>
+            <m:sty m:val="p"/>
+          </m:rPr>
+          <m:t>.</m:t>
+        </m:r>
+        <m:sSub>
+          <m:e>
+            <m:r>
+              <m:rPr>
+                <m:sty m:val="p"/>
+              </m:rPr>
+              <m:t>⊤</m:t>
             </m:r>
           </m:e>
           <m:sub>
             <m:r>
-              <m:t xml:space="preserve">S</m:t>
+              <m:t>S</m:t>
             </m:r>
           </m:sub>
         </m:sSub>
@@ -1400,15 +1531,22 @@
           <w:numId w:val="1003"/>
         </w:numPr>
       </w:pPr>
-      <m:oMath xmlns:m="http://schemas.openxmlformats.org/officeDocument/2006/math" xmlns:w="http://schemas.openxmlformats.org/wordprocessingml/2006/main">
-        <m:r>
-          <m:t xml:space="preserve">n∈</m:t>
+      <m:oMath>
+        <m:r>
+          <m:t>n</m:t>
+        </m:r>
+        <m:r>
+          <m:rPr>
+            <m:sty m:val="p"/>
+          </m:rPr>
+          <m:t>∈</m:t>
         </m:r>
         <m:r>
           <m:rPr>
             <m:nor/>
+            <m:sty m:val="p"/>
           </m:rPr>
-          <m:t xml:space="preserve">String</m:t>
+          <m:t>String</m:t>
         </m:r>
       </m:oMath>
       <w:r>
@@ -1426,21 +1564,26 @@
           <w:numId w:val="1003"/>
         </w:numPr>
       </w:pPr>
-      <m:oMath xmlns:m="http://schemas.openxmlformats.org/officeDocument/2006/math" xmlns:w="http://schemas.openxmlformats.org/wordprocessingml/2006/main">
+      <m:oMath>
         <m:r>
           <m:rPr>
             <m:nor/>
+            <m:sty m:val="p"/>
           </m:rPr>
-          <m:t xml:space="preserve">pid</m:t>
-        </m:r>
-        <m:r>
-          <m:t xml:space="preserve">∈</m:t>
+          <m:t>pid</m:t>
+        </m:r>
+        <m:r>
+          <m:rPr>
+            <m:sty m:val="p"/>
+          </m:rPr>
+          <m:t>∈</m:t>
         </m:r>
         <m:r>
           <m:rPr>
             <m:nor/>
+            <m:sty m:val="p"/>
           </m:rPr>
-          <m:t xml:space="preserve">String</m:t>
+          <m:t>String</m:t>
         </m:r>
       </m:oMath>
       <w:r>
@@ -1452,9 +1595,9 @@
       <w:r>
         <w:t xml:space="preserve"> </w:t>
       </w:r>
-      <m:oMath xmlns:m="http://schemas.openxmlformats.org/officeDocument/2006/math" xmlns:w="http://schemas.openxmlformats.org/wordprocessingml/2006/main">
-        <m:r>
-          <m:t xml:space="preserve">τ</m:t>
+      <m:oMath>
+        <m:r>
+          <m:t>τ</m:t>
         </m:r>
       </m:oMath>
       <w:r>
@@ -1472,68 +1615,74 @@
           <w:numId w:val="1003"/>
         </w:numPr>
       </w:pPr>
-      <m:oMath xmlns:m="http://schemas.openxmlformats.org/officeDocument/2006/math" xmlns:w="http://schemas.openxmlformats.org/wordprocessingml/2006/main">
-        <m:r>
-          <w:rPr/>
+      <m:oMath>
+        <m:r>
+          <m:rPr>
+            <m:scr m:val="script"/>
+            <m:sty m:val="p"/>
+          </m:rPr>
+          <m:t>A</m:t>
+        </m:r>
+        <m:r>
+          <m:rPr>
+            <m:sty m:val="p"/>
+          </m:rPr>
+          <m:t>⊆</m:t>
+        </m:r>
+        <m:r>
           <m:rPr>
             <m:nor/>
-            <m:sty m:val="undefined"/>
+            <m:sty m:val="p"/>
           </m:rPr>
-          <m:t xml:space="preserve">A</m:t>
-        </m:r>
-        <m:r>
-          <m:t xml:space="preserve">⊆</m:t>
+          <m:t>SpecAttribute</m:t>
+        </m:r>
+      </m:oMath>
+      <w:r>
+        <w:t xml:space="preserve"> </w:t>
+      </w:r>
+      <w:r>
+        <w:t xml:space="preserve">is the set of typed attributes (version, status, date, etc.).</w:t>
+      </w:r>
+    </w:p>
+    <w:p>
+      <w:pPr>
+        <w:pStyle w:val="Compact"/>
+        <w:numPr>
+          <w:ilvl w:val="0"/>
+          <w:numId w:val="1003"/>
+        </w:numPr>
+      </w:pPr>
+      <m:oMath>
+        <m:r>
+          <m:rPr>
+            <m:scr m:val="script"/>
+            <m:sty m:val="p"/>
+          </m:rPr>
+          <m:t>O</m:t>
+        </m:r>
+        <m:r>
+          <m:rPr>
+            <m:sty m:val="p"/>
+          </m:rPr>
+          <m:t>⊆</m:t>
         </m:r>
         <m:r>
           <m:rPr>
             <m:nor/>
+            <m:sty m:val="p"/>
           </m:rPr>
-          <m:t xml:space="preserve">SpecAttribute</m:t>
+          <m:t>SpecObject</m:t>
         </m:r>
       </m:oMath>
       <w:r>
         <w:t xml:space="preserve"> </w:t>
       </w:r>
       <w:r>
-        <w:t xml:space="preserve">is the set of typed attributes (version, status, date, etc.).</w:t>
-      </w:r>
-    </w:p>
-    <w:p>
-      <w:pPr>
-        <w:pStyle w:val="Compact"/>
-        <w:numPr>
-          <w:ilvl w:val="0"/>
-          <w:numId w:val="1003"/>
-        </w:numPr>
-      </w:pPr>
-      <m:oMath xmlns:m="http://schemas.openxmlformats.org/officeDocument/2006/math" xmlns:w="http://schemas.openxmlformats.org/wordprocessingml/2006/main">
-        <m:r>
-          <w:rPr/>
-          <m:rPr>
-            <m:nor/>
-            <m:sty m:val="undefined"/>
-          </m:rPr>
-          <m:t xml:space="preserve">O</m:t>
-        </m:r>
-        <m:r>
-          <m:t xml:space="preserve">⊆</m:t>
-        </m:r>
-        <m:r>
-          <m:rPr>
-            <m:nor/>
-          </m:rPr>
-          <m:t xml:space="preserve">SpecObject</m:t>
-        </m:r>
-      </m:oMath>
-      <w:r>
-        <w:t xml:space="preserve"> </w:t>
-      </w:r>
-      <w:r>
         <w:t xml:space="preserve">is the set of child spec objects.</w:t>
       </w:r>
     </w:p>
-    <w:bookmarkEnd w:id="26"/>
-    <w:bookmarkStart w:id="30" w:name="grammar"/>
+    <w:bookmarkEnd w:id="15"/>
+    <w:bookmarkStart w:id="19" w:name="grammar"/>
     <w:p>
       <w:pPr>
         <w:pStyle w:val="Heading3"/>
@@ -1548,7 +1697,7 @@
     </w:p>
     <w:p>
       <w:pPr>
-        <w:spacing w:lineRule="exact" w:after="0" w:line="20" w:before="0"/>
+        <w:spacing w:line="20" w:before="0" w:lineRule="exact" w:after="0"/>
         <w:rPr>
           <w:sz w:val="2"/>
         </w:rPr>
@@ -1591,20 +1740,20 @@
       <w:r>
         <w:drawing>
           <wp:inline>
-            <wp:extent cx="5334000" cy="1517009"/>
+            <wp:extent cx="5334000" cy="1406939"/>
             <wp:effectExtent b="0" l="0" r="0" t="0"/>
-            <wp:docPr descr="" title="" id="28" name="Picture"/>
+            <wp:docPr descr="" title="" id="17" name="Picture"/>
             <a:graphic>
               <a:graphicData uri="http://schemas.openxmlformats.org/drawingml/2006/picture">
                 <pic:pic>
                   <pic:nvPicPr>
-                    <pic:cNvPr descr="diagrams/914a205f97052d55a70a59d729d8a4c4ec421903.png" id="29" name="Picture"/>
+                    <pic:cNvPr descr="diagrams/914a205f97052d55a70a59d729d8a4c4ec421903.png" id="18" name="Picture"/>
                     <pic:cNvPicPr>
                       <a:picLocks noChangeArrowheads="1" noChangeAspect="1"/>
                     </pic:cNvPicPr>
                   </pic:nvPicPr>
                   <pic:blipFill>
-                    <a:blip r:embed="rId27"/>
+                    <a:blip r:embed="rId16"/>
                     <a:stretch>
                       <a:fillRect/>
                     </a:stretch>
@@ -1612,7 +1761,7 @@
                   <pic:spPr bwMode="auto">
                     <a:xfrm>
                       <a:off x="0" y="0"/>
-                      <a:ext cx="5334000" cy="1517009"/>
+                      <a:ext cx="5334000" cy="1406939"/>
                     </a:xfrm>
                     <a:prstGeom prst="rect">
                       <a:avLst/>
@@ -1631,8 +1780,8 @@
         </w:drawing>
       </w:r>
     </w:p>
-    <w:bookmarkEnd w:id="30"/>
-    <w:bookmarkStart w:id="31" w:name="examples"/>
+    <w:bookmarkEnd w:id="19"/>
+    <w:bookmarkStart w:id="20" w:name="examples"/>
     <w:p>
       <w:pPr>
         <w:pStyle w:val="Heading3"/>
@@ -1707,9 +1856,9 @@
         <w:t xml:space="preserve"># User Manual</w:t>
       </w:r>
     </w:p>
-    <w:bookmarkEnd w:id="31"/>
-    <w:bookmarkEnd w:id="32"/>
-    <w:bookmarkStart w:id="41" w:name="spec-object"/>
+    <w:bookmarkEnd w:id="20"/>
+    <w:bookmarkEnd w:id="21"/>
+    <w:bookmarkStart w:id="30" w:name="spec-object"/>
     <w:p>
       <w:pPr>
         <w:pStyle w:val="Heading2"/>
@@ -1746,7 +1895,7 @@
         <w:t xml:space="preserve">is a traceable element within a specification, created from H2–H6 headers. Objects can be requirements (HLR, LLR), verification cases (VC), design elements (FD, CSC, CSU), or structural sections (SECTION). Each object has a type, an optional PID, and can contain attributes, body content, floats, relations, views, and child objects.</w:t>
       </w:r>
     </w:p>
-    <w:bookmarkStart w:id="33" w:name="formal-definition-1"/>
+    <w:bookmarkStart w:id="22" w:name="formal-definition-1"/>
     <w:p>
       <w:pPr>
         <w:pStyle w:val="Heading3"/>
@@ -1769,118 +1918,179 @@
       <w:r>
         <w:t xml:space="preserve"> </w:t>
       </w:r>
-      <m:oMath xmlns:m="http://schemas.openxmlformats.org/officeDocument/2006/math" xmlns:w="http://schemas.openxmlformats.org/wordprocessingml/2006/main">
-        <m:r>
-          <m:t xml:space="preserve">O=</m:t>
-        </m:r>
-        <m:r>
-          <m:t xml:space="preserve">(τ,</m:t>
+      <m:oMath>
+        <m:r>
+          <m:t>O</m:t>
         </m:r>
         <m:r>
           <m:rPr>
-            <m:nor/>
+            <m:sty m:val="p"/>
           </m:rPr>
-          <m:t xml:space="preserve">title</m:t>
-        </m:r>
-        <m:r>
-          <m:t xml:space="preserve">,</m:t>
-        </m:r>
-        <m:r>
-          <m:rPr>
-            <m:nor/>
-          </m:rPr>
-          <m:t xml:space="preserve">pid</m:t>
-        </m:r>
-        <m:r>
-          <m:t xml:space="preserve">,β,</m:t>
-        </m:r>
-        <m:r>
-          <w:rPr/>
-          <m:rPr>
-            <m:nor/>
-            <m:sty m:val="undefined"/>
-          </m:rPr>
-          <m:t xml:space="preserve">A</m:t>
-        </m:r>
-        <m:r>
-          <m:t xml:space="preserve">,</m:t>
-        </m:r>
-        <m:r>
-          <w:rPr/>
-          <m:rPr>
-            <m:nor/>
-            <m:sty m:val="undefined"/>
-          </m:rPr>
-          <m:t xml:space="preserve">F</m:t>
-        </m:r>
-        <m:r>
-          <m:t xml:space="preserve">,</m:t>
-        </m:r>
-        <m:r>
-          <w:rPr/>
-          <m:rPr>
-            <m:nor/>
-            <m:sty m:val="undefined"/>
-          </m:rPr>
-          <m:t xml:space="preserve">R</m:t>
-        </m:r>
-        <m:r>
-          <m:t xml:space="preserve">,</m:t>
-        </m:r>
-        <m:r>
-          <w:rPr/>
-          <m:rPr>
-            <m:nor/>
-            <m:sty m:val="undefined"/>
-          </m:rPr>
-          <m:t xml:space="preserve">V</m:t>
-        </m:r>
-        <m:r>
-          <m:t xml:space="preserve">,</m:t>
-        </m:r>
-        <m:r>
-          <w:rPr/>
-          <m:rPr>
-            <m:nor/>
-            <m:sty m:val="undefined"/>
-          </m:rPr>
-          <m:t xml:space="preserve">O</m:t>
-        </m:r>
-        <m:r>
-          <m:t xml:space="preserve">)</m:t>
-        </m:r>
-      </m:oMath>
-      <w:r>
-        <w:t xml:space="preserve"> </w:t>
-      </w:r>
-      <w:r>
-        <w:t xml:space="preserve">where:</w:t>
-      </w:r>
-    </w:p>
-    <w:p>
-      <w:pPr>
-        <w:pStyle w:val="Compact"/>
-        <w:numPr>
-          <w:ilvl w:val="0"/>
-          <w:numId w:val="1004"/>
-        </w:numPr>
-      </w:pPr>
-      <m:oMath xmlns:m="http://schemas.openxmlformats.org/officeDocument/2006/math" xmlns:w="http://schemas.openxmlformats.org/wordprocessingml/2006/main">
-        <m:r>
-          <m:t xml:space="preserve">τ∈Γ.</m:t>
-        </m:r>
-        <m:sSub>
-          <m:sSubPr>
-            <m:ctrlPr/>
-          </m:sSubPr>
+          <m:t>=</m:t>
+        </m:r>
+        <m:d>
+          <m:dPr>
+            <m:begChr m:val="("/>
+            <m:sepChr m:val=""/>
+            <m:endChr m:val=")"/>
+            <m:grow/>
+          </m:dPr>
           <m:e>
             <m:r>
-              <m:t xml:space="preserve">⊤</m:t>
+              <m:t>τ</m:t>
+            </m:r>
+            <m:r>
+              <m:rPr>
+                <m:sty m:val="p"/>
+              </m:rPr>
+              <m:t>,</m:t>
+            </m:r>
+            <m:r>
+              <m:rPr>
+                <m:nor/>
+                <m:sty m:val="p"/>
+              </m:rPr>
+              <m:t>title</m:t>
+            </m:r>
+            <m:r>
+              <m:rPr>
+                <m:sty m:val="p"/>
+              </m:rPr>
+              <m:t>,</m:t>
+            </m:r>
+            <m:r>
+              <m:rPr>
+                <m:nor/>
+                <m:sty m:val="p"/>
+              </m:rPr>
+              <m:t>pid</m:t>
+            </m:r>
+            <m:r>
+              <m:rPr>
+                <m:sty m:val="p"/>
+              </m:rPr>
+              <m:t>,</m:t>
+            </m:r>
+            <m:r>
+              <m:t>β</m:t>
+            </m:r>
+            <m:r>
+              <m:rPr>
+                <m:sty m:val="p"/>
+              </m:rPr>
+              <m:t>,</m:t>
+            </m:r>
+            <m:r>
+              <m:rPr>
+                <m:scr m:val="script"/>
+                <m:sty m:val="p"/>
+              </m:rPr>
+              <m:t>A</m:t>
+            </m:r>
+            <m:r>
+              <m:rPr>
+                <m:sty m:val="p"/>
+              </m:rPr>
+              <m:t>,</m:t>
+            </m:r>
+            <m:r>
+              <m:rPr>
+                <m:scr m:val="script"/>
+                <m:sty m:val="p"/>
+              </m:rPr>
+              <m:t>F</m:t>
+            </m:r>
+            <m:r>
+              <m:rPr>
+                <m:sty m:val="p"/>
+              </m:rPr>
+              <m:t>,</m:t>
+            </m:r>
+            <m:r>
+              <m:rPr>
+                <m:scr m:val="script"/>
+                <m:sty m:val="p"/>
+              </m:rPr>
+              <m:t>R</m:t>
+            </m:r>
+            <m:r>
+              <m:rPr>
+                <m:sty m:val="p"/>
+              </m:rPr>
+              <m:t>,</m:t>
+            </m:r>
+            <m:r>
+              <m:rPr>
+                <m:scr m:val="script"/>
+                <m:sty m:val="p"/>
+              </m:rPr>
+              <m:t>V</m:t>
+            </m:r>
+            <m:r>
+              <m:rPr>
+                <m:sty m:val="p"/>
+              </m:rPr>
+              <m:t>,</m:t>
+            </m:r>
+            <m:r>
+              <m:rPr>
+                <m:scr m:val="script"/>
+                <m:sty m:val="p"/>
+              </m:rPr>
+              <m:t>O</m:t>
+            </m:r>
+          </m:e>
+        </m:d>
+      </m:oMath>
+      <w:r>
+        <w:t xml:space="preserve"> </w:t>
+      </w:r>
+      <w:r>
+        <w:t xml:space="preserve">where:</w:t>
+      </w:r>
+    </w:p>
+    <w:p>
+      <w:pPr>
+        <w:pStyle w:val="Compact"/>
+        <w:numPr>
+          <w:ilvl w:val="0"/>
+          <w:numId w:val="1004"/>
+        </w:numPr>
+      </w:pPr>
+      <m:oMath>
+        <m:r>
+          <m:t>τ</m:t>
+        </m:r>
+        <m:r>
+          <m:rPr>
+            <m:sty m:val="p"/>
+          </m:rPr>
+          <m:t>∈</m:t>
+        </m:r>
+        <m:r>
+          <m:rPr>
+            <m:sty m:val="p"/>
+          </m:rPr>
+          <m:t>Γ</m:t>
+        </m:r>
+        <m:r>
+          <m:rPr>
+            <m:sty m:val="p"/>
+          </m:rPr>
+          <m:t>.</m:t>
+        </m:r>
+        <m:sSub>
+          <m:e>
+            <m:r>
+              <m:rPr>
+                <m:sty m:val="p"/>
+              </m:rPr>
+              <m:t>⊤</m:t>
             </m:r>
           </m:e>
           <m:sub>
             <m:r>
-              <m:t xml:space="preserve">O</m:t>
+              <m:t>O</m:t>
             </m:r>
           </m:sub>
         </m:sSub>
@@ -1900,21 +2110,26 @@
           <w:numId w:val="1004"/>
         </w:numPr>
       </w:pPr>
-      <m:oMath xmlns:m="http://schemas.openxmlformats.org/officeDocument/2006/math" xmlns:w="http://schemas.openxmlformats.org/wordprocessingml/2006/main">
+      <m:oMath>
         <m:r>
           <m:rPr>
             <m:nor/>
+            <m:sty m:val="p"/>
           </m:rPr>
-          <m:t xml:space="preserve">title</m:t>
-        </m:r>
-        <m:r>
-          <m:t xml:space="preserve">∈</m:t>
+          <m:t>title</m:t>
+        </m:r>
+        <m:r>
+          <m:rPr>
+            <m:sty m:val="p"/>
+          </m:rPr>
+          <m:t>∈</m:t>
         </m:r>
         <m:r>
           <m:rPr>
             <m:nor/>
+            <m:sty m:val="p"/>
           </m:rPr>
-          <m:t xml:space="preserve">String</m:t>
+          <m:t>String</m:t>
         </m:r>
       </m:oMath>
       <w:r>
@@ -1932,21 +2147,26 @@
           <w:numId w:val="1004"/>
         </w:numPr>
       </w:pPr>
-      <m:oMath xmlns:m="http://schemas.openxmlformats.org/officeDocument/2006/math" xmlns:w="http://schemas.openxmlformats.org/wordprocessingml/2006/main">
+      <m:oMath>
         <m:r>
           <m:rPr>
             <m:nor/>
+            <m:sty m:val="p"/>
           </m:rPr>
-          <m:t xml:space="preserve">pid</m:t>
-        </m:r>
-        <m:r>
-          <m:t xml:space="preserve">∈</m:t>
+          <m:t>pid</m:t>
+        </m:r>
+        <m:r>
+          <m:rPr>
+            <m:sty m:val="p"/>
+          </m:rPr>
+          <m:t>∈</m:t>
         </m:r>
         <m:r>
           <m:rPr>
             <m:nor/>
+            <m:sty m:val="p"/>
           </m:rPr>
-          <m:t xml:space="preserve">String</m:t>
+          <m:t>String</m:t>
         </m:r>
       </m:oMath>
       <w:r>
@@ -1964,9 +2184,9 @@
           <w:numId w:val="1004"/>
         </w:numPr>
       </w:pPr>
-      <m:oMath xmlns:m="http://schemas.openxmlformats.org/officeDocument/2006/math" xmlns:w="http://schemas.openxmlformats.org/wordprocessingml/2006/main">
-        <m:r>
-          <m:t xml:space="preserve">β</m:t>
+      <m:oMath>
+        <m:r>
+          <m:t>β</m:t>
         </m:r>
       </m:oMath>
       <w:r>
@@ -1984,30 +2204,70 @@
           <w:numId w:val="1004"/>
         </w:numPr>
       </w:pPr>
-      <m:oMath xmlns:m="http://schemas.openxmlformats.org/officeDocument/2006/math" xmlns:w="http://schemas.openxmlformats.org/wordprocessingml/2006/main">
-        <m:r>
-          <w:rPr/>
+      <m:oMath>
+        <m:r>
+          <m:rPr>
+            <m:scr m:val="script"/>
+            <m:sty m:val="p"/>
+          </m:rPr>
+          <m:t>A</m:t>
+        </m:r>
+        <m:r>
+          <m:rPr>
+            <m:sty m:val="p"/>
+          </m:rPr>
+          <m:t>⊆</m:t>
+        </m:r>
+        <m:r>
           <m:rPr>
             <m:nor/>
-            <m:sty m:val="undefined"/>
+            <m:sty m:val="p"/>
           </m:rPr>
-          <m:t xml:space="preserve">A</m:t>
-        </m:r>
-        <m:r>
-          <m:t xml:space="preserve">⊆</m:t>
+          <m:t>SpecAttribute</m:t>
+        </m:r>
+      </m:oMath>
+      <w:r>
+        <w:t xml:space="preserve"> </w:t>
+      </w:r>
+      <w:r>
+        <w:t xml:space="preserve">is the set of typed attributes.</w:t>
+      </w:r>
+    </w:p>
+    <w:p>
+      <w:pPr>
+        <w:pStyle w:val="Compact"/>
+        <w:numPr>
+          <w:ilvl w:val="0"/>
+          <w:numId w:val="1004"/>
+        </w:numPr>
+      </w:pPr>
+      <m:oMath>
+        <m:r>
+          <m:rPr>
+            <m:scr m:val="script"/>
+            <m:sty m:val="p"/>
+          </m:rPr>
+          <m:t>F</m:t>
+        </m:r>
+        <m:r>
+          <m:rPr>
+            <m:sty m:val="p"/>
+          </m:rPr>
+          <m:t>⊆</m:t>
         </m:r>
         <m:r>
           <m:rPr>
             <m:nor/>
+            <m:sty m:val="p"/>
           </m:rPr>
-          <m:t xml:space="preserve">SpecAttribute</m:t>
+          <m:t>SpecFloat</m:t>
         </m:r>
       </m:oMath>
       <w:r>
         <w:t xml:space="preserve"> </w:t>
       </w:r>
       <w:r>
-        <w:t xml:space="preserve">is the set of typed attributes.</w:t>
+        <w:t xml:space="preserve">is the set of child floats.</w:t>
       </w:r>
     </w:p>
     <w:p>
@@ -2018,30 +2278,81 @@
           <w:numId w:val="1004"/>
         </w:numPr>
       </w:pPr>
-      <m:oMath xmlns:m="http://schemas.openxmlformats.org/officeDocument/2006/math" xmlns:w="http://schemas.openxmlformats.org/wordprocessingml/2006/main">
-        <m:r>
-          <w:rPr/>
+      <m:oMath>
+        <m:r>
+          <m:rPr>
+            <m:scr m:val="script"/>
+            <m:sty m:val="p"/>
+          </m:rPr>
+          <m:t>R</m:t>
+        </m:r>
+        <m:r>
+          <m:rPr>
+            <m:sty m:val="p"/>
+          </m:rPr>
+          <m:t>⊆</m:t>
+        </m:r>
+        <m:r>
           <m:rPr>
             <m:nor/>
-            <m:sty m:val="undefined"/>
+            <m:sty m:val="p"/>
           </m:rPr>
-          <m:t xml:space="preserve">F</m:t>
-        </m:r>
-        <m:r>
-          <m:t xml:space="preserve">⊆</m:t>
+          <m:t>SpecRelation</m:t>
+        </m:r>
+      </m:oMath>
+      <w:r>
+        <w:t xml:space="preserve"> </w:t>
+      </w:r>
+      <w:r>
+        <w:t xml:space="preserve">is the set of child relations in</w:t>
+      </w:r>
+      <w:r>
+        <w:t xml:space="preserve"> </w:t>
+      </w:r>
+      <m:oMath>
+        <m:r>
+          <m:t>β</m:t>
+        </m:r>
+      </m:oMath>
+      <w:r>
+        <w:t xml:space="preserve">.</w:t>
+      </w:r>
+    </w:p>
+    <w:p>
+      <w:pPr>
+        <w:pStyle w:val="Compact"/>
+        <w:numPr>
+          <w:ilvl w:val="0"/>
+          <w:numId w:val="1004"/>
+        </w:numPr>
+      </w:pPr>
+      <m:oMath>
+        <m:r>
+          <m:rPr>
+            <m:scr m:val="script"/>
+            <m:sty m:val="p"/>
+          </m:rPr>
+          <m:t>V</m:t>
+        </m:r>
+        <m:r>
+          <m:rPr>
+            <m:sty m:val="p"/>
+          </m:rPr>
+          <m:t>⊆</m:t>
         </m:r>
         <m:r>
           <m:rPr>
             <m:nor/>
+            <m:sty m:val="p"/>
           </m:rPr>
-          <m:t xml:space="preserve">SpecFloat</m:t>
+          <m:t>SpecView</m:t>
         </m:r>
       </m:oMath>
       <w:r>
         <w:t xml:space="preserve"> </w:t>
       </w:r>
       <w:r>
-        <w:t xml:space="preserve">is the set of child floats.</w:t>
+        <w:t xml:space="preserve">is the set of child views.</w:t>
       </w:r>
     </w:p>
     <w:p>
@@ -2052,113 +2363,37 @@
           <w:numId w:val="1004"/>
         </w:numPr>
       </w:pPr>
-      <m:oMath xmlns:m="http://schemas.openxmlformats.org/officeDocument/2006/math" xmlns:w="http://schemas.openxmlformats.org/wordprocessingml/2006/main">
-        <m:r>
-          <w:rPr/>
+      <m:oMath>
+        <m:r>
+          <m:rPr>
+            <m:scr m:val="script"/>
+            <m:sty m:val="p"/>
+          </m:rPr>
+          <m:t>O</m:t>
+        </m:r>
+        <m:r>
+          <m:rPr>
+            <m:sty m:val="p"/>
+          </m:rPr>
+          <m:t>⊆</m:t>
+        </m:r>
+        <m:r>
           <m:rPr>
             <m:nor/>
-            <m:sty m:val="undefined"/>
+            <m:sty m:val="p"/>
           </m:rPr>
-          <m:t xml:space="preserve">R</m:t>
-        </m:r>
-        <m:r>
-          <m:t xml:space="preserve">⊆</m:t>
-        </m:r>
-        <m:r>
-          <m:rPr>
-            <m:nor/>
-          </m:rPr>
-          <m:t xml:space="preserve">SpecRelation</m:t>
+          <m:t>SpecObject</m:t>
         </m:r>
       </m:oMath>
       <w:r>
         <w:t xml:space="preserve"> </w:t>
       </w:r>
       <w:r>
-        <w:t xml:space="preserve">is the set of child relations in</w:t>
-      </w:r>
-      <w:r>
-        <w:t xml:space="preserve"> </w:t>
-      </w:r>
-      <m:oMath xmlns:m="http://schemas.openxmlformats.org/officeDocument/2006/math" xmlns:w="http://schemas.openxmlformats.org/wordprocessingml/2006/main">
-        <m:r>
-          <m:t xml:space="preserve">β</m:t>
-        </m:r>
-      </m:oMath>
-      <w:r>
-        <w:t xml:space="preserve">.</w:t>
-      </w:r>
-    </w:p>
-    <w:p>
-      <w:pPr>
-        <w:pStyle w:val="Compact"/>
-        <w:numPr>
-          <w:ilvl w:val="0"/>
-          <w:numId w:val="1004"/>
-        </w:numPr>
-      </w:pPr>
-      <m:oMath xmlns:m="http://schemas.openxmlformats.org/officeDocument/2006/math" xmlns:w="http://schemas.openxmlformats.org/wordprocessingml/2006/main">
-        <m:r>
-          <w:rPr/>
-          <m:rPr>
-            <m:nor/>
-            <m:sty m:val="undefined"/>
-          </m:rPr>
-          <m:t xml:space="preserve">V</m:t>
-        </m:r>
-        <m:r>
-          <m:t xml:space="preserve">⊆</m:t>
-        </m:r>
-        <m:r>
-          <m:rPr>
-            <m:nor/>
-          </m:rPr>
-          <m:t xml:space="preserve">SpecView</m:t>
-        </m:r>
-      </m:oMath>
-      <w:r>
-        <w:t xml:space="preserve"> </w:t>
-      </w:r>
-      <w:r>
-        <w:t xml:space="preserve">is the set of child views.</w:t>
-      </w:r>
-    </w:p>
-    <w:p>
-      <w:pPr>
-        <w:pStyle w:val="Compact"/>
-        <w:numPr>
-          <w:ilvl w:val="0"/>
-          <w:numId w:val="1004"/>
-        </w:numPr>
-      </w:pPr>
-      <m:oMath xmlns:m="http://schemas.openxmlformats.org/officeDocument/2006/math" xmlns:w="http://schemas.openxmlformats.org/wordprocessingml/2006/main">
-        <m:r>
-          <w:rPr/>
-          <m:rPr>
-            <m:nor/>
-            <m:sty m:val="undefined"/>
-          </m:rPr>
-          <m:t xml:space="preserve">O</m:t>
-        </m:r>
-        <m:r>
-          <m:t xml:space="preserve">⊆</m:t>
-        </m:r>
-        <m:r>
-          <m:rPr>
-            <m:nor/>
-          </m:rPr>
-          <m:t xml:space="preserve">SpecObject</m:t>
-        </m:r>
-      </m:oMath>
-      <w:r>
-        <w:t xml:space="preserve"> </w:t>
-      </w:r>
-      <w:r>
         <w:t xml:space="preserve">is the set of child objects (exactly one heading level deeper).</w:t>
       </w:r>
     </w:p>
-    <w:bookmarkEnd w:id="33"/>
-    <w:bookmarkStart w:id="37" w:name="grammar-1"/>
+    <w:bookmarkEnd w:id="22"/>
+    <w:bookmarkStart w:id="26" w:name="grammar-1"/>
     <w:p>
       <w:pPr>
         <w:pStyle w:val="Heading3"/>
@@ -2173,7 +2408,7 @@
     </w:p>
     <w:p>
       <w:pPr>
-        <w:spacing w:lineRule="exact" w:after="0" w:line="20" w:before="0"/>
+        <w:spacing w:line="20" w:before="0" w:lineRule="exact" w:after="0"/>
         <w:rPr>
           <w:sz w:val="2"/>
         </w:rPr>
@@ -2199,7 +2434,7 @@
         <w:fldChar w:fldCharType="separate"/>
       </w:r>
       <w:r>
-        <w:t>1</w:t>
+        <w:t>2</w:t>
       </w:r>
       <w:r>
         <w:fldChar w:fldCharType="end"/>
@@ -2216,20 +2451,20 @@
       <w:r>
         <w:drawing>
           <wp:inline>
-            <wp:extent cx="5334000" cy="2747375"/>
+            <wp:extent cx="5334000" cy="2590402"/>
             <wp:effectExtent b="0" l="0" r="0" t="0"/>
-            <wp:docPr descr="" title="" id="35" name="Picture"/>
+            <wp:docPr descr="" title="" id="24" name="Picture"/>
             <a:graphic>
               <a:graphicData uri="http://schemas.openxmlformats.org/drawingml/2006/picture">
                 <pic:pic>
                   <pic:nvPicPr>
-                    <pic:cNvPr descr="diagrams/0b4b16c17baff5b520ae303f0938c1a333742fc6.png" id="36" name="Picture"/>
+                    <pic:cNvPr descr="diagrams/0b4b16c17baff5b520ae303f0938c1a333742fc6.png" id="25" name="Picture"/>
                     <pic:cNvPicPr>
                       <a:picLocks noChangeArrowheads="1" noChangeAspect="1"/>
                     </pic:cNvPicPr>
                   </pic:nvPicPr>
                   <pic:blipFill>
-                    <a:blip r:embed="rId34"/>
+                    <a:blip r:embed="rId23"/>
                     <a:stretch>
                       <a:fillRect/>
                     </a:stretch>
@@ -2237,7 +2472,7 @@
                   <pic:spPr bwMode="auto">
                     <a:xfrm>
                       <a:off x="0" y="0"/>
-                      <a:ext cx="5334000" cy="2747375"/>
+                      <a:ext cx="5334000" cy="2590402"/>
                     </a:xfrm>
                     <a:prstGeom prst="rect">
                       <a:avLst/>
@@ -2256,8 +2491,8 @@
         </w:drawing>
       </w:r>
     </w:p>
-    <w:bookmarkEnd w:id="37"/>
-    <w:bookmarkStart w:id="38" w:name="type-inference"/>
+    <w:bookmarkEnd w:id="26"/>
+    <w:bookmarkStart w:id="27" w:name="type-inference"/>
     <w:p>
       <w:pPr>
         <w:pStyle w:val="Heading3"/>
@@ -2349,8 +2584,8 @@
         <w:t xml:space="preserve">If no alias matches, the model’s default object type is used (typically SECTION).</w:t>
       </w:r>
     </w:p>
-    <w:bookmarkEnd w:id="38"/>
-    <w:bookmarkStart w:id="39" w:name="pid-auto-generation"/>
+    <w:bookmarkEnd w:id="27"/>
+    <w:bookmarkStart w:id="28" w:name="pid-auto-generation"/>
     <w:p>
       <w:pPr>
         <w:pStyle w:val="Heading3"/>
@@ -2437,8 +2672,8 @@
         <w:t xml:space="preserve">), starting from the next available sequence number.</w:t>
       </w:r>
     </w:p>
-    <w:bookmarkEnd w:id="39"/>
-    <w:bookmarkStart w:id="40" w:name="examples-1"/>
+    <w:bookmarkEnd w:id="28"/>
+    <w:bookmarkStart w:id="29" w:name="examples-1"/>
     <w:p>
       <w:pPr>
         <w:pStyle w:val="Heading3"/>
@@ -2580,9 +2815,9 @@
         <w:t xml:space="preserve">Passwords shall be at least 12 characters.</w:t>
       </w:r>
     </w:p>
-    <w:bookmarkEnd w:id="40"/>
-    <w:bookmarkEnd w:id="41"/>
-    <w:bookmarkStart w:id="49" w:name="spec-float"/>
+    <w:bookmarkEnd w:id="29"/>
+    <w:bookmarkEnd w:id="30"/>
+    <w:bookmarkStart w:id="38" w:name="spec-float"/>
     <w:p>
       <w:pPr>
         <w:pStyle w:val="Heading2"/>
@@ -2634,7 +2869,7 @@
         <w:t xml:space="preserve">info string. They are automatically numbered within their counter group and can be cross-referenced by label.</w:t>
       </w:r>
     </w:p>
-    <w:bookmarkStart w:id="42" w:name="formal-definition-2"/>
+    <w:bookmarkStart w:id="31" w:name="formal-definition-2"/>
     <w:p>
       <w:pPr>
         <w:pStyle w:val="Heading3"/>
@@ -2657,74 +2892,118 @@
       <w:r>
         <w:t xml:space="preserve"> </w:t>
       </w:r>
-      <m:oMath xmlns:m="http://schemas.openxmlformats.org/officeDocument/2006/math" xmlns:w="http://schemas.openxmlformats.org/wordprocessingml/2006/main">
-        <m:r>
-          <m:t xml:space="preserve">F=</m:t>
-        </m:r>
-        <m:r>
-          <m:t xml:space="preserve">(τ,</m:t>
+      <m:oMath>
+        <m:r>
+          <m:t>F</m:t>
         </m:r>
         <m:r>
           <m:rPr>
-            <m:nor/>
+            <m:sty m:val="p"/>
           </m:rPr>
-          <m:t xml:space="preserve">label</m:t>
-        </m:r>
-        <m:r>
-          <m:t xml:space="preserve">,</m:t>
-        </m:r>
-        <m:r>
-          <w:rPr/>
-          <m:rPr>
-            <m:nor/>
-            <m:sty m:val="undefined"/>
-          </m:rPr>
-          <m:t xml:space="preserve">kv</m:t>
-        </m:r>
-        <m:r>
-          <m:t xml:space="preserve">,</m:t>
-        </m:r>
-        <m:r>
-          <m:rPr>
-            <m:nor/>
-          </m:rPr>
-          <m:t xml:space="preserve">content</m:t>
-        </m:r>
-        <m:r>
-          <m:t xml:space="preserve">)</m:t>
-        </m:r>
-      </m:oMath>
-      <w:r>
-        <w:t xml:space="preserve"> </w:t>
-      </w:r>
-      <w:r>
-        <w:t xml:space="preserve">where:</w:t>
-      </w:r>
-    </w:p>
-    <w:p>
-      <w:pPr>
-        <w:pStyle w:val="Compact"/>
-        <w:numPr>
-          <w:ilvl w:val="0"/>
-          <w:numId w:val="1006"/>
-        </w:numPr>
-      </w:pPr>
-      <m:oMath xmlns:m="http://schemas.openxmlformats.org/officeDocument/2006/math" xmlns:w="http://schemas.openxmlformats.org/wordprocessingml/2006/main">
-        <m:r>
-          <m:t xml:space="preserve">τ∈Γ.</m:t>
-        </m:r>
-        <m:sSub>
-          <m:sSubPr>
-            <m:ctrlPr/>
-          </m:sSubPr>
+          <m:t>=</m:t>
+        </m:r>
+        <m:d>
+          <m:dPr>
+            <m:begChr m:val="("/>
+            <m:sepChr m:val=""/>
+            <m:endChr m:val=")"/>
+            <m:grow/>
+          </m:dPr>
           <m:e>
             <m:r>
-              <m:t xml:space="preserve">⊤</m:t>
+              <m:t>τ</m:t>
+            </m:r>
+            <m:r>
+              <m:rPr>
+                <m:sty m:val="p"/>
+              </m:rPr>
+              <m:t>,</m:t>
+            </m:r>
+            <m:r>
+              <m:rPr>
+                <m:nor/>
+                <m:sty m:val="p"/>
+              </m:rPr>
+              <m:t>label</m:t>
+            </m:r>
+            <m:r>
+              <m:rPr>
+                <m:sty m:val="p"/>
+              </m:rPr>
+              <m:t>,</m:t>
+            </m:r>
+            <m:r>
+              <m:rPr>
+                <m:nor/>
+                <m:sty m:val="p"/>
+              </m:rPr>
+              <m:t>kv</m:t>
+            </m:r>
+            <m:r>
+              <m:rPr>
+                <m:sty m:val="p"/>
+              </m:rPr>
+              <m:t>,</m:t>
+            </m:r>
+            <m:r>
+              <m:rPr>
+                <m:nor/>
+                <m:sty m:val="p"/>
+              </m:rPr>
+              <m:t>content</m:t>
+            </m:r>
+          </m:e>
+        </m:d>
+      </m:oMath>
+      <w:r>
+        <w:t xml:space="preserve"> </w:t>
+      </w:r>
+      <w:r>
+        <w:t xml:space="preserve">where:</w:t>
+      </w:r>
+    </w:p>
+    <w:p>
+      <w:pPr>
+        <w:pStyle w:val="Compact"/>
+        <w:numPr>
+          <w:ilvl w:val="0"/>
+          <w:numId w:val="1006"/>
+        </w:numPr>
+      </w:pPr>
+      <m:oMath>
+        <m:r>
+          <m:t>τ</m:t>
+        </m:r>
+        <m:r>
+          <m:rPr>
+            <m:sty m:val="p"/>
+          </m:rPr>
+          <m:t>∈</m:t>
+        </m:r>
+        <m:r>
+          <m:rPr>
+            <m:sty m:val="p"/>
+          </m:rPr>
+          <m:t>Γ</m:t>
+        </m:r>
+        <m:r>
+          <m:rPr>
+            <m:sty m:val="p"/>
+          </m:rPr>
+          <m:t>.</m:t>
+        </m:r>
+        <m:sSub>
+          <m:e>
+            <m:r>
+              <m:rPr>
+                <m:sty m:val="p"/>
+              </m:rPr>
+              <m:t>⊤</m:t>
             </m:r>
           </m:e>
           <m:sub>
             <m:r>
-              <m:t xml:space="preserve">F</m:t>
+              <m:t>F</m:t>
             </m:r>
           </m:sub>
         </m:sSub>
@@ -2744,21 +3023,26 @@
           <w:numId w:val="1006"/>
         </w:numPr>
       </w:pPr>
-      <m:oMath xmlns:m="http://schemas.openxmlformats.org/officeDocument/2006/math" xmlns:w="http://schemas.openxmlformats.org/wordprocessingml/2006/main">
+      <m:oMath>
         <m:r>
           <m:rPr>
             <m:nor/>
+            <m:sty m:val="p"/>
           </m:rPr>
-          <m:t xml:space="preserve">label</m:t>
-        </m:r>
-        <m:r>
-          <m:t xml:space="preserve">∈</m:t>
+          <m:t>label</m:t>
+        </m:r>
+        <m:r>
+          <m:rPr>
+            <m:sty m:val="p"/>
+          </m:rPr>
+          <m:t>∈</m:t>
         </m:r>
         <m:r>
           <m:rPr>
             <m:nor/>
+            <m:sty m:val="p"/>
           </m:rPr>
-          <m:t xml:space="preserve">String</m:t>
+          <m:t>String</m:t>
         </m:r>
       </m:oMath>
       <w:r>
@@ -2788,23 +3072,26 @@
           <w:numId w:val="1006"/>
         </w:numPr>
       </w:pPr>
-      <m:oMath xmlns:m="http://schemas.openxmlformats.org/officeDocument/2006/math" xmlns:w="http://schemas.openxmlformats.org/wordprocessingml/2006/main">
-        <m:r>
-          <w:rPr/>
+      <m:oMath>
+        <m:r>
           <m:rPr>
             <m:nor/>
-            <m:sty m:val="undefined"/>
+            <m:sty m:val="p"/>
           </m:rPr>
-          <m:t xml:space="preserve">kv</m:t>
-        </m:r>
-        <m:r>
-          <m:t xml:space="preserve">⊆</m:t>
+          <m:t>kv</m:t>
+        </m:r>
+        <m:r>
+          <m:rPr>
+            <m:sty m:val="p"/>
+          </m:rPr>
+          <m:t>⊆</m:t>
         </m:r>
         <m:r>
           <m:rPr>
             <m:nor/>
+            <m:sty m:val="p"/>
           </m:rPr>
-          <m:t xml:space="preserve">FloatAttribute</m:t>
+          <m:t>FloatAttribute</m:t>
         </m:r>
       </m:oMath>
       <w:r>
@@ -2822,12 +3109,13 @@
           <w:numId w:val="1006"/>
         </w:numPr>
       </w:pPr>
-      <m:oMath xmlns:m="http://schemas.openxmlformats.org/officeDocument/2006/math" xmlns:w="http://schemas.openxmlformats.org/wordprocessingml/2006/main">
+      <m:oMath>
         <m:r>
           <m:rPr>
             <m:nor/>
+            <m:sty m:val="p"/>
           </m:rPr>
-          <m:t xml:space="preserve">content</m:t>
+          <m:t>content</m:t>
         </m:r>
       </m:oMath>
       <w:r>
@@ -2837,8 +3125,8 @@
         <w:t xml:space="preserve">is the raw payload of the fenced code block.</w:t>
       </w:r>
     </w:p>
-    <w:bookmarkEnd w:id="42"/>
-    <w:bookmarkStart w:id="46" w:name="grammar-2"/>
+    <w:bookmarkEnd w:id="31"/>
+    <w:bookmarkStart w:id="35" w:name="grammar-2"/>
     <w:p>
       <w:pPr>
         <w:pStyle w:val="Heading3"/>
@@ -2853,7 +3141,7 @@
     </w:p>
     <w:p>
       <w:pPr>
-        <w:spacing w:lineRule="exact" w:after="0" w:line="20" w:before="0"/>
+        <w:spacing w:line="20" w:before="0" w:lineRule="exact" w:after="0"/>
         <w:rPr>
           <w:sz w:val="2"/>
         </w:rPr>
@@ -2879,7 +3167,7 @@
         <w:fldChar w:fldCharType="separate"/>
       </w:r>
       <w:r>
-        <w:t>1</w:t>
+        <w:t>3</w:t>
       </w:r>
       <w:r>
         <w:fldChar w:fldCharType="end"/>
@@ -2896,20 +3184,20 @@
       <w:r>
         <w:drawing>
           <wp:inline>
-            <wp:extent cx="5334000" cy="829415"/>
+            <wp:extent cx="5334000" cy="858746"/>
             <wp:effectExtent b="0" l="0" r="0" t="0"/>
-            <wp:docPr descr="" title="" id="44" name="Picture"/>
+            <wp:docPr descr="" title="" id="33" name="Picture"/>
             <a:graphic>
               <a:graphicData uri="http://schemas.openxmlformats.org/drawingml/2006/picture">
                 <pic:pic>
                   <pic:nvPicPr>
-                    <pic:cNvPr descr="diagrams/cbabee19ae66429ec6eda82dec8ea5357efaceb9.png" id="45" name="Picture"/>
+                    <pic:cNvPr descr="diagrams/cbabee19ae66429ec6eda82dec8ea5357efaceb9.png" id="34" name="Picture"/>
                     <pic:cNvPicPr>
                       <a:picLocks noChangeArrowheads="1" noChangeAspect="1"/>
                     </pic:cNvPicPr>
                   </pic:nvPicPr>
                   <pic:blipFill>
-                    <a:blip r:embed="rId43"/>
+                    <a:blip r:embed="rId32"/>
                     <a:stretch>
                       <a:fillRect/>
                     </a:stretch>
@@ -2917,7 +3205,7 @@
                   <pic:spPr bwMode="auto">
                     <a:xfrm>
                       <a:off x="0" y="0"/>
-                      <a:ext cx="5334000" cy="829415"/>
+                      <a:ext cx="5334000" cy="858746"/>
                     </a:xfrm>
                     <a:prstGeom prst="rect">
                       <a:avLst/>
@@ -2936,8 +3224,8 @@
         </w:drawing>
       </w:r>
     </w:p>
-    <w:bookmarkEnd w:id="46"/>
-    <w:bookmarkStart w:id="47" w:name="float-types-and-aliases"/>
+    <w:bookmarkEnd w:id="35"/>
+    <w:bookmarkStart w:id="36" w:name="float-types-and-aliases"/>
     <w:p>
       <w:pPr>
         <w:pStyle w:val="Heading3"/>
@@ -3267,8 +3555,8 @@
         <w:t xml:space="preserve">share a numbering sequence. For example, FIGURE, PLANTUML, CHART, and DIAGRAM may all share counter group FIGURE, producing Figure 1, Figure 2, Figure 3 regardless of specific type.</w:t>
       </w:r>
     </w:p>
-    <w:bookmarkEnd w:id="47"/>
-    <w:bookmarkStart w:id="48" w:name="examples-2"/>
+    <w:bookmarkEnd w:id="36"/>
+    <w:bookmarkStart w:id="37" w:name="examples-2"/>
     <w:p>
       <w:pPr>
         <w:pStyle w:val="Heading3"/>
@@ -3455,9 +3743,9 @@
         <w:t xml:space="preserve">```</w:t>
       </w:r>
     </w:p>
-    <w:bookmarkEnd w:id="48"/>
-    <w:bookmarkEnd w:id="49"/>
-    <w:bookmarkStart w:id="59" w:name="attribute"/>
+    <w:bookmarkEnd w:id="37"/>
+    <w:bookmarkEnd w:id="38"/>
+    <w:bookmarkStart w:id="48" w:name="attribute"/>
     <w:p>
       <w:pPr>
         <w:pStyle w:val="Heading2"/>
@@ -3494,7 +3782,7 @@
         <w:t xml:space="preserve">stores metadata for specifications and spec objects using an Entity-Attribute-Value (EAV) pattern. Attributes are declared in blockquotes following headers and support seven datatypes.</w:t>
       </w:r>
     </w:p>
-    <w:bookmarkStart w:id="50" w:name="formal-definition-3"/>
+    <w:bookmarkStart w:id="39" w:name="formal-definition-3"/>
     <w:p>
       <w:pPr>
         <w:pStyle w:val="Heading3"/>
@@ -3517,56 +3805,101 @@
       <w:r>
         <w:t xml:space="preserve"> </w:t>
       </w:r>
-      <m:oMath xmlns:m="http://schemas.openxmlformats.org/officeDocument/2006/math" xmlns:w="http://schemas.openxmlformats.org/wordprocessingml/2006/main">
-        <m:r>
-          <m:t xml:space="preserve">A=</m:t>
-        </m:r>
-        <m:r>
-          <m:t xml:space="preserve">(τ,β,</m:t>
-        </m:r>
-        <m:r>
-          <w:rPr/>
+      <m:oMath>
+        <m:r>
+          <m:t>A</m:t>
+        </m:r>
+        <m:r>
           <m:rPr>
-            <m:nor/>
-            <m:sty m:val="undefined"/>
+            <m:sty m:val="p"/>
           </m:rPr>
-          <m:t xml:space="preserve">R</m:t>
-        </m:r>
-        <m:r>
-          <m:t xml:space="preserve">)</m:t>
-        </m:r>
-      </m:oMath>
-      <w:r>
-        <w:t xml:space="preserve"> </w:t>
-      </w:r>
-      <w:r>
-        <w:t xml:space="preserve">where:</w:t>
-      </w:r>
-    </w:p>
-    <w:p>
-      <w:pPr>
-        <w:pStyle w:val="Compact"/>
-        <w:numPr>
-          <w:ilvl w:val="0"/>
-          <w:numId w:val="1008"/>
-        </w:numPr>
-      </w:pPr>
-      <m:oMath xmlns:m="http://schemas.openxmlformats.org/officeDocument/2006/math" xmlns:w="http://schemas.openxmlformats.org/wordprocessingml/2006/main">
-        <m:r>
-          <m:t xml:space="preserve">τ∈Γ.</m:t>
-        </m:r>
-        <m:sSub>
-          <m:sSubPr>
-            <m:ctrlPr/>
-          </m:sSubPr>
+          <m:t>=</m:t>
+        </m:r>
+        <m:d>
+          <m:dPr>
+            <m:begChr m:val="("/>
+            <m:sepChr m:val=""/>
+            <m:endChr m:val=")"/>
+            <m:grow/>
+          </m:dPr>
           <m:e>
             <m:r>
-              <m:t xml:space="preserve">⊤</m:t>
+              <m:t>τ</m:t>
+            </m:r>
+            <m:r>
+              <m:rPr>
+                <m:sty m:val="p"/>
+              </m:rPr>
+              <m:t>,</m:t>
+            </m:r>
+            <m:r>
+              <m:t>β</m:t>
+            </m:r>
+            <m:r>
+              <m:rPr>
+                <m:sty m:val="p"/>
+              </m:rPr>
+              <m:t>,</m:t>
+            </m:r>
+            <m:r>
+              <m:rPr>
+                <m:scr m:val="script"/>
+                <m:sty m:val="p"/>
+              </m:rPr>
+              <m:t>R</m:t>
+            </m:r>
+          </m:e>
+        </m:d>
+      </m:oMath>
+      <w:r>
+        <w:t xml:space="preserve"> </w:t>
+      </w:r>
+      <w:r>
+        <w:t xml:space="preserve">where:</w:t>
+      </w:r>
+    </w:p>
+    <w:p>
+      <w:pPr>
+        <w:pStyle w:val="Compact"/>
+        <w:numPr>
+          <w:ilvl w:val="0"/>
+          <w:numId w:val="1008"/>
+        </w:numPr>
+      </w:pPr>
+      <m:oMath>
+        <m:r>
+          <m:t>τ</m:t>
+        </m:r>
+        <m:r>
+          <m:rPr>
+            <m:sty m:val="p"/>
+          </m:rPr>
+          <m:t>∈</m:t>
+        </m:r>
+        <m:r>
+          <m:rPr>
+            <m:sty m:val="p"/>
+          </m:rPr>
+          <m:t>Γ</m:t>
+        </m:r>
+        <m:r>
+          <m:rPr>
+            <m:sty m:val="p"/>
+          </m:rPr>
+          <m:t>.</m:t>
+        </m:r>
+        <m:sSub>
+          <m:e>
+            <m:r>
+              <m:rPr>
+                <m:sty m:val="p"/>
+              </m:rPr>
+              <m:t>⊤</m:t>
             </m:r>
           </m:e>
           <m:sub>
             <m:r>
-              <m:t xml:space="preserve">A</m:t>
+              <m:t>A</m:t>
             </m:r>
           </m:sub>
         </m:sSub>
@@ -3613,9 +3946,9 @@
           <w:numId w:val="1008"/>
         </w:numPr>
       </w:pPr>
-      <m:oMath xmlns:m="http://schemas.openxmlformats.org/officeDocument/2006/math" xmlns:w="http://schemas.openxmlformats.org/wordprocessingml/2006/main">
-        <m:r>
-          <m:t xml:space="preserve">β</m:t>
+      <m:oMath>
+        <m:r>
+          <m:t>β</m:t>
         </m:r>
       </m:oMath>
       <w:r>
@@ -3633,23 +3966,26 @@
           <w:numId w:val="1008"/>
         </w:numPr>
       </w:pPr>
-      <m:oMath xmlns:m="http://schemas.openxmlformats.org/officeDocument/2006/math" xmlns:w="http://schemas.openxmlformats.org/wordprocessingml/2006/main">
-        <m:r>
-          <w:rPr/>
+      <m:oMath>
+        <m:r>
+          <m:rPr>
+            <m:scr m:val="script"/>
+            <m:sty m:val="p"/>
+          </m:rPr>
+          <m:t>R</m:t>
+        </m:r>
+        <m:r>
+          <m:rPr>
+            <m:sty m:val="p"/>
+          </m:rPr>
+          <m:t>⊆</m:t>
+        </m:r>
+        <m:r>
           <m:rPr>
             <m:nor/>
-            <m:sty m:val="undefined"/>
+            <m:sty m:val="p"/>
           </m:rPr>
-          <m:t xml:space="preserve">R</m:t>
-        </m:r>
-        <m:r>
-          <m:t xml:space="preserve">⊆</m:t>
-        </m:r>
-        <m:r>
-          <m:rPr>
-            <m:nor/>
-          </m:rPr>
-          <m:t xml:space="preserve">SpecRelation</m:t>
+          <m:t>SpecRelation</m:t>
         </m:r>
       </m:oMath>
       <w:r>
@@ -3661,17 +3997,17 @@
       <w:r>
         <w:t xml:space="preserve"> </w:t>
       </w:r>
-      <m:oMath xmlns:m="http://schemas.openxmlformats.org/officeDocument/2006/math" xmlns:w="http://schemas.openxmlformats.org/wordprocessingml/2006/main">
-        <m:r>
-          <m:t xml:space="preserve">β</m:t>
+      <m:oMath>
+        <m:r>
+          <m:t>β</m:t>
         </m:r>
       </m:oMath>
       <w:r>
         <w:t xml:space="preserve">.</w:t>
       </w:r>
     </w:p>
-    <w:bookmarkEnd w:id="50"/>
-    <w:bookmarkStart w:id="54" w:name="grammar-3"/>
+    <w:bookmarkEnd w:id="39"/>
+    <w:bookmarkStart w:id="43" w:name="grammar-3"/>
     <w:p>
       <w:pPr>
         <w:pStyle w:val="Heading3"/>
@@ -3686,7 +4022,7 @@
     </w:p>
     <w:p>
       <w:pPr>
-        <w:spacing w:lineRule="exact" w:after="0" w:line="20" w:before="0"/>
+        <w:spacing w:line="20" w:before="0" w:lineRule="exact" w:after="0"/>
         <w:rPr>
           <w:sz w:val="2"/>
         </w:rPr>
@@ -3712,7 +4048,7 @@
         <w:fldChar w:fldCharType="separate"/>
       </w:r>
       <w:r>
-        <w:t>1</w:t>
+        <w:t>4</w:t>
       </w:r>
       <w:r>
         <w:fldChar w:fldCharType="end"/>
@@ -3731,18 +4067,18 @@
           <wp:inline>
             <wp:extent cx="5334000" cy="1538491"/>
             <wp:effectExtent b="0" l="0" r="0" t="0"/>
-            <wp:docPr descr="" title="" id="52" name="Picture"/>
+            <wp:docPr descr="" title="" id="41" name="Picture"/>
             <a:graphic>
               <a:graphicData uri="http://schemas.openxmlformats.org/drawingml/2006/picture">
                 <pic:pic>
                   <pic:nvPicPr>
-                    <pic:cNvPr descr="diagrams/a87faeacf04f59cdc7bd06bbdac3768412b277cd.png" id="53" name="Picture"/>
+                    <pic:cNvPr descr="diagrams/a87faeacf04f59cdc7bd06bbdac3768412b277cd.png" id="42" name="Picture"/>
                     <pic:cNvPicPr>
                       <a:picLocks noChangeArrowheads="1" noChangeAspect="1"/>
                     </pic:cNvPicPr>
                   </pic:nvPicPr>
                   <pic:blipFill>
-                    <a:blip r:embed="rId51"/>
+                    <a:blip r:embed="rId40"/>
                     <a:stretch>
                       <a:fillRect/>
                     </a:stretch>
@@ -3807,8 +4143,8 @@
         <w:t xml:space="preserve">lines within the same blockquote.</w:t>
       </w:r>
     </w:p>
-    <w:bookmarkEnd w:id="54"/>
-    <w:bookmarkStart w:id="55" w:name="datatypes"/>
+    <w:bookmarkEnd w:id="43"/>
+    <w:bookmarkStart w:id="44" w:name="datatypes"/>
     <w:p>
       <w:pPr>
         <w:pStyle w:val="Heading3"/>
@@ -4067,8 +4403,8 @@
         <w:t xml:space="preserve">— rich text. Supports full Markdown formatting including links, bold, italic, and lists.</w:t>
       </w:r>
     </w:p>
-    <w:bookmarkEnd w:id="55"/>
-    <w:bookmarkStart w:id="56" w:name="attribute-constraints"/>
+    <w:bookmarkEnd w:id="44"/>
+    <w:bookmarkStart w:id="45" w:name="attribute-constraints"/>
     <w:p>
       <w:pPr>
         <w:pStyle w:val="Heading3"/>
@@ -4169,8 +4505,8 @@
         <w:t xml:space="preserve">These constraints are enforced by the type system during verification.</w:t>
       </w:r>
     </w:p>
-    <w:bookmarkEnd w:id="56"/>
-    <w:bookmarkStart w:id="57" w:name="multi-value-attributes"/>
+    <w:bookmarkEnd w:id="45"/>
+    <w:bookmarkStart w:id="46" w:name="multi-value-attributes"/>
     <w:p>
       <w:pPr>
         <w:pStyle w:val="Heading3"/>
@@ -4226,8 +4562,8 @@
         <w:t xml:space="preserve">&gt; applicable_standard: DO-254</w:t>
       </w:r>
     </w:p>
-    <w:bookmarkEnd w:id="57"/>
-    <w:bookmarkStart w:id="58" w:name="examples-3"/>
+    <w:bookmarkEnd w:id="46"/>
+    <w:bookmarkStart w:id="47" w:name="examples-3"/>
     <w:p>
       <w:pPr>
         <w:pStyle w:val="Heading3"/>
@@ -4339,9 +4675,9 @@
         <w:t xml:space="preserve">&gt; traceability: [HLR-001](@) [HLR-002](@)</w:t>
       </w:r>
     </w:p>
-    <w:bookmarkEnd w:id="58"/>
-    <w:bookmarkEnd w:id="59"/>
-    <w:bookmarkStart w:id="68" w:name="spec-relation"/>
+    <w:bookmarkEnd w:id="47"/>
+    <w:bookmarkEnd w:id="48"/>
+    <w:bookmarkStart w:id="57" w:name="spec-relation"/>
     <w:p>
       <w:pPr>
         <w:pStyle w:val="Heading2"/>
@@ -4394,7 +4730,7 @@
         <w:t xml:space="preserve">that drives type inference. The relation type is not authored explicitly — it is inferred from the selector, the source context, and the resolved target.</w:t>
       </w:r>
     </w:p>
-    <w:bookmarkStart w:id="60" w:name="formal-definition-4"/>
+    <w:bookmarkStart w:id="49" w:name="formal-definition-4"/>
     <w:p>
       <w:pPr>
         <w:pStyle w:val="Heading3"/>
@@ -4417,12 +4753,57 @@
       <w:r>
         <w:t xml:space="preserve"> </w:t>
       </w:r>
-      <m:oMath xmlns:m="http://schemas.openxmlformats.org/officeDocument/2006/math" xmlns:w="http://schemas.openxmlformats.org/wordprocessingml/2006/main">
-        <m:r>
-          <m:t xml:space="preserve">R=</m:t>
-        </m:r>
-        <m:r>
-          <m:t xml:space="preserve">(s,t,σ,α)</m:t>
+      <m:oMath>
+        <m:r>
+          <m:t>R</m:t>
+        </m:r>
+        <m:r>
+          <m:rPr>
+            <m:sty m:val="p"/>
+          </m:rPr>
+          <m:t>=</m:t>
+        </m:r>
+        <m:r>
+          <m:rPr>
+            <m:sty m:val="p"/>
+          </m:rPr>
+          <m:t>(</m:t>
+        </m:r>
+        <m:r>
+          <m:t>s</m:t>
+        </m:r>
+        <m:r>
+          <m:rPr>
+            <m:sty m:val="p"/>
+          </m:rPr>
+          <m:t>,</m:t>
+        </m:r>
+        <m:r>
+          <m:t>t</m:t>
+        </m:r>
+        <m:r>
+          <m:rPr>
+            <m:sty m:val="p"/>
+          </m:rPr>
+          <m:t>,</m:t>
+        </m:r>
+        <m:r>
+          <m:t>σ</m:t>
+        </m:r>
+        <m:r>
+          <m:rPr>
+            <m:sty m:val="p"/>
+          </m:rPr>
+          <m:t>,</m:t>
+        </m:r>
+        <m:r>
+          <m:t>α</m:t>
+        </m:r>
+        <m:r>
+          <m:rPr>
+            <m:sty m:val="p"/>
+          </m:rPr>
+          <m:t>)</m:t>
         </m:r>
       </m:oMath>
       <w:r>
@@ -4440,24 +4821,118 @@
           <w:numId w:val="1011"/>
         </w:numPr>
       </w:pPr>
-      <m:oMath xmlns:m="http://schemas.openxmlformats.org/officeDocument/2006/math" xmlns:w="http://schemas.openxmlformats.org/wordprocessingml/2006/main">
-        <m:r>
-          <m:t xml:space="preserve">s∈</m:t>
-        </m:r>
-        <m:r>
-          <w:rPr/>
+      <m:oMath>
+        <m:r>
+          <m:t>s</m:t>
+        </m:r>
+        <m:r>
+          <m:rPr>
+            <m:sty m:val="p"/>
+          </m:rPr>
+          <m:t>∈</m:t>
+        </m:r>
+        <m:r>
+          <m:rPr>
+            <m:scr m:val="script"/>
+            <m:sty m:val="p"/>
+          </m:rPr>
+          <m:t>O</m:t>
+        </m:r>
+      </m:oMath>
+      <w:r>
+        <w:t xml:space="preserve"> </w:t>
+      </w:r>
+      <w:r>
+        <w:t xml:space="preserve">is the source object.</w:t>
+      </w:r>
+    </w:p>
+    <w:p>
+      <w:pPr>
+        <w:pStyle w:val="Compact"/>
+        <w:numPr>
+          <w:ilvl w:val="0"/>
+          <w:numId w:val="1011"/>
+        </w:numPr>
+      </w:pPr>
+      <m:oMath>
+        <m:r>
+          <m:t>t</m:t>
+        </m:r>
+        <m:r>
+          <m:rPr>
+            <m:sty m:val="p"/>
+          </m:rPr>
+          <m:t>∈</m:t>
+        </m:r>
+        <m:d>
+          <m:dPr>
+            <m:begChr m:val="("/>
+            <m:sepChr m:val=""/>
+            <m:endChr m:val=")"/>
+            <m:grow/>
+          </m:dPr>
+          <m:e>
+            <m:r>
+              <m:rPr>
+                <m:scr m:val="script"/>
+                <m:sty m:val="p"/>
+              </m:rPr>
+              <m:t>O</m:t>
+            </m:r>
+            <m:r>
+              <m:rPr>
+                <m:sty m:val="p"/>
+              </m:rPr>
+              <m:t>∪</m:t>
+            </m:r>
+            <m:r>
+              <m:rPr>
+                <m:scr m:val="script"/>
+                <m:sty m:val="p"/>
+              </m:rPr>
+              <m:t>F</m:t>
+            </m:r>
+          </m:e>
+        </m:d>
+      </m:oMath>
+      <w:r>
+        <w:t xml:space="preserve"> </w:t>
+      </w:r>
+      <w:r>
+        <w:t xml:space="preserve">is the target element (object or float).</w:t>
+      </w:r>
+    </w:p>
+    <w:p>
+      <w:pPr>
+        <w:pStyle w:val="Compact"/>
+        <w:numPr>
+          <w:ilvl w:val="0"/>
+          <w:numId w:val="1011"/>
+        </w:numPr>
+      </w:pPr>
+      <m:oMath>
+        <m:r>
+          <m:t>σ</m:t>
+        </m:r>
+        <m:r>
+          <m:rPr>
+            <m:sty m:val="p"/>
+          </m:rPr>
+          <m:t>∈</m:t>
+        </m:r>
+        <m:r>
           <m:rPr>
             <m:nor/>
-            <m:sty m:val="undefined"/>
+            <m:sty m:val="p"/>
           </m:rPr>
-          <m:t xml:space="preserve">O</m:t>
+          <m:t>String</m:t>
         </m:r>
       </m:oMath>
       <w:r>
         <w:t xml:space="preserve"> </w:t>
       </w:r>
       <w:r>
-        <w:t xml:space="preserve">is the source object.</w:t>
+        <w:t xml:space="preserve">is the link selector (the URL portion of the Markdown link).</w:t>
       </w:r>
     </w:p>
     <w:p>
@@ -4468,141 +4943,114 @@
           <w:numId w:val="1011"/>
         </w:numPr>
       </w:pPr>
-      <m:oMath xmlns:m="http://schemas.openxmlformats.org/officeDocument/2006/math" xmlns:w="http://schemas.openxmlformats.org/wordprocessingml/2006/main">
-        <m:r>
-          <m:t xml:space="preserve">t∈</m:t>
-        </m:r>
-        <m:r>
-          <m:t xml:space="preserve">(</m:t>
-        </m:r>
-        <m:r>
-          <w:rPr/>
+      <m:oMath>
+        <m:r>
+          <m:t>α</m:t>
+        </m:r>
+        <m:r>
+          <m:rPr>
+            <m:sty m:val="p"/>
+          </m:rPr>
+          <m:t>∈</m:t>
+        </m:r>
+        <m:r>
           <m:rPr>
             <m:nor/>
-            <m:sty m:val="undefined"/>
+            <m:sty m:val="p"/>
           </m:rPr>
-          <m:t xml:space="preserve">O</m:t>
-        </m:r>
-        <m:r>
-          <m:t xml:space="preserve">∪</m:t>
-        </m:r>
-        <m:r>
-          <w:rPr/>
+          <m:t>String</m:t>
+        </m:r>
+        <m:r>
           <m:rPr>
-            <m:nor/>
-            <m:sty m:val="undefined"/>
+            <m:sty m:val="p"/>
           </m:rPr>
-          <m:t xml:space="preserve">F</m:t>
-        </m:r>
-        <m:r>
-          <m:t xml:space="preserve">)</m:t>
-        </m:r>
-      </m:oMath>
-      <w:r>
-        <w:t xml:space="preserve"> </w:t>
-      </w:r>
-      <w:r>
-        <w:t xml:space="preserve">is the target element (object or float).</w:t>
-      </w:r>
-    </w:p>
-    <w:p>
-      <w:pPr>
-        <w:pStyle w:val="Compact"/>
-        <w:numPr>
-          <w:ilvl w:val="0"/>
-          <w:numId w:val="1011"/>
-        </w:numPr>
-      </w:pPr>
-      <m:oMath xmlns:m="http://schemas.openxmlformats.org/officeDocument/2006/math" xmlns:w="http://schemas.openxmlformats.org/wordprocessingml/2006/main">
-        <m:r>
-          <m:t xml:space="preserve">σ∈</m:t>
-        </m:r>
-        <m:r>
-          <m:rPr>
-            <m:nor/>
-          </m:rPr>
-          <m:t xml:space="preserve">String</m:t>
-        </m:r>
-      </m:oMath>
-      <w:r>
-        <w:t xml:space="preserve"> </w:t>
-      </w:r>
-      <w:r>
-        <w:t xml:space="preserve">is the link selector (the URL portion of the Markdown link).</w:t>
-      </w:r>
-    </w:p>
-    <w:p>
-      <w:pPr>
-        <w:pStyle w:val="Compact"/>
-        <w:numPr>
-          <w:ilvl w:val="0"/>
-          <w:numId w:val="1011"/>
-        </w:numPr>
-      </w:pPr>
-      <m:oMath xmlns:m="http://schemas.openxmlformats.org/officeDocument/2006/math" xmlns:w="http://schemas.openxmlformats.org/wordprocessingml/2006/main">
-        <m:r>
-          <m:t xml:space="preserve">α∈</m:t>
-        </m:r>
-        <m:r>
-          <m:rPr>
-            <m:nor/>
-          </m:rPr>
-          <m:t xml:space="preserve">String</m:t>
-        </m:r>
-        <m:r>
-          <m:t xml:space="preserve">∪</m:t>
-        </m:r>
-        <m:r>
-          <m:t xml:space="preserve">{⊥}</m:t>
-        </m:r>
-      </m:oMath>
-      <w:r>
-        <w:t xml:space="preserve"> </w:t>
-      </w:r>
-      <w:r>
-        <w:t xml:space="preserve">is the source attribute containing the link, or</w:t>
-      </w:r>
-      <w:r>
-        <w:t xml:space="preserve"> </w:t>
-      </w:r>
-      <m:oMath xmlns:m="http://schemas.openxmlformats.org/officeDocument/2006/math" xmlns:w="http://schemas.openxmlformats.org/wordprocessingml/2006/main">
-        <m:r>
-          <m:t xml:space="preserve">⊥</m:t>
-        </m:r>
-      </m:oMath>
-      <w:r>
-        <w:t xml:space="preserve"> </w:t>
-      </w:r>
-      <w:r>
-        <w:t xml:space="preserve">when the link appears in body text.</w:t>
-      </w:r>
-    </w:p>
-    <w:p>
-      <w:pPr>
-        <w:pStyle w:val="FirstParagraph"/>
-      </w:pPr>
-      <w:r>
-        <w:t xml:space="preserve">The relation type</w:t>
-      </w:r>
-      <w:r>
-        <w:t xml:space="preserve"> </w:t>
-      </w:r>
-      <m:oMath xmlns:m="http://schemas.openxmlformats.org/officeDocument/2006/math" xmlns:w="http://schemas.openxmlformats.org/wordprocessingml/2006/main">
-        <m:r>
-          <m:t xml:space="preserve">ρ∈Γ.</m:t>
-        </m:r>
-        <m:sSub>
-          <m:sSubPr>
-            <m:ctrlPr/>
-          </m:sSubPr>
+          <m:t>∪</m:t>
+        </m:r>
+        <m:d>
+          <m:dPr>
+            <m:begChr m:val="{"/>
+            <m:sepChr m:val=""/>
+            <m:endChr m:val="}"/>
+            <m:grow/>
+          </m:dPr>
           <m:e>
             <m:r>
-              <m:t xml:space="preserve">⊤</m:t>
+              <m:rPr>
+                <m:sty m:val="p"/>
+              </m:rPr>
+              <m:t>⊥</m:t>
+            </m:r>
+          </m:e>
+        </m:d>
+      </m:oMath>
+      <w:r>
+        <w:t xml:space="preserve"> </w:t>
+      </w:r>
+      <w:r>
+        <w:t xml:space="preserve">is the source attribute containing the link, or</w:t>
+      </w:r>
+      <w:r>
+        <w:t xml:space="preserve"> </w:t>
+      </w:r>
+      <m:oMath>
+        <m:r>
+          <m:rPr>
+            <m:sty m:val="p"/>
+          </m:rPr>
+          <m:t>⊥</m:t>
+        </m:r>
+      </m:oMath>
+      <w:r>
+        <w:t xml:space="preserve"> </w:t>
+      </w:r>
+      <w:r>
+        <w:t xml:space="preserve">when the link appears in body text.</w:t>
+      </w:r>
+    </w:p>
+    <w:p>
+      <w:pPr>
+        <w:pStyle w:val="FirstParagraph"/>
+      </w:pPr>
+      <w:r>
+        <w:t xml:space="preserve">The relation type</w:t>
+      </w:r>
+      <w:r>
+        <w:t xml:space="preserve"> </w:t>
+      </w:r>
+      <m:oMath>
+        <m:r>
+          <m:t>ρ</m:t>
+        </m:r>
+        <m:r>
+          <m:rPr>
+            <m:sty m:val="p"/>
+          </m:rPr>
+          <m:t>∈</m:t>
+        </m:r>
+        <m:r>
+          <m:rPr>
+            <m:sty m:val="p"/>
+          </m:rPr>
+          <m:t>Γ</m:t>
+        </m:r>
+        <m:r>
+          <m:rPr>
+            <m:sty m:val="p"/>
+          </m:rPr>
+          <m:t>.</m:t>
+        </m:r>
+        <m:sSub>
+          <m:e>
+            <m:r>
+              <m:rPr>
+                <m:sty m:val="p"/>
+              </m:rPr>
+              <m:t>⊤</m:t>
             </m:r>
           </m:e>
           <m:sub>
             <m:r>
-              <m:t xml:space="preserve">R</m:t>
+              <m:t>R</m:t>
             </m:r>
           </m:sub>
         </m:sSub>
@@ -4629,62 +5077,88 @@
       <w:r>
         <w:t xml:space="preserve"> </w:t>
       </w:r>
-      <m:oMath xmlns:m="http://schemas.openxmlformats.org/officeDocument/2006/math" xmlns:w="http://schemas.openxmlformats.org/wordprocessingml/2006/main">
-        <m:r>
-          <m:t xml:space="preserve">ρ=</m:t>
+      <m:oMath>
+        <m:r>
+          <m:t>ρ</m:t>
+        </m:r>
+        <m:r>
+          <m:rPr>
+            <m:sty m:val="p"/>
+          </m:rPr>
+          <m:t>=</m:t>
         </m:r>
         <m:r>
           <m:rPr>
             <m:nor/>
+            <m:sty m:val="p"/>
           </m:rPr>
-          <m:t xml:space="preserve">infer</m:t>
-        </m:r>
-        <m:r>
-          <m:t xml:space="preserve">(σ,α,</m:t>
-        </m:r>
-        <m:sSub>
-          <m:sSubPr>
-            <m:ctrlPr/>
-          </m:sSubPr>
+          <m:t>infer</m:t>
+        </m:r>
+        <m:d>
+          <m:dPr>
+            <m:begChr m:val="("/>
+            <m:sepChr m:val=""/>
+            <m:endChr m:val=")"/>
+            <m:grow/>
+          </m:dPr>
           <m:e>
             <m:r>
-              <m:t xml:space="preserve">τ</m:t>
+              <m:t>σ</m:t>
             </m:r>
+            <m:r>
+              <m:rPr>
+                <m:sty m:val="p"/>
+              </m:rPr>
+              <m:t>,</m:t>
+            </m:r>
+            <m:r>
+              <m:t>α</m:t>
+            </m:r>
+            <m:r>
+              <m:rPr>
+                <m:sty m:val="p"/>
+              </m:rPr>
+              <m:t>,</m:t>
+            </m:r>
+            <m:sSub>
+              <m:e>
+                <m:r>
+                  <m:t>τ</m:t>
+                </m:r>
+              </m:e>
+              <m:sub>
+                <m:r>
+                  <m:t>s</m:t>
+                </m:r>
+              </m:sub>
+            </m:sSub>
+            <m:r>
+              <m:rPr>
+                <m:sty m:val="p"/>
+              </m:rPr>
+              <m:t>,</m:t>
+            </m:r>
+            <m:sSub>
+              <m:e>
+                <m:r>
+                  <m:t>τ</m:t>
+                </m:r>
+              </m:e>
+              <m:sub>
+                <m:r>
+                  <m:t>t</m:t>
+                </m:r>
+              </m:sub>
+            </m:sSub>
           </m:e>
-          <m:sub>
-            <m:r>
-              <m:t xml:space="preserve">s</m:t>
-            </m:r>
-          </m:sub>
-        </m:sSub>
-        <m:r>
-          <m:t xml:space="preserve">,</m:t>
-        </m:r>
-        <m:sSub>
-          <m:sSubPr>
-            <m:ctrlPr/>
-          </m:sSubPr>
-          <m:e>
-            <m:r>
-              <m:t xml:space="preserve">τ</m:t>
-            </m:r>
-          </m:e>
-          <m:sub>
-            <m:r>
-              <m:t xml:space="preserve">t</m:t>
-            </m:r>
-          </m:sub>
-        </m:sSub>
-        <m:r>
-          <m:t xml:space="preserve">)</m:t>
-        </m:r>
+        </m:d>
       </m:oMath>
       <w:r>
         <w:t xml:space="preserve">.</w:t>
       </w:r>
     </w:p>
-    <w:bookmarkEnd w:id="60"/>
-    <w:bookmarkStart w:id="64" w:name="grammar-4"/>
+    <w:bookmarkEnd w:id="49"/>
+    <w:bookmarkStart w:id="53" w:name="grammar-4"/>
     <w:p>
       <w:pPr>
         <w:pStyle w:val="Heading3"/>
@@ -4699,7 +5173,7 @@
     </w:p>
     <w:p>
       <w:pPr>
-        <w:spacing w:lineRule="exact" w:after="0" w:line="20" w:before="0"/>
+        <w:spacing w:line="20" w:before="0" w:lineRule="exact" w:after="0"/>
         <w:rPr>
           <w:sz w:val="2"/>
         </w:rPr>
@@ -4725,7 +5199,7 @@
         <w:fldChar w:fldCharType="separate"/>
       </w:r>
       <w:r>
-        <w:t>1</w:t>
+        <w:t>5</w:t>
       </w:r>
       <w:r>
         <w:fldChar w:fldCharType="end"/>
@@ -4744,18 +5218,18 @@
           <wp:inline>
             <wp:extent cx="4851400" cy="1689100"/>
             <wp:effectExtent b="0" l="0" r="0" t="0"/>
-            <wp:docPr descr="" title="" id="62" name="Picture"/>
+            <wp:docPr descr="" title="" id="51" name="Picture"/>
             <a:graphic>
               <a:graphicData uri="http://schemas.openxmlformats.org/drawingml/2006/picture">
                 <pic:pic>
                   <pic:nvPicPr>
-                    <pic:cNvPr descr="diagrams/e81fdc30ba9988a4c689ff034107d1c6b1b73337.png" id="63" name="Picture"/>
+                    <pic:cNvPr descr="diagrams/e81fdc30ba9988a4c689ff034107d1c6b1b73337.png" id="52" name="Picture"/>
                     <pic:cNvPicPr>
                       <a:picLocks noChangeArrowheads="1" noChangeAspect="1"/>
                     </pic:cNvPicPr>
                   </pic:nvPicPr>
                   <pic:blipFill>
-                    <a:blip r:embed="rId61"/>
+                    <a:blip r:embed="rId50"/>
                     <a:stretch>
                       <a:fillRect/>
                     </a:stretch>
@@ -4782,8 +5256,8 @@
         </w:drawing>
       </w:r>
     </w:p>
-    <w:bookmarkEnd w:id="64"/>
-    <w:bookmarkStart w:id="65" w:name="link-selectors"/>
+    <w:bookmarkEnd w:id="53"/>
+    <w:bookmarkStart w:id="54" w:name="link-selectors"/>
     <w:p>
       <w:pPr>
         <w:pStyle w:val="Heading3"/>
@@ -5174,8 +5648,8 @@
         <w:t xml:space="preserve">and optional resolver.</w:t>
       </w:r>
     </w:p>
-    <w:bookmarkEnd w:id="65"/>
-    <w:bookmarkStart w:id="66" w:name="type-inference-1"/>
+    <w:bookmarkEnd w:id="54"/>
+    <w:bookmarkStart w:id="55" w:name="type-inference-1"/>
     <w:p>
       <w:pPr>
         <w:pStyle w:val="Heading3"/>
@@ -5472,12 +5946,12 @@
         <w:tblW w:type="auto" w:w="0"/>
         <w:tblLook w:firstRow="1" w:lastRow="0" w:firstColumn="0" w:lastColumn="0" w:noHBand="0" w:noVBand="0" w:val="0020"/>
         <w:tblBorders>
-          <w:top w:color="000000" w:sz="6" w:space="0" w:val="single"/>
-          <w:left w:color="000000" w:sz="6" w:space="0" w:val="single"/>
-          <w:bottom w:color="000000" w:sz="6" w:space="0" w:val="single"/>
-          <w:right w:color="000000" w:sz="6" w:space="0" w:val="single"/>
-          <w:insideH w:color="000000" w:sz="6" w:space="0" w:val="single"/>
-          <w:insideV w:color="000000" w:sz="6" w:space="0" w:val="single"/>
+          <w:top w:space="0" w:val="single" w:color="000000" w:sz="6"/>
+          <w:left w:space="0" w:val="single" w:color="000000" w:sz="6"/>
+          <w:bottom w:space="0" w:val="single" w:color="000000" w:sz="6"/>
+          <w:right w:space="0" w:val="single" w:color="000000" w:sz="6"/>
+          <w:insideH w:space="0" w:val="single" w:color="000000" w:sz="6"/>
+          <w:insideV w:space="0" w:val="single" w:color="000000" w:sz="6"/>
         </w:tblBorders>
         <w:tblCellMar>
           <w:top w:w="57" w:type="dxa"/>
@@ -5500,13 +5974,13 @@
         </w:trPr>
         <w:tc>
           <w:tcPr>
-            <w:shd w:fill="E8E8E8" w:color="auto" w:val="clear"/>
+            <w:shd w:val="clear" w:color="auto" w:fill="E8E8E8"/>
           </w:tcPr>
           <w:p>
             <w:pPr>
               <w:pStyle w:val="Compact"/>
-              <w:ind w:left="0" w:firstLine="0" w:right="0"/>
-              <w:spacing w:lineRule="auto" w:before="40" w:line="240" w:after="40"/>
+              <w:ind w:firstLine="0" w:right="0" w:left="0"/>
+              <w:spacing w:after="40" w:lineRule="auto" w:before="40" w:line="240"/>
             </w:pPr>
             <w:r>
               <w:rPr>
@@ -5518,13 +5992,13 @@
         </w:tc>
         <w:tc>
           <w:tcPr>
-            <w:shd w:fill="E8E8E8" w:color="auto" w:val="clear"/>
+            <w:shd w:val="clear" w:color="auto" w:fill="E8E8E8"/>
           </w:tcPr>
           <w:p>
             <w:pPr>
               <w:pStyle w:val="Compact"/>
-              <w:ind w:left="0" w:firstLine="0" w:right="0"/>
-              <w:spacing w:lineRule="auto" w:before="40" w:line="240" w:after="40"/>
+              <w:ind w:firstLine="0" w:right="0" w:left="0"/>
+              <w:spacing w:after="40" w:lineRule="auto" w:before="40" w:line="240"/>
             </w:pPr>
             <w:r>
               <w:rPr>
@@ -5536,13 +6010,13 @@
         </w:tc>
         <w:tc>
           <w:tcPr>
-            <w:shd w:fill="E8E8E8" w:color="auto" w:val="clear"/>
+            <w:shd w:val="clear" w:color="auto" w:fill="E8E8E8"/>
           </w:tcPr>
           <w:p>
             <w:pPr>
               <w:pStyle w:val="Compact"/>
-              <w:ind w:left="0" w:firstLine="0" w:right="0"/>
-              <w:spacing w:lineRule="auto" w:before="40" w:line="240" w:after="40"/>
+              <w:ind w:firstLine="0" w:right="0" w:left="0"/>
+              <w:spacing w:after="40" w:lineRule="auto" w:before="40" w:line="240"/>
             </w:pPr>
             <w:r>
               <w:rPr>
@@ -5554,13 +6028,13 @@
         </w:tc>
         <w:tc>
           <w:tcPr>
-            <w:shd w:fill="E8E8E8" w:color="auto" w:val="clear"/>
+            <w:shd w:val="clear" w:color="auto" w:fill="E8E8E8"/>
           </w:tcPr>
           <w:p>
             <w:pPr>
               <w:pStyle w:val="Compact"/>
-              <w:ind w:left="0" w:firstLine="0" w:right="0"/>
-              <w:spacing w:lineRule="auto" w:before="40" w:line="240" w:after="40"/>
+              <w:ind w:firstLine="0" w:right="0" w:left="0"/>
+              <w:spacing w:after="40" w:lineRule="auto" w:before="40" w:line="240"/>
             </w:pPr>
             <w:r>
               <w:rPr>
@@ -5572,13 +6046,13 @@
         </w:tc>
         <w:tc>
           <w:tcPr>
-            <w:shd w:fill="E8E8E8" w:color="auto" w:val="clear"/>
+            <w:shd w:val="clear" w:color="auto" w:fill="E8E8E8"/>
           </w:tcPr>
           <w:p>
             <w:pPr>
               <w:pStyle w:val="Compact"/>
-              <w:ind w:left="0" w:firstLine="0" w:right="0"/>
-              <w:spacing w:lineRule="auto" w:before="40" w:line="240" w:after="40"/>
+              <w:ind w:firstLine="0" w:right="0" w:left="0"/>
+              <w:spacing w:after="40" w:lineRule="auto" w:before="40" w:line="240"/>
             </w:pPr>
             <w:r>
               <w:rPr>
@@ -5590,13 +6064,13 @@
         </w:tc>
         <w:tc>
           <w:tcPr>
-            <w:shd w:fill="E8E8E8" w:color="auto" w:val="clear"/>
+            <w:shd w:val="clear" w:color="auto" w:fill="E8E8E8"/>
           </w:tcPr>
           <w:p>
             <w:pPr>
               <w:pStyle w:val="Compact"/>
-              <w:ind w:left="0" w:firstLine="0" w:right="0"/>
-              <w:spacing w:lineRule="auto" w:before="40" w:line="240" w:after="40"/>
+              <w:ind w:firstLine="0" w:right="0" w:left="0"/>
+              <w:spacing w:after="40" w:lineRule="auto" w:before="40" w:line="240"/>
             </w:pPr>
             <w:r>
               <w:rPr>
@@ -5613,8 +6087,8 @@
           <w:p>
             <w:pPr>
               <w:pStyle w:val="Compact"/>
-              <w:ind w:left="0" w:firstLine="0" w:right="0"/>
-              <w:spacing w:lineRule="auto" w:before="40" w:line="240" w:after="40"/>
+              <w:ind w:firstLine="0" w:right="0" w:left="0"/>
+              <w:spacing w:after="40" w:lineRule="auto" w:before="40" w:line="240"/>
             </w:pPr>
             <w:r>
               <w:t xml:space="preserve">VERIFIES</w:t>
@@ -5626,8 +6100,8 @@
           <w:p>
             <w:pPr>
               <w:pStyle w:val="Compact"/>
-              <w:ind w:left="0" w:firstLine="0" w:right="0"/>
-              <w:spacing w:lineRule="auto" w:before="40" w:line="240" w:after="40"/>
+              <w:ind w:firstLine="0" w:right="0" w:left="0"/>
+              <w:spacing w:after="40" w:lineRule="auto" w:before="40" w:line="240"/>
             </w:pPr>
             <w:r>
               <w:rPr>
@@ -5642,8 +6116,8 @@
           <w:p>
             <w:pPr>
               <w:pStyle w:val="Compact"/>
-              <w:ind w:left="0" w:firstLine="0" w:right="0"/>
-              <w:spacing w:lineRule="auto" w:before="40" w:line="240" w:after="40"/>
+              <w:ind w:firstLine="0" w:right="0" w:left="0"/>
+              <w:spacing w:after="40" w:lineRule="auto" w:before="40" w:line="240"/>
             </w:pPr>
             <w:r>
               <w:rPr>
@@ -5658,8 +6132,8 @@
           <w:p>
             <w:pPr>
               <w:pStyle w:val="Compact"/>
-              <w:ind w:left="0" w:firstLine="0" w:right="0"/>
-              <w:spacing w:lineRule="auto" w:before="40" w:line="240" w:after="40"/>
+              <w:ind w:firstLine="0" w:right="0" w:left="0"/>
+              <w:spacing w:after="40" w:lineRule="auto" w:before="40" w:line="240"/>
             </w:pPr>
             <w:r>
               <w:rPr>
@@ -5674,8 +6148,8 @@
           <w:p>
             <w:pPr>
               <w:pStyle w:val="Compact"/>
-              <w:ind w:left="0" w:firstLine="0" w:right="0"/>
-              <w:spacing w:lineRule="auto" w:before="40" w:line="240" w:after="40"/>
+              <w:ind w:firstLine="0" w:right="0" w:left="0"/>
+              <w:spacing w:after="40" w:lineRule="auto" w:before="40" w:line="240"/>
             </w:pPr>
             <w:r>
               <w:rPr>
@@ -5690,8 +6164,8 @@
           <w:p>
             <w:pPr>
               <w:pStyle w:val="Compact"/>
-              <w:ind w:left="0" w:firstLine="0" w:right="0"/>
-              <w:spacing w:lineRule="auto" w:before="40" w:line="240" w:after="40"/>
+              <w:ind w:firstLine="0" w:right="0" w:left="0"/>
+              <w:spacing w:after="40" w:lineRule="auto" w:before="40" w:line="240"/>
             </w:pPr>
             <w:r>
               <w:rPr>
@@ -5709,8 +6183,8 @@
           <w:p>
             <w:pPr>
               <w:pStyle w:val="Compact"/>
-              <w:ind w:left="0" w:firstLine="0" w:right="0"/>
-              <w:spacing w:lineRule="auto" w:before="40" w:line="240" w:after="40"/>
+              <w:ind w:firstLine="0" w:right="0" w:left="0"/>
+              <w:spacing w:after="40" w:lineRule="auto" w:before="40" w:line="240"/>
             </w:pPr>
             <w:r>
               <w:t xml:space="preserve">TRACES_TO</w:t>
@@ -5722,8 +6196,8 @@
           <w:p>
             <w:pPr>
               <w:pStyle w:val="Compact"/>
-              <w:ind w:left="0" w:firstLine="0" w:right="0"/>
-              <w:spacing w:lineRule="auto" w:before="40" w:line="240" w:after="40"/>
+              <w:ind w:firstLine="0" w:right="0" w:left="0"/>
+              <w:spacing w:after="40" w:lineRule="auto" w:before="40" w:line="240"/>
             </w:pPr>
             <w:r>
               <w:rPr>
@@ -5738,8 +6212,8 @@
           <w:p>
             <w:pPr>
               <w:pStyle w:val="Compact"/>
-              <w:ind w:left="0" w:firstLine="0" w:right="0"/>
-              <w:spacing w:lineRule="auto" w:before="40" w:line="240" w:after="40"/>
+              <w:ind w:firstLine="0" w:right="0" w:left="0"/>
+              <w:spacing w:after="40" w:lineRule="auto" w:before="40" w:line="240"/>
             </w:pPr>
             <w:r>
               <w:t xml:space="preserve">—</w:t>
@@ -5751,8 +6225,8 @@
           <w:p>
             <w:pPr>
               <w:pStyle w:val="Compact"/>
-              <w:ind w:left="0" w:firstLine="0" w:right="0"/>
-              <w:spacing w:lineRule="auto" w:before="40" w:line="240" w:after="40"/>
+              <w:ind w:firstLine="0" w:right="0" w:left="0"/>
+              <w:spacing w:after="40" w:lineRule="auto" w:before="40" w:line="240"/>
             </w:pPr>
             <w:r>
               <w:t xml:space="preserve">—</w:t>
@@ -5764,8 +6238,8 @@
           <w:p>
             <w:pPr>
               <w:pStyle w:val="Compact"/>
-              <w:ind w:left="0" w:firstLine="0" w:right="0"/>
-              <w:spacing w:lineRule="auto" w:before="40" w:line="240" w:after="40"/>
+              <w:ind w:firstLine="0" w:right="0" w:left="0"/>
+              <w:spacing w:after="40" w:lineRule="auto" w:before="40" w:line="240"/>
             </w:pPr>
             <w:r>
               <w:t xml:space="preserve">—</w:t>
@@ -5777,8 +6251,8 @@
           <w:p>
             <w:pPr>
               <w:pStyle w:val="Compact"/>
-              <w:ind w:left="0" w:firstLine="0" w:right="0"/>
-              <w:spacing w:lineRule="auto" w:before="40" w:line="240" w:after="40"/>
+              <w:ind w:firstLine="0" w:right="0" w:left="0"/>
+              <w:spacing w:after="40" w:lineRule="auto" w:before="40" w:line="240"/>
             </w:pPr>
             <w:r>
               <w:t xml:space="preserve">1</w:t>
@@ -5792,8 +6266,8 @@
           <w:p>
             <w:pPr>
               <w:pStyle w:val="Compact"/>
-              <w:ind w:left="0" w:firstLine="0" w:right="0"/>
-              <w:spacing w:lineRule="auto" w:before="40" w:line="240" w:after="40"/>
+              <w:ind w:firstLine="0" w:right="0" w:left="0"/>
+              <w:spacing w:after="40" w:lineRule="auto" w:before="40" w:line="240"/>
             </w:pPr>
             <w:r>
               <w:t xml:space="preserve">XREF_SEC</w:t>
@@ -5805,8 +6279,8 @@
           <w:p>
             <w:pPr>
               <w:pStyle w:val="Compact"/>
-              <w:ind w:left="0" w:firstLine="0" w:right="0"/>
-              <w:spacing w:lineRule="auto" w:before="40" w:line="240" w:after="40"/>
+              <w:ind w:firstLine="0" w:right="0" w:left="0"/>
+              <w:spacing w:after="40" w:lineRule="auto" w:before="40" w:line="240"/>
             </w:pPr>
             <w:r>
               <w:rPr>
@@ -5821,8 +6295,8 @@
           <w:p>
             <w:pPr>
               <w:pStyle w:val="Compact"/>
-              <w:ind w:left="0" w:firstLine="0" w:right="0"/>
-              <w:spacing w:lineRule="auto" w:before="40" w:line="240" w:after="40"/>
+              <w:ind w:firstLine="0" w:right="0" w:left="0"/>
+              <w:spacing w:after="40" w:lineRule="auto" w:before="40" w:line="240"/>
             </w:pPr>
             <w:r>
               <w:t xml:space="preserve">—</w:t>
@@ -5834,8 +6308,8 @@
           <w:p>
             <w:pPr>
               <w:pStyle w:val="Compact"/>
-              <w:ind w:left="0" w:firstLine="0" w:right="0"/>
-              <w:spacing w:lineRule="auto" w:before="40" w:line="240" w:after="40"/>
+              <w:ind w:firstLine="0" w:right="0" w:left="0"/>
+              <w:spacing w:after="40" w:lineRule="auto" w:before="40" w:line="240"/>
             </w:pPr>
             <w:r>
               <w:t xml:space="preserve">—</w:t>
@@ -5847,8 +6321,8 @@
           <w:p>
             <w:pPr>
               <w:pStyle w:val="Compact"/>
-              <w:ind w:left="0" w:firstLine="0" w:right="0"/>
-              <w:spacing w:lineRule="auto" w:before="40" w:line="240" w:after="40"/>
+              <w:ind w:firstLine="0" w:right="0" w:left="0"/>
+              <w:spacing w:after="40" w:lineRule="auto" w:before="40" w:line="240"/>
             </w:pPr>
             <w:r>
               <w:rPr>
@@ -5864,8 +6338,8 @@
           <w:p>
             <w:pPr>
               <w:pStyle w:val="Compact"/>
-              <w:ind w:left="0" w:firstLine="0" w:right="0"/>
-              <w:spacing w:lineRule="auto" w:before="40" w:line="240" w:after="40"/>
+              <w:ind w:firstLine="0" w:right="0" w:left="0"/>
+              <w:spacing w:after="40" w:lineRule="auto" w:before="40" w:line="240"/>
             </w:pPr>
             <w:r>
               <w:t xml:space="preserve">eliminated</w:t>
@@ -5882,8 +6356,8 @@
         <w:t xml:space="preserve">VERIFIES wins with the highest specificity (4 non-NULL constraints matched).</w:t>
       </w:r>
     </w:p>
-    <w:bookmarkEnd w:id="66"/>
-    <w:bookmarkStart w:id="67" w:name="examples-4"/>
+    <w:bookmarkEnd w:id="55"/>
+    <w:bookmarkStart w:id="56" w:name="examples-4"/>
     <w:p>
       <w:pPr>
         <w:pStyle w:val="Heading3"/>
@@ -5953,9 +6427,9 @@
         <w:t xml:space="preserve">See [SRS-001](@) for the parent specification.</w:t>
       </w:r>
     </w:p>
-    <w:bookmarkEnd w:id="67"/>
-    <w:bookmarkEnd w:id="68"/>
-    <w:bookmarkStart w:id="76" w:name="spec-view"/>
+    <w:bookmarkEnd w:id="56"/>
+    <w:bookmarkEnd w:id="57"/>
+    <w:bookmarkStart w:id="65" w:name="spec-view"/>
     <w:p>
       <w:pPr>
         <w:pStyle w:val="Heading2"/>
@@ -5992,7 +6466,7 @@
         <w:t xml:space="preserve">is a dynamic query or generated content block. Views are materialized at processing time and produce content such as tables of contents, lists of figures, abbreviation expansions, and inline math.</w:t>
       </w:r>
     </w:p>
-    <w:bookmarkStart w:id="69" w:name="formal-definition-5"/>
+    <w:bookmarkStart w:id="58" w:name="formal-definition-5"/>
     <w:p>
       <w:pPr>
         <w:pStyle w:val="Heading3"/>
@@ -6015,12 +6489,39 @@
       <w:r>
         <w:t xml:space="preserve"> </w:t>
       </w:r>
-      <m:oMath xmlns:m="http://schemas.openxmlformats.org/officeDocument/2006/math" xmlns:w="http://schemas.openxmlformats.org/wordprocessingml/2006/main">
-        <m:r>
-          <m:t xml:space="preserve">V=</m:t>
-        </m:r>
-        <m:r>
-          <m:t xml:space="preserve">(τ,ω)</m:t>
+      <m:oMath>
+        <m:r>
+          <m:t>V</m:t>
+        </m:r>
+        <m:r>
+          <m:rPr>
+            <m:sty m:val="p"/>
+          </m:rPr>
+          <m:t>=</m:t>
+        </m:r>
+        <m:r>
+          <m:rPr>
+            <m:sty m:val="p"/>
+          </m:rPr>
+          <m:t>(</m:t>
+        </m:r>
+        <m:r>
+          <m:t>τ</m:t>
+        </m:r>
+        <m:r>
+          <m:rPr>
+            <m:sty m:val="p"/>
+          </m:rPr>
+          <m:t>,</m:t>
+        </m:r>
+        <m:r>
+          <m:t>ω</m:t>
+        </m:r>
+        <m:r>
+          <m:rPr>
+            <m:sty m:val="p"/>
+          </m:rPr>
+          <m:t>)</m:t>
         </m:r>
       </m:oMath>
       <w:r>
@@ -6038,22 +6539,40 @@
           <w:numId w:val="1014"/>
         </w:numPr>
       </w:pPr>
-      <m:oMath xmlns:m="http://schemas.openxmlformats.org/officeDocument/2006/math" xmlns:w="http://schemas.openxmlformats.org/wordprocessingml/2006/main">
-        <m:r>
-          <m:t xml:space="preserve">τ∈Γ.</m:t>
+      <m:oMath>
+        <m:r>
+          <m:t>τ</m:t>
+        </m:r>
+        <m:r>
+          <m:rPr>
+            <m:sty m:val="p"/>
+          </m:rPr>
+          <m:t>∈</m:t>
+        </m:r>
+        <m:r>
+          <m:rPr>
+            <m:sty m:val="p"/>
+          </m:rPr>
+          <m:t>Γ</m:t>
+        </m:r>
+        <m:r>
+          <m:rPr>
+            <m:sty m:val="p"/>
+          </m:rPr>
+          <m:t>.</m:t>
         </m:r>
         <m:sSub>
-          <m:sSubPr>
-            <m:ctrlPr/>
-          </m:sSubPr>
           <m:e>
             <m:r>
-              <m:t xml:space="preserve">⊤</m:t>
+              <m:rPr>
+                <m:sty m:val="p"/>
+              </m:rPr>
+              <m:t>⊤</m:t>
             </m:r>
           </m:e>
           <m:sub>
             <m:r>
-              <m:t xml:space="preserve">V</m:t>
+              <m:t>V</m:t>
             </m:r>
           </m:sub>
         </m:sSub>
@@ -6073,15 +6592,22 @@
           <w:numId w:val="1014"/>
         </w:numPr>
       </w:pPr>
-      <m:oMath xmlns:m="http://schemas.openxmlformats.org/officeDocument/2006/math" xmlns:w="http://schemas.openxmlformats.org/wordprocessingml/2006/main">
-        <m:r>
-          <m:t xml:space="preserve">ω∈</m:t>
+      <m:oMath>
+        <m:r>
+          <m:t>ω</m:t>
+        </m:r>
+        <m:r>
+          <m:rPr>
+            <m:sty m:val="p"/>
+          </m:rPr>
+          <m:t>∈</m:t>
         </m:r>
         <m:r>
           <m:rPr>
             <m:nor/>
+            <m:sty m:val="p"/>
           </m:rPr>
-          <m:t xml:space="preserve">String</m:t>
+          <m:t>String</m:t>
         </m:r>
       </m:oMath>
       <w:r>
@@ -6091,8 +6617,8 @@
         <w:t xml:space="preserve">is the raw parameter string.</w:t>
       </w:r>
     </w:p>
-    <w:bookmarkEnd w:id="69"/>
-    <w:bookmarkStart w:id="73" w:name="grammar-5"/>
+    <w:bookmarkEnd w:id="58"/>
+    <w:bookmarkStart w:id="62" w:name="grammar-5"/>
     <w:p>
       <w:pPr>
         <w:pStyle w:val="Heading3"/>
@@ -6107,7 +6633,7 @@
     </w:p>
     <w:p>
       <w:pPr>
-        <w:spacing w:lineRule="exact" w:after="0" w:line="20" w:before="0"/>
+        <w:spacing w:line="20" w:before="0" w:lineRule="exact" w:after="0"/>
         <w:rPr>
           <w:sz w:val="2"/>
         </w:rPr>
@@ -6133,7 +6659,7 @@
         <w:fldChar w:fldCharType="separate"/>
       </w:r>
       <w:r>
-        <w:t>1</w:t>
+        <w:t>6</w:t>
       </w:r>
       <w:r>
         <w:fldChar w:fldCharType="end"/>
@@ -6150,20 +6676,20 @@
       <w:r>
         <w:drawing>
           <wp:inline>
-            <wp:extent cx="5054600" cy="1320800"/>
+            <wp:extent cx="5283200" cy="1409700"/>
             <wp:effectExtent b="0" l="0" r="0" t="0"/>
-            <wp:docPr descr="" title="" id="71" name="Picture"/>
+            <wp:docPr descr="" title="" id="60" name="Picture"/>
             <a:graphic>
               <a:graphicData uri="http://schemas.openxmlformats.org/drawingml/2006/picture">
                 <pic:pic>
                   <pic:nvPicPr>
-                    <pic:cNvPr descr="diagrams/66854711fd100da85b86d601327ac920c398ea0e.png" id="72" name="Picture"/>
+                    <pic:cNvPr descr="diagrams/66854711fd100da85b86d601327ac920c398ea0e.png" id="61" name="Picture"/>
                     <pic:cNvPicPr>
                       <a:picLocks noChangeArrowheads="1" noChangeAspect="1"/>
                     </pic:cNvPicPr>
                   </pic:nvPicPr>
                   <pic:blipFill>
-                    <a:blip r:embed="rId70"/>
+                    <a:blip r:embed="rId59"/>
                     <a:stretch>
                       <a:fillRect/>
                     </a:stretch>
@@ -6171,7 +6697,7 @@
                   <pic:spPr bwMode="auto">
                     <a:xfrm>
                       <a:off x="0" y="0"/>
-                      <a:ext cx="5054600" cy="1320800"/>
+                      <a:ext cx="5283200" cy="1409700"/>
                     </a:xfrm>
                     <a:prstGeom prst="rect">
                       <a:avLst/>
@@ -6190,8 +6716,8 @@
         </w:drawing>
       </w:r>
     </w:p>
-    <w:bookmarkEnd w:id="73"/>
-    <w:bookmarkStart w:id="74" w:name="view-types"/>
+    <w:bookmarkEnd w:id="62"/>
+    <w:bookmarkStart w:id="63" w:name="view-types"/>
     <w:p>
       <w:pPr>
         <w:pStyle w:val="Heading3"/>
@@ -6408,8 +6934,8 @@
         <w:t xml:space="preserve">— summary report of requirements by type and status.</w:t>
       </w:r>
     </w:p>
-    <w:bookmarkEnd w:id="74"/>
-    <w:bookmarkStart w:id="75" w:name="examples-5"/>
+    <w:bookmarkEnd w:id="63"/>
+    <w:bookmarkStart w:id="64" w:name="examples-5"/>
     <w:p>
       <w:pPr>
         <w:pStyle w:val="Heading3"/>
@@ -6468,9 +6994,9 @@
         <w:t xml:space="preserve">`math_inline: x = \frac{-b}{2a}`</w:t>
       </w:r>
     </w:p>
-    <w:bookmarkEnd w:id="75"/>
-    <w:bookmarkEnd w:id="76"/>
-    <w:bookmarkStart w:id="77" w:name="disambiguation-rules"/>
+    <w:bookmarkEnd w:id="64"/>
+    <w:bookmarkEnd w:id="65"/>
+    <w:bookmarkStart w:id="66" w:name="disambiguation-rules"/>
     <w:p>
       <w:pPr>
         <w:pStyle w:val="Heading2"/>
@@ -6799,9 +7325,9 @@
         <w:t xml:space="preserve">If a heading skips levels (e.g., H2 followed by H4 with no intervening H3), the document is malformed. Processors should report an error; the missing intermediate level is not implicitly created.</w:t>
       </w:r>
     </w:p>
-    <w:bookmarkEnd w:id="77"/>
-    <w:bookmarkEnd w:id="78"/>
-    <w:bookmarkStart w:id="84" w:name="type-system"/>
+    <w:bookmarkEnd w:id="66"/>
+    <w:bookmarkEnd w:id="67"/>
+    <w:bookmarkStart w:id="73" w:name="type-system"/>
     <w:p>
       <w:pPr>
         <w:pStyle w:val="Heading1"/>
@@ -6840,9 +7366,12 @@
       <w:r>
         <w:t xml:space="preserve"> </w:t>
       </w:r>
-      <m:oMath xmlns:m="http://schemas.openxmlformats.org/officeDocument/2006/math" xmlns:w="http://schemas.openxmlformats.org/wordprocessingml/2006/main">
-        <m:r>
-          <m:t xml:space="preserve">Γ</m:t>
+      <m:oMath>
+        <m:r>
+          <m:rPr>
+            <m:sty m:val="p"/>
+          </m:rPr>
+          <m:t>Γ</m:t>
         </m:r>
       </m:oMath>
       <w:r>
@@ -6852,7 +7381,7 @@
         <w:t xml:space="preserve">that defines what object types, float types, relation types, view types, specification types, datatypes, and attributes exist. The language syntax is fixed; the model determines what types are valid and how they behave.</w:t>
       </w:r>
     </w:p>
-    <w:bookmarkStart w:id="79" w:name="model-structure"/>
+    <w:bookmarkStart w:id="68" w:name="model-structure"/>
     <w:p>
       <w:pPr>
         <w:pStyle w:val="Heading2"/>
@@ -6996,7 +7525,7 @@
           <w:b/>
           <w:bCs/>
         </w:rPr>
-        <w:t xml:space="preserve">Proof rules</w:t>
+        <w:t xml:space="preserve">Verification rules</w:t>
       </w:r>
       <w:r>
         <w:t xml:space="preserve"> </w:t>
@@ -7005,8 +7534,8 @@
         <w:t xml:space="preserve">— constraint violation detectors that enforce model invariants (e.g., missing required attributes, invalid enum values, broken traceability).</w:t>
       </w:r>
     </w:p>
-    <w:bookmarkEnd w:id="79"/>
-    <w:bookmarkStart w:id="80" w:name="type-definition-schema"/>
+    <w:bookmarkEnd w:id="68"/>
+    <w:bookmarkStart w:id="69" w:name="type-definition-schema"/>
     <w:p>
       <w:pPr>
         <w:pStyle w:val="Heading2"/>
@@ -7376,8 +7905,8 @@
         <w:t xml:space="preserve">).</w:t>
       </w:r>
     </w:p>
-    <w:bookmarkEnd w:id="80"/>
-    <w:bookmarkStart w:id="81" w:name="type-inheritance"/>
+    <w:bookmarkEnd w:id="69"/>
+    <w:bookmarkStart w:id="70" w:name="type-inheritance"/>
     <w:p>
       <w:pPr>
         <w:pStyle w:val="Heading2"/>
@@ -7573,8 +8102,8 @@
         <w:t xml:space="preserve">.</w:t>
       </w:r>
     </w:p>
-    <w:bookmarkEnd w:id="81"/>
-    <w:bookmarkStart w:id="82" w:name="default-model"/>
+    <w:bookmarkEnd w:id="70"/>
+    <w:bookmarkStart w:id="71" w:name="default-model"/>
     <w:p>
       <w:pPr>
         <w:pStyle w:val="Heading2"/>
@@ -7683,8 +8212,8 @@
         <w:t xml:space="preserve">A single default specification type.</w:t>
       </w:r>
     </w:p>
-    <w:bookmarkEnd w:id="82"/>
-    <w:bookmarkStart w:id="83" w:name="domain-models"/>
+    <w:bookmarkEnd w:id="71"/>
+    <w:bookmarkStart w:id="72" w:name="domain-models"/>
     <w:p>
       <w:pPr>
         <w:pStyle w:val="Heading2"/>
@@ -7806,7 +8335,7 @@
           <w:b/>
           <w:bCs/>
         </w:rPr>
-        <w:t xml:space="preserve">Proofs:</w:t>
+        <w:t xml:space="preserve">Verification views:</w:t>
       </w:r>
       <w:r>
         <w:t xml:space="preserve"> </w:t>
@@ -7815,9 +8344,9 @@
         <w:t xml:space="preserve">Missing traceability coverage, invalid attribute values, duplicate PIDs.</w:t>
       </w:r>
     </w:p>
-    <w:bookmarkEnd w:id="83"/>
-    <w:bookmarkEnd w:id="84"/>
-    <w:bookmarkStart w:id="88" w:name="datatypes-1"/>
+    <w:bookmarkEnd w:id="72"/>
+    <w:bookmarkEnd w:id="73"/>
+    <w:bookmarkStart w:id="77" w:name="datatypes-1"/>
     <w:p>
       <w:pPr>
         <w:pStyle w:val="Heading1"/>
@@ -7830,7 +8359,7 @@
         <w:t xml:space="preserve">Datatypes</w:t>
       </w:r>
     </w:p>
-    <w:bookmarkStart w:id="85" w:name="primitive-datatypes"/>
+    <w:bookmarkStart w:id="74" w:name="primitive-datatypes"/>
     <w:p>
       <w:pPr>
         <w:pStyle w:val="Heading2"/>
@@ -7853,7 +8382,7 @@
     </w:p>
     <w:p>
       <w:pPr>
-        <w:spacing w:lineRule="exact" w:after="0" w:line="20" w:before="0"/>
+        <w:spacing w:line="20" w:before="0" w:lineRule="exact" w:after="0"/>
         <w:rPr>
           <w:sz w:val="2"/>
         </w:rPr>
@@ -7894,12 +8423,12 @@
         <w:tblW w:type="auto" w:w="0"/>
         <w:tblLook w:firstRow="1" w:lastRow="0" w:firstColumn="0" w:lastColumn="0" w:noHBand="0" w:noVBand="0" w:val="0020"/>
         <w:tblBorders>
-          <w:top w:color="000000" w:sz="6" w:space="0" w:val="single"/>
-          <w:left w:color="000000" w:sz="6" w:space="0" w:val="single"/>
-          <w:bottom w:color="000000" w:sz="6" w:space="0" w:val="single"/>
-          <w:right w:color="000000" w:sz="6" w:space="0" w:val="single"/>
-          <w:insideH w:color="000000" w:sz="6" w:space="0" w:val="single"/>
-          <w:insideV w:color="000000" w:sz="6" w:space="0" w:val="single"/>
+          <w:top w:space="0" w:val="single" w:color="000000" w:sz="6"/>
+          <w:left w:space="0" w:val="single" w:color="000000" w:sz="6"/>
+          <w:bottom w:space="0" w:val="single" w:color="000000" w:sz="6"/>
+          <w:right w:space="0" w:val="single" w:color="000000" w:sz="6"/>
+          <w:insideH w:space="0" w:val="single" w:color="000000" w:sz="6"/>
+          <w:insideV w:space="0" w:val="single" w:color="000000" w:sz="6"/>
         </w:tblBorders>
         <w:tblCellMar>
           <w:top w:w="57" w:type="dxa"/>
@@ -7919,13 +8448,13 @@
         </w:trPr>
         <w:tc>
           <w:tcPr>
-            <w:shd w:fill="E8E8E8" w:color="auto" w:val="clear"/>
+            <w:shd w:val="clear" w:color="auto" w:fill="E8E8E8"/>
           </w:tcPr>
           <w:p>
             <w:pPr>
               <w:pStyle w:val="Compact"/>
-              <w:ind w:left="0" w:firstLine="0" w:right="0"/>
-              <w:spacing w:lineRule="auto" w:before="40" w:line="240" w:after="40"/>
+              <w:ind w:firstLine="0" w:right="0" w:left="0"/>
+              <w:spacing w:after="40" w:lineRule="auto" w:before="40" w:line="240"/>
             </w:pPr>
             <w:r>
               <w:rPr>
@@ -7937,13 +8466,13 @@
         </w:tc>
         <w:tc>
           <w:tcPr>
-            <w:shd w:fill="E8E8E8" w:color="auto" w:val="clear"/>
+            <w:shd w:val="clear" w:color="auto" w:fill="E8E8E8"/>
           </w:tcPr>
           <w:p>
             <w:pPr>
               <w:pStyle w:val="Compact"/>
-              <w:ind w:left="0" w:firstLine="0" w:right="0"/>
-              <w:spacing w:lineRule="auto" w:before="40" w:line="240" w:after="40"/>
+              <w:ind w:firstLine="0" w:right="0" w:left="0"/>
+              <w:spacing w:after="40" w:lineRule="auto" w:before="40" w:line="240"/>
             </w:pPr>
             <w:r>
               <w:rPr>
@@ -7955,13 +8484,13 @@
         </w:tc>
         <w:tc>
           <w:tcPr>
-            <w:shd w:fill="E8E8E8" w:color="auto" w:val="clear"/>
+            <w:shd w:val="clear" w:color="auto" w:fill="E8E8E8"/>
           </w:tcPr>
           <w:p>
             <w:pPr>
               <w:pStyle w:val="Compact"/>
-              <w:ind w:left="0" w:firstLine="0" w:right="0"/>
-              <w:spacing w:lineRule="auto" w:before="40" w:line="240" w:after="40"/>
+              <w:ind w:firstLine="0" w:right="0" w:left="0"/>
+              <w:spacing w:after="40" w:lineRule="auto" w:before="40" w:line="240"/>
             </w:pPr>
             <w:r>
               <w:rPr>
@@ -7978,8 +8507,8 @@
           <w:p>
             <w:pPr>
               <w:pStyle w:val="Compact"/>
-              <w:ind w:left="0" w:firstLine="0" w:right="0"/>
-              <w:spacing w:lineRule="auto" w:before="40" w:line="240" w:after="40"/>
+              <w:ind w:firstLine="0" w:right="0" w:left="0"/>
+              <w:spacing w:after="40" w:lineRule="auto" w:before="40" w:line="240"/>
             </w:pPr>
             <w:r>
               <w:t xml:space="preserve">STRING</w:t>
@@ -7991,8 +8520,8 @@
           <w:p>
             <w:pPr>
               <w:pStyle w:val="Compact"/>
-              <w:ind w:left="0" w:firstLine="0" w:right="0"/>
-              <w:spacing w:lineRule="auto" w:before="40" w:line="240" w:after="40"/>
+              <w:ind w:firstLine="0" w:right="0" w:left="0"/>
+              <w:spacing w:after="40" w:lineRule="auto" w:before="40" w:line="240"/>
             </w:pPr>
             <w:r>
               <w:t xml:space="preserve">Plain text</w:t>
@@ -8004,8 +8533,8 @@
           <w:p>
             <w:pPr>
               <w:pStyle w:val="Compact"/>
-              <w:ind w:left="0" w:firstLine="0" w:right="0"/>
-              <w:spacing w:lineRule="auto" w:before="40" w:line="240" w:after="40"/>
+              <w:ind w:firstLine="0" w:right="0" w:left="0"/>
+              <w:spacing w:after="40" w:lineRule="auto" w:before="40" w:line="240"/>
             </w:pPr>
             <w:r>
               <w:t xml:space="preserve">Unformatted text value</w:t>
@@ -8019,8 +8548,8 @@
           <w:p>
             <w:pPr>
               <w:pStyle w:val="Compact"/>
-              <w:ind w:left="0" w:firstLine="0" w:right="0"/>
-              <w:spacing w:lineRule="auto" w:before="40" w:line="240" w:after="40"/>
+              <w:ind w:firstLine="0" w:right="0" w:left="0"/>
+              <w:spacing w:after="40" w:lineRule="auto" w:before="40" w:line="240"/>
             </w:pPr>
             <w:r>
               <w:t xml:space="preserve">INTEGER</w:t>
@@ -8032,8 +8561,8 @@
           <w:p>
             <w:pPr>
               <w:pStyle w:val="Compact"/>
-              <w:ind w:left="0" w:firstLine="0" w:right="0"/>
-              <w:spacing w:lineRule="auto" w:before="40" w:line="240" w:after="40"/>
+              <w:ind w:firstLine="0" w:right="0" w:left="0"/>
+              <w:spacing w:after="40" w:lineRule="auto" w:before="40" w:line="240"/>
             </w:pPr>
             <w:r>
               <w:t xml:space="preserve">Whole number</w:t>
@@ -8045,8 +8574,8 @@
           <w:p>
             <w:pPr>
               <w:pStyle w:val="Compact"/>
-              <w:ind w:left="0" w:firstLine="0" w:right="0"/>
-              <w:spacing w:lineRule="auto" w:before="40" w:line="240" w:after="40"/>
+              <w:ind w:firstLine="0" w:right="0" w:left="0"/>
+              <w:spacing w:after="40" w:lineRule="auto" w:before="40" w:line="240"/>
             </w:pPr>
             <w:r>
               <w:t xml:space="preserve">Numeric value (supports min/max bounds)</w:t>
@@ -8060,8 +8589,8 @@
           <w:p>
             <w:pPr>
               <w:pStyle w:val="Compact"/>
-              <w:ind w:left="0" w:firstLine="0" w:right="0"/>
-              <w:spacing w:lineRule="auto" w:before="40" w:line="240" w:after="40"/>
+              <w:ind w:firstLine="0" w:right="0" w:left="0"/>
+              <w:spacing w:after="40" w:lineRule="auto" w:before="40" w:line="240"/>
             </w:pPr>
             <w:r>
               <w:t xml:space="preserve">REAL</w:t>
@@ -8073,8 +8602,8 @@
           <w:p>
             <w:pPr>
               <w:pStyle w:val="Compact"/>
-              <w:ind w:left="0" w:firstLine="0" w:right="0"/>
-              <w:spacing w:lineRule="auto" w:before="40" w:line="240" w:after="40"/>
+              <w:ind w:firstLine="0" w:right="0" w:left="0"/>
+              <w:spacing w:after="40" w:lineRule="auto" w:before="40" w:line="240"/>
             </w:pPr>
             <w:r>
               <w:t xml:space="preserve">Decimal number</w:t>
@@ -8086,8 +8615,8 @@
           <w:p>
             <w:pPr>
               <w:pStyle w:val="Compact"/>
-              <w:ind w:left="0" w:firstLine="0" w:right="0"/>
-              <w:spacing w:lineRule="auto" w:before="40" w:line="240" w:after="40"/>
+              <w:ind w:firstLine="0" w:right="0" w:left="0"/>
+              <w:spacing w:after="40" w:lineRule="auto" w:before="40" w:line="240"/>
             </w:pPr>
             <w:r>
               <w:t xml:space="preserve">Floating-point value (supports min/max bounds)</w:t>
@@ -8101,8 +8630,8 @@
           <w:p>
             <w:pPr>
               <w:pStyle w:val="Compact"/>
-              <w:ind w:left="0" w:firstLine="0" w:right="0"/>
-              <w:spacing w:lineRule="auto" w:before="40" w:line="240" w:after="40"/>
+              <w:ind w:firstLine="0" w:right="0" w:left="0"/>
+              <w:spacing w:after="40" w:lineRule="auto" w:before="40" w:line="240"/>
             </w:pPr>
             <w:r>
               <w:t xml:space="preserve">BOOLEAN</w:t>
@@ -8114,8 +8643,8 @@
           <w:p>
             <w:pPr>
               <w:pStyle w:val="Compact"/>
-              <w:ind w:left="0" w:firstLine="0" w:right="0"/>
-              <w:spacing w:lineRule="auto" w:before="40" w:line="240" w:after="40"/>
+              <w:ind w:firstLine="0" w:right="0" w:left="0"/>
+              <w:spacing w:after="40" w:lineRule="auto" w:before="40" w:line="240"/>
             </w:pPr>
             <w:r>
               <w:t xml:space="preserve">true / false</w:t>
@@ -8127,8 +8656,8 @@
           <w:p>
             <w:pPr>
               <w:pStyle w:val="Compact"/>
-              <w:ind w:left="0" w:firstLine="0" w:right="0"/>
-              <w:spacing w:lineRule="auto" w:before="40" w:line="240" w:after="40"/>
+              <w:ind w:firstLine="0" w:right="0" w:left="0"/>
+              <w:spacing w:after="40" w:lineRule="auto" w:before="40" w:line="240"/>
             </w:pPr>
             <w:r>
               <w:t xml:space="preserve">Boolean flag</w:t>
@@ -8142,8 +8671,8 @@
           <w:p>
             <w:pPr>
               <w:pStyle w:val="Compact"/>
-              <w:ind w:left="0" w:firstLine="0" w:right="0"/>
-              <w:spacing w:lineRule="auto" w:before="40" w:line="240" w:after="40"/>
+              <w:ind w:firstLine="0" w:right="0" w:left="0"/>
+              <w:spacing w:after="40" w:lineRule="auto" w:before="40" w:line="240"/>
             </w:pPr>
             <w:r>
               <w:t xml:space="preserve">DATE</w:t>
@@ -8155,8 +8684,8 @@
           <w:p>
             <w:pPr>
               <w:pStyle w:val="Compact"/>
-              <w:ind w:left="0" w:firstLine="0" w:right="0"/>
-              <w:spacing w:lineRule="auto" w:before="40" w:line="240" w:after="40"/>
+              <w:ind w:firstLine="0" w:right="0" w:left="0"/>
+              <w:spacing w:after="40" w:lineRule="auto" w:before="40" w:line="240"/>
             </w:pPr>
             <w:r>
               <w:t xml:space="preserve">YYYY-MM-DD</w:t>
@@ -8168,8 +8697,8 @@
           <w:p>
             <w:pPr>
               <w:pStyle w:val="Compact"/>
-              <w:ind w:left="0" w:firstLine="0" w:right="0"/>
-              <w:spacing w:lineRule="auto" w:before="40" w:line="240" w:after="40"/>
+              <w:ind w:firstLine="0" w:right="0" w:left="0"/>
+              <w:spacing w:after="40" w:lineRule="auto" w:before="40" w:line="240"/>
             </w:pPr>
             <w:r>
               <w:t xml:space="preserve">ISO 8601 date</w:t>
@@ -8183,8 +8712,8 @@
           <w:p>
             <w:pPr>
               <w:pStyle w:val="Compact"/>
-              <w:ind w:left="0" w:firstLine="0" w:right="0"/>
-              <w:spacing w:lineRule="auto" w:before="40" w:line="240" w:after="40"/>
+              <w:ind w:firstLine="0" w:right="0" w:left="0"/>
+              <w:spacing w:after="40" w:lineRule="auto" w:before="40" w:line="240"/>
             </w:pPr>
             <w:r>
               <w:t xml:space="preserve">ENUM</w:t>
@@ -8196,8 +8725,8 @@
           <w:p>
             <w:pPr>
               <w:pStyle w:val="Compact"/>
-              <w:ind w:left="0" w:firstLine="0" w:right="0"/>
-              <w:spacing w:lineRule="auto" w:before="40" w:line="240" w:after="40"/>
+              <w:ind w:firstLine="0" w:right="0" w:left="0"/>
+              <w:spacing w:after="40" w:lineRule="auto" w:before="40" w:line="240"/>
             </w:pPr>
             <w:r>
               <w:t xml:space="preserve">Named value</w:t>
@@ -8209,8 +8738,8 @@
           <w:p>
             <w:pPr>
               <w:pStyle w:val="Compact"/>
-              <w:ind w:left="0" w:firstLine="0" w:right="0"/>
-              <w:spacing w:lineRule="auto" w:before="40" w:line="240" w:after="40"/>
+              <w:ind w:firstLine="0" w:right="0" w:left="0"/>
+              <w:spacing w:after="40" w:lineRule="auto" w:before="40" w:line="240"/>
             </w:pPr>
             <w:r>
               <w:t xml:space="preserve">One of a model-declared set of values</w:t>
@@ -8224,8 +8753,8 @@
           <w:p>
             <w:pPr>
               <w:pStyle w:val="Compact"/>
-              <w:ind w:left="0" w:firstLine="0" w:right="0"/>
-              <w:spacing w:lineRule="auto" w:before="40" w:line="240" w:after="40"/>
+              <w:ind w:firstLine="0" w:right="0" w:left="0"/>
+              <w:spacing w:after="40" w:lineRule="auto" w:before="40" w:line="240"/>
             </w:pPr>
             <w:r>
               <w:t xml:space="preserve">XHTML</w:t>
@@ -8237,8 +8766,8 @@
           <w:p>
             <w:pPr>
               <w:pStyle w:val="Compact"/>
-              <w:ind w:left="0" w:firstLine="0" w:right="0"/>
-              <w:spacing w:lineRule="auto" w:before="40" w:line="240" w:after="40"/>
+              <w:ind w:firstLine="0" w:right="0" w:left="0"/>
+              <w:spacing w:after="40" w:lineRule="auto" w:before="40" w:line="240"/>
             </w:pPr>
             <w:r>
               <w:t xml:space="preserve">Markdown text</w:t>
@@ -8250,8 +8779,8 @@
           <w:p>
             <w:pPr>
               <w:pStyle w:val="Compact"/>
-              <w:ind w:left="0" w:firstLine="0" w:right="0"/>
-              <w:spacing w:lineRule="auto" w:before="40" w:line="240" w:after="40"/>
+              <w:ind w:firstLine="0" w:right="0" w:left="0"/>
+              <w:spacing w:after="40" w:lineRule="auto" w:before="40" w:line="240"/>
             </w:pPr>
             <w:r>
               <w:t xml:space="preserve">Rich text preserving block and inline formatting</w:t>
@@ -8260,8 +8789,8 @@
         </w:tc>
       </w:tr>
     </w:tbl>
-    <w:bookmarkEnd w:id="85"/>
-    <w:bookmarkStart w:id="86" w:name="enum-definitions"/>
+    <w:bookmarkEnd w:id="74"/>
+    <w:bookmarkStart w:id="75" w:name="enum-definitions"/>
     <w:p>
       <w:pPr>
         <w:pStyle w:val="Heading2"/>
@@ -8350,8 +8879,8 @@
         <w:t xml:space="preserve">An enum value that does not match one of the declared keys is a constraint violation.</w:t>
       </w:r>
     </w:p>
-    <w:bookmarkEnd w:id="86"/>
-    <w:bookmarkStart w:id="87" w:name="attribute-type-declarations"/>
+    <w:bookmarkEnd w:id="75"/>
+    <w:bookmarkStart w:id="76" w:name="attribute-type-declarations"/>
     <w:p>
       <w:pPr>
         <w:pStyle w:val="Heading2"/>
@@ -8500,9 +9029,9 @@
         <w:t xml:space="preserve">— bounds for INTEGER and REAL attributes.</w:t>
       </w:r>
     </w:p>
-    <w:bookmarkEnd w:id="87"/>
-    <w:bookmarkEnd w:id="88"/>
-    <w:bookmarkStart w:id="89" w:name="summary"/>
+    <w:bookmarkEnd w:id="76"/>
+    <w:bookmarkEnd w:id="77"/>
+    <w:bookmarkStart w:id="78" w:name="summary"/>
     <w:p>
       <w:pPr>
         <w:pStyle w:val="Heading1"/>
@@ -8759,7 +9288,7 @@
         <w:t xml:space="preserve">The language is model-parameterized: the type environment determines what types, attributes, relations, and constraints are active. Any compliant processor that loads the same model will interpret the same CommonSpec document identically.</w:t>
       </w:r>
     </w:p>
-    <w:bookmarkEnd w:id="89"/>
+    <w:bookmarkEnd w:id="78"/>
     <w:sectPr>
       <w:footerReference w:type="default" r:id="rId9200"/>
       <w:headerReference w:type="default" r:id="rId9101"/>
@@ -8783,12 +9312,12 @@
     <w:tblPr>
       <w:tblW w:w="5000" w:type="pct"/>
       <w:tblBorders>
-        <w:top w:color="CCCCCC" w:sz="4" w:space="1" w:val="single"/>
-        <w:bottom w:color="auto" w:sz="0" w:space="0" w:val="none"/>
-        <w:left w:color="auto" w:sz="0" w:space="0" w:val="none"/>
-        <w:right w:color="auto" w:sz="0" w:space="0" w:val="none"/>
-        <w:insideH w:color="auto" w:sz="0" w:space="0" w:val="none"/>
-        <w:insideV w:color="auto" w:sz="0" w:space="0" w:val="none"/>
+        <w:top w:space="1" w:val="single" w:color="CCCCCC" w:sz="4"/>
+        <w:bottom w:space="0" w:val="none" w:color="auto" w:sz="0"/>
+        <w:left w:space="0" w:val="none" w:color="auto" w:sz="0"/>
+        <w:right w:space="0" w:val="none" w:color="auto" w:sz="0"/>
+        <w:insideH w:space="0" w:val="none" w:color="auto" w:sz="0"/>
+        <w:insideV w:space="0" w:val="none" w:color="auto" w:sz="0"/>
       </w:tblBorders>
       <w:tblLayout w:type="fixed"/>
     </w:tblPr>
@@ -8808,7 +9337,7 @@
             <w:jc w:val="left"/>
           </w:pPr>
           <w:r>
-            <w:t xml:space="preserve">v1.0</w:t>
+            <w:t xml:space="preserve"/>
           </w:r>
         </w:p>
       </w:tc>
@@ -8957,7 +9486,7 @@
       <w:lvlText w:val="%1"/>
       <w:lvlJc w:val="left"/>
       <w:pPr>
-        <w:ind w:left="0" w:hanging="0"/>
+        <w:ind w:hanging="0" w:left="0"/>
       </w:pPr>
     </w:lvl>
     <w:lvl w:ilvl="1">
@@ -8969,7 +9498,7 @@
       <w:lvlText w:val="%1.%2"/>
       <w:lvlJc w:val="left"/>
       <w:pPr>
-        <w:ind w:left="0" w:hanging="0"/>
+        <w:ind w:hanging="0" w:left="0"/>
       </w:pPr>
     </w:lvl>
     <w:lvl w:ilvl="2">
@@ -8981,7 +9510,7 @@
       <w:lvlText w:val="%1.%2.%3"/>
       <w:lvlJc w:val="left"/>
       <w:pPr>
-        <w:ind w:left="0" w:hanging="0"/>
+        <w:ind w:hanging="0" w:left="0"/>
       </w:pPr>
     </w:lvl>
     <w:lvl w:ilvl="3">
@@ -8993,7 +9522,7 @@
       <w:lvlText w:val="%1.%2.%3.%4"/>
       <w:lvlJc w:val="left"/>
       <w:pPr>
-        <w:ind w:left="0" w:hanging="0"/>
+        <w:ind w:hanging="0" w:left="0"/>
       </w:pPr>
     </w:lvl>
     <w:lvl w:ilvl="4">
@@ -9005,7 +9534,7 @@
       <w:lvlText w:val="%1.%2.%3.%4.%5"/>
       <w:lvlJc w:val="left"/>
       <w:pPr>
-        <w:ind w:left="0" w:hanging="0"/>
+        <w:ind w:hanging="0" w:left="0"/>
       </w:pPr>
     </w:lvl>
   </w:abstractNum>
@@ -9467,10 +9996,10 @@
   <w:docDefaults>
     <w:rPrDefault>
       <w:rPr>
-        <w:rFonts w:asciiTheme="minorHAnsi" w:cstheme="minorBidi" w:eastAsiaTheme="minorHAnsi" w:hAnsiTheme="minorHAnsi"/>
+        <w:rFonts w:asciiTheme="minorHAnsi" w:cstheme="minorBidi" w:eastAsiaTheme="minorEastAsia" w:hAnsiTheme="minorHAnsi"/>
         <w:sz w:val="24"/>
         <w:szCs w:val="24"/>
-        <w:lang w:bidi="ar-SA" w:eastAsia="en-US" w:val="en-US"/>
+        <w:lang w:bidi="ar-SA" w:eastAsia="zh-CN" w:val="en-US"/>
       </w:rPr>
     </w:rPrDefault>
     <w:pPrDefault>
@@ -9522,8 +10051,6 @@
     </w:pPr>
     <w:rPr>
       <w:rFonts w:asciiTheme="majorHAnsi" w:cstheme="majorBidi" w:eastAsiaTheme="majorEastAsia" w:hAnsiTheme="majorHAnsi"/>
-      <w:spacing w:val="-10"/>
-      <w:kern w:val="28"/>
       <w:sz w:val="56"/>
       <w:szCs w:val="56"/>
     </w:rPr>
@@ -9536,8 +10063,6 @@
     <w:rsid w:val="00A10FD9"/>
     <w:rPr>
       <w:rFonts w:asciiTheme="majorHAnsi" w:cstheme="majorBidi" w:eastAsiaTheme="majorEastAsia" w:hAnsiTheme="majorHAnsi"/>
-      <w:spacing w:val="-10"/>
-      <w:kern w:val="28"/>
       <w:sz w:val="56"/>
       <w:szCs w:val="56"/>
     </w:rPr>
@@ -9578,23 +10103,31 @@
   </w:style>
   <w:style w:customStyle="1" w:styleId="Author" w:type="paragraph">
     <w:name w:val="Author"/>
+    <w:basedOn w:val="Title"/>
     <w:next w:val="BodyText"/>
     <w:qFormat/>
     <w:pPr>
       <w:keepNext/>
       <w:keepLines/>
-      <w:jc w:val="center"/>
     </w:pPr>
+    <w:rPr>
+      <w:sz w:val="24"/>
+      <w:szCs w:val="24"/>
+    </w:rPr>
   </w:style>
   <w:style w:styleId="Date" w:type="paragraph">
     <w:name w:val="Date"/>
+    <w:basedOn w:val="Title"/>
     <w:next w:val="BodyText"/>
     <w:qFormat/>
     <w:pPr>
       <w:keepNext/>
       <w:keepLines/>
-      <w:jc w:val="center"/>
     </w:pPr>
+    <w:rPr>
+      <w:sz w:val="24"/>
+      <w:szCs w:val="24"/>
+    </w:rPr>
   </w:style>
   <w:style w:customStyle="1" w:styleId="AbstractTitle" w:type="paragraph">
     <w:name w:val="Abstract Title"/>
@@ -10008,13 +10541,6 @@
       </w:tblCellMar>
     </w:tblPr>
     <w:tblStylePr w:type="firstRow">
-      <w:tblPr>
-        <w:jc w:val="left"/>
-        <w:tblInd w:type="dxa" w:w="0"/>
-      </w:tblPr>
-      <w:trPr>
-        <w:jc w:val="left"/>
-      </w:trPr>
       <w:tcPr>
         <w:tcBorders>
           <w:bottom w:val="single"/>
@@ -10356,293 +10882,52 @@
     <w:basedOn w:val="VerbatimChar"/>
     <w:rPr/>
   </w:style>
-  <w:style w:customStyle="1" w:type="character" w:styleId="VerbatimChar">
+  <w:style w:styleId="VerbatimChar" w:type="character" w:customStyle="1">
     <w:name w:val="Verbatim Char"/>
     <w:rPr>
-      <w:rFonts w:cs="Courier New" w:hAnsi="Courier New" w:ascii="Courier New"/>
+      <w:rFonts w:ascii="Courier New" w:hAnsi="Courier New" w:cs="Courier New"/>
       <w:sz w:val="20"/>
       <w:szCs w:val="20"/>
     </w:rPr>
   </w:style>
-  <w:style w:customStyle="1" w:type="paragraph" w:styleId="SourceCode">
+  <w:style w:styleId="SourceCode" w:type="paragraph" w:customStyle="1">
     <w:name w:val="Source Code"/>
     <w:basedOn w:val="Normal"/>
     <w:pPr>
-      <w:spacing w:lineRule="auto" w:before="0" w:line="240" w:after="0"/>
+      <w:spacing w:after="0" w:lineRule="auto" w:before="0" w:line="240"/>
       <w:jc w:val="left"/>
       <w:pBdr>
-        <w:top w:color="CCCCCC" w:sz="4" w:space="1" w:val="single"/>
-        <w:bottom w:color="CCCCCC" w:sz="4" w:space="1" w:val="single"/>
-        <w:left w:color="CCCCCC" w:sz="4" w:space="1" w:val="single"/>
-        <w:right w:color="CCCCCC" w:sz="4" w:space="1" w:val="single"/>
+        <w:top w:space="1" w:val="single" w:color="CCCCCC" w:sz="4"/>
+        <w:bottom w:space="1" w:val="single" w:color="CCCCCC" w:sz="4"/>
+        <w:left w:space="1" w:val="single" w:color="CCCCCC" w:sz="4"/>
+        <w:right w:space="1" w:val="single" w:color="CCCCCC" w:sz="4"/>
       </w:pBdr>
-      <w:shd w:fill="F5F5F5" w:color="auto" w:val="clear"/>
+      <w:shd w:val="clear" w:color="auto" w:fill="F5F5F5"/>
     </w:pPr>
     <w:rPr>
-      <w:rFonts w:cs="Courier New" w:hAnsi="Courier New" w:ascii="Courier New"/>
+      <w:rFonts w:ascii="Courier New" w:hAnsi="Courier New" w:cs="Courier New"/>
       <w:sz w:val="20"/>
       <w:szCs w:val="20"/>
     </w:rPr>
   </w:style>
-  <w:style w:customStyle="1" w:type="paragraph" w:styleId="Source">
-    <w:name w:val="Source"/>
+  <w:style w:customStyle="1" w:type="paragraph" w:styleId="SpecObjectHeader">
+    <w:name w:val="Spec Object Header"/>
     <w:basedOn w:val="Normal"/>
+    <w:next w:val="FirstParagraph"/>
     <w:qFormat/>
-    <w:uiPriority w:val="99"/>
     <w:pPr>
-      <w:widowControl/>
-      <w:spacing w:lineRule="auto" w:before="0" w:line="240" w:after="80"/>
-      <w:ind w:firstLine="0"/>
+      <w:keepNext/>
+      <w:spacing w:after="120" w:lineRule="auto" w:before="280" w:line="276"/>
+      <w:outlineLvl w:val="0"/>
     </w:pPr>
     <w:rPr>
-      <w:rFonts w:cs="Calibri" w:hAnsi="Calibri" w:eastAsia="Calibri" w:ascii="Calibri"/>
-      <w:sz w:val="18"/>
-      <w:szCs w:val="18"/>
-    </w:rPr>
-  </w:style>
-  <w:style w:type="paragraph" w:styleId="TOC2">
-    <w:name w:val="TOC 2"/>
-    <w:basedOn w:val="Normal"/>
-    <w:qFormat/>
-    <w:uiPriority w:val="99"/>
-    <w:pPr>
-      <w:widowControl/>
-      <w:spacing w:lineRule="auto" w:before="0" w:line="276" w:after="0"/>
-      <w:ind w:left="360" w:firstLine="0"/>
-    </w:pPr>
-    <w:rPr>
-      <w:rFonts w:cs="Calibri" w:hAnsi="Calibri" w:eastAsia="Calibri" w:ascii="Calibri"/>
-      <w:sz w:val="24"/>
-      <w:szCs w:val="24"/>
-      <w:color w:val="000000"/>
-    </w:rPr>
-  </w:style>
-  <w:style w:customStyle="1" w:type="paragraph" w:styleId="Reference">
-    <w:name w:val="Reference"/>
-    <w:basedOn w:val="Normal"/>
-    <w:qFormat/>
-    <w:uiPriority w:val="99"/>
-    <w:pPr>
-      <w:widowControl/>
-      <w:spacing w:lineRule="auto" w:before="0" w:line="276" w:after="120"/>
-      <w:ind w:left="720" w:hanging="720"/>
-    </w:pPr>
-    <w:rPr>
-      <w:rFonts w:cs="Calibri" w:hAnsi="Calibri" w:eastAsia="Calibri" w:ascii="Calibri"/>
-      <w:sz w:val="24"/>
-      <w:szCs w:val="24"/>
-    </w:rPr>
-  </w:style>
-  <w:style w:customStyle="1" w:type="paragraph" w:styleId="CoverDate">
-    <w:name w:val="Cover Date"/>
-    <w:basedOn w:val="Normal"/>
-    <w:qFormat/>
-    <w:uiPriority w:val="99"/>
-    <w:pPr>
-      <w:widowControl/>
-      <w:spacing w:lineRule="auto" w:before="0" w:line="240" w:after="80"/>
-      <w:ind w:firstLine="0"/>
-      <w:jc w:val="center"/>
-    </w:pPr>
-    <w:rPr>
-      <w:rFonts w:cs="Calibri" w:hAnsi="Calibri" w:eastAsia="Calibri" w:ascii="Calibri"/>
-      <w:i/>
-      <w:iCs/>
-      <w:sz w:val="24"/>
-      <w:szCs w:val="24"/>
-      <w:color w:val="666666"/>
-    </w:rPr>
-  </w:style>
-  <w:style w:customStyle="1" w:type="paragraph" w:styleId="Header">
-    <w:name w:val="Header"/>
-    <w:basedOn w:val="Normal"/>
-    <w:qFormat/>
-    <w:uiPriority w:val="99"/>
-    <w:pPr>
-      <w:widowControl/>
-      <w:spacing w:lineRule="auto" w:after="0" w:line="240"/>
-      <w:ind w:firstLine="0"/>
-    </w:pPr>
-    <w:rPr>
-      <w:rFonts w:cs="Calibri" w:hAnsi="Calibri" w:eastAsia="Calibri" w:ascii="Calibri"/>
-      <w:sz w:val="20"/>
-      <w:szCs w:val="20"/>
-    </w:rPr>
-  </w:style>
-  <w:style w:customStyle="1" w:type="paragraph" w:styleId="CoverTitle">
-    <w:name w:val="Cover Title"/>
-    <w:basedOn w:val="Normal"/>
-    <w:qFormat/>
-    <w:uiPriority w:val="99"/>
-    <w:pPr>
-      <w:widowControl/>
-      <w:spacing w:lineRule="auto" w:before="0" w:line="240" w:after="240"/>
-      <w:ind w:firstLine="0"/>
-      <w:jc w:val="center"/>
-    </w:pPr>
-    <w:rPr>
-      <w:rFonts w:cs="Calibri" w:hAnsi="Calibri" w:eastAsia="Calibri" w:ascii="Calibri"/>
+      <w:rFonts w:ascii="Calibri Light" w:hAnsi="Calibri Light" w:cs="Calibri Light"/>
       <w:b/>
       <w:bCs/>
-      <w:sz w:val="56"/>
-      <w:szCs w:val="56"/>
-      <w:color w:val="000000"/>
-    </w:rPr>
-  </w:style>
-  <w:style w:customStyle="1" w:type="paragraph" w:styleId="CoverVersion">
-    <w:name w:val="Cover Version"/>
-    <w:basedOn w:val="Normal"/>
-    <w:qFormat/>
-    <w:uiPriority w:val="99"/>
-    <w:pPr>
-      <w:widowControl/>
-      <w:spacing w:lineRule="auto" w:before="0" w:line="240" w:after="80"/>
-      <w:ind w:firstLine="0"/>
-      <w:jc w:val="center"/>
-    </w:pPr>
-    <w:rPr>
-      <w:rFonts w:cs="Calibri" w:hAnsi="Calibri" w:eastAsia="Calibri" w:ascii="Calibri"/>
-      <w:sz w:val="20"/>
-      <w:szCs w:val="20"/>
-      <w:color w:val="888888"/>
-    </w:rPr>
-  </w:style>
-  <w:style w:type="paragraph" w:styleId="TOC1">
-    <w:name w:val="TOC 1"/>
-    <w:basedOn w:val="Normal"/>
-    <w:qFormat/>
-    <w:uiPriority w:val="99"/>
-    <w:pPr>
-      <w:widowControl/>
-      <w:spacing w:lineRule="auto" w:before="120" w:line="276" w:after="0"/>
-      <w:ind w:firstLine="0"/>
-    </w:pPr>
-    <w:rPr>
-      <w:rFonts w:cs="Calibri" w:hAnsi="Calibri" w:eastAsia="Calibri" w:ascii="Calibri"/>
-      <w:b/>
-      <w:bCs/>
-      <w:sz w:val="24"/>
-      <w:szCs w:val="24"/>
-      <w:color w:val="000000"/>
-    </w:rPr>
-  </w:style>
-  <w:style w:type="paragraph" w:styleId="TOC3">
-    <w:name w:val="TOC 3"/>
-    <w:basedOn w:val="Normal"/>
-    <w:qFormat/>
-    <w:uiPriority w:val="99"/>
-    <w:pPr>
-      <w:widowControl/>
-      <w:spacing w:lineRule="auto" w:before="0" w:line="276" w:after="0"/>
-      <w:ind w:left="720" w:firstLine="0"/>
-    </w:pPr>
-    <w:rPr>
-      <w:rFonts w:cs="Calibri" w:hAnsi="Calibri" w:eastAsia="Calibri" w:ascii="Calibri"/>
-      <w:sz w:val="24"/>
-      <w:szCs w:val="24"/>
-      <w:color w:val="000000"/>
-    </w:rPr>
-  </w:style>
-  <w:style w:customStyle="1" w:type="paragraph" w:styleId="Footer">
-    <w:name w:val="Footer"/>
-    <w:basedOn w:val="Normal"/>
-    <w:qFormat/>
-    <w:uiPriority w:val="99"/>
-    <w:pPr>
-      <w:widowControl/>
-      <w:spacing w:lineRule="auto" w:after="0" w:line="240"/>
-      <w:ind w:firstLine="0"/>
-    </w:pPr>
-    <w:rPr>
-      <w:rFonts w:cs="Calibri" w:hAnsi="Calibri" w:eastAsia="Calibri" w:ascii="Calibri"/>
-      <w:sz w:val="20"/>
-      <w:szCs w:val="20"/>
-    </w:rPr>
-  </w:style>
-  <w:style w:customStyle="1" w:type="paragraph" w:styleId="CoverAuthor">
-    <w:name w:val="Cover Author"/>
-    <w:basedOn w:val="Normal"/>
-    <w:qFormat/>
-    <w:uiPriority w:val="99"/>
-    <w:pPr>
-      <w:widowControl/>
-      <w:spacing w:lineRule="auto" w:before="0" w:line="240" w:after="80"/>
-      <w:ind w:firstLine="0"/>
-      <w:jc w:val="center"/>
-    </w:pPr>
-    <w:rPr>
-      <w:rFonts w:cs="Calibri" w:hAnsi="Calibri" w:eastAsia="Calibri" w:ascii="Calibri"/>
-      <w:sz w:val="24"/>
-      <w:szCs w:val="24"/>
-      <w:color w:val="000000"/>
-    </w:rPr>
-  </w:style>
-  <w:style w:type="paragraph" w:styleId="Quote">
-    <w:name w:val="Quote"/>
-    <w:basedOn w:val="Normal"/>
-    <w:qFormat/>
-    <w:uiPriority w:val="99"/>
-    <w:pPr>
-      <w:widowControl/>
-      <w:spacing w:lineRule="auto" w:before="200" w:line="276" w:after="160"/>
-      <w:ind w:left="720" w:firstLine="0" w:right="720"/>
-    </w:pPr>
-    <w:rPr>
-      <w:rFonts w:cs="Calibri" w:hAnsi="Calibri" w:eastAsia="Calibri" w:ascii="Calibri"/>
-      <w:i/>
-      <w:iCs/>
-      <w:sz w:val="24"/>
-      <w:szCs w:val="24"/>
-      <w:color w:val="404040"/>
-    </w:rPr>
-  </w:style>
-  <w:style w:customStyle="1" w:type="paragraph" w:styleId="CoverSubtitle">
-    <w:name w:val="Cover Subtitle"/>
-    <w:basedOn w:val="Normal"/>
-    <w:qFormat/>
-    <w:uiPriority w:val="99"/>
-    <w:pPr>
-      <w:widowControl/>
-      <w:spacing w:lineRule="auto" w:before="0" w:line="240" w:after="160"/>
-      <w:ind w:firstLine="0"/>
-      <w:jc w:val="center"/>
-    </w:pPr>
-    <w:rPr>
-      <w:rFonts w:cs="Calibri" w:hAnsi="Calibri" w:eastAsia="Calibri" w:ascii="Calibri"/>
+      <w:color w:val="0F4C64"/>
       <w:sz w:val="32"/>
       <w:szCs w:val="32"/>
-      <w:color w:val="444444"/>
     </w:rPr>
-  </w:style>
-  <w:style w:customStyle="1" w:type="paragraph" w:styleId="CoverDocId">
-    <w:name w:val="Cover Document ID"/>
-    <w:basedOn w:val="Normal"/>
-    <w:qFormat/>
-    <w:uiPriority w:val="99"/>
-    <w:pPr>
-      <w:widowControl/>
-      <w:spacing w:lineRule="auto" w:before="0" w:line="240" w:after="80"/>
-      <w:ind w:firstLine="0"/>
-      <w:jc w:val="center"/>
-    </w:pPr>
-    <w:rPr>
-      <w:rFonts w:cs="Calibri" w:hAnsi="Calibri" w:eastAsia="Calibri" w:ascii="Calibri"/>
-      <w:sz w:val="20"/>
-      <w:szCs w:val="20"/>
-      <w:color w:val="888888"/>
-    </w:rPr>
-  </w:style>
-  <w:style w:customStyle="1" w:type="paragraph" w:styleId="FigureCenter">
-    <w:name w:val="Figure Center"/>
-    <w:basedOn w:val="Normal"/>
-    <w:qFormat/>
-    <w:uiPriority w:val="99"/>
-    <w:pPr>
-      <w:widowControl/>
-      <w:spacing w:lineRule="auto" w:before="120" w:line="240" w:after="120"/>
-      <w:ind w:firstLine="0"/>
-      <w:jc w:val="center"/>
-    </w:pPr>
   </w:style>
 </w:styles>
 </file>

</xml_diff>

<commit_message>
Deploy documentation from v0.1
</commit_message>
<xml_diff>
--- a/commonspec/downloads/commonspec.docx
+++ b/commonspec/downloads/commonspec.docx
@@ -1697,7 +1697,7 @@
     </w:p>
     <w:p>
       <w:pPr>
-        <w:spacing w:line="20" w:before="0" w:lineRule="exact" w:after="0"/>
+        <w:spacing w:after="0" w:line="20" w:before="0" w:lineRule="exact"/>
         <w:rPr>
           <w:sz w:val="2"/>
         </w:rPr>
@@ -2408,7 +2408,7 @@
     </w:p>
     <w:p>
       <w:pPr>
-        <w:spacing w:line="20" w:before="0" w:lineRule="exact" w:after="0"/>
+        <w:spacing w:after="0" w:line="20" w:before="0" w:lineRule="exact"/>
         <w:rPr>
           <w:sz w:val="2"/>
         </w:rPr>
@@ -3141,7 +3141,7 @@
     </w:p>
     <w:p>
       <w:pPr>
-        <w:spacing w:line="20" w:before="0" w:lineRule="exact" w:after="0"/>
+        <w:spacing w:after="0" w:line="20" w:before="0" w:lineRule="exact"/>
         <w:rPr>
           <w:sz w:val="2"/>
         </w:rPr>
@@ -4022,7 +4022,7 @@
     </w:p>
     <w:p>
       <w:pPr>
-        <w:spacing w:line="20" w:before="0" w:lineRule="exact" w:after="0"/>
+        <w:spacing w:after="0" w:line="20" w:before="0" w:lineRule="exact"/>
         <w:rPr>
           <w:sz w:val="2"/>
         </w:rPr>
@@ -5173,7 +5173,7 @@
     </w:p>
     <w:p>
       <w:pPr>
-        <w:spacing w:line="20" w:before="0" w:lineRule="exact" w:after="0"/>
+        <w:spacing w:after="0" w:line="20" w:before="0" w:lineRule="exact"/>
         <w:rPr>
           <w:sz w:val="2"/>
         </w:rPr>
@@ -5946,12 +5946,12 @@
         <w:tblW w:type="auto" w:w="0"/>
         <w:tblLook w:firstRow="1" w:lastRow="0" w:firstColumn="0" w:lastColumn="0" w:noHBand="0" w:noVBand="0" w:val="0020"/>
         <w:tblBorders>
-          <w:top w:space="0" w:val="single" w:color="000000" w:sz="6"/>
-          <w:left w:space="0" w:val="single" w:color="000000" w:sz="6"/>
-          <w:bottom w:space="0" w:val="single" w:color="000000" w:sz="6"/>
-          <w:right w:space="0" w:val="single" w:color="000000" w:sz="6"/>
-          <w:insideH w:space="0" w:val="single" w:color="000000" w:sz="6"/>
-          <w:insideV w:space="0" w:val="single" w:color="000000" w:sz="6"/>
+          <w:top w:color="000000" w:sz="6" w:val="single" w:space="0"/>
+          <w:left w:color="000000" w:sz="6" w:val="single" w:space="0"/>
+          <w:bottom w:color="000000" w:sz="6" w:val="single" w:space="0"/>
+          <w:right w:color="000000" w:sz="6" w:val="single" w:space="0"/>
+          <w:insideH w:color="000000" w:sz="6" w:val="single" w:space="0"/>
+          <w:insideV w:color="000000" w:sz="6" w:val="single" w:space="0"/>
         </w:tblBorders>
         <w:tblCellMar>
           <w:top w:w="57" w:type="dxa"/>
@@ -5974,13 +5974,13 @@
         </w:trPr>
         <w:tc>
           <w:tcPr>
-            <w:shd w:val="clear" w:color="auto" w:fill="E8E8E8"/>
+            <w:shd w:fill="E8E8E8" w:val="clear" w:color="auto"/>
           </w:tcPr>
           <w:p>
             <w:pPr>
               <w:pStyle w:val="Compact"/>
-              <w:ind w:firstLine="0" w:right="0" w:left="0"/>
-              <w:spacing w:after="40" w:lineRule="auto" w:before="40" w:line="240"/>
+              <w:ind w:right="0" w:firstLine="0" w:left="0"/>
+              <w:spacing w:before="40" w:after="40" w:lineRule="auto" w:line="240"/>
             </w:pPr>
             <w:r>
               <w:rPr>
@@ -5992,13 +5992,13 @@
         </w:tc>
         <w:tc>
           <w:tcPr>
-            <w:shd w:val="clear" w:color="auto" w:fill="E8E8E8"/>
+            <w:shd w:fill="E8E8E8" w:val="clear" w:color="auto"/>
           </w:tcPr>
           <w:p>
             <w:pPr>
               <w:pStyle w:val="Compact"/>
-              <w:ind w:firstLine="0" w:right="0" w:left="0"/>
-              <w:spacing w:after="40" w:lineRule="auto" w:before="40" w:line="240"/>
+              <w:ind w:right="0" w:firstLine="0" w:left="0"/>
+              <w:spacing w:before="40" w:after="40" w:lineRule="auto" w:line="240"/>
             </w:pPr>
             <w:r>
               <w:rPr>
@@ -6010,13 +6010,13 @@
         </w:tc>
         <w:tc>
           <w:tcPr>
-            <w:shd w:val="clear" w:color="auto" w:fill="E8E8E8"/>
+            <w:shd w:fill="E8E8E8" w:val="clear" w:color="auto"/>
           </w:tcPr>
           <w:p>
             <w:pPr>
               <w:pStyle w:val="Compact"/>
-              <w:ind w:firstLine="0" w:right="0" w:left="0"/>
-              <w:spacing w:after="40" w:lineRule="auto" w:before="40" w:line="240"/>
+              <w:ind w:right="0" w:firstLine="0" w:left="0"/>
+              <w:spacing w:before="40" w:after="40" w:lineRule="auto" w:line="240"/>
             </w:pPr>
             <w:r>
               <w:rPr>
@@ -6028,13 +6028,13 @@
         </w:tc>
         <w:tc>
           <w:tcPr>
-            <w:shd w:val="clear" w:color="auto" w:fill="E8E8E8"/>
+            <w:shd w:fill="E8E8E8" w:val="clear" w:color="auto"/>
           </w:tcPr>
           <w:p>
             <w:pPr>
               <w:pStyle w:val="Compact"/>
-              <w:ind w:firstLine="0" w:right="0" w:left="0"/>
-              <w:spacing w:after="40" w:lineRule="auto" w:before="40" w:line="240"/>
+              <w:ind w:right="0" w:firstLine="0" w:left="0"/>
+              <w:spacing w:before="40" w:after="40" w:lineRule="auto" w:line="240"/>
             </w:pPr>
             <w:r>
               <w:rPr>
@@ -6046,13 +6046,13 @@
         </w:tc>
         <w:tc>
           <w:tcPr>
-            <w:shd w:val="clear" w:color="auto" w:fill="E8E8E8"/>
+            <w:shd w:fill="E8E8E8" w:val="clear" w:color="auto"/>
           </w:tcPr>
           <w:p>
             <w:pPr>
               <w:pStyle w:val="Compact"/>
-              <w:ind w:firstLine="0" w:right="0" w:left="0"/>
-              <w:spacing w:after="40" w:lineRule="auto" w:before="40" w:line="240"/>
+              <w:ind w:right="0" w:firstLine="0" w:left="0"/>
+              <w:spacing w:before="40" w:after="40" w:lineRule="auto" w:line="240"/>
             </w:pPr>
             <w:r>
               <w:rPr>
@@ -6064,13 +6064,13 @@
         </w:tc>
         <w:tc>
           <w:tcPr>
-            <w:shd w:val="clear" w:color="auto" w:fill="E8E8E8"/>
+            <w:shd w:fill="E8E8E8" w:val="clear" w:color="auto"/>
           </w:tcPr>
           <w:p>
             <w:pPr>
               <w:pStyle w:val="Compact"/>
-              <w:ind w:firstLine="0" w:right="0" w:left="0"/>
-              <w:spacing w:after="40" w:lineRule="auto" w:before="40" w:line="240"/>
+              <w:ind w:right="0" w:firstLine="0" w:left="0"/>
+              <w:spacing w:before="40" w:after="40" w:lineRule="auto" w:line="240"/>
             </w:pPr>
             <w:r>
               <w:rPr>
@@ -6087,8 +6087,8 @@
           <w:p>
             <w:pPr>
               <w:pStyle w:val="Compact"/>
-              <w:ind w:firstLine="0" w:right="0" w:left="0"/>
-              <w:spacing w:after="40" w:lineRule="auto" w:before="40" w:line="240"/>
+              <w:ind w:right="0" w:firstLine="0" w:left="0"/>
+              <w:spacing w:before="40" w:after="40" w:lineRule="auto" w:line="240"/>
             </w:pPr>
             <w:r>
               <w:t xml:space="preserve">VERIFIES</w:t>
@@ -6100,8 +6100,8 @@
           <w:p>
             <w:pPr>
               <w:pStyle w:val="Compact"/>
-              <w:ind w:firstLine="0" w:right="0" w:left="0"/>
-              <w:spacing w:after="40" w:lineRule="auto" w:before="40" w:line="240"/>
+              <w:ind w:right="0" w:firstLine="0" w:left="0"/>
+              <w:spacing w:before="40" w:after="40" w:lineRule="auto" w:line="240"/>
             </w:pPr>
             <w:r>
               <w:rPr>
@@ -6116,8 +6116,8 @@
           <w:p>
             <w:pPr>
               <w:pStyle w:val="Compact"/>
-              <w:ind w:firstLine="0" w:right="0" w:left="0"/>
-              <w:spacing w:after="40" w:lineRule="auto" w:before="40" w:line="240"/>
+              <w:ind w:right="0" w:firstLine="0" w:left="0"/>
+              <w:spacing w:before="40" w:after="40" w:lineRule="auto" w:line="240"/>
             </w:pPr>
             <w:r>
               <w:rPr>
@@ -6132,8 +6132,8 @@
           <w:p>
             <w:pPr>
               <w:pStyle w:val="Compact"/>
-              <w:ind w:firstLine="0" w:right="0" w:left="0"/>
-              <w:spacing w:after="40" w:lineRule="auto" w:before="40" w:line="240"/>
+              <w:ind w:right="0" w:firstLine="0" w:left="0"/>
+              <w:spacing w:before="40" w:after="40" w:lineRule="auto" w:line="240"/>
             </w:pPr>
             <w:r>
               <w:rPr>
@@ -6148,8 +6148,8 @@
           <w:p>
             <w:pPr>
               <w:pStyle w:val="Compact"/>
-              <w:ind w:firstLine="0" w:right="0" w:left="0"/>
-              <w:spacing w:after="40" w:lineRule="auto" w:before="40" w:line="240"/>
+              <w:ind w:right="0" w:firstLine="0" w:left="0"/>
+              <w:spacing w:before="40" w:after="40" w:lineRule="auto" w:line="240"/>
             </w:pPr>
             <w:r>
               <w:rPr>
@@ -6164,8 +6164,8 @@
           <w:p>
             <w:pPr>
               <w:pStyle w:val="Compact"/>
-              <w:ind w:firstLine="0" w:right="0" w:left="0"/>
-              <w:spacing w:after="40" w:lineRule="auto" w:before="40" w:line="240"/>
+              <w:ind w:right="0" w:firstLine="0" w:left="0"/>
+              <w:spacing w:before="40" w:after="40" w:lineRule="auto" w:line="240"/>
             </w:pPr>
             <w:r>
               <w:rPr>
@@ -6183,8 +6183,8 @@
           <w:p>
             <w:pPr>
               <w:pStyle w:val="Compact"/>
-              <w:ind w:firstLine="0" w:right="0" w:left="0"/>
-              <w:spacing w:after="40" w:lineRule="auto" w:before="40" w:line="240"/>
+              <w:ind w:right="0" w:firstLine="0" w:left="0"/>
+              <w:spacing w:before="40" w:after="40" w:lineRule="auto" w:line="240"/>
             </w:pPr>
             <w:r>
               <w:t xml:space="preserve">TRACES_TO</w:t>
@@ -6196,8 +6196,8 @@
           <w:p>
             <w:pPr>
               <w:pStyle w:val="Compact"/>
-              <w:ind w:firstLine="0" w:right="0" w:left="0"/>
-              <w:spacing w:after="40" w:lineRule="auto" w:before="40" w:line="240"/>
+              <w:ind w:right="0" w:firstLine="0" w:left="0"/>
+              <w:spacing w:before="40" w:after="40" w:lineRule="auto" w:line="240"/>
             </w:pPr>
             <w:r>
               <w:rPr>
@@ -6212,8 +6212,8 @@
           <w:p>
             <w:pPr>
               <w:pStyle w:val="Compact"/>
-              <w:ind w:firstLine="0" w:right="0" w:left="0"/>
-              <w:spacing w:after="40" w:lineRule="auto" w:before="40" w:line="240"/>
+              <w:ind w:right="0" w:firstLine="0" w:left="0"/>
+              <w:spacing w:before="40" w:after="40" w:lineRule="auto" w:line="240"/>
             </w:pPr>
             <w:r>
               <w:t xml:space="preserve">—</w:t>
@@ -6225,8 +6225,8 @@
           <w:p>
             <w:pPr>
               <w:pStyle w:val="Compact"/>
-              <w:ind w:firstLine="0" w:right="0" w:left="0"/>
-              <w:spacing w:after="40" w:lineRule="auto" w:before="40" w:line="240"/>
+              <w:ind w:right="0" w:firstLine="0" w:left="0"/>
+              <w:spacing w:before="40" w:after="40" w:lineRule="auto" w:line="240"/>
             </w:pPr>
             <w:r>
               <w:t xml:space="preserve">—</w:t>
@@ -6238,8 +6238,8 @@
           <w:p>
             <w:pPr>
               <w:pStyle w:val="Compact"/>
-              <w:ind w:firstLine="0" w:right="0" w:left="0"/>
-              <w:spacing w:after="40" w:lineRule="auto" w:before="40" w:line="240"/>
+              <w:ind w:right="0" w:firstLine="0" w:left="0"/>
+              <w:spacing w:before="40" w:after="40" w:lineRule="auto" w:line="240"/>
             </w:pPr>
             <w:r>
               <w:t xml:space="preserve">—</w:t>
@@ -6251,8 +6251,8 @@
           <w:p>
             <w:pPr>
               <w:pStyle w:val="Compact"/>
-              <w:ind w:firstLine="0" w:right="0" w:left="0"/>
-              <w:spacing w:after="40" w:lineRule="auto" w:before="40" w:line="240"/>
+              <w:ind w:right="0" w:firstLine="0" w:left="0"/>
+              <w:spacing w:before="40" w:after="40" w:lineRule="auto" w:line="240"/>
             </w:pPr>
             <w:r>
               <w:t xml:space="preserve">1</w:t>
@@ -6266,8 +6266,8 @@
           <w:p>
             <w:pPr>
               <w:pStyle w:val="Compact"/>
-              <w:ind w:firstLine="0" w:right="0" w:left="0"/>
-              <w:spacing w:after="40" w:lineRule="auto" w:before="40" w:line="240"/>
+              <w:ind w:right="0" w:firstLine="0" w:left="0"/>
+              <w:spacing w:before="40" w:after="40" w:lineRule="auto" w:line="240"/>
             </w:pPr>
             <w:r>
               <w:t xml:space="preserve">XREF_SEC</w:t>
@@ -6279,8 +6279,8 @@
           <w:p>
             <w:pPr>
               <w:pStyle w:val="Compact"/>
-              <w:ind w:firstLine="0" w:right="0" w:left="0"/>
-              <w:spacing w:after="40" w:lineRule="auto" w:before="40" w:line="240"/>
+              <w:ind w:right="0" w:firstLine="0" w:left="0"/>
+              <w:spacing w:before="40" w:after="40" w:lineRule="auto" w:line="240"/>
             </w:pPr>
             <w:r>
               <w:rPr>
@@ -6295,8 +6295,8 @@
           <w:p>
             <w:pPr>
               <w:pStyle w:val="Compact"/>
-              <w:ind w:firstLine="0" w:right="0" w:left="0"/>
-              <w:spacing w:after="40" w:lineRule="auto" w:before="40" w:line="240"/>
+              <w:ind w:right="0" w:firstLine="0" w:left="0"/>
+              <w:spacing w:before="40" w:after="40" w:lineRule="auto" w:line="240"/>
             </w:pPr>
             <w:r>
               <w:t xml:space="preserve">—</w:t>
@@ -6308,8 +6308,8 @@
           <w:p>
             <w:pPr>
               <w:pStyle w:val="Compact"/>
-              <w:ind w:firstLine="0" w:right="0" w:left="0"/>
-              <w:spacing w:after="40" w:lineRule="auto" w:before="40" w:line="240"/>
+              <w:ind w:right="0" w:firstLine="0" w:left="0"/>
+              <w:spacing w:before="40" w:after="40" w:lineRule="auto" w:line="240"/>
             </w:pPr>
             <w:r>
               <w:t xml:space="preserve">—</w:t>
@@ -6321,8 +6321,8 @@
           <w:p>
             <w:pPr>
               <w:pStyle w:val="Compact"/>
-              <w:ind w:firstLine="0" w:right="0" w:left="0"/>
-              <w:spacing w:after="40" w:lineRule="auto" w:before="40" w:line="240"/>
+              <w:ind w:right="0" w:firstLine="0" w:left="0"/>
+              <w:spacing w:before="40" w:after="40" w:lineRule="auto" w:line="240"/>
             </w:pPr>
             <w:r>
               <w:rPr>
@@ -6338,8 +6338,8 @@
           <w:p>
             <w:pPr>
               <w:pStyle w:val="Compact"/>
-              <w:ind w:firstLine="0" w:right="0" w:left="0"/>
-              <w:spacing w:after="40" w:lineRule="auto" w:before="40" w:line="240"/>
+              <w:ind w:right="0" w:firstLine="0" w:left="0"/>
+              <w:spacing w:before="40" w:after="40" w:lineRule="auto" w:line="240"/>
             </w:pPr>
             <w:r>
               <w:t xml:space="preserve">eliminated</w:t>
@@ -6633,7 +6633,7 @@
     </w:p>
     <w:p>
       <w:pPr>
-        <w:spacing w:line="20" w:before="0" w:lineRule="exact" w:after="0"/>
+        <w:spacing w:after="0" w:line="20" w:before="0" w:lineRule="exact"/>
         <w:rPr>
           <w:sz w:val="2"/>
         </w:rPr>
@@ -8382,7 +8382,7 @@
     </w:p>
     <w:p>
       <w:pPr>
-        <w:spacing w:line="20" w:before="0" w:lineRule="exact" w:after="0"/>
+        <w:spacing w:after="0" w:line="20" w:before="0" w:lineRule="exact"/>
         <w:rPr>
           <w:sz w:val="2"/>
         </w:rPr>
@@ -8423,12 +8423,12 @@
         <w:tblW w:type="auto" w:w="0"/>
         <w:tblLook w:firstRow="1" w:lastRow="0" w:firstColumn="0" w:lastColumn="0" w:noHBand="0" w:noVBand="0" w:val="0020"/>
         <w:tblBorders>
-          <w:top w:space="0" w:val="single" w:color="000000" w:sz="6"/>
-          <w:left w:space="0" w:val="single" w:color="000000" w:sz="6"/>
-          <w:bottom w:space="0" w:val="single" w:color="000000" w:sz="6"/>
-          <w:right w:space="0" w:val="single" w:color="000000" w:sz="6"/>
-          <w:insideH w:space="0" w:val="single" w:color="000000" w:sz="6"/>
-          <w:insideV w:space="0" w:val="single" w:color="000000" w:sz="6"/>
+          <w:top w:color="000000" w:sz="6" w:val="single" w:space="0"/>
+          <w:left w:color="000000" w:sz="6" w:val="single" w:space="0"/>
+          <w:bottom w:color="000000" w:sz="6" w:val="single" w:space="0"/>
+          <w:right w:color="000000" w:sz="6" w:val="single" w:space="0"/>
+          <w:insideH w:color="000000" w:sz="6" w:val="single" w:space="0"/>
+          <w:insideV w:color="000000" w:sz="6" w:val="single" w:space="0"/>
         </w:tblBorders>
         <w:tblCellMar>
           <w:top w:w="57" w:type="dxa"/>
@@ -8448,13 +8448,13 @@
         </w:trPr>
         <w:tc>
           <w:tcPr>
-            <w:shd w:val="clear" w:color="auto" w:fill="E8E8E8"/>
+            <w:shd w:fill="E8E8E8" w:val="clear" w:color="auto"/>
           </w:tcPr>
           <w:p>
             <w:pPr>
               <w:pStyle w:val="Compact"/>
-              <w:ind w:firstLine="0" w:right="0" w:left="0"/>
-              <w:spacing w:after="40" w:lineRule="auto" w:before="40" w:line="240"/>
+              <w:ind w:right="0" w:firstLine="0" w:left="0"/>
+              <w:spacing w:before="40" w:after="40" w:lineRule="auto" w:line="240"/>
             </w:pPr>
             <w:r>
               <w:rPr>
@@ -8466,13 +8466,13 @@
         </w:tc>
         <w:tc>
           <w:tcPr>
-            <w:shd w:val="clear" w:color="auto" w:fill="E8E8E8"/>
+            <w:shd w:fill="E8E8E8" w:val="clear" w:color="auto"/>
           </w:tcPr>
           <w:p>
             <w:pPr>
               <w:pStyle w:val="Compact"/>
-              <w:ind w:firstLine="0" w:right="0" w:left="0"/>
-              <w:spacing w:after="40" w:lineRule="auto" w:before="40" w:line="240"/>
+              <w:ind w:right="0" w:firstLine="0" w:left="0"/>
+              <w:spacing w:before="40" w:after="40" w:lineRule="auto" w:line="240"/>
             </w:pPr>
             <w:r>
               <w:rPr>
@@ -8484,13 +8484,13 @@
         </w:tc>
         <w:tc>
           <w:tcPr>
-            <w:shd w:val="clear" w:color="auto" w:fill="E8E8E8"/>
+            <w:shd w:fill="E8E8E8" w:val="clear" w:color="auto"/>
           </w:tcPr>
           <w:p>
             <w:pPr>
               <w:pStyle w:val="Compact"/>
-              <w:ind w:firstLine="0" w:right="0" w:left="0"/>
-              <w:spacing w:after="40" w:lineRule="auto" w:before="40" w:line="240"/>
+              <w:ind w:right="0" w:firstLine="0" w:left="0"/>
+              <w:spacing w:before="40" w:after="40" w:lineRule="auto" w:line="240"/>
             </w:pPr>
             <w:r>
               <w:rPr>
@@ -8507,8 +8507,8 @@
           <w:p>
             <w:pPr>
               <w:pStyle w:val="Compact"/>
-              <w:ind w:firstLine="0" w:right="0" w:left="0"/>
-              <w:spacing w:after="40" w:lineRule="auto" w:before="40" w:line="240"/>
+              <w:ind w:right="0" w:firstLine="0" w:left="0"/>
+              <w:spacing w:before="40" w:after="40" w:lineRule="auto" w:line="240"/>
             </w:pPr>
             <w:r>
               <w:t xml:space="preserve">STRING</w:t>
@@ -8520,8 +8520,8 @@
           <w:p>
             <w:pPr>
               <w:pStyle w:val="Compact"/>
-              <w:ind w:firstLine="0" w:right="0" w:left="0"/>
-              <w:spacing w:after="40" w:lineRule="auto" w:before="40" w:line="240"/>
+              <w:ind w:right="0" w:firstLine="0" w:left="0"/>
+              <w:spacing w:before="40" w:after="40" w:lineRule="auto" w:line="240"/>
             </w:pPr>
             <w:r>
               <w:t xml:space="preserve">Plain text</w:t>
@@ -8533,8 +8533,8 @@
           <w:p>
             <w:pPr>
               <w:pStyle w:val="Compact"/>
-              <w:ind w:firstLine="0" w:right="0" w:left="0"/>
-              <w:spacing w:after="40" w:lineRule="auto" w:before="40" w:line="240"/>
+              <w:ind w:right="0" w:firstLine="0" w:left="0"/>
+              <w:spacing w:before="40" w:after="40" w:lineRule="auto" w:line="240"/>
             </w:pPr>
             <w:r>
               <w:t xml:space="preserve">Unformatted text value</w:t>
@@ -8548,8 +8548,8 @@
           <w:p>
             <w:pPr>
               <w:pStyle w:val="Compact"/>
-              <w:ind w:firstLine="0" w:right="0" w:left="0"/>
-              <w:spacing w:after="40" w:lineRule="auto" w:before="40" w:line="240"/>
+              <w:ind w:right="0" w:firstLine="0" w:left="0"/>
+              <w:spacing w:before="40" w:after="40" w:lineRule="auto" w:line="240"/>
             </w:pPr>
             <w:r>
               <w:t xml:space="preserve">INTEGER</w:t>
@@ -8561,8 +8561,8 @@
           <w:p>
             <w:pPr>
               <w:pStyle w:val="Compact"/>
-              <w:ind w:firstLine="0" w:right="0" w:left="0"/>
-              <w:spacing w:after="40" w:lineRule="auto" w:before="40" w:line="240"/>
+              <w:ind w:right="0" w:firstLine="0" w:left="0"/>
+              <w:spacing w:before="40" w:after="40" w:lineRule="auto" w:line="240"/>
             </w:pPr>
             <w:r>
               <w:t xml:space="preserve">Whole number</w:t>
@@ -8574,8 +8574,8 @@
           <w:p>
             <w:pPr>
               <w:pStyle w:val="Compact"/>
-              <w:ind w:firstLine="0" w:right="0" w:left="0"/>
-              <w:spacing w:after="40" w:lineRule="auto" w:before="40" w:line="240"/>
+              <w:ind w:right="0" w:firstLine="0" w:left="0"/>
+              <w:spacing w:before="40" w:after="40" w:lineRule="auto" w:line="240"/>
             </w:pPr>
             <w:r>
               <w:t xml:space="preserve">Numeric value (supports min/max bounds)</w:t>
@@ -8589,8 +8589,8 @@
           <w:p>
             <w:pPr>
               <w:pStyle w:val="Compact"/>
-              <w:ind w:firstLine="0" w:right="0" w:left="0"/>
-              <w:spacing w:after="40" w:lineRule="auto" w:before="40" w:line="240"/>
+              <w:ind w:right="0" w:firstLine="0" w:left="0"/>
+              <w:spacing w:before="40" w:after="40" w:lineRule="auto" w:line="240"/>
             </w:pPr>
             <w:r>
               <w:t xml:space="preserve">REAL</w:t>
@@ -8602,8 +8602,8 @@
           <w:p>
             <w:pPr>
               <w:pStyle w:val="Compact"/>
-              <w:ind w:firstLine="0" w:right="0" w:left="0"/>
-              <w:spacing w:after="40" w:lineRule="auto" w:before="40" w:line="240"/>
+              <w:ind w:right="0" w:firstLine="0" w:left="0"/>
+              <w:spacing w:before="40" w:after="40" w:lineRule="auto" w:line="240"/>
             </w:pPr>
             <w:r>
               <w:t xml:space="preserve">Decimal number</w:t>
@@ -8615,8 +8615,8 @@
           <w:p>
             <w:pPr>
               <w:pStyle w:val="Compact"/>
-              <w:ind w:firstLine="0" w:right="0" w:left="0"/>
-              <w:spacing w:after="40" w:lineRule="auto" w:before="40" w:line="240"/>
+              <w:ind w:right="0" w:firstLine="0" w:left="0"/>
+              <w:spacing w:before="40" w:after="40" w:lineRule="auto" w:line="240"/>
             </w:pPr>
             <w:r>
               <w:t xml:space="preserve">Floating-point value (supports min/max bounds)</w:t>
@@ -8630,8 +8630,8 @@
           <w:p>
             <w:pPr>
               <w:pStyle w:val="Compact"/>
-              <w:ind w:firstLine="0" w:right="0" w:left="0"/>
-              <w:spacing w:after="40" w:lineRule="auto" w:before="40" w:line="240"/>
+              <w:ind w:right="0" w:firstLine="0" w:left="0"/>
+              <w:spacing w:before="40" w:after="40" w:lineRule="auto" w:line="240"/>
             </w:pPr>
             <w:r>
               <w:t xml:space="preserve">BOOLEAN</w:t>
@@ -8643,8 +8643,8 @@
           <w:p>
             <w:pPr>
               <w:pStyle w:val="Compact"/>
-              <w:ind w:firstLine="0" w:right="0" w:left="0"/>
-              <w:spacing w:after="40" w:lineRule="auto" w:before="40" w:line="240"/>
+              <w:ind w:right="0" w:firstLine="0" w:left="0"/>
+              <w:spacing w:before="40" w:after="40" w:lineRule="auto" w:line="240"/>
             </w:pPr>
             <w:r>
               <w:t xml:space="preserve">true / false</w:t>
@@ -8656,8 +8656,8 @@
           <w:p>
             <w:pPr>
               <w:pStyle w:val="Compact"/>
-              <w:ind w:firstLine="0" w:right="0" w:left="0"/>
-              <w:spacing w:after="40" w:lineRule="auto" w:before="40" w:line="240"/>
+              <w:ind w:right="0" w:firstLine="0" w:left="0"/>
+              <w:spacing w:before="40" w:after="40" w:lineRule="auto" w:line="240"/>
             </w:pPr>
             <w:r>
               <w:t xml:space="preserve">Boolean flag</w:t>
@@ -8671,8 +8671,8 @@
           <w:p>
             <w:pPr>
               <w:pStyle w:val="Compact"/>
-              <w:ind w:firstLine="0" w:right="0" w:left="0"/>
-              <w:spacing w:after="40" w:lineRule="auto" w:before="40" w:line="240"/>
+              <w:ind w:right="0" w:firstLine="0" w:left="0"/>
+              <w:spacing w:before="40" w:after="40" w:lineRule="auto" w:line="240"/>
             </w:pPr>
             <w:r>
               <w:t xml:space="preserve">DATE</w:t>
@@ -8684,8 +8684,8 @@
           <w:p>
             <w:pPr>
               <w:pStyle w:val="Compact"/>
-              <w:ind w:firstLine="0" w:right="0" w:left="0"/>
-              <w:spacing w:after="40" w:lineRule="auto" w:before="40" w:line="240"/>
+              <w:ind w:right="0" w:firstLine="0" w:left="0"/>
+              <w:spacing w:before="40" w:after="40" w:lineRule="auto" w:line="240"/>
             </w:pPr>
             <w:r>
               <w:t xml:space="preserve">YYYY-MM-DD</w:t>
@@ -8697,8 +8697,8 @@
           <w:p>
             <w:pPr>
               <w:pStyle w:val="Compact"/>
-              <w:ind w:firstLine="0" w:right="0" w:left="0"/>
-              <w:spacing w:after="40" w:lineRule="auto" w:before="40" w:line="240"/>
+              <w:ind w:right="0" w:firstLine="0" w:left="0"/>
+              <w:spacing w:before="40" w:after="40" w:lineRule="auto" w:line="240"/>
             </w:pPr>
             <w:r>
               <w:t xml:space="preserve">ISO 8601 date</w:t>
@@ -8712,8 +8712,8 @@
           <w:p>
             <w:pPr>
               <w:pStyle w:val="Compact"/>
-              <w:ind w:firstLine="0" w:right="0" w:left="0"/>
-              <w:spacing w:after="40" w:lineRule="auto" w:before="40" w:line="240"/>
+              <w:ind w:right="0" w:firstLine="0" w:left="0"/>
+              <w:spacing w:before="40" w:after="40" w:lineRule="auto" w:line="240"/>
             </w:pPr>
             <w:r>
               <w:t xml:space="preserve">ENUM</w:t>
@@ -8725,8 +8725,8 @@
           <w:p>
             <w:pPr>
               <w:pStyle w:val="Compact"/>
-              <w:ind w:firstLine="0" w:right="0" w:left="0"/>
-              <w:spacing w:after="40" w:lineRule="auto" w:before="40" w:line="240"/>
+              <w:ind w:right="0" w:firstLine="0" w:left="0"/>
+              <w:spacing w:before="40" w:after="40" w:lineRule="auto" w:line="240"/>
             </w:pPr>
             <w:r>
               <w:t xml:space="preserve">Named value</w:t>
@@ -8738,8 +8738,8 @@
           <w:p>
             <w:pPr>
               <w:pStyle w:val="Compact"/>
-              <w:ind w:firstLine="0" w:right="0" w:left="0"/>
-              <w:spacing w:after="40" w:lineRule="auto" w:before="40" w:line="240"/>
+              <w:ind w:right="0" w:firstLine="0" w:left="0"/>
+              <w:spacing w:before="40" w:after="40" w:lineRule="auto" w:line="240"/>
             </w:pPr>
             <w:r>
               <w:t xml:space="preserve">One of a model-declared set of values</w:t>
@@ -8753,8 +8753,8 @@
           <w:p>
             <w:pPr>
               <w:pStyle w:val="Compact"/>
-              <w:ind w:firstLine="0" w:right="0" w:left="0"/>
-              <w:spacing w:after="40" w:lineRule="auto" w:before="40" w:line="240"/>
+              <w:ind w:right="0" w:firstLine="0" w:left="0"/>
+              <w:spacing w:before="40" w:after="40" w:lineRule="auto" w:line="240"/>
             </w:pPr>
             <w:r>
               <w:t xml:space="preserve">XHTML</w:t>
@@ -8766,8 +8766,8 @@
           <w:p>
             <w:pPr>
               <w:pStyle w:val="Compact"/>
-              <w:ind w:firstLine="0" w:right="0" w:left="0"/>
-              <w:spacing w:after="40" w:lineRule="auto" w:before="40" w:line="240"/>
+              <w:ind w:right="0" w:firstLine="0" w:left="0"/>
+              <w:spacing w:before="40" w:after="40" w:lineRule="auto" w:line="240"/>
             </w:pPr>
             <w:r>
               <w:t xml:space="preserve">Markdown text</w:t>
@@ -8779,8 +8779,8 @@
           <w:p>
             <w:pPr>
               <w:pStyle w:val="Compact"/>
-              <w:ind w:firstLine="0" w:right="0" w:left="0"/>
-              <w:spacing w:after="40" w:lineRule="auto" w:before="40" w:line="240"/>
+              <w:ind w:right="0" w:firstLine="0" w:left="0"/>
+              <w:spacing w:before="40" w:after="40" w:lineRule="auto" w:line="240"/>
             </w:pPr>
             <w:r>
               <w:t xml:space="preserve">Rich text preserving block and inline formatting</w:t>
@@ -9290,9 +9290,9 @@
     </w:p>
     <w:bookmarkEnd w:id="78"/>
     <w:sectPr>
-      <w:footerReference w:type="default" r:id="rId9200"/>
-      <w:headerReference w:type="default" r:id="rId9101"/>
-      <w:headerReference w:type="first" r:id="rId9100"/>
+      <w:footerReference r:id="rId9200" w:type="default"/>
+      <w:headerReference r:id="rId9101" w:type="default"/>
+      <w:headerReference r:id="rId9100" w:type="first"/>
       <w:footnotePr>
         <w:numRestart w:val="eachSect"/>
       </w:footnotePr>
@@ -9312,12 +9312,12 @@
     <w:tblPr>
       <w:tblW w:w="5000" w:type="pct"/>
       <w:tblBorders>
-        <w:top w:space="1" w:val="single" w:color="CCCCCC" w:sz="4"/>
-        <w:bottom w:space="0" w:val="none" w:color="auto" w:sz="0"/>
-        <w:left w:space="0" w:val="none" w:color="auto" w:sz="0"/>
-        <w:right w:space="0" w:val="none" w:color="auto" w:sz="0"/>
-        <w:insideH w:space="0" w:val="none" w:color="auto" w:sz="0"/>
-        <w:insideV w:space="0" w:val="none" w:color="auto" w:sz="0"/>
+        <w:top w:color="CCCCCC" w:sz="4" w:val="single" w:space="1"/>
+        <w:bottom w:color="auto" w:sz="0" w:val="none" w:space="0"/>
+        <w:left w:color="auto" w:sz="0" w:val="none" w:space="0"/>
+        <w:right w:color="auto" w:sz="0" w:val="none" w:space="0"/>
+        <w:insideH w:color="auto" w:sz="0" w:val="none" w:space="0"/>
+        <w:insideV w:color="auto" w:sz="0" w:val="none" w:space="0"/>
       </w:tblBorders>
       <w:tblLayout w:type="fixed"/>
     </w:tblPr>
@@ -10882,46 +10882,46 @@
     <w:basedOn w:val="VerbatimChar"/>
     <w:rPr/>
   </w:style>
-  <w:style w:styleId="VerbatimChar" w:type="character" w:customStyle="1">
+  <w:style w:customStyle="1" w:styleId="VerbatimChar" w:type="character">
     <w:name w:val="Verbatim Char"/>
     <w:rPr>
-      <w:rFonts w:ascii="Courier New" w:hAnsi="Courier New" w:cs="Courier New"/>
+      <w:rFonts w:hAnsi="Courier New" w:ascii="Courier New" w:cs="Courier New"/>
       <w:sz w:val="20"/>
       <w:szCs w:val="20"/>
     </w:rPr>
   </w:style>
-  <w:style w:styleId="SourceCode" w:type="paragraph" w:customStyle="1">
+  <w:style w:customStyle="1" w:styleId="SourceCode" w:type="paragraph">
     <w:name w:val="Source Code"/>
     <w:basedOn w:val="Normal"/>
     <w:pPr>
-      <w:spacing w:after="0" w:lineRule="auto" w:before="0" w:line="240"/>
+      <w:spacing w:before="0" w:after="0" w:lineRule="auto" w:line="240"/>
       <w:jc w:val="left"/>
       <w:pBdr>
-        <w:top w:space="1" w:val="single" w:color="CCCCCC" w:sz="4"/>
-        <w:bottom w:space="1" w:val="single" w:color="CCCCCC" w:sz="4"/>
-        <w:left w:space="1" w:val="single" w:color="CCCCCC" w:sz="4"/>
-        <w:right w:space="1" w:val="single" w:color="CCCCCC" w:sz="4"/>
+        <w:top w:color="CCCCCC" w:sz="4" w:val="single" w:space="1"/>
+        <w:bottom w:color="CCCCCC" w:sz="4" w:val="single" w:space="1"/>
+        <w:left w:color="CCCCCC" w:sz="4" w:val="single" w:space="1"/>
+        <w:right w:color="CCCCCC" w:sz="4" w:val="single" w:space="1"/>
       </w:pBdr>
-      <w:shd w:val="clear" w:color="auto" w:fill="F5F5F5"/>
+      <w:shd w:fill="F5F5F5" w:val="clear" w:color="auto"/>
     </w:pPr>
     <w:rPr>
-      <w:rFonts w:ascii="Courier New" w:hAnsi="Courier New" w:cs="Courier New"/>
+      <w:rFonts w:hAnsi="Courier New" w:ascii="Courier New" w:cs="Courier New"/>
       <w:sz w:val="20"/>
       <w:szCs w:val="20"/>
     </w:rPr>
   </w:style>
-  <w:style w:customStyle="1" w:type="paragraph" w:styleId="SpecObjectHeader">
+  <w:style w:customStyle="1" w:styleId="SpecObjectHeader" w:type="paragraph">
     <w:name w:val="Spec Object Header"/>
     <w:basedOn w:val="Normal"/>
     <w:next w:val="FirstParagraph"/>
     <w:qFormat/>
     <w:pPr>
       <w:keepNext/>
-      <w:spacing w:after="120" w:lineRule="auto" w:before="280" w:line="276"/>
+      <w:spacing w:before="280" w:after="120" w:lineRule="auto" w:line="276"/>
       <w:outlineLvl w:val="0"/>
     </w:pPr>
     <w:rPr>
-      <w:rFonts w:ascii="Calibri Light" w:hAnsi="Calibri Light" w:cs="Calibri Light"/>
+      <w:rFonts w:hAnsi="Calibri Light" w:ascii="Calibri Light" w:cs="Calibri Light"/>
       <w:b/>
       <w:bCs/>
       <w:color w:val="0F4C64"/>

</xml_diff>

<commit_message>
Deploy documentation from v0.2
</commit_message>
<xml_diff>
--- a/commonspec/downloads/commonspec.docx
+++ b/commonspec/downloads/commonspec.docx
@@ -626,7 +626,7 @@
     </w:p>
     <w:bookmarkEnd w:id="12"/>
     <w:bookmarkEnd w:id="13"/>
-    <w:bookmarkStart w:id="67" w:name="language-constructs"/>
+    <w:bookmarkStart w:id="68" w:name="language-constructs"/>
     <w:p>
       <w:pPr>
         <w:pStyle w:val="Heading1"/>
@@ -1697,7 +1697,7 @@
     </w:p>
     <w:p>
       <w:pPr>
-        <w:spacing w:after="0" w:line="20" w:before="0" w:lineRule="exact"/>
+        <w:spacing w:line="20" w:lineRule="exact" w:before="0" w:after="0"/>
         <w:rPr>
           <w:sz w:val="2"/>
         </w:rPr>
@@ -1858,7 +1858,7 @@
     </w:p>
     <w:bookmarkEnd w:id="20"/>
     <w:bookmarkEnd w:id="21"/>
-    <w:bookmarkStart w:id="30" w:name="spec-object"/>
+    <w:bookmarkStart w:id="31" w:name="spec-object"/>
     <w:p>
       <w:pPr>
         <w:pStyle w:val="Heading2"/>
@@ -2408,7 +2408,7 @@
     </w:p>
     <w:p>
       <w:pPr>
-        <w:spacing w:after="0" w:line="20" w:before="0" w:lineRule="exact"/>
+        <w:spacing w:line="20" w:lineRule="exact" w:before="0" w:after="0"/>
         <w:rPr>
           <w:sz w:val="2"/>
         </w:rPr>
@@ -2816,8 +2816,264 @@
       </w:r>
     </w:p>
     <w:bookmarkEnd w:id="29"/>
+    <w:bookmarkStart w:id="30" w:name="scope-and-section-close"/>
+    <w:p>
+      <w:pPr>
+        <w:pStyle w:val="Heading3"/>
+        <w:numPr>
+          <w:ilvl w:val="2"/>
+          <w:numId w:val="100"/>
+        </w:numPr>
+      </w:pPr>
+      <w:r>
+        <w:t xml:space="preserve">Scope and Section Close</w:t>
+      </w:r>
+    </w:p>
+    <w:p>
+      <w:pPr>
+        <w:pStyle w:val="FirstParagraph"/>
+      </w:pPr>
+      <w:r>
+        <w:t xml:space="preserve">A spec object’s</w:t>
+      </w:r>
+      <w:r>
+        <w:t xml:space="preserve"> </w:t>
+      </w:r>
+      <w:r>
+        <w:rPr>
+          <w:b/>
+          <w:bCs/>
+        </w:rPr>
+        <w:t xml:space="preserve">scope</w:t>
+      </w:r>
+      <w:r>
+        <w:t xml:space="preserve"> </w:t>
+      </w:r>
+      <w:r>
+        <w:t xml:space="preserve">— the body content and floats it contains — runs from its header until the section is closed. A section closes in one of two ways:</w:t>
+      </w:r>
+    </w:p>
+    <w:p>
+      <w:pPr>
+        <w:pStyle w:val="Compact"/>
+        <w:numPr>
+          <w:ilvl w:val="0"/>
+          <w:numId w:val="1006"/>
+        </w:numPr>
+      </w:pPr>
+      <w:r>
+        <w:rPr>
+          <w:b/>
+          <w:bCs/>
+        </w:rPr>
+        <w:t xml:space="preserve">Automatically</w:t>
+      </w:r>
+      <w:r>
+        <w:t xml:space="preserve">, at the next header of equal or shallower level (the usual case). A child object must be exactly one heading level deeper than its parent; skipping a level (for example</w:t>
+      </w:r>
+      <w:r>
+        <w:t xml:space="preserve"> </w:t>
+      </w:r>
+      <w:r>
+        <w:rPr>
+          <w:rStyle w:val="VerbatimChar"/>
+        </w:rPr>
+        <w:t xml:space="preserve">##</w:t>
+      </w:r>
+      <w:r>
+        <w:t xml:space="preserve"> </w:t>
+      </w:r>
+      <w:r>
+        <w:t xml:space="preserve">directly to</w:t>
+      </w:r>
+      <w:r>
+        <w:t xml:space="preserve"> </w:t>
+      </w:r>
+      <w:r>
+        <w:rPr>
+          <w:rStyle w:val="VerbatimChar"/>
+        </w:rPr>
+        <w:t xml:space="preserve">####</w:t>
+      </w:r>
+      <w:r>
+        <w:t xml:space="preserve">) is rejected as a broken hierarchy.</w:t>
+      </w:r>
+    </w:p>
+    <w:p>
+      <w:pPr>
+        <w:pStyle w:val="Compact"/>
+        <w:numPr>
+          <w:ilvl w:val="0"/>
+          <w:numId w:val="1006"/>
+        </w:numPr>
+      </w:pPr>
+      <w:r>
+        <w:rPr>
+          <w:b/>
+          <w:bCs/>
+        </w:rPr>
+        <w:t xml:space="preserve">Manually</w:t>
+      </w:r>
+      <w:r>
+        <w:t xml:space="preserve">, at a</w:t>
+      </w:r>
+      <w:r>
+        <w:t xml:space="preserve"> </w:t>
+      </w:r>
+      <w:r>
+        <w:rPr>
+          <w:rStyle w:val="VerbatimChar"/>
+        </w:rPr>
+        <w:t xml:space="preserve">----</w:t>
+      </w:r>
+      <w:r>
+        <w:t xml:space="preserve"> </w:t>
+      </w:r>
+      <w:r>
+        <w:t xml:space="preserve">thematic break. The marker closes the current section so that following content belongs to the parent scope, and it is</w:t>
+      </w:r>
+      <w:r>
+        <w:t xml:space="preserve"> </w:t>
+      </w:r>
+      <w:r>
+        <w:rPr>
+          <w:b/>
+          <w:bCs/>
+        </w:rPr>
+        <w:t xml:space="preserve">consumed</w:t>
+      </w:r>
+      <w:r>
+        <w:t xml:space="preserve"> </w:t>
+      </w:r>
+      <w:r>
+        <w:t xml:space="preserve">— it produces no horizontal rule in the output.</w:t>
+      </w:r>
+    </w:p>
+    <w:p>
+      <w:pPr>
+        <w:pStyle w:val="FirstParagraph"/>
+      </w:pPr>
+      <w:r>
+        <w:t xml:space="preserve">A</w:t>
+      </w:r>
+      <w:r>
+        <w:t xml:space="preserve"> </w:t>
+      </w:r>
+      <w:r>
+        <w:rPr>
+          <w:rStyle w:val="VerbatimChar"/>
+        </w:rPr>
+        <w:t xml:space="preserve">----</w:t>
+      </w:r>
+      <w:r>
+        <w:t xml:space="preserve"> </w:t>
+      </w:r>
+      <w:r>
+        <w:t xml:space="preserve">is the correct way to end a section without opening a new heading. It replaces the anti-pattern of an empty</w:t>
+      </w:r>
+      <w:r>
+        <w:t xml:space="preserve"> </w:t>
+      </w:r>
+      <w:r>
+        <w:rPr>
+          <w:rStyle w:val="VerbatimChar"/>
+        </w:rPr>
+        <w:t xml:space="preserve">##</w:t>
+      </w:r>
+      <w:r>
+        <w:t xml:space="preserve"> </w:t>
+      </w:r>
+      <w:r>
+        <w:t xml:space="preserve">used as a</w:t>
+      </w:r>
+      <w:r>
+        <w:t xml:space="preserve"> </w:t>
+      </w:r>
+      <w:r>
+        <w:t xml:space="preserve">“section reset”</w:t>
+      </w:r>
+      <w:r>
+        <w:t xml:space="preserve">: an</w:t>
+      </w:r>
+      <w:r>
+        <w:t xml:space="preserve"> </w:t>
+      </w:r>
+      <w:r>
+        <w:rPr>
+          <w:b/>
+          <w:bCs/>
+        </w:rPr>
+        <w:t xml:space="preserve">empty heading</w:t>
+      </w:r>
+      <w:r>
+        <w:t xml:space="preserve"> </w:t>
+      </w:r>
+      <w:r>
+        <w:t xml:space="preserve">(a header with no title) is rejected, because it would render as a blank numbered heading and corrupt downstream numbering.</w:t>
+      </w:r>
+    </w:p>
+    <w:p>
+      <w:pPr>
+        <w:pStyle w:val="SourceCode"/>
+      </w:pPr>
+      <w:r>
+        <w:rPr>
+          <w:rStyle w:val="VerbatimChar"/>
+        </w:rPr>
+        <w:t xml:space="preserve">## Pesquisa-Ação @SEC-PA</w:t>
+      </w:r>
+      <w:r>
+        <w:br/>
+      </w:r>
+      <w:r>
+        <w:br/>
+      </w:r>
+      <w:r>
+        <w:rPr>
+          <w:rStyle w:val="VerbatimChar"/>
+        </w:rPr>
+        <w:t xml:space="preserve">### Considerações Iniciais</w:t>
+      </w:r>
+      <w:r>
+        <w:br/>
+      </w:r>
+      <w:r>
+        <w:br/>
+      </w:r>
+      <w:r>
+        <w:rPr>
+          <w:rStyle w:val="VerbatimChar"/>
+        </w:rPr>
+        <w:t xml:space="preserve">Intro body that belongs to "Considerações Iniciais".</w:t>
+      </w:r>
+      <w:r>
+        <w:br/>
+      </w:r>
+      <w:r>
+        <w:br/>
+      </w:r>
+      <w:r>
+        <w:rPr>
+          <w:rStyle w:val="VerbatimChar"/>
+        </w:rPr>
+        <w:t xml:space="preserve">----</w:t>
+      </w:r>
+      <w:r>
+        <w:br/>
+      </w:r>
+      <w:r>
+        <w:br/>
+      </w:r>
+      <w:r>
+        <w:rPr>
+          <w:rStyle w:val="VerbatimChar"/>
+        </w:rPr>
+        <w:t xml:space="preserve">This trailing paragraph belongs to the chapter, not to the section above.</w:t>
+      </w:r>
+    </w:p>
     <w:bookmarkEnd w:id="30"/>
-    <w:bookmarkStart w:id="38" w:name="spec-float"/>
+    <w:bookmarkEnd w:id="31"/>
+    <w:bookmarkStart w:id="39" w:name="spec-float"/>
     <w:p>
       <w:pPr>
         <w:pStyle w:val="Heading2"/>
@@ -2869,7 +3125,7 @@
         <w:t xml:space="preserve">info string. They are automatically numbered within their counter group and can be cross-referenced by label.</w:t>
       </w:r>
     </w:p>
-    <w:bookmarkStart w:id="31" w:name="formal-definition-2"/>
+    <w:bookmarkStart w:id="32" w:name="formal-definition-2"/>
     <w:p>
       <w:pPr>
         <w:pStyle w:val="Heading3"/>
@@ -2967,7 +3223,7 @@
         <w:pStyle w:val="Compact"/>
         <w:numPr>
           <w:ilvl w:val="0"/>
-          <w:numId w:val="1006"/>
+          <w:numId w:val="1007"/>
         </w:numPr>
       </w:pPr>
       <m:oMath>
@@ -3020,7 +3276,7 @@
         <w:pStyle w:val="Compact"/>
         <w:numPr>
           <w:ilvl w:val="0"/>
-          <w:numId w:val="1006"/>
+          <w:numId w:val="1007"/>
         </w:numPr>
       </w:pPr>
       <m:oMath>
@@ -3069,7 +3325,7 @@
         <w:pStyle w:val="Compact"/>
         <w:numPr>
           <w:ilvl w:val="0"/>
-          <w:numId w:val="1006"/>
+          <w:numId w:val="1007"/>
         </w:numPr>
       </w:pPr>
       <m:oMath>
@@ -3106,7 +3362,7 @@
         <w:pStyle w:val="Compact"/>
         <w:numPr>
           <w:ilvl w:val="0"/>
-          <w:numId w:val="1006"/>
+          <w:numId w:val="1007"/>
         </w:numPr>
       </w:pPr>
       <m:oMath>
@@ -3125,8 +3381,8 @@
         <w:t xml:space="preserve">is the raw payload of the fenced code block.</w:t>
       </w:r>
     </w:p>
-    <w:bookmarkEnd w:id="31"/>
-    <w:bookmarkStart w:id="35" w:name="grammar-2"/>
+    <w:bookmarkEnd w:id="32"/>
+    <w:bookmarkStart w:id="36" w:name="grammar-2"/>
     <w:p>
       <w:pPr>
         <w:pStyle w:val="Heading3"/>
@@ -3141,7 +3397,7 @@
     </w:p>
     <w:p>
       <w:pPr>
-        <w:spacing w:after="0" w:line="20" w:before="0" w:lineRule="exact"/>
+        <w:spacing w:line="20" w:lineRule="exact" w:before="0" w:after="0"/>
         <w:rPr>
           <w:sz w:val="2"/>
         </w:rPr>
@@ -3186,18 +3442,18 @@
           <wp:inline>
             <wp:extent cx="5334000" cy="858746"/>
             <wp:effectExtent b="0" l="0" r="0" t="0"/>
-            <wp:docPr descr="" title="" id="33" name="Picture"/>
+            <wp:docPr descr="" title="" id="34" name="Picture"/>
             <a:graphic>
               <a:graphicData uri="http://schemas.openxmlformats.org/drawingml/2006/picture">
                 <pic:pic>
                   <pic:nvPicPr>
-                    <pic:cNvPr descr="diagrams/cbabee19ae66429ec6eda82dec8ea5357efaceb9.png" id="34" name="Picture"/>
+                    <pic:cNvPr descr="diagrams/cbabee19ae66429ec6eda82dec8ea5357efaceb9.png" id="35" name="Picture"/>
                     <pic:cNvPicPr>
                       <a:picLocks noChangeArrowheads="1" noChangeAspect="1"/>
                     </pic:cNvPicPr>
                   </pic:nvPicPr>
                   <pic:blipFill>
-                    <a:blip r:embed="rId32"/>
+                    <a:blip r:embed="rId33"/>
                     <a:stretch>
                       <a:fillRect/>
                     </a:stretch>
@@ -3224,8 +3480,8 @@
         </w:drawing>
       </w:r>
     </w:p>
-    <w:bookmarkEnd w:id="35"/>
-    <w:bookmarkStart w:id="36" w:name="float-types-and-aliases"/>
+    <w:bookmarkEnd w:id="36"/>
+    <w:bookmarkStart w:id="37" w:name="float-types-and-aliases"/>
     <w:p>
       <w:pPr>
         <w:pStyle w:val="Heading3"/>
@@ -3251,7 +3507,7 @@
         <w:pStyle w:val="Compact"/>
         <w:numPr>
           <w:ilvl w:val="0"/>
-          <w:numId w:val="1007"/>
+          <w:numId w:val="1008"/>
         </w:numPr>
       </w:pPr>
       <w:r>
@@ -3285,7 +3541,7 @@
         <w:pStyle w:val="Compact"/>
         <w:numPr>
           <w:ilvl w:val="0"/>
-          <w:numId w:val="1007"/>
+          <w:numId w:val="1008"/>
         </w:numPr>
       </w:pPr>
       <w:r>
@@ -3343,7 +3599,7 @@
         <w:pStyle w:val="Compact"/>
         <w:numPr>
           <w:ilvl w:val="0"/>
-          <w:numId w:val="1007"/>
+          <w:numId w:val="1008"/>
         </w:numPr>
       </w:pPr>
       <w:r>
@@ -3389,7 +3645,7 @@
         <w:pStyle w:val="Compact"/>
         <w:numPr>
           <w:ilvl w:val="0"/>
-          <w:numId w:val="1007"/>
+          <w:numId w:val="1008"/>
         </w:numPr>
       </w:pPr>
       <w:r>
@@ -3423,7 +3679,7 @@
         <w:pStyle w:val="Compact"/>
         <w:numPr>
           <w:ilvl w:val="0"/>
-          <w:numId w:val="1007"/>
+          <w:numId w:val="1008"/>
         </w:numPr>
       </w:pPr>
       <w:r>
@@ -3469,7 +3725,7 @@
         <w:pStyle w:val="Compact"/>
         <w:numPr>
           <w:ilvl w:val="0"/>
-          <w:numId w:val="1007"/>
+          <w:numId w:val="1008"/>
         </w:numPr>
       </w:pPr>
       <w:r>
@@ -3503,7 +3759,7 @@
         <w:pStyle w:val="Compact"/>
         <w:numPr>
           <w:ilvl w:val="0"/>
-          <w:numId w:val="1007"/>
+          <w:numId w:val="1008"/>
         </w:numPr>
       </w:pPr>
       <w:r>
@@ -3555,8 +3811,8 @@
         <w:t xml:space="preserve">share a numbering sequence. For example, FIGURE, PLANTUML, CHART, and DIAGRAM may all share counter group FIGURE, producing Figure 1, Figure 2, Figure 3 regardless of specific type.</w:t>
       </w:r>
     </w:p>
-    <w:bookmarkEnd w:id="36"/>
-    <w:bookmarkStart w:id="37" w:name="examples-2"/>
+    <w:bookmarkEnd w:id="37"/>
+    <w:bookmarkStart w:id="38" w:name="examples-2"/>
     <w:p>
       <w:pPr>
         <w:pStyle w:val="Heading3"/>
@@ -3743,9 +3999,9 @@
         <w:t xml:space="preserve">```</w:t>
       </w:r>
     </w:p>
-    <w:bookmarkEnd w:id="37"/>
     <w:bookmarkEnd w:id="38"/>
-    <w:bookmarkStart w:id="48" w:name="attribute"/>
+    <w:bookmarkEnd w:id="39"/>
+    <w:bookmarkStart w:id="49" w:name="attribute"/>
     <w:p>
       <w:pPr>
         <w:pStyle w:val="Heading2"/>
@@ -3782,7 +4038,7 @@
         <w:t xml:space="preserve">stores metadata for specifications and spec objects using an Entity-Attribute-Value (EAV) pattern. Attributes are declared in blockquotes following headers and support seven datatypes.</w:t>
       </w:r>
     </w:p>
-    <w:bookmarkStart w:id="39" w:name="formal-definition-3"/>
+    <w:bookmarkStart w:id="40" w:name="formal-definition-3"/>
     <w:p>
       <w:pPr>
         <w:pStyle w:val="Heading3"/>
@@ -3863,7 +4119,7 @@
         <w:pStyle w:val="Compact"/>
         <w:numPr>
           <w:ilvl w:val="0"/>
-          <w:numId w:val="1008"/>
+          <w:numId w:val="1009"/>
         </w:numPr>
       </w:pPr>
       <m:oMath>
@@ -3943,7 +4199,7 @@
         <w:pStyle w:val="Compact"/>
         <w:numPr>
           <w:ilvl w:val="0"/>
-          <w:numId w:val="1008"/>
+          <w:numId w:val="1009"/>
         </w:numPr>
       </w:pPr>
       <m:oMath>
@@ -3963,7 +4219,7 @@
         <w:pStyle w:val="Compact"/>
         <w:numPr>
           <w:ilvl w:val="0"/>
-          <w:numId w:val="1008"/>
+          <w:numId w:val="1009"/>
         </w:numPr>
       </w:pPr>
       <m:oMath>
@@ -4006,8 +4262,8 @@
         <w:t xml:space="preserve">.</w:t>
       </w:r>
     </w:p>
-    <w:bookmarkEnd w:id="39"/>
-    <w:bookmarkStart w:id="43" w:name="grammar-3"/>
+    <w:bookmarkEnd w:id="40"/>
+    <w:bookmarkStart w:id="44" w:name="grammar-3"/>
     <w:p>
       <w:pPr>
         <w:pStyle w:val="Heading3"/>
@@ -4022,7 +4278,7 @@
     </w:p>
     <w:p>
       <w:pPr>
-        <w:spacing w:after="0" w:line="20" w:before="0" w:lineRule="exact"/>
+        <w:spacing w:line="20" w:lineRule="exact" w:before="0" w:after="0"/>
         <w:rPr>
           <w:sz w:val="2"/>
         </w:rPr>
@@ -4067,18 +4323,18 @@
           <wp:inline>
             <wp:extent cx="5334000" cy="1538491"/>
             <wp:effectExtent b="0" l="0" r="0" t="0"/>
-            <wp:docPr descr="" title="" id="41" name="Picture"/>
+            <wp:docPr descr="" title="" id="42" name="Picture"/>
             <a:graphic>
               <a:graphicData uri="http://schemas.openxmlformats.org/drawingml/2006/picture">
                 <pic:pic>
                   <pic:nvPicPr>
-                    <pic:cNvPr descr="diagrams/a87faeacf04f59cdc7bd06bbdac3768412b277cd.png" id="42" name="Picture"/>
+                    <pic:cNvPr descr="diagrams/a87faeacf04f59cdc7bd06bbdac3768412b277cd.png" id="43" name="Picture"/>
                     <pic:cNvPicPr>
                       <a:picLocks noChangeArrowheads="1" noChangeAspect="1"/>
                     </pic:cNvPicPr>
                   </pic:nvPicPr>
                   <pic:blipFill>
-                    <a:blip r:embed="rId40"/>
+                    <a:blip r:embed="rId41"/>
                     <a:stretch>
                       <a:fillRect/>
                     </a:stretch>
@@ -4143,8 +4399,8 @@
         <w:t xml:space="preserve">lines within the same blockquote.</w:t>
       </w:r>
     </w:p>
-    <w:bookmarkEnd w:id="43"/>
-    <w:bookmarkStart w:id="44" w:name="datatypes"/>
+    <w:bookmarkEnd w:id="44"/>
+    <w:bookmarkStart w:id="45" w:name="datatypes"/>
     <w:p>
       <w:pPr>
         <w:pStyle w:val="Heading3"/>
@@ -4170,7 +4426,7 @@
         <w:pStyle w:val="Compact"/>
         <w:numPr>
           <w:ilvl w:val="0"/>
-          <w:numId w:val="1009"/>
+          <w:numId w:val="1010"/>
         </w:numPr>
       </w:pPr>
       <w:r>
@@ -4192,7 +4448,7 @@
         <w:pStyle w:val="Compact"/>
         <w:numPr>
           <w:ilvl w:val="0"/>
-          <w:numId w:val="1009"/>
+          <w:numId w:val="1010"/>
         </w:numPr>
       </w:pPr>
       <w:r>
@@ -4238,7 +4494,7 @@
         <w:pStyle w:val="Compact"/>
         <w:numPr>
           <w:ilvl w:val="0"/>
-          <w:numId w:val="1009"/>
+          <w:numId w:val="1010"/>
         </w:numPr>
       </w:pPr>
       <w:r>
@@ -4284,7 +4540,7 @@
         <w:pStyle w:val="Compact"/>
         <w:numPr>
           <w:ilvl w:val="0"/>
-          <w:numId w:val="1009"/>
+          <w:numId w:val="1010"/>
         </w:numPr>
       </w:pPr>
       <w:r>
@@ -4333,7 +4589,7 @@
         <w:pStyle w:val="Compact"/>
         <w:numPr>
           <w:ilvl w:val="0"/>
-          <w:numId w:val="1009"/>
+          <w:numId w:val="1010"/>
         </w:numPr>
       </w:pPr>
       <w:r>
@@ -4364,7 +4620,7 @@
         <w:pStyle w:val="Compact"/>
         <w:numPr>
           <w:ilvl w:val="0"/>
-          <w:numId w:val="1009"/>
+          <w:numId w:val="1010"/>
         </w:numPr>
       </w:pPr>
       <w:r>
@@ -4386,7 +4642,7 @@
         <w:pStyle w:val="Compact"/>
         <w:numPr>
           <w:ilvl w:val="0"/>
-          <w:numId w:val="1009"/>
+          <w:numId w:val="1010"/>
         </w:numPr>
       </w:pPr>
       <w:r>
@@ -4403,8 +4659,8 @@
         <w:t xml:space="preserve">— rich text. Supports full Markdown formatting including links, bold, italic, and lists.</w:t>
       </w:r>
     </w:p>
-    <w:bookmarkEnd w:id="44"/>
-    <w:bookmarkStart w:id="45" w:name="attribute-constraints"/>
+    <w:bookmarkEnd w:id="45"/>
+    <w:bookmarkStart w:id="46" w:name="attribute-constraints"/>
     <w:p>
       <w:pPr>
         <w:pStyle w:val="Heading3"/>
@@ -4430,7 +4686,7 @@
         <w:pStyle w:val="Compact"/>
         <w:numPr>
           <w:ilvl w:val="0"/>
-          <w:numId w:val="1010"/>
+          <w:numId w:val="1011"/>
         </w:numPr>
       </w:pPr>
       <w:r>
@@ -4451,7 +4707,7 @@
         <w:pStyle w:val="Compact"/>
         <w:numPr>
           <w:ilvl w:val="0"/>
-          <w:numId w:val="1010"/>
+          <w:numId w:val="1011"/>
         </w:numPr>
       </w:pPr>
       <w:r>
@@ -4472,7 +4728,7 @@
         <w:pStyle w:val="Compact"/>
         <w:numPr>
           <w:ilvl w:val="0"/>
-          <w:numId w:val="1010"/>
+          <w:numId w:val="1011"/>
         </w:numPr>
       </w:pPr>
       <w:r>
@@ -4505,8 +4761,8 @@
         <w:t xml:space="preserve">These constraints are enforced by the type system during verification.</w:t>
       </w:r>
     </w:p>
-    <w:bookmarkEnd w:id="45"/>
-    <w:bookmarkStart w:id="46" w:name="multi-value-attributes"/>
+    <w:bookmarkEnd w:id="46"/>
+    <w:bookmarkStart w:id="47" w:name="multi-value-attributes"/>
     <w:p>
       <w:pPr>
         <w:pStyle w:val="Heading3"/>
@@ -4562,8 +4818,8 @@
         <w:t xml:space="preserve">&gt; applicable_standard: DO-254</w:t>
       </w:r>
     </w:p>
-    <w:bookmarkEnd w:id="46"/>
-    <w:bookmarkStart w:id="47" w:name="examples-3"/>
+    <w:bookmarkEnd w:id="47"/>
+    <w:bookmarkStart w:id="48" w:name="examples-3"/>
     <w:p>
       <w:pPr>
         <w:pStyle w:val="Heading3"/>
@@ -4675,9 +4931,9 @@
         <w:t xml:space="preserve">&gt; traceability: [HLR-001](@) [HLR-002](@)</w:t>
       </w:r>
     </w:p>
-    <w:bookmarkEnd w:id="47"/>
     <w:bookmarkEnd w:id="48"/>
-    <w:bookmarkStart w:id="57" w:name="spec-relation"/>
+    <w:bookmarkEnd w:id="49"/>
+    <w:bookmarkStart w:id="58" w:name="spec-relation"/>
     <w:p>
       <w:pPr>
         <w:pStyle w:val="Heading2"/>
@@ -4730,7 +4986,7 @@
         <w:t xml:space="preserve">that drives type inference. The relation type is not authored explicitly — it is inferred from the selector, the source context, and the resolved target.</w:t>
       </w:r>
     </w:p>
-    <w:bookmarkStart w:id="49" w:name="formal-definition-4"/>
+    <w:bookmarkStart w:id="50" w:name="formal-definition-4"/>
     <w:p>
       <w:pPr>
         <w:pStyle w:val="Heading3"/>
@@ -4818,7 +5074,7 @@
         <w:pStyle w:val="Compact"/>
         <w:numPr>
           <w:ilvl w:val="0"/>
-          <w:numId w:val="1011"/>
+          <w:numId w:val="1012"/>
         </w:numPr>
       </w:pPr>
       <m:oMath>
@@ -4851,7 +5107,7 @@
         <w:pStyle w:val="Compact"/>
         <w:numPr>
           <w:ilvl w:val="0"/>
-          <w:numId w:val="1011"/>
+          <w:numId w:val="1012"/>
         </w:numPr>
       </w:pPr>
       <m:oMath>
@@ -4907,7 +5163,7 @@
         <w:pStyle w:val="Compact"/>
         <w:numPr>
           <w:ilvl w:val="0"/>
-          <w:numId w:val="1011"/>
+          <w:numId w:val="1012"/>
         </w:numPr>
       </w:pPr>
       <m:oMath>
@@ -4940,7 +5196,7 @@
         <w:pStyle w:val="Compact"/>
         <w:numPr>
           <w:ilvl w:val="0"/>
-          <w:numId w:val="1011"/>
+          <w:numId w:val="1012"/>
         </w:numPr>
       </w:pPr>
       <m:oMath>
@@ -5157,8 +5413,8 @@
         <w:t xml:space="preserve">.</w:t>
       </w:r>
     </w:p>
-    <w:bookmarkEnd w:id="49"/>
-    <w:bookmarkStart w:id="53" w:name="grammar-4"/>
+    <w:bookmarkEnd w:id="50"/>
+    <w:bookmarkStart w:id="54" w:name="grammar-4"/>
     <w:p>
       <w:pPr>
         <w:pStyle w:val="Heading3"/>
@@ -5173,7 +5429,7 @@
     </w:p>
     <w:p>
       <w:pPr>
-        <w:spacing w:after="0" w:line="20" w:before="0" w:lineRule="exact"/>
+        <w:spacing w:line="20" w:lineRule="exact" w:before="0" w:after="0"/>
         <w:rPr>
           <w:sz w:val="2"/>
         </w:rPr>
@@ -5218,18 +5474,18 @@
           <wp:inline>
             <wp:extent cx="4851400" cy="1689100"/>
             <wp:effectExtent b="0" l="0" r="0" t="0"/>
-            <wp:docPr descr="" title="" id="51" name="Picture"/>
+            <wp:docPr descr="" title="" id="52" name="Picture"/>
             <a:graphic>
               <a:graphicData uri="http://schemas.openxmlformats.org/drawingml/2006/picture">
                 <pic:pic>
                   <pic:nvPicPr>
-                    <pic:cNvPr descr="diagrams/e81fdc30ba9988a4c689ff034107d1c6b1b73337.png" id="52" name="Picture"/>
+                    <pic:cNvPr descr="diagrams/e81fdc30ba9988a4c689ff034107d1c6b1b73337.png" id="53" name="Picture"/>
                     <pic:cNvPicPr>
                       <a:picLocks noChangeArrowheads="1" noChangeAspect="1"/>
                     </pic:cNvPicPr>
                   </pic:nvPicPr>
                   <pic:blipFill>
-                    <a:blip r:embed="rId50"/>
+                    <a:blip r:embed="rId51"/>
                     <a:stretch>
                       <a:fillRect/>
                     </a:stretch>
@@ -5256,8 +5512,8 @@
         </w:drawing>
       </w:r>
     </w:p>
-    <w:bookmarkEnd w:id="53"/>
-    <w:bookmarkStart w:id="54" w:name="link-selectors"/>
+    <w:bookmarkEnd w:id="54"/>
+    <w:bookmarkStart w:id="55" w:name="link-selectors"/>
     <w:p>
       <w:pPr>
         <w:pStyle w:val="Heading3"/>
@@ -5349,7 +5605,7 @@
         <w:pStyle w:val="Compact"/>
         <w:numPr>
           <w:ilvl w:val="0"/>
-          <w:numId w:val="1012"/>
+          <w:numId w:val="1013"/>
         </w:numPr>
       </w:pPr>
       <w:r>
@@ -5396,7 +5652,7 @@
         <w:pStyle w:val="Compact"/>
         <w:numPr>
           <w:ilvl w:val="0"/>
-          <w:numId w:val="1012"/>
+          <w:numId w:val="1013"/>
         </w:numPr>
       </w:pPr>
       <w:r>
@@ -5443,7 +5699,7 @@
         <w:pStyle w:val="Compact"/>
         <w:numPr>
           <w:ilvl w:val="0"/>
-          <w:numId w:val="1012"/>
+          <w:numId w:val="1013"/>
         </w:numPr>
       </w:pPr>
       <w:r>
@@ -5648,8 +5904,8 @@
         <w:t xml:space="preserve">and optional resolver.</w:t>
       </w:r>
     </w:p>
-    <w:bookmarkEnd w:id="54"/>
-    <w:bookmarkStart w:id="55" w:name="type-inference-1"/>
+    <w:bookmarkEnd w:id="55"/>
+    <w:bookmarkStart w:id="56" w:name="type-inference-1"/>
     <w:p>
       <w:pPr>
         <w:pStyle w:val="Heading3"/>
@@ -5762,7 +6018,7 @@
         <w:pStyle w:val="Compact"/>
         <w:numPr>
           <w:ilvl w:val="0"/>
-          <w:numId w:val="1013"/>
+          <w:numId w:val="1014"/>
         </w:numPr>
       </w:pPr>
       <w:r>
@@ -5793,7 +6049,7 @@
         <w:pStyle w:val="Compact"/>
         <w:numPr>
           <w:ilvl w:val="0"/>
-          <w:numId w:val="1013"/>
+          <w:numId w:val="1014"/>
         </w:numPr>
       </w:pPr>
       <w:r>
@@ -5827,7 +6083,7 @@
         <w:pStyle w:val="Compact"/>
         <w:numPr>
           <w:ilvl w:val="0"/>
-          <w:numId w:val="1013"/>
+          <w:numId w:val="1014"/>
         </w:numPr>
       </w:pPr>
       <w:r>
@@ -5888,7 +6144,7 @@
         <w:pStyle w:val="Compact"/>
         <w:numPr>
           <w:ilvl w:val="0"/>
-          <w:numId w:val="1013"/>
+          <w:numId w:val="1014"/>
         </w:numPr>
       </w:pPr>
       <w:r>
@@ -5946,12 +6202,12 @@
         <w:tblW w:type="auto" w:w="0"/>
         <w:tblLook w:firstRow="1" w:lastRow="0" w:firstColumn="0" w:lastColumn="0" w:noHBand="0" w:noVBand="0" w:val="0020"/>
         <w:tblBorders>
-          <w:top w:color="000000" w:sz="6" w:val="single" w:space="0"/>
-          <w:left w:color="000000" w:sz="6" w:val="single" w:space="0"/>
-          <w:bottom w:color="000000" w:sz="6" w:val="single" w:space="0"/>
-          <w:right w:color="000000" w:sz="6" w:val="single" w:space="0"/>
-          <w:insideH w:color="000000" w:sz="6" w:val="single" w:space="0"/>
-          <w:insideV w:color="000000" w:sz="6" w:val="single" w:space="0"/>
+          <w:top w:space="0" w:val="single" w:color="000000" w:sz="6"/>
+          <w:left w:space="0" w:val="single" w:color="000000" w:sz="6"/>
+          <w:bottom w:space="0" w:val="single" w:color="000000" w:sz="6"/>
+          <w:right w:space="0" w:val="single" w:color="000000" w:sz="6"/>
+          <w:insideH w:space="0" w:val="single" w:color="000000" w:sz="6"/>
+          <w:insideV w:space="0" w:val="single" w:color="000000" w:sz="6"/>
         </w:tblBorders>
         <w:tblCellMar>
           <w:top w:w="57" w:type="dxa"/>
@@ -5974,13 +6230,13 @@
         </w:trPr>
         <w:tc>
           <w:tcPr>
-            <w:shd w:fill="E8E8E8" w:val="clear" w:color="auto"/>
+            <w:shd w:val="clear" w:color="auto" w:fill="E8E8E8"/>
           </w:tcPr>
           <w:p>
             <w:pPr>
               <w:pStyle w:val="Compact"/>
-              <w:ind w:right="0" w:firstLine="0" w:left="0"/>
-              <w:spacing w:before="40" w:after="40" w:lineRule="auto" w:line="240"/>
+              <w:ind w:left="0" w:firstLine="0" w:right="0"/>
+              <w:spacing w:lineRule="auto" w:after="40" w:before="40" w:line="240"/>
             </w:pPr>
             <w:r>
               <w:rPr>
@@ -5992,13 +6248,13 @@
         </w:tc>
         <w:tc>
           <w:tcPr>
-            <w:shd w:fill="E8E8E8" w:val="clear" w:color="auto"/>
+            <w:shd w:val="clear" w:color="auto" w:fill="E8E8E8"/>
           </w:tcPr>
           <w:p>
             <w:pPr>
               <w:pStyle w:val="Compact"/>
-              <w:ind w:right="0" w:firstLine="0" w:left="0"/>
-              <w:spacing w:before="40" w:after="40" w:lineRule="auto" w:line="240"/>
+              <w:ind w:left="0" w:firstLine="0" w:right="0"/>
+              <w:spacing w:lineRule="auto" w:after="40" w:before="40" w:line="240"/>
             </w:pPr>
             <w:r>
               <w:rPr>
@@ -6010,13 +6266,13 @@
         </w:tc>
         <w:tc>
           <w:tcPr>
-            <w:shd w:fill="E8E8E8" w:val="clear" w:color="auto"/>
+            <w:shd w:val="clear" w:color="auto" w:fill="E8E8E8"/>
           </w:tcPr>
           <w:p>
             <w:pPr>
               <w:pStyle w:val="Compact"/>
-              <w:ind w:right="0" w:firstLine="0" w:left="0"/>
-              <w:spacing w:before="40" w:after="40" w:lineRule="auto" w:line="240"/>
+              <w:ind w:left="0" w:firstLine="0" w:right="0"/>
+              <w:spacing w:lineRule="auto" w:after="40" w:before="40" w:line="240"/>
             </w:pPr>
             <w:r>
               <w:rPr>
@@ -6028,13 +6284,13 @@
         </w:tc>
         <w:tc>
           <w:tcPr>
-            <w:shd w:fill="E8E8E8" w:val="clear" w:color="auto"/>
+            <w:shd w:val="clear" w:color="auto" w:fill="E8E8E8"/>
           </w:tcPr>
           <w:p>
             <w:pPr>
               <w:pStyle w:val="Compact"/>
-              <w:ind w:right="0" w:firstLine="0" w:left="0"/>
-              <w:spacing w:before="40" w:after="40" w:lineRule="auto" w:line="240"/>
+              <w:ind w:left="0" w:firstLine="0" w:right="0"/>
+              <w:spacing w:lineRule="auto" w:after="40" w:before="40" w:line="240"/>
             </w:pPr>
             <w:r>
               <w:rPr>
@@ -6046,13 +6302,13 @@
         </w:tc>
         <w:tc>
           <w:tcPr>
-            <w:shd w:fill="E8E8E8" w:val="clear" w:color="auto"/>
+            <w:shd w:val="clear" w:color="auto" w:fill="E8E8E8"/>
           </w:tcPr>
           <w:p>
             <w:pPr>
               <w:pStyle w:val="Compact"/>
-              <w:ind w:right="0" w:firstLine="0" w:left="0"/>
-              <w:spacing w:before="40" w:after="40" w:lineRule="auto" w:line="240"/>
+              <w:ind w:left="0" w:firstLine="0" w:right="0"/>
+              <w:spacing w:lineRule="auto" w:after="40" w:before="40" w:line="240"/>
             </w:pPr>
             <w:r>
               <w:rPr>
@@ -6064,13 +6320,13 @@
         </w:tc>
         <w:tc>
           <w:tcPr>
-            <w:shd w:fill="E8E8E8" w:val="clear" w:color="auto"/>
+            <w:shd w:val="clear" w:color="auto" w:fill="E8E8E8"/>
           </w:tcPr>
           <w:p>
             <w:pPr>
               <w:pStyle w:val="Compact"/>
-              <w:ind w:right="0" w:firstLine="0" w:left="0"/>
-              <w:spacing w:before="40" w:after="40" w:lineRule="auto" w:line="240"/>
+              <w:ind w:left="0" w:firstLine="0" w:right="0"/>
+              <w:spacing w:lineRule="auto" w:after="40" w:before="40" w:line="240"/>
             </w:pPr>
             <w:r>
               <w:rPr>
@@ -6087,8 +6343,8 @@
           <w:p>
             <w:pPr>
               <w:pStyle w:val="Compact"/>
-              <w:ind w:right="0" w:firstLine="0" w:left="0"/>
-              <w:spacing w:before="40" w:after="40" w:lineRule="auto" w:line="240"/>
+              <w:ind w:left="0" w:firstLine="0" w:right="0"/>
+              <w:spacing w:lineRule="auto" w:after="40" w:before="40" w:line="240"/>
             </w:pPr>
             <w:r>
               <w:t xml:space="preserve">VERIFIES</w:t>
@@ -6100,8 +6356,8 @@
           <w:p>
             <w:pPr>
               <w:pStyle w:val="Compact"/>
-              <w:ind w:right="0" w:firstLine="0" w:left="0"/>
-              <w:spacing w:before="40" w:after="40" w:lineRule="auto" w:line="240"/>
+              <w:ind w:left="0" w:firstLine="0" w:right="0"/>
+              <w:spacing w:lineRule="auto" w:after="40" w:before="40" w:line="240"/>
             </w:pPr>
             <w:r>
               <w:rPr>
@@ -6116,8 +6372,8 @@
           <w:p>
             <w:pPr>
               <w:pStyle w:val="Compact"/>
-              <w:ind w:right="0" w:firstLine="0" w:left="0"/>
-              <w:spacing w:before="40" w:after="40" w:lineRule="auto" w:line="240"/>
+              <w:ind w:left="0" w:firstLine="0" w:right="0"/>
+              <w:spacing w:lineRule="auto" w:after="40" w:before="40" w:line="240"/>
             </w:pPr>
             <w:r>
               <w:rPr>
@@ -6132,8 +6388,8 @@
           <w:p>
             <w:pPr>
               <w:pStyle w:val="Compact"/>
-              <w:ind w:right="0" w:firstLine="0" w:left="0"/>
-              <w:spacing w:before="40" w:after="40" w:lineRule="auto" w:line="240"/>
+              <w:ind w:left="0" w:firstLine="0" w:right="0"/>
+              <w:spacing w:lineRule="auto" w:after="40" w:before="40" w:line="240"/>
             </w:pPr>
             <w:r>
               <w:rPr>
@@ -6148,8 +6404,8 @@
           <w:p>
             <w:pPr>
               <w:pStyle w:val="Compact"/>
-              <w:ind w:right="0" w:firstLine="0" w:left="0"/>
-              <w:spacing w:before="40" w:after="40" w:lineRule="auto" w:line="240"/>
+              <w:ind w:left="0" w:firstLine="0" w:right="0"/>
+              <w:spacing w:lineRule="auto" w:after="40" w:before="40" w:line="240"/>
             </w:pPr>
             <w:r>
               <w:rPr>
@@ -6164,8 +6420,8 @@
           <w:p>
             <w:pPr>
               <w:pStyle w:val="Compact"/>
-              <w:ind w:right="0" w:firstLine="0" w:left="0"/>
-              <w:spacing w:before="40" w:after="40" w:lineRule="auto" w:line="240"/>
+              <w:ind w:left="0" w:firstLine="0" w:right="0"/>
+              <w:spacing w:lineRule="auto" w:after="40" w:before="40" w:line="240"/>
             </w:pPr>
             <w:r>
               <w:rPr>
@@ -6183,8 +6439,8 @@
           <w:p>
             <w:pPr>
               <w:pStyle w:val="Compact"/>
-              <w:ind w:right="0" w:firstLine="0" w:left="0"/>
-              <w:spacing w:before="40" w:after="40" w:lineRule="auto" w:line="240"/>
+              <w:ind w:left="0" w:firstLine="0" w:right="0"/>
+              <w:spacing w:lineRule="auto" w:after="40" w:before="40" w:line="240"/>
             </w:pPr>
             <w:r>
               <w:t xml:space="preserve">TRACES_TO</w:t>
@@ -6196,8 +6452,8 @@
           <w:p>
             <w:pPr>
               <w:pStyle w:val="Compact"/>
-              <w:ind w:right="0" w:firstLine="0" w:left="0"/>
-              <w:spacing w:before="40" w:after="40" w:lineRule="auto" w:line="240"/>
+              <w:ind w:left="0" w:firstLine="0" w:right="0"/>
+              <w:spacing w:lineRule="auto" w:after="40" w:before="40" w:line="240"/>
             </w:pPr>
             <w:r>
               <w:rPr>
@@ -6212,8 +6468,8 @@
           <w:p>
             <w:pPr>
               <w:pStyle w:val="Compact"/>
-              <w:ind w:right="0" w:firstLine="0" w:left="0"/>
-              <w:spacing w:before="40" w:after="40" w:lineRule="auto" w:line="240"/>
+              <w:ind w:left="0" w:firstLine="0" w:right="0"/>
+              <w:spacing w:lineRule="auto" w:after="40" w:before="40" w:line="240"/>
             </w:pPr>
             <w:r>
               <w:t xml:space="preserve">—</w:t>
@@ -6225,8 +6481,8 @@
           <w:p>
             <w:pPr>
               <w:pStyle w:val="Compact"/>
-              <w:ind w:right="0" w:firstLine="0" w:left="0"/>
-              <w:spacing w:before="40" w:after="40" w:lineRule="auto" w:line="240"/>
+              <w:ind w:left="0" w:firstLine="0" w:right="0"/>
+              <w:spacing w:lineRule="auto" w:after="40" w:before="40" w:line="240"/>
             </w:pPr>
             <w:r>
               <w:t xml:space="preserve">—</w:t>
@@ -6238,8 +6494,8 @@
           <w:p>
             <w:pPr>
               <w:pStyle w:val="Compact"/>
-              <w:ind w:right="0" w:firstLine="0" w:left="0"/>
-              <w:spacing w:before="40" w:after="40" w:lineRule="auto" w:line="240"/>
+              <w:ind w:left="0" w:firstLine="0" w:right="0"/>
+              <w:spacing w:lineRule="auto" w:after="40" w:before="40" w:line="240"/>
             </w:pPr>
             <w:r>
               <w:t xml:space="preserve">—</w:t>
@@ -6251,8 +6507,8 @@
           <w:p>
             <w:pPr>
               <w:pStyle w:val="Compact"/>
-              <w:ind w:right="0" w:firstLine="0" w:left="0"/>
-              <w:spacing w:before="40" w:after="40" w:lineRule="auto" w:line="240"/>
+              <w:ind w:left="0" w:firstLine="0" w:right="0"/>
+              <w:spacing w:lineRule="auto" w:after="40" w:before="40" w:line="240"/>
             </w:pPr>
             <w:r>
               <w:t xml:space="preserve">1</w:t>
@@ -6266,8 +6522,8 @@
           <w:p>
             <w:pPr>
               <w:pStyle w:val="Compact"/>
-              <w:ind w:right="0" w:firstLine="0" w:left="0"/>
-              <w:spacing w:before="40" w:after="40" w:lineRule="auto" w:line="240"/>
+              <w:ind w:left="0" w:firstLine="0" w:right="0"/>
+              <w:spacing w:lineRule="auto" w:after="40" w:before="40" w:line="240"/>
             </w:pPr>
             <w:r>
               <w:t xml:space="preserve">XREF_SEC</w:t>
@@ -6279,8 +6535,8 @@
           <w:p>
             <w:pPr>
               <w:pStyle w:val="Compact"/>
-              <w:ind w:right="0" w:firstLine="0" w:left="0"/>
-              <w:spacing w:before="40" w:after="40" w:lineRule="auto" w:line="240"/>
+              <w:ind w:left="0" w:firstLine="0" w:right="0"/>
+              <w:spacing w:lineRule="auto" w:after="40" w:before="40" w:line="240"/>
             </w:pPr>
             <w:r>
               <w:rPr>
@@ -6295,8 +6551,8 @@
           <w:p>
             <w:pPr>
               <w:pStyle w:val="Compact"/>
-              <w:ind w:right="0" w:firstLine="0" w:left="0"/>
-              <w:spacing w:before="40" w:after="40" w:lineRule="auto" w:line="240"/>
+              <w:ind w:left="0" w:firstLine="0" w:right="0"/>
+              <w:spacing w:lineRule="auto" w:after="40" w:before="40" w:line="240"/>
             </w:pPr>
             <w:r>
               <w:t xml:space="preserve">—</w:t>
@@ -6308,8 +6564,8 @@
           <w:p>
             <w:pPr>
               <w:pStyle w:val="Compact"/>
-              <w:ind w:right="0" w:firstLine="0" w:left="0"/>
-              <w:spacing w:before="40" w:after="40" w:lineRule="auto" w:line="240"/>
+              <w:ind w:left="0" w:firstLine="0" w:right="0"/>
+              <w:spacing w:lineRule="auto" w:after="40" w:before="40" w:line="240"/>
             </w:pPr>
             <w:r>
               <w:t xml:space="preserve">—</w:t>
@@ -6321,8 +6577,8 @@
           <w:p>
             <w:pPr>
               <w:pStyle w:val="Compact"/>
-              <w:ind w:right="0" w:firstLine="0" w:left="0"/>
-              <w:spacing w:before="40" w:after="40" w:lineRule="auto" w:line="240"/>
+              <w:ind w:left="0" w:firstLine="0" w:right="0"/>
+              <w:spacing w:lineRule="auto" w:after="40" w:before="40" w:line="240"/>
             </w:pPr>
             <w:r>
               <w:rPr>
@@ -6338,8 +6594,8 @@
           <w:p>
             <w:pPr>
               <w:pStyle w:val="Compact"/>
-              <w:ind w:right="0" w:firstLine="0" w:left="0"/>
-              <w:spacing w:before="40" w:after="40" w:lineRule="auto" w:line="240"/>
+              <w:ind w:left="0" w:firstLine="0" w:right="0"/>
+              <w:spacing w:lineRule="auto" w:after="40" w:before="40" w:line="240"/>
             </w:pPr>
             <w:r>
               <w:t xml:space="preserve">eliminated</w:t>
@@ -6356,8 +6612,8 @@
         <w:t xml:space="preserve">VERIFIES wins with the highest specificity (4 non-NULL constraints matched).</w:t>
       </w:r>
     </w:p>
-    <w:bookmarkEnd w:id="55"/>
-    <w:bookmarkStart w:id="56" w:name="examples-4"/>
+    <w:bookmarkEnd w:id="56"/>
+    <w:bookmarkStart w:id="57" w:name="examples-4"/>
     <w:p>
       <w:pPr>
         <w:pStyle w:val="Heading3"/>
@@ -6427,9 +6683,9 @@
         <w:t xml:space="preserve">See [SRS-001](@) for the parent specification.</w:t>
       </w:r>
     </w:p>
-    <w:bookmarkEnd w:id="56"/>
     <w:bookmarkEnd w:id="57"/>
-    <w:bookmarkStart w:id="65" w:name="spec-view"/>
+    <w:bookmarkEnd w:id="58"/>
+    <w:bookmarkStart w:id="66" w:name="spec-view"/>
     <w:p>
       <w:pPr>
         <w:pStyle w:val="Heading2"/>
@@ -6466,7 +6722,7 @@
         <w:t xml:space="preserve">is a dynamic query or generated content block. Views are materialized at processing time and produce content such as tables of contents, lists of figures, abbreviation expansions, and inline math.</w:t>
       </w:r>
     </w:p>
-    <w:bookmarkStart w:id="58" w:name="formal-definition-5"/>
+    <w:bookmarkStart w:id="59" w:name="formal-definition-5"/>
     <w:p>
       <w:pPr>
         <w:pStyle w:val="Heading3"/>
@@ -6536,7 +6792,7 @@
         <w:pStyle w:val="Compact"/>
         <w:numPr>
           <w:ilvl w:val="0"/>
-          <w:numId w:val="1014"/>
+          <w:numId w:val="1015"/>
         </w:numPr>
       </w:pPr>
       <m:oMath>
@@ -6589,7 +6845,7 @@
         <w:pStyle w:val="Compact"/>
         <w:numPr>
           <w:ilvl w:val="0"/>
-          <w:numId w:val="1014"/>
+          <w:numId w:val="1015"/>
         </w:numPr>
       </w:pPr>
       <m:oMath>
@@ -6617,8 +6873,8 @@
         <w:t xml:space="preserve">is the raw parameter string.</w:t>
       </w:r>
     </w:p>
-    <w:bookmarkEnd w:id="58"/>
-    <w:bookmarkStart w:id="62" w:name="grammar-5"/>
+    <w:bookmarkEnd w:id="59"/>
+    <w:bookmarkStart w:id="63" w:name="grammar-5"/>
     <w:p>
       <w:pPr>
         <w:pStyle w:val="Heading3"/>
@@ -6633,7 +6889,7 @@
     </w:p>
     <w:p>
       <w:pPr>
-        <w:spacing w:after="0" w:line="20" w:before="0" w:lineRule="exact"/>
+        <w:spacing w:line="20" w:lineRule="exact" w:before="0" w:after="0"/>
         <w:rPr>
           <w:sz w:val="2"/>
         </w:rPr>
@@ -6678,18 +6934,18 @@
           <wp:inline>
             <wp:extent cx="5283200" cy="1409700"/>
             <wp:effectExtent b="0" l="0" r="0" t="0"/>
-            <wp:docPr descr="" title="" id="60" name="Picture"/>
+            <wp:docPr descr="" title="" id="61" name="Picture"/>
             <a:graphic>
               <a:graphicData uri="http://schemas.openxmlformats.org/drawingml/2006/picture">
                 <pic:pic>
                   <pic:nvPicPr>
-                    <pic:cNvPr descr="diagrams/66854711fd100da85b86d601327ac920c398ea0e.png" id="61" name="Picture"/>
+                    <pic:cNvPr descr="diagrams/66854711fd100da85b86d601327ac920c398ea0e.png" id="62" name="Picture"/>
                     <pic:cNvPicPr>
                       <a:picLocks noChangeArrowheads="1" noChangeAspect="1"/>
                     </pic:cNvPicPr>
                   </pic:nvPicPr>
                   <pic:blipFill>
-                    <a:blip r:embed="rId59"/>
+                    <a:blip r:embed="rId60"/>
                     <a:stretch>
                       <a:fillRect/>
                     </a:stretch>
@@ -6716,8 +6972,8 @@
         </w:drawing>
       </w:r>
     </w:p>
-    <w:bookmarkEnd w:id="62"/>
-    <w:bookmarkStart w:id="63" w:name="view-types"/>
+    <w:bookmarkEnd w:id="63"/>
+    <w:bookmarkStart w:id="64" w:name="view-types"/>
     <w:p>
       <w:pPr>
         <w:pStyle w:val="Heading3"/>
@@ -6743,7 +6999,7 @@
         <w:pStyle w:val="Compact"/>
         <w:numPr>
           <w:ilvl w:val="0"/>
-          <w:numId w:val="1015"/>
+          <w:numId w:val="1016"/>
         </w:numPr>
       </w:pPr>
       <w:r>
@@ -6765,7 +7021,7 @@
         <w:pStyle w:val="Compact"/>
         <w:numPr>
           <w:ilvl w:val="0"/>
-          <w:numId w:val="1015"/>
+          <w:numId w:val="1016"/>
         </w:numPr>
       </w:pPr>
       <w:r>
@@ -6787,7 +7043,7 @@
         <w:pStyle w:val="Compact"/>
         <w:numPr>
           <w:ilvl w:val="0"/>
-          <w:numId w:val="1015"/>
+          <w:numId w:val="1016"/>
         </w:numPr>
       </w:pPr>
       <w:r>
@@ -6809,7 +7065,7 @@
         <w:pStyle w:val="Compact"/>
         <w:numPr>
           <w:ilvl w:val="0"/>
-          <w:numId w:val="1015"/>
+          <w:numId w:val="1016"/>
         </w:numPr>
       </w:pPr>
       <w:r>
@@ -6864,7 +7120,7 @@
         <w:pStyle w:val="Compact"/>
         <w:numPr>
           <w:ilvl w:val="0"/>
-          <w:numId w:val="1015"/>
+          <w:numId w:val="1016"/>
         </w:numPr>
       </w:pPr>
       <w:r>
@@ -6895,7 +7151,7 @@
         <w:pStyle w:val="Compact"/>
         <w:numPr>
           <w:ilvl w:val="0"/>
-          <w:numId w:val="1015"/>
+          <w:numId w:val="1016"/>
         </w:numPr>
       </w:pPr>
       <w:r>
@@ -6917,7 +7173,7 @@
         <w:pStyle w:val="Compact"/>
         <w:numPr>
           <w:ilvl w:val="0"/>
-          <w:numId w:val="1015"/>
+          <w:numId w:val="1016"/>
         </w:numPr>
       </w:pPr>
       <w:r>
@@ -6934,8 +7190,8 @@
         <w:t xml:space="preserve">— summary report of requirements by type and status.</w:t>
       </w:r>
     </w:p>
-    <w:bookmarkEnd w:id="63"/>
-    <w:bookmarkStart w:id="64" w:name="examples-5"/>
+    <w:bookmarkEnd w:id="64"/>
+    <w:bookmarkStart w:id="65" w:name="examples-5"/>
     <w:p>
       <w:pPr>
         <w:pStyle w:val="Heading3"/>
@@ -6994,9 +7250,9 @@
         <w:t xml:space="preserve">`math_inline: x = \frac{-b}{2a}`</w:t>
       </w:r>
     </w:p>
-    <w:bookmarkEnd w:id="64"/>
     <w:bookmarkEnd w:id="65"/>
-    <w:bookmarkStart w:id="66" w:name="disambiguation-rules"/>
+    <w:bookmarkEnd w:id="66"/>
+    <w:bookmarkStart w:id="67" w:name="disambiguation-rules"/>
     <w:p>
       <w:pPr>
         <w:pStyle w:val="Heading2"/>
@@ -7049,7 +7305,7 @@
         <w:pStyle w:val="Compact"/>
         <w:numPr>
           <w:ilvl w:val="0"/>
-          <w:numId w:val="1016"/>
+          <w:numId w:val="1017"/>
         </w:numPr>
       </w:pPr>
       <w:r>
@@ -7061,7 +7317,7 @@
         <w:pStyle w:val="Compact"/>
         <w:numPr>
           <w:ilvl w:val="0"/>
-          <w:numId w:val="1016"/>
+          <w:numId w:val="1017"/>
         </w:numPr>
       </w:pPr>
       <w:r>
@@ -7325,9 +7581,9 @@
         <w:t xml:space="preserve">If a heading skips levels (e.g., H2 followed by H4 with no intervening H3), the document is malformed. Processors should report an error; the missing intermediate level is not implicitly created.</w:t>
       </w:r>
     </w:p>
-    <w:bookmarkEnd w:id="66"/>
     <w:bookmarkEnd w:id="67"/>
-    <w:bookmarkStart w:id="73" w:name="type-system"/>
+    <w:bookmarkEnd w:id="68"/>
+    <w:bookmarkStart w:id="74" w:name="type-system"/>
     <w:p>
       <w:pPr>
         <w:pStyle w:val="Heading1"/>
@@ -7381,7 +7637,7 @@
         <w:t xml:space="preserve">that defines what object types, float types, relation types, view types, specification types, datatypes, and attributes exist. The language syntax is fixed; the model determines what types are valid and how they behave.</w:t>
       </w:r>
     </w:p>
-    <w:bookmarkStart w:id="68" w:name="model-structure"/>
+    <w:bookmarkStart w:id="69" w:name="model-structure"/>
     <w:p>
       <w:pPr>
         <w:pStyle w:val="Heading2"/>
@@ -7407,7 +7663,7 @@
         <w:pStyle w:val="Compact"/>
         <w:numPr>
           <w:ilvl w:val="0"/>
-          <w:numId w:val="1017"/>
+          <w:numId w:val="1018"/>
         </w:numPr>
       </w:pPr>
       <w:r>
@@ -7429,7 +7685,7 @@
         <w:pStyle w:val="Compact"/>
         <w:numPr>
           <w:ilvl w:val="0"/>
-          <w:numId w:val="1017"/>
+          <w:numId w:val="1018"/>
         </w:numPr>
       </w:pPr>
       <w:r>
@@ -7451,7 +7707,7 @@
         <w:pStyle w:val="Compact"/>
         <w:numPr>
           <w:ilvl w:val="0"/>
-          <w:numId w:val="1017"/>
+          <w:numId w:val="1018"/>
         </w:numPr>
       </w:pPr>
       <w:r>
@@ -7473,7 +7729,7 @@
         <w:pStyle w:val="Compact"/>
         <w:numPr>
           <w:ilvl w:val="0"/>
-          <w:numId w:val="1017"/>
+          <w:numId w:val="1018"/>
         </w:numPr>
       </w:pPr>
       <w:r>
@@ -7495,7 +7751,7 @@
         <w:pStyle w:val="Compact"/>
         <w:numPr>
           <w:ilvl w:val="0"/>
-          <w:numId w:val="1017"/>
+          <w:numId w:val="1018"/>
         </w:numPr>
       </w:pPr>
       <w:r>
@@ -7517,7 +7773,7 @@
         <w:pStyle w:val="Compact"/>
         <w:numPr>
           <w:ilvl w:val="0"/>
-          <w:numId w:val="1017"/>
+          <w:numId w:val="1018"/>
         </w:numPr>
       </w:pPr>
       <w:r>
@@ -7534,8 +7790,8 @@
         <w:t xml:space="preserve">— constraint violation detectors that enforce model invariants (e.g., missing required attributes, invalid enum values, broken traceability).</w:t>
       </w:r>
     </w:p>
-    <w:bookmarkEnd w:id="68"/>
-    <w:bookmarkStart w:id="69" w:name="type-definition-schema"/>
+    <w:bookmarkEnd w:id="69"/>
+    <w:bookmarkStart w:id="70" w:name="type-definition-schema"/>
     <w:p>
       <w:pPr>
         <w:pStyle w:val="Heading2"/>
@@ -7561,7 +7817,7 @@
         <w:pStyle w:val="Compact"/>
         <w:numPr>
           <w:ilvl w:val="0"/>
-          <w:numId w:val="1018"/>
+          <w:numId w:val="1019"/>
         </w:numPr>
       </w:pPr>
       <w:r>
@@ -7595,7 +7851,7 @@
         <w:pStyle w:val="Compact"/>
         <w:numPr>
           <w:ilvl w:val="0"/>
-          <w:numId w:val="1018"/>
+          <w:numId w:val="1019"/>
         </w:numPr>
       </w:pPr>
       <w:r>
@@ -7626,7 +7882,7 @@
         <w:pStyle w:val="Compact"/>
         <w:numPr>
           <w:ilvl w:val="0"/>
-          <w:numId w:val="1018"/>
+          <w:numId w:val="1019"/>
         </w:numPr>
       </w:pPr>
       <w:r>
@@ -7660,7 +7916,7 @@
         <w:pStyle w:val="Compact"/>
         <w:numPr>
           <w:ilvl w:val="0"/>
-          <w:numId w:val="1018"/>
+          <w:numId w:val="1019"/>
         </w:numPr>
       </w:pPr>
       <w:r>
@@ -7694,7 +7950,7 @@
         <w:pStyle w:val="Compact"/>
         <w:numPr>
           <w:ilvl w:val="0"/>
-          <w:numId w:val="1018"/>
+          <w:numId w:val="1019"/>
         </w:numPr>
       </w:pPr>
       <w:r>
@@ -7728,7 +7984,7 @@
         <w:pStyle w:val="Compact"/>
         <w:numPr>
           <w:ilvl w:val="0"/>
-          <w:numId w:val="1018"/>
+          <w:numId w:val="1019"/>
         </w:numPr>
       </w:pPr>
       <w:r>
@@ -7782,7 +8038,7 @@
         <w:pStyle w:val="Compact"/>
         <w:numPr>
           <w:ilvl w:val="0"/>
-          <w:numId w:val="1019"/>
+          <w:numId w:val="1020"/>
         </w:numPr>
       </w:pPr>
       <w:r>
@@ -7816,7 +8072,7 @@
         <w:pStyle w:val="Compact"/>
         <w:numPr>
           <w:ilvl w:val="0"/>
-          <w:numId w:val="1019"/>
+          <w:numId w:val="1020"/>
         </w:numPr>
       </w:pPr>
       <w:r>
@@ -7854,7 +8110,7 @@
         <w:pStyle w:val="Compact"/>
         <w:numPr>
           <w:ilvl w:val="0"/>
-          <w:numId w:val="1019"/>
+          <w:numId w:val="1020"/>
         </w:numPr>
       </w:pPr>
       <w:r>
@@ -7876,7 +8132,7 @@
         <w:pStyle w:val="Compact"/>
         <w:numPr>
           <w:ilvl w:val="0"/>
-          <w:numId w:val="1019"/>
+          <w:numId w:val="1020"/>
         </w:numPr>
       </w:pPr>
       <w:r>
@@ -7905,8 +8161,8 @@
         <w:t xml:space="preserve">).</w:t>
       </w:r>
     </w:p>
-    <w:bookmarkEnd w:id="69"/>
-    <w:bookmarkStart w:id="70" w:name="type-inheritance"/>
+    <w:bookmarkEnd w:id="70"/>
+    <w:bookmarkStart w:id="71" w:name="type-inheritance"/>
     <w:p>
       <w:pPr>
         <w:pStyle w:val="Heading2"/>
@@ -7944,7 +8200,7 @@
         <w:pStyle w:val="Compact"/>
         <w:numPr>
           <w:ilvl w:val="0"/>
-          <w:numId w:val="1020"/>
+          <w:numId w:val="1021"/>
         </w:numPr>
       </w:pPr>
       <w:r>
@@ -7966,7 +8222,7 @@
         <w:pStyle w:val="Compact"/>
         <w:numPr>
           <w:ilvl w:val="0"/>
-          <w:numId w:val="1020"/>
+          <w:numId w:val="1021"/>
         </w:numPr>
       </w:pPr>
       <w:r>
@@ -8003,7 +8259,7 @@
         <w:pStyle w:val="Compact"/>
         <w:numPr>
           <w:ilvl w:val="0"/>
-          <w:numId w:val="1020"/>
+          <w:numId w:val="1021"/>
         </w:numPr>
       </w:pPr>
       <w:r>
@@ -8049,7 +8305,7 @@
         <w:pStyle w:val="Compact"/>
         <w:numPr>
           <w:ilvl w:val="0"/>
-          <w:numId w:val="1020"/>
+          <w:numId w:val="1021"/>
         </w:numPr>
       </w:pPr>
       <w:r>
@@ -8102,8 +8358,8 @@
         <w:t xml:space="preserve">.</w:t>
       </w:r>
     </w:p>
-    <w:bookmarkEnd w:id="70"/>
-    <w:bookmarkStart w:id="71" w:name="default-model"/>
+    <w:bookmarkEnd w:id="71"/>
+    <w:bookmarkStart w:id="72" w:name="default-model"/>
     <w:p>
       <w:pPr>
         <w:pStyle w:val="Heading2"/>
@@ -8129,7 +8385,7 @@
         <w:pStyle w:val="Compact"/>
         <w:numPr>
           <w:ilvl w:val="0"/>
-          <w:numId w:val="1021"/>
+          <w:numId w:val="1022"/>
         </w:numPr>
       </w:pPr>
       <w:r>
@@ -8151,7 +8407,7 @@
         <w:pStyle w:val="Compact"/>
         <w:numPr>
           <w:ilvl w:val="0"/>
-          <w:numId w:val="1021"/>
+          <w:numId w:val="1022"/>
         </w:numPr>
       </w:pPr>
       <w:r>
@@ -8173,7 +8429,7 @@
         <w:pStyle w:val="Compact"/>
         <w:numPr>
           <w:ilvl w:val="0"/>
-          <w:numId w:val="1021"/>
+          <w:numId w:val="1022"/>
         </w:numPr>
       </w:pPr>
       <w:r>
@@ -8195,7 +8451,7 @@
         <w:pStyle w:val="Compact"/>
         <w:numPr>
           <w:ilvl w:val="0"/>
-          <w:numId w:val="1021"/>
+          <w:numId w:val="1022"/>
         </w:numPr>
       </w:pPr>
       <w:r>
@@ -8212,8 +8468,8 @@
         <w:t xml:space="preserve">A single default specification type.</w:t>
       </w:r>
     </w:p>
-    <w:bookmarkEnd w:id="71"/>
-    <w:bookmarkStart w:id="72" w:name="domain-models"/>
+    <w:bookmarkEnd w:id="72"/>
+    <w:bookmarkStart w:id="73" w:name="domain-models"/>
     <w:p>
       <w:pPr>
         <w:pStyle w:val="Heading2"/>
@@ -8239,7 +8495,7 @@
         <w:pStyle w:val="Compact"/>
         <w:numPr>
           <w:ilvl w:val="0"/>
-          <w:numId w:val="1022"/>
+          <w:numId w:val="1023"/>
         </w:numPr>
       </w:pPr>
       <w:r>
@@ -8261,7 +8517,7 @@
         <w:pStyle w:val="Compact"/>
         <w:numPr>
           <w:ilvl w:val="0"/>
-          <w:numId w:val="1022"/>
+          <w:numId w:val="1023"/>
         </w:numPr>
       </w:pPr>
       <w:r>
@@ -8283,7 +8539,7 @@
         <w:pStyle w:val="Compact"/>
         <w:numPr>
           <w:ilvl w:val="0"/>
-          <w:numId w:val="1022"/>
+          <w:numId w:val="1023"/>
         </w:numPr>
       </w:pPr>
       <w:r>
@@ -8305,7 +8561,7 @@
         <w:pStyle w:val="Compact"/>
         <w:numPr>
           <w:ilvl w:val="0"/>
-          <w:numId w:val="1022"/>
+          <w:numId w:val="1023"/>
         </w:numPr>
       </w:pPr>
       <w:r>
@@ -8327,7 +8583,7 @@
         <w:pStyle w:val="Compact"/>
         <w:numPr>
           <w:ilvl w:val="0"/>
-          <w:numId w:val="1022"/>
+          <w:numId w:val="1023"/>
         </w:numPr>
       </w:pPr>
       <w:r>
@@ -8344,9 +8600,9 @@
         <w:t xml:space="preserve">Missing traceability coverage, invalid attribute values, duplicate PIDs.</w:t>
       </w:r>
     </w:p>
-    <w:bookmarkEnd w:id="72"/>
     <w:bookmarkEnd w:id="73"/>
-    <w:bookmarkStart w:id="77" w:name="datatypes-1"/>
+    <w:bookmarkEnd w:id="74"/>
+    <w:bookmarkStart w:id="78" w:name="datatypes-1"/>
     <w:p>
       <w:pPr>
         <w:pStyle w:val="Heading1"/>
@@ -8359,7 +8615,7 @@
         <w:t xml:space="preserve">Datatypes</w:t>
       </w:r>
     </w:p>
-    <w:bookmarkStart w:id="74" w:name="primitive-datatypes"/>
+    <w:bookmarkStart w:id="75" w:name="primitive-datatypes"/>
     <w:p>
       <w:pPr>
         <w:pStyle w:val="Heading2"/>
@@ -8382,7 +8638,7 @@
     </w:p>
     <w:p>
       <w:pPr>
-        <w:spacing w:after="0" w:line="20" w:before="0" w:lineRule="exact"/>
+        <w:spacing w:line="20" w:lineRule="exact" w:before="0" w:after="0"/>
         <w:rPr>
           <w:sz w:val="2"/>
         </w:rPr>
@@ -8423,12 +8679,12 @@
         <w:tblW w:type="auto" w:w="0"/>
         <w:tblLook w:firstRow="1" w:lastRow="0" w:firstColumn="0" w:lastColumn="0" w:noHBand="0" w:noVBand="0" w:val="0020"/>
         <w:tblBorders>
-          <w:top w:color="000000" w:sz="6" w:val="single" w:space="0"/>
-          <w:left w:color="000000" w:sz="6" w:val="single" w:space="0"/>
-          <w:bottom w:color="000000" w:sz="6" w:val="single" w:space="0"/>
-          <w:right w:color="000000" w:sz="6" w:val="single" w:space="0"/>
-          <w:insideH w:color="000000" w:sz="6" w:val="single" w:space="0"/>
-          <w:insideV w:color="000000" w:sz="6" w:val="single" w:space="0"/>
+          <w:top w:space="0" w:val="single" w:color="000000" w:sz="6"/>
+          <w:left w:space="0" w:val="single" w:color="000000" w:sz="6"/>
+          <w:bottom w:space="0" w:val="single" w:color="000000" w:sz="6"/>
+          <w:right w:space="0" w:val="single" w:color="000000" w:sz="6"/>
+          <w:insideH w:space="0" w:val="single" w:color="000000" w:sz="6"/>
+          <w:insideV w:space="0" w:val="single" w:color="000000" w:sz="6"/>
         </w:tblBorders>
         <w:tblCellMar>
           <w:top w:w="57" w:type="dxa"/>
@@ -8448,13 +8704,13 @@
         </w:trPr>
         <w:tc>
           <w:tcPr>
-            <w:shd w:fill="E8E8E8" w:val="clear" w:color="auto"/>
+            <w:shd w:val="clear" w:color="auto" w:fill="E8E8E8"/>
           </w:tcPr>
           <w:p>
             <w:pPr>
               <w:pStyle w:val="Compact"/>
-              <w:ind w:right="0" w:firstLine="0" w:left="0"/>
-              <w:spacing w:before="40" w:after="40" w:lineRule="auto" w:line="240"/>
+              <w:ind w:left="0" w:firstLine="0" w:right="0"/>
+              <w:spacing w:lineRule="auto" w:after="40" w:before="40" w:line="240"/>
             </w:pPr>
             <w:r>
               <w:rPr>
@@ -8466,13 +8722,13 @@
         </w:tc>
         <w:tc>
           <w:tcPr>
-            <w:shd w:fill="E8E8E8" w:val="clear" w:color="auto"/>
+            <w:shd w:val="clear" w:color="auto" w:fill="E8E8E8"/>
           </w:tcPr>
           <w:p>
             <w:pPr>
               <w:pStyle w:val="Compact"/>
-              <w:ind w:right="0" w:firstLine="0" w:left="0"/>
-              <w:spacing w:before="40" w:after="40" w:lineRule="auto" w:line="240"/>
+              <w:ind w:left="0" w:firstLine="0" w:right="0"/>
+              <w:spacing w:lineRule="auto" w:after="40" w:before="40" w:line="240"/>
             </w:pPr>
             <w:r>
               <w:rPr>
@@ -8484,13 +8740,13 @@
         </w:tc>
         <w:tc>
           <w:tcPr>
-            <w:shd w:fill="E8E8E8" w:val="clear" w:color="auto"/>
+            <w:shd w:val="clear" w:color="auto" w:fill="E8E8E8"/>
           </w:tcPr>
           <w:p>
             <w:pPr>
               <w:pStyle w:val="Compact"/>
-              <w:ind w:right="0" w:firstLine="0" w:left="0"/>
-              <w:spacing w:before="40" w:after="40" w:lineRule="auto" w:line="240"/>
+              <w:ind w:left="0" w:firstLine="0" w:right="0"/>
+              <w:spacing w:lineRule="auto" w:after="40" w:before="40" w:line="240"/>
             </w:pPr>
             <w:r>
               <w:rPr>
@@ -8507,8 +8763,8 @@
           <w:p>
             <w:pPr>
               <w:pStyle w:val="Compact"/>
-              <w:ind w:right="0" w:firstLine="0" w:left="0"/>
-              <w:spacing w:before="40" w:after="40" w:lineRule="auto" w:line="240"/>
+              <w:ind w:left="0" w:firstLine="0" w:right="0"/>
+              <w:spacing w:lineRule="auto" w:after="40" w:before="40" w:line="240"/>
             </w:pPr>
             <w:r>
               <w:t xml:space="preserve">STRING</w:t>
@@ -8520,8 +8776,8 @@
           <w:p>
             <w:pPr>
               <w:pStyle w:val="Compact"/>
-              <w:ind w:right="0" w:firstLine="0" w:left="0"/>
-              <w:spacing w:before="40" w:after="40" w:lineRule="auto" w:line="240"/>
+              <w:ind w:left="0" w:firstLine="0" w:right="0"/>
+              <w:spacing w:lineRule="auto" w:after="40" w:before="40" w:line="240"/>
             </w:pPr>
             <w:r>
               <w:t xml:space="preserve">Plain text</w:t>
@@ -8533,8 +8789,8 @@
           <w:p>
             <w:pPr>
               <w:pStyle w:val="Compact"/>
-              <w:ind w:right="0" w:firstLine="0" w:left="0"/>
-              <w:spacing w:before="40" w:after="40" w:lineRule="auto" w:line="240"/>
+              <w:ind w:left="0" w:firstLine="0" w:right="0"/>
+              <w:spacing w:lineRule="auto" w:after="40" w:before="40" w:line="240"/>
             </w:pPr>
             <w:r>
               <w:t xml:space="preserve">Unformatted text value</w:t>
@@ -8548,8 +8804,8 @@
           <w:p>
             <w:pPr>
               <w:pStyle w:val="Compact"/>
-              <w:ind w:right="0" w:firstLine="0" w:left="0"/>
-              <w:spacing w:before="40" w:after="40" w:lineRule="auto" w:line="240"/>
+              <w:ind w:left="0" w:firstLine="0" w:right="0"/>
+              <w:spacing w:lineRule="auto" w:after="40" w:before="40" w:line="240"/>
             </w:pPr>
             <w:r>
               <w:t xml:space="preserve">INTEGER</w:t>
@@ -8561,8 +8817,8 @@
           <w:p>
             <w:pPr>
               <w:pStyle w:val="Compact"/>
-              <w:ind w:right="0" w:firstLine="0" w:left="0"/>
-              <w:spacing w:before="40" w:after="40" w:lineRule="auto" w:line="240"/>
+              <w:ind w:left="0" w:firstLine="0" w:right="0"/>
+              <w:spacing w:lineRule="auto" w:after="40" w:before="40" w:line="240"/>
             </w:pPr>
             <w:r>
               <w:t xml:space="preserve">Whole number</w:t>
@@ -8574,8 +8830,8 @@
           <w:p>
             <w:pPr>
               <w:pStyle w:val="Compact"/>
-              <w:ind w:right="0" w:firstLine="0" w:left="0"/>
-              <w:spacing w:before="40" w:after="40" w:lineRule="auto" w:line="240"/>
+              <w:ind w:left="0" w:firstLine="0" w:right="0"/>
+              <w:spacing w:lineRule="auto" w:after="40" w:before="40" w:line="240"/>
             </w:pPr>
             <w:r>
               <w:t xml:space="preserve">Numeric value (supports min/max bounds)</w:t>
@@ -8589,8 +8845,8 @@
           <w:p>
             <w:pPr>
               <w:pStyle w:val="Compact"/>
-              <w:ind w:right="0" w:firstLine="0" w:left="0"/>
-              <w:spacing w:before="40" w:after="40" w:lineRule="auto" w:line="240"/>
+              <w:ind w:left="0" w:firstLine="0" w:right="0"/>
+              <w:spacing w:lineRule="auto" w:after="40" w:before="40" w:line="240"/>
             </w:pPr>
             <w:r>
               <w:t xml:space="preserve">REAL</w:t>
@@ -8602,8 +8858,8 @@
           <w:p>
             <w:pPr>
               <w:pStyle w:val="Compact"/>
-              <w:ind w:right="0" w:firstLine="0" w:left="0"/>
-              <w:spacing w:before="40" w:after="40" w:lineRule="auto" w:line="240"/>
+              <w:ind w:left="0" w:firstLine="0" w:right="0"/>
+              <w:spacing w:lineRule="auto" w:after="40" w:before="40" w:line="240"/>
             </w:pPr>
             <w:r>
               <w:t xml:space="preserve">Decimal number</w:t>
@@ -8615,8 +8871,8 @@
           <w:p>
             <w:pPr>
               <w:pStyle w:val="Compact"/>
-              <w:ind w:right="0" w:firstLine="0" w:left="0"/>
-              <w:spacing w:before="40" w:after="40" w:lineRule="auto" w:line="240"/>
+              <w:ind w:left="0" w:firstLine="0" w:right="0"/>
+              <w:spacing w:lineRule="auto" w:after="40" w:before="40" w:line="240"/>
             </w:pPr>
             <w:r>
               <w:t xml:space="preserve">Floating-point value (supports min/max bounds)</w:t>
@@ -8630,8 +8886,8 @@
           <w:p>
             <w:pPr>
               <w:pStyle w:val="Compact"/>
-              <w:ind w:right="0" w:firstLine="0" w:left="0"/>
-              <w:spacing w:before="40" w:after="40" w:lineRule="auto" w:line="240"/>
+              <w:ind w:left="0" w:firstLine="0" w:right="0"/>
+              <w:spacing w:lineRule="auto" w:after="40" w:before="40" w:line="240"/>
             </w:pPr>
             <w:r>
               <w:t xml:space="preserve">BOOLEAN</w:t>
@@ -8643,8 +8899,8 @@
           <w:p>
             <w:pPr>
               <w:pStyle w:val="Compact"/>
-              <w:ind w:right="0" w:firstLine="0" w:left="0"/>
-              <w:spacing w:before="40" w:after="40" w:lineRule="auto" w:line="240"/>
+              <w:ind w:left="0" w:firstLine="0" w:right="0"/>
+              <w:spacing w:lineRule="auto" w:after="40" w:before="40" w:line="240"/>
             </w:pPr>
             <w:r>
               <w:t xml:space="preserve">true / false</w:t>
@@ -8656,8 +8912,8 @@
           <w:p>
             <w:pPr>
               <w:pStyle w:val="Compact"/>
-              <w:ind w:right="0" w:firstLine="0" w:left="0"/>
-              <w:spacing w:before="40" w:after="40" w:lineRule="auto" w:line="240"/>
+              <w:ind w:left="0" w:firstLine="0" w:right="0"/>
+              <w:spacing w:lineRule="auto" w:after="40" w:before="40" w:line="240"/>
             </w:pPr>
             <w:r>
               <w:t xml:space="preserve">Boolean flag</w:t>
@@ -8671,8 +8927,8 @@
           <w:p>
             <w:pPr>
               <w:pStyle w:val="Compact"/>
-              <w:ind w:right="0" w:firstLine="0" w:left="0"/>
-              <w:spacing w:before="40" w:after="40" w:lineRule="auto" w:line="240"/>
+              <w:ind w:left="0" w:firstLine="0" w:right="0"/>
+              <w:spacing w:lineRule="auto" w:after="40" w:before="40" w:line="240"/>
             </w:pPr>
             <w:r>
               <w:t xml:space="preserve">DATE</w:t>
@@ -8684,8 +8940,8 @@
           <w:p>
             <w:pPr>
               <w:pStyle w:val="Compact"/>
-              <w:ind w:right="0" w:firstLine="0" w:left="0"/>
-              <w:spacing w:before="40" w:after="40" w:lineRule="auto" w:line="240"/>
+              <w:ind w:left="0" w:firstLine="0" w:right="0"/>
+              <w:spacing w:lineRule="auto" w:after="40" w:before="40" w:line="240"/>
             </w:pPr>
             <w:r>
               <w:t xml:space="preserve">YYYY-MM-DD</w:t>
@@ -8697,8 +8953,8 @@
           <w:p>
             <w:pPr>
               <w:pStyle w:val="Compact"/>
-              <w:ind w:right="0" w:firstLine="0" w:left="0"/>
-              <w:spacing w:before="40" w:after="40" w:lineRule="auto" w:line="240"/>
+              <w:ind w:left="0" w:firstLine="0" w:right="0"/>
+              <w:spacing w:lineRule="auto" w:after="40" w:before="40" w:line="240"/>
             </w:pPr>
             <w:r>
               <w:t xml:space="preserve">ISO 8601 date</w:t>
@@ -8712,8 +8968,8 @@
           <w:p>
             <w:pPr>
               <w:pStyle w:val="Compact"/>
-              <w:ind w:right="0" w:firstLine="0" w:left="0"/>
-              <w:spacing w:before="40" w:after="40" w:lineRule="auto" w:line="240"/>
+              <w:ind w:left="0" w:firstLine="0" w:right="0"/>
+              <w:spacing w:lineRule="auto" w:after="40" w:before="40" w:line="240"/>
             </w:pPr>
             <w:r>
               <w:t xml:space="preserve">ENUM</w:t>
@@ -8725,8 +8981,8 @@
           <w:p>
             <w:pPr>
               <w:pStyle w:val="Compact"/>
-              <w:ind w:right="0" w:firstLine="0" w:left="0"/>
-              <w:spacing w:before="40" w:after="40" w:lineRule="auto" w:line="240"/>
+              <w:ind w:left="0" w:firstLine="0" w:right="0"/>
+              <w:spacing w:lineRule="auto" w:after="40" w:before="40" w:line="240"/>
             </w:pPr>
             <w:r>
               <w:t xml:space="preserve">Named value</w:t>
@@ -8738,8 +8994,8 @@
           <w:p>
             <w:pPr>
               <w:pStyle w:val="Compact"/>
-              <w:ind w:right="0" w:firstLine="0" w:left="0"/>
-              <w:spacing w:before="40" w:after="40" w:lineRule="auto" w:line="240"/>
+              <w:ind w:left="0" w:firstLine="0" w:right="0"/>
+              <w:spacing w:lineRule="auto" w:after="40" w:before="40" w:line="240"/>
             </w:pPr>
             <w:r>
               <w:t xml:space="preserve">One of a model-declared set of values</w:t>
@@ -8753,8 +9009,8 @@
           <w:p>
             <w:pPr>
               <w:pStyle w:val="Compact"/>
-              <w:ind w:right="0" w:firstLine="0" w:left="0"/>
-              <w:spacing w:before="40" w:after="40" w:lineRule="auto" w:line="240"/>
+              <w:ind w:left="0" w:firstLine="0" w:right="0"/>
+              <w:spacing w:lineRule="auto" w:after="40" w:before="40" w:line="240"/>
             </w:pPr>
             <w:r>
               <w:t xml:space="preserve">XHTML</w:t>
@@ -8766,8 +9022,8 @@
           <w:p>
             <w:pPr>
               <w:pStyle w:val="Compact"/>
-              <w:ind w:right="0" w:firstLine="0" w:left="0"/>
-              <w:spacing w:before="40" w:after="40" w:lineRule="auto" w:line="240"/>
+              <w:ind w:left="0" w:firstLine="0" w:right="0"/>
+              <w:spacing w:lineRule="auto" w:after="40" w:before="40" w:line="240"/>
             </w:pPr>
             <w:r>
               <w:t xml:space="preserve">Markdown text</w:t>
@@ -8779,8 +9035,8 @@
           <w:p>
             <w:pPr>
               <w:pStyle w:val="Compact"/>
-              <w:ind w:right="0" w:firstLine="0" w:left="0"/>
-              <w:spacing w:before="40" w:after="40" w:lineRule="auto" w:line="240"/>
+              <w:ind w:left="0" w:firstLine="0" w:right="0"/>
+              <w:spacing w:lineRule="auto" w:after="40" w:before="40" w:line="240"/>
             </w:pPr>
             <w:r>
               <w:t xml:space="preserve">Rich text preserving block and inline formatting</w:t>
@@ -8789,8 +9045,8 @@
         </w:tc>
       </w:tr>
     </w:tbl>
-    <w:bookmarkEnd w:id="74"/>
-    <w:bookmarkStart w:id="75" w:name="enum-definitions"/>
+    <w:bookmarkEnd w:id="75"/>
+    <w:bookmarkStart w:id="76" w:name="enum-definitions"/>
     <w:p>
       <w:pPr>
         <w:pStyle w:val="Heading2"/>
@@ -8879,8 +9135,8 @@
         <w:t xml:space="preserve">An enum value that does not match one of the declared keys is a constraint violation.</w:t>
       </w:r>
     </w:p>
-    <w:bookmarkEnd w:id="75"/>
-    <w:bookmarkStart w:id="76" w:name="attribute-type-declarations"/>
+    <w:bookmarkEnd w:id="76"/>
+    <w:bookmarkStart w:id="77" w:name="attribute-type-declarations"/>
     <w:p>
       <w:pPr>
         <w:pStyle w:val="Heading2"/>
@@ -8906,7 +9162,7 @@
         <w:pStyle w:val="Compact"/>
         <w:numPr>
           <w:ilvl w:val="0"/>
-          <w:numId w:val="1023"/>
+          <w:numId w:val="1024"/>
         </w:numPr>
       </w:pPr>
       <w:r>
@@ -8946,7 +9202,7 @@
         <w:pStyle w:val="Compact"/>
         <w:numPr>
           <w:ilvl w:val="0"/>
-          <w:numId w:val="1023"/>
+          <w:numId w:val="1024"/>
         </w:numPr>
       </w:pPr>
       <w:r>
@@ -8968,7 +9224,7 @@
         <w:pStyle w:val="Compact"/>
         <w:numPr>
           <w:ilvl w:val="0"/>
-          <w:numId w:val="1023"/>
+          <w:numId w:val="1024"/>
         </w:numPr>
       </w:pPr>
       <w:r>
@@ -8990,7 +9246,7 @@
         <w:pStyle w:val="Compact"/>
         <w:numPr>
           <w:ilvl w:val="0"/>
-          <w:numId w:val="1023"/>
+          <w:numId w:val="1024"/>
         </w:numPr>
       </w:pPr>
       <w:r>
@@ -9012,7 +9268,7 @@
         <w:pStyle w:val="Compact"/>
         <w:numPr>
           <w:ilvl w:val="0"/>
-          <w:numId w:val="1023"/>
+          <w:numId w:val="1024"/>
         </w:numPr>
       </w:pPr>
       <w:r>
@@ -9029,9 +9285,9 @@
         <w:t xml:space="preserve">— bounds for INTEGER and REAL attributes.</w:t>
       </w:r>
     </w:p>
-    <w:bookmarkEnd w:id="76"/>
     <w:bookmarkEnd w:id="77"/>
-    <w:bookmarkStart w:id="78" w:name="summary"/>
+    <w:bookmarkEnd w:id="78"/>
+    <w:bookmarkStart w:id="79" w:name="summary"/>
     <w:p>
       <w:pPr>
         <w:pStyle w:val="Heading1"/>
@@ -9057,7 +9313,7 @@
         <w:pStyle w:val="Compact"/>
         <w:numPr>
           <w:ilvl w:val="0"/>
-          <w:numId w:val="1024"/>
+          <w:numId w:val="1025"/>
         </w:numPr>
       </w:pPr>
       <w:r>
@@ -9091,7 +9347,7 @@
         <w:pStyle w:val="Compact"/>
         <w:numPr>
           <w:ilvl w:val="0"/>
-          <w:numId w:val="1024"/>
+          <w:numId w:val="1025"/>
         </w:numPr>
       </w:pPr>
       <w:r>
@@ -9134,7 +9390,7 @@
         <w:pStyle w:val="Compact"/>
         <w:numPr>
           <w:ilvl w:val="0"/>
-          <w:numId w:val="1024"/>
+          <w:numId w:val="1025"/>
         </w:numPr>
       </w:pPr>
       <w:r>
@@ -9168,7 +9424,7 @@
         <w:pStyle w:val="Compact"/>
         <w:numPr>
           <w:ilvl w:val="0"/>
-          <w:numId w:val="1024"/>
+          <w:numId w:val="1025"/>
         </w:numPr>
       </w:pPr>
       <w:r>
@@ -9202,7 +9458,7 @@
         <w:pStyle w:val="Compact"/>
         <w:numPr>
           <w:ilvl w:val="0"/>
-          <w:numId w:val="1024"/>
+          <w:numId w:val="1025"/>
         </w:numPr>
       </w:pPr>
       <w:r>
@@ -9251,7 +9507,7 @@
         <w:pStyle w:val="Compact"/>
         <w:numPr>
           <w:ilvl w:val="0"/>
-          <w:numId w:val="1024"/>
+          <w:numId w:val="1025"/>
         </w:numPr>
       </w:pPr>
       <w:r>
@@ -9288,7 +9544,7 @@
         <w:t xml:space="preserve">The language is model-parameterized: the type environment determines what types, attributes, relations, and constraints are active. Any compliant processor that loads the same model will interpret the same CommonSpec document identically.</w:t>
       </w:r>
     </w:p>
-    <w:bookmarkEnd w:id="78"/>
+    <w:bookmarkEnd w:id="79"/>
     <w:sectPr>
       <w:footerReference r:id="rId9200" w:type="default"/>
       <w:headerReference r:id="rId9101" w:type="default"/>
@@ -9307,17 +9563,17 @@
 </file>
 
 <file path=word/footer1.xml><?xml version="1.0" encoding="utf-8"?>
-<w:ftr xmlns:r="http://schemas.openxmlformats.org/officeDocument/2006/relationships" xmlns:w="http://schemas.openxmlformats.org/wordprocessingml/2006/main">
+<w:ftr xmlns:w="http://schemas.openxmlformats.org/wordprocessingml/2006/main" xmlns:r="http://schemas.openxmlformats.org/officeDocument/2006/relationships">
   <w:tbl>
     <w:tblPr>
       <w:tblW w:w="5000" w:type="pct"/>
       <w:tblBorders>
-        <w:top w:color="CCCCCC" w:sz="4" w:val="single" w:space="1"/>
-        <w:bottom w:color="auto" w:sz="0" w:val="none" w:space="0"/>
-        <w:left w:color="auto" w:sz="0" w:val="none" w:space="0"/>
-        <w:right w:color="auto" w:sz="0" w:val="none" w:space="0"/>
-        <w:insideH w:color="auto" w:sz="0" w:val="none" w:space="0"/>
-        <w:insideV w:color="auto" w:sz="0" w:val="none" w:space="0"/>
+        <w:top w:space="1" w:val="single" w:color="CCCCCC" w:sz="4"/>
+        <w:bottom w:space="0" w:val="none" w:color="auto" w:sz="0"/>
+        <w:left w:space="0" w:val="none" w:color="auto" w:sz="0"/>
+        <w:right w:space="0" w:val="none" w:color="auto" w:sz="0"/>
+        <w:insideH w:space="0" w:val="none" w:color="auto" w:sz="0"/>
+        <w:insideV w:space="0" w:val="none" w:color="auto" w:sz="0"/>
       </w:tblBorders>
       <w:tblLayout w:type="fixed"/>
     </w:tblPr>
@@ -9433,7 +9689,7 @@
 </file>
 
 <file path=word/header1.xml><?xml version="1.0" encoding="utf-8"?>
-<w:hdr xmlns:r="http://schemas.openxmlformats.org/officeDocument/2006/relationships" xmlns:w="http://schemas.openxmlformats.org/wordprocessingml/2006/main">
+<w:hdr xmlns:w="http://schemas.openxmlformats.org/wordprocessingml/2006/main" xmlns:r="http://schemas.openxmlformats.org/officeDocument/2006/relationships">
   <w:p>
     <w:pPr>
       <w:pStyle w:val="Header"/>
@@ -9443,7 +9699,7 @@
 </file>
 
 <file path=word/header2.xml><?xml version="1.0" encoding="utf-8"?>
-<w:hdr xmlns:r="http://schemas.openxmlformats.org/officeDocument/2006/relationships" xmlns:w="http://schemas.openxmlformats.org/wordprocessingml/2006/main">
+<w:hdr xmlns:w="http://schemas.openxmlformats.org/wordprocessingml/2006/main" xmlns:r="http://schemas.openxmlformats.org/officeDocument/2006/relationships">
   <w:p>
     <w:pPr>
       <w:pStyle w:val="Header"/>
@@ -9486,7 +9742,7 @@
       <w:lvlText w:val="%1"/>
       <w:lvlJc w:val="left"/>
       <w:pPr>
-        <w:ind w:hanging="0" w:left="0"/>
+        <w:ind w:left="0" w:hanging="0"/>
       </w:pPr>
     </w:lvl>
     <w:lvl w:ilvl="1">
@@ -9498,7 +9754,7 @@
       <w:lvlText w:val="%1.%2"/>
       <w:lvlJc w:val="left"/>
       <w:pPr>
-        <w:ind w:hanging="0" w:left="0"/>
+        <w:ind w:left="0" w:hanging="0"/>
       </w:pPr>
     </w:lvl>
     <w:lvl w:ilvl="2">
@@ -9510,7 +9766,7 @@
       <w:lvlText w:val="%1.%2.%3"/>
       <w:lvlJc w:val="left"/>
       <w:pPr>
-        <w:ind w:hanging="0" w:left="0"/>
+        <w:ind w:left="0" w:hanging="0"/>
       </w:pPr>
     </w:lvl>
     <w:lvl w:ilvl="3">
@@ -9522,7 +9778,7 @@
       <w:lvlText w:val="%1.%2.%3.%4"/>
       <w:lvlJc w:val="left"/>
       <w:pPr>
-        <w:ind w:hanging="0" w:left="0"/>
+        <w:ind w:left="0" w:hanging="0"/>
       </w:pPr>
     </w:lvl>
     <w:lvl w:ilvl="4">
@@ -9534,7 +9790,7 @@
       <w:lvlText w:val="%1.%2.%3.%4.%5"/>
       <w:lvlJc w:val="left"/>
       <w:pPr>
-        <w:ind w:hanging="0" w:left="0"/>
+        <w:ind w:left="0" w:hanging="0"/>
       </w:pPr>
     </w:lvl>
   </w:abstractNum>
@@ -9848,27 +10104,6 @@
     </w:lvlOverride>
   </w:num>
   <w:num w:numId="1006">
-    <w:abstractNumId w:val="991"/>
-  </w:num>
-  <w:num w:numId="1007">
-    <w:abstractNumId w:val="991"/>
-  </w:num>
-  <w:num w:numId="1008">
-    <w:abstractNumId w:val="991"/>
-  </w:num>
-  <w:num w:numId="1009">
-    <w:abstractNumId w:val="991"/>
-  </w:num>
-  <w:num w:numId="1010">
-    <w:abstractNumId w:val="991"/>
-  </w:num>
-  <w:num w:numId="1011">
-    <w:abstractNumId w:val="991"/>
-  </w:num>
-  <w:num w:numId="1012">
-    <w:abstractNumId w:val="991"/>
-  </w:num>
-  <w:num w:numId="1013">
     <w:abstractNumId w:val="99411"/>
     <w:lvlOverride w:ilvl="0">
       <w:startOverride w:val="1"/>
@@ -9898,13 +10133,28 @@
       <w:startOverride w:val="1"/>
     </w:lvlOverride>
   </w:num>
-  <w:num w:numId="1014">
+  <w:num w:numId="1007">
     <w:abstractNumId w:val="991"/>
   </w:num>
-  <w:num w:numId="1015">
+  <w:num w:numId="1008">
     <w:abstractNumId w:val="991"/>
   </w:num>
-  <w:num w:numId="1016">
+  <w:num w:numId="1009">
+    <w:abstractNumId w:val="991"/>
+  </w:num>
+  <w:num w:numId="1010">
+    <w:abstractNumId w:val="991"/>
+  </w:num>
+  <w:num w:numId="1011">
+    <w:abstractNumId w:val="991"/>
+  </w:num>
+  <w:num w:numId="1012">
+    <w:abstractNumId w:val="991"/>
+  </w:num>
+  <w:num w:numId="1013">
+    <w:abstractNumId w:val="991"/>
+  </w:num>
+  <w:num w:numId="1014">
     <w:abstractNumId w:val="99411"/>
     <w:lvlOverride w:ilvl="0">
       <w:startOverride w:val="1"/>
@@ -9934,8 +10184,41 @@
       <w:startOverride w:val="1"/>
     </w:lvlOverride>
   </w:num>
+  <w:num w:numId="1015">
+    <w:abstractNumId w:val="991"/>
+  </w:num>
+  <w:num w:numId="1016">
+    <w:abstractNumId w:val="991"/>
+  </w:num>
   <w:num w:numId="1017">
-    <w:abstractNumId w:val="991"/>
+    <w:abstractNumId w:val="99411"/>
+    <w:lvlOverride w:ilvl="0">
+      <w:startOverride w:val="1"/>
+    </w:lvlOverride>
+    <w:lvlOverride w:ilvl="1">
+      <w:startOverride w:val="1"/>
+    </w:lvlOverride>
+    <w:lvlOverride w:ilvl="2">
+      <w:startOverride w:val="1"/>
+    </w:lvlOverride>
+    <w:lvlOverride w:ilvl="3">
+      <w:startOverride w:val="1"/>
+    </w:lvlOverride>
+    <w:lvlOverride w:ilvl="4">
+      <w:startOverride w:val="1"/>
+    </w:lvlOverride>
+    <w:lvlOverride w:ilvl="5">
+      <w:startOverride w:val="1"/>
+    </w:lvlOverride>
+    <w:lvlOverride w:ilvl="6">
+      <w:startOverride w:val="1"/>
+    </w:lvlOverride>
+    <w:lvlOverride w:ilvl="7">
+      <w:startOverride w:val="1"/>
+    </w:lvlOverride>
+    <w:lvlOverride w:ilvl="8">
+      <w:startOverride w:val="1"/>
+    </w:lvlOverride>
   </w:num>
   <w:num w:numId="1018">
     <w:abstractNumId w:val="991"/>
@@ -9956,6 +10239,9 @@
     <w:abstractNumId w:val="991"/>
   </w:num>
   <w:num w:numId="1024">
+    <w:abstractNumId w:val="991"/>
+  </w:num>
+  <w:num w:numId="1025">
     <w:abstractNumId w:val="99411"/>
     <w:lvlOverride w:ilvl="0">
       <w:startOverride w:val="1"/>
@@ -10882,46 +11168,18 @@
     <w:basedOn w:val="VerbatimChar"/>
     <w:rPr/>
   </w:style>
-  <w:style w:customStyle="1" w:styleId="VerbatimChar" w:type="character">
-    <w:name w:val="Verbatim Char"/>
-    <w:rPr>
-      <w:rFonts w:hAnsi="Courier New" w:ascii="Courier New" w:cs="Courier New"/>
-      <w:sz w:val="20"/>
-      <w:szCs w:val="20"/>
-    </w:rPr>
-  </w:style>
-  <w:style w:customStyle="1" w:styleId="SourceCode" w:type="paragraph">
-    <w:name w:val="Source Code"/>
-    <w:basedOn w:val="Normal"/>
-    <w:pPr>
-      <w:spacing w:before="0" w:after="0" w:lineRule="auto" w:line="240"/>
-      <w:jc w:val="left"/>
-      <w:pBdr>
-        <w:top w:color="CCCCCC" w:sz="4" w:val="single" w:space="1"/>
-        <w:bottom w:color="CCCCCC" w:sz="4" w:val="single" w:space="1"/>
-        <w:left w:color="CCCCCC" w:sz="4" w:val="single" w:space="1"/>
-        <w:right w:color="CCCCCC" w:sz="4" w:val="single" w:space="1"/>
-      </w:pBdr>
-      <w:shd w:fill="F5F5F5" w:val="clear" w:color="auto"/>
-    </w:pPr>
-    <w:rPr>
-      <w:rFonts w:hAnsi="Courier New" w:ascii="Courier New" w:cs="Courier New"/>
-      <w:sz w:val="20"/>
-      <w:szCs w:val="20"/>
-    </w:rPr>
-  </w:style>
-  <w:style w:customStyle="1" w:styleId="SpecObjectHeader" w:type="paragraph">
+  <w:style w:type="paragraph" w:styleId="SpecObjectHeader" w:customStyle="1">
     <w:name w:val="Spec Object Header"/>
     <w:basedOn w:val="Normal"/>
     <w:next w:val="FirstParagraph"/>
     <w:qFormat/>
     <w:pPr>
       <w:keepNext/>
-      <w:spacing w:before="280" w:after="120" w:lineRule="auto" w:line="276"/>
+      <w:spacing w:lineRule="auto" w:after="120" w:before="280" w:line="276"/>
       <w:outlineLvl w:val="0"/>
     </w:pPr>
     <w:rPr>
-      <w:rFonts w:hAnsi="Calibri Light" w:ascii="Calibri Light" w:cs="Calibri Light"/>
+      <w:rFonts w:hAnsi="Calibri Light" w:cs="Calibri Light" w:ascii="Calibri Light"/>
       <w:b/>
       <w:bCs/>
       <w:color w:val="0F4C64"/>

</xml_diff>

<commit_message>
Deploy documentation from v0.3
</commit_message>
<xml_diff>
--- a/commonspec/downloads/commonspec.docx
+++ b/commonspec/downloads/commonspec.docx
@@ -1686,7 +1686,7 @@
     </w:p>
     <w:p>
       <w:pPr>
-        <w:spacing w:line="20" w:before="0" w:lineRule="exact" w:after="0"/>
+        <w:spacing w:lineRule="exact" w:line="20" w:before="0" w:after="0"/>
         <w:rPr>
           <w:sz w:val="2"/>
         </w:rPr>
@@ -2394,7 +2394,7 @@
     </w:p>
     <w:p>
       <w:pPr>
-        <w:spacing w:line="20" w:before="0" w:lineRule="exact" w:after="0"/>
+        <w:spacing w:lineRule="exact" w:line="20" w:before="0" w:after="0"/>
         <w:rPr>
           <w:sz w:val="2"/>
         </w:rPr>
@@ -3398,7 +3398,7 @@
     </w:p>
     <w:p>
       <w:pPr>
-        <w:spacing w:line="20" w:before="0" w:lineRule="exact" w:after="0"/>
+        <w:spacing w:lineRule="exact" w:line="20" w:before="0" w:after="0"/>
         <w:rPr>
           <w:sz w:val="2"/>
         </w:rPr>
@@ -4294,7 +4294,7 @@
     </w:p>
     <w:p>
       <w:pPr>
-        <w:spacing w:line="20" w:before="0" w:lineRule="exact" w:after="0"/>
+        <w:spacing w:lineRule="exact" w:line="20" w:before="0" w:after="0"/>
         <w:rPr>
           <w:sz w:val="2"/>
         </w:rPr>
@@ -5440,7 +5440,7 @@
     </w:p>
     <w:p>
       <w:pPr>
-        <w:spacing w:line="20" w:before="0" w:lineRule="exact" w:after="0"/>
+        <w:spacing w:lineRule="exact" w:line="20" w:before="0" w:after="0"/>
         <w:rPr>
           <w:sz w:val="2"/>
         </w:rPr>
@@ -6214,12 +6214,12 @@
         <w:tblLook w:firstRow="1" w:lastRow="0" w:firstColumn="0" w:lastColumn="0" w:noHBand="0" w:noVBand="0" w:val="0020"/>
         <w:jc w:val="start"/>
         <w:tblBorders>
-          <w:top w:color="000000" w:sz="6" w:space="0" w:val="single"/>
-          <w:left w:color="000000" w:sz="6" w:space="0" w:val="single"/>
-          <w:bottom w:color="000000" w:sz="6" w:space="0" w:val="single"/>
-          <w:right w:color="000000" w:sz="6" w:space="0" w:val="single"/>
-          <w:insideH w:color="000000" w:sz="6" w:space="0" w:val="single"/>
-          <w:insideV w:color="000000" w:sz="6" w:space="0" w:val="single"/>
+          <w:top w:color="000000" w:space="0" w:sz="6" w:val="single"/>
+          <w:left w:color="000000" w:space="0" w:sz="6" w:val="single"/>
+          <w:bottom w:color="000000" w:space="0" w:sz="6" w:val="single"/>
+          <w:right w:color="000000" w:space="0" w:sz="6" w:val="single"/>
+          <w:insideH w:color="000000" w:space="0" w:sz="6" w:val="single"/>
+          <w:insideV w:color="000000" w:space="0" w:sz="6" w:val="single"/>
         </w:tblBorders>
         <w:tblCellMar>
           <w:top w:type="dxa" w:w="57"/>
@@ -6248,8 +6248,8 @@
             <w:pPr>
               <w:pStyle w:val="Compact"/>
               <w:jc w:val="left"/>
-              <w:ind w:left="0" w:firstLine="0" w:right="0"/>
-              <w:spacing w:after="40" w:lineRule="auto" w:line="240" w:before="40"/>
+              <w:ind w:right="0" w:left="0" w:firstLine="0"/>
+              <w:spacing w:lineRule="auto" w:after="40" w:before="40" w:line="240"/>
             </w:pPr>
             <w:r>
               <w:rPr>
@@ -6267,8 +6267,8 @@
             <w:pPr>
               <w:pStyle w:val="Compact"/>
               <w:jc w:val="left"/>
-              <w:ind w:left="0" w:firstLine="0" w:right="0"/>
-              <w:spacing w:after="40" w:lineRule="auto" w:line="240" w:before="40"/>
+              <w:ind w:right="0" w:left="0" w:firstLine="0"/>
+              <w:spacing w:lineRule="auto" w:after="40" w:before="40" w:line="240"/>
             </w:pPr>
             <w:r>
               <w:rPr>
@@ -6286,8 +6286,8 @@
             <w:pPr>
               <w:pStyle w:val="Compact"/>
               <w:jc w:val="left"/>
-              <w:ind w:left="0" w:firstLine="0" w:right="0"/>
-              <w:spacing w:after="40" w:lineRule="auto" w:line="240" w:before="40"/>
+              <w:ind w:right="0" w:left="0" w:firstLine="0"/>
+              <w:spacing w:lineRule="auto" w:after="40" w:before="40" w:line="240"/>
             </w:pPr>
             <w:r>
               <w:rPr>
@@ -6305,8 +6305,8 @@
             <w:pPr>
               <w:pStyle w:val="Compact"/>
               <w:jc w:val="left"/>
-              <w:ind w:left="0" w:firstLine="0" w:right="0"/>
-              <w:spacing w:after="40" w:lineRule="auto" w:line="240" w:before="40"/>
+              <w:ind w:right="0" w:left="0" w:firstLine="0"/>
+              <w:spacing w:lineRule="auto" w:after="40" w:before="40" w:line="240"/>
             </w:pPr>
             <w:r>
               <w:rPr>
@@ -6324,8 +6324,8 @@
             <w:pPr>
               <w:pStyle w:val="Compact"/>
               <w:jc w:val="left"/>
-              <w:ind w:left="0" w:firstLine="0" w:right="0"/>
-              <w:spacing w:after="40" w:lineRule="auto" w:line="240" w:before="40"/>
+              <w:ind w:right="0" w:left="0" w:firstLine="0"/>
+              <w:spacing w:lineRule="auto" w:after="40" w:before="40" w:line="240"/>
             </w:pPr>
             <w:r>
               <w:rPr>
@@ -6343,8 +6343,8 @@
             <w:pPr>
               <w:pStyle w:val="Compact"/>
               <w:jc w:val="left"/>
-              <w:ind w:left="0" w:firstLine="0" w:right="0"/>
-              <w:spacing w:after="40" w:lineRule="auto" w:line="240" w:before="40"/>
+              <w:ind w:right="0" w:left="0" w:firstLine="0"/>
+              <w:spacing w:lineRule="auto" w:after="40" w:before="40" w:line="240"/>
             </w:pPr>
             <w:r>
               <w:rPr>
@@ -6362,8 +6362,8 @@
             <w:pPr>
               <w:pStyle w:val="Compact"/>
               <w:jc w:val="left"/>
-              <w:ind w:left="0" w:firstLine="0" w:right="0"/>
-              <w:spacing w:after="40" w:lineRule="auto" w:line="240" w:before="40"/>
+              <w:ind w:right="0" w:left="0" w:firstLine="0"/>
+              <w:spacing w:lineRule="auto" w:after="40" w:before="40" w:line="240"/>
             </w:pPr>
             <w:r>
               <w:t xml:space="preserve">VERIFIES</w:t>
@@ -6376,8 +6376,8 @@
             <w:pPr>
               <w:pStyle w:val="Compact"/>
               <w:jc w:val="left"/>
-              <w:ind w:left="0" w:firstLine="0" w:right="0"/>
-              <w:spacing w:after="40" w:lineRule="auto" w:line="240" w:before="40"/>
+              <w:ind w:right="0" w:left="0" w:firstLine="0"/>
+              <w:spacing w:lineRule="auto" w:after="40" w:before="40" w:line="240"/>
             </w:pPr>
             <w:r>
               <w:rPr>
@@ -6393,8 +6393,8 @@
             <w:pPr>
               <w:pStyle w:val="Compact"/>
               <w:jc w:val="left"/>
-              <w:ind w:left="0" w:firstLine="0" w:right="0"/>
-              <w:spacing w:after="40" w:lineRule="auto" w:line="240" w:before="40"/>
+              <w:ind w:right="0" w:left="0" w:firstLine="0"/>
+              <w:spacing w:lineRule="auto" w:after="40" w:before="40" w:line="240"/>
             </w:pPr>
             <w:r>
               <w:rPr>
@@ -6410,8 +6410,8 @@
             <w:pPr>
               <w:pStyle w:val="Compact"/>
               <w:jc w:val="left"/>
-              <w:ind w:left="0" w:firstLine="0" w:right="0"/>
-              <w:spacing w:after="40" w:lineRule="auto" w:line="240" w:before="40"/>
+              <w:ind w:right="0" w:left="0" w:firstLine="0"/>
+              <w:spacing w:lineRule="auto" w:after="40" w:before="40" w:line="240"/>
             </w:pPr>
             <w:r>
               <w:rPr>
@@ -6427,8 +6427,8 @@
             <w:pPr>
               <w:pStyle w:val="Compact"/>
               <w:jc w:val="left"/>
-              <w:ind w:left="0" w:firstLine="0" w:right="0"/>
-              <w:spacing w:after="40" w:lineRule="auto" w:line="240" w:before="40"/>
+              <w:ind w:right="0" w:left="0" w:firstLine="0"/>
+              <w:spacing w:lineRule="auto" w:after="40" w:before="40" w:line="240"/>
             </w:pPr>
             <w:r>
               <w:rPr>
@@ -6444,8 +6444,8 @@
             <w:pPr>
               <w:pStyle w:val="Compact"/>
               <w:jc w:val="left"/>
-              <w:ind w:left="0" w:firstLine="0" w:right="0"/>
-              <w:spacing w:after="40" w:lineRule="auto" w:line="240" w:before="40"/>
+              <w:ind w:right="0" w:left="0" w:firstLine="0"/>
+              <w:spacing w:lineRule="auto" w:after="40" w:before="40" w:line="240"/>
             </w:pPr>
             <w:r>
               <w:rPr>
@@ -6464,8 +6464,8 @@
             <w:pPr>
               <w:pStyle w:val="Compact"/>
               <w:jc w:val="left"/>
-              <w:ind w:left="0" w:firstLine="0" w:right="0"/>
-              <w:spacing w:after="40" w:lineRule="auto" w:line="240" w:before="40"/>
+              <w:ind w:right="0" w:left="0" w:firstLine="0"/>
+              <w:spacing w:lineRule="auto" w:after="40" w:before="40" w:line="240"/>
             </w:pPr>
             <w:r>
               <w:t xml:space="preserve">TRACES_TO</w:t>
@@ -6478,8 +6478,8 @@
             <w:pPr>
               <w:pStyle w:val="Compact"/>
               <w:jc w:val="left"/>
-              <w:ind w:left="0" w:firstLine="0" w:right="0"/>
-              <w:spacing w:after="40" w:lineRule="auto" w:line="240" w:before="40"/>
+              <w:ind w:right="0" w:left="0" w:firstLine="0"/>
+              <w:spacing w:lineRule="auto" w:after="40" w:before="40" w:line="240"/>
             </w:pPr>
             <w:r>
               <w:rPr>
@@ -6495,8 +6495,8 @@
             <w:pPr>
               <w:pStyle w:val="Compact"/>
               <w:jc w:val="left"/>
-              <w:ind w:left="0" w:firstLine="0" w:right="0"/>
-              <w:spacing w:after="40" w:lineRule="auto" w:line="240" w:before="40"/>
+              <w:ind w:right="0" w:left="0" w:firstLine="0"/>
+              <w:spacing w:lineRule="auto" w:after="40" w:before="40" w:line="240"/>
             </w:pPr>
             <w:r>
               <w:t xml:space="preserve">—</w:t>
@@ -6509,8 +6509,8 @@
             <w:pPr>
               <w:pStyle w:val="Compact"/>
               <w:jc w:val="left"/>
-              <w:ind w:left="0" w:firstLine="0" w:right="0"/>
-              <w:spacing w:after="40" w:lineRule="auto" w:line="240" w:before="40"/>
+              <w:ind w:right="0" w:left="0" w:firstLine="0"/>
+              <w:spacing w:lineRule="auto" w:after="40" w:before="40" w:line="240"/>
             </w:pPr>
             <w:r>
               <w:t xml:space="preserve">—</w:t>
@@ -6523,8 +6523,8 @@
             <w:pPr>
               <w:pStyle w:val="Compact"/>
               <w:jc w:val="left"/>
-              <w:ind w:left="0" w:firstLine="0" w:right="0"/>
-              <w:spacing w:after="40" w:lineRule="auto" w:line="240" w:before="40"/>
+              <w:ind w:right="0" w:left="0" w:firstLine="0"/>
+              <w:spacing w:lineRule="auto" w:after="40" w:before="40" w:line="240"/>
             </w:pPr>
             <w:r>
               <w:t xml:space="preserve">—</w:t>
@@ -6537,8 +6537,8 @@
             <w:pPr>
               <w:pStyle w:val="Compact"/>
               <w:jc w:val="left"/>
-              <w:ind w:left="0" w:firstLine="0" w:right="0"/>
-              <w:spacing w:after="40" w:lineRule="auto" w:line="240" w:before="40"/>
+              <w:ind w:right="0" w:left="0" w:firstLine="0"/>
+              <w:spacing w:lineRule="auto" w:after="40" w:before="40" w:line="240"/>
             </w:pPr>
             <w:r>
               <w:t xml:space="preserve">1</w:t>
@@ -6553,8 +6553,8 @@
             <w:pPr>
               <w:pStyle w:val="Compact"/>
               <w:jc w:val="left"/>
-              <w:ind w:left="0" w:firstLine="0" w:right="0"/>
-              <w:spacing w:after="40" w:lineRule="auto" w:line="240" w:before="40"/>
+              <w:ind w:right="0" w:left="0" w:firstLine="0"/>
+              <w:spacing w:lineRule="auto" w:after="40" w:before="40" w:line="240"/>
             </w:pPr>
             <w:r>
               <w:t xml:space="preserve">XREF_SEC</w:t>
@@ -6567,8 +6567,8 @@
             <w:pPr>
               <w:pStyle w:val="Compact"/>
               <w:jc w:val="left"/>
-              <w:ind w:left="0" w:firstLine="0" w:right="0"/>
-              <w:spacing w:after="40" w:lineRule="auto" w:line="240" w:before="40"/>
+              <w:ind w:right="0" w:left="0" w:firstLine="0"/>
+              <w:spacing w:lineRule="auto" w:after="40" w:before="40" w:line="240"/>
             </w:pPr>
             <w:r>
               <w:rPr>
@@ -6584,8 +6584,8 @@
             <w:pPr>
               <w:pStyle w:val="Compact"/>
               <w:jc w:val="left"/>
-              <w:ind w:left="0" w:firstLine="0" w:right="0"/>
-              <w:spacing w:after="40" w:lineRule="auto" w:line="240" w:before="40"/>
+              <w:ind w:right="0" w:left="0" w:firstLine="0"/>
+              <w:spacing w:lineRule="auto" w:after="40" w:before="40" w:line="240"/>
             </w:pPr>
             <w:r>
               <w:t xml:space="preserve">—</w:t>
@@ -6598,8 +6598,8 @@
             <w:pPr>
               <w:pStyle w:val="Compact"/>
               <w:jc w:val="left"/>
-              <w:ind w:left="0" w:firstLine="0" w:right="0"/>
-              <w:spacing w:after="40" w:lineRule="auto" w:line="240" w:before="40"/>
+              <w:ind w:right="0" w:left="0" w:firstLine="0"/>
+              <w:spacing w:lineRule="auto" w:after="40" w:before="40" w:line="240"/>
             </w:pPr>
             <w:r>
               <w:t xml:space="preserve">—</w:t>
@@ -6612,8 +6612,8 @@
             <w:pPr>
               <w:pStyle w:val="Compact"/>
               <w:jc w:val="left"/>
-              <w:ind w:left="0" w:firstLine="0" w:right="0"/>
-              <w:spacing w:after="40" w:lineRule="auto" w:line="240" w:before="40"/>
+              <w:ind w:right="0" w:left="0" w:firstLine="0"/>
+              <w:spacing w:lineRule="auto" w:after="40" w:before="40" w:line="240"/>
             </w:pPr>
             <w:r>
               <w:rPr>
@@ -6630,8 +6630,8 @@
             <w:pPr>
               <w:pStyle w:val="Compact"/>
               <w:jc w:val="left"/>
-              <w:ind w:left="0" w:firstLine="0" w:right="0"/>
-              <w:spacing w:after="40" w:lineRule="auto" w:line="240" w:before="40"/>
+              <w:ind w:right="0" w:left="0" w:firstLine="0"/>
+              <w:spacing w:lineRule="auto" w:after="40" w:before="40" w:line="240"/>
             </w:pPr>
             <w:r>
               <w:t xml:space="preserve">eliminated</w:t>
@@ -6920,7 +6920,7 @@
     </w:p>
     <w:p>
       <w:pPr>
-        <w:spacing w:line="20" w:before="0" w:lineRule="exact" w:after="0"/>
+        <w:spacing w:lineRule="exact" w:line="20" w:before="0" w:after="0"/>
         <w:rPr>
           <w:sz w:val="2"/>
         </w:rPr>
@@ -8684,7 +8684,7 @@
     </w:p>
     <w:p>
       <w:pPr>
-        <w:spacing w:line="20" w:before="0" w:lineRule="exact" w:after="0"/>
+        <w:spacing w:lineRule="exact" w:line="20" w:before="0" w:after="0"/>
         <w:rPr>
           <w:sz w:val="2"/>
         </w:rPr>
@@ -8726,12 +8726,12 @@
         <w:tblLook w:firstRow="1" w:lastRow="0" w:firstColumn="0" w:lastColumn="0" w:noHBand="0" w:noVBand="0" w:val="0020"/>
         <w:jc w:val="start"/>
         <w:tblBorders>
-          <w:top w:color="000000" w:sz="6" w:space="0" w:val="single"/>
-          <w:left w:color="000000" w:sz="6" w:space="0" w:val="single"/>
-          <w:bottom w:color="000000" w:sz="6" w:space="0" w:val="single"/>
-          <w:right w:color="000000" w:sz="6" w:space="0" w:val="single"/>
-          <w:insideH w:color="000000" w:sz="6" w:space="0" w:val="single"/>
-          <w:insideV w:color="000000" w:sz="6" w:space="0" w:val="single"/>
+          <w:top w:color="000000" w:space="0" w:sz="6" w:val="single"/>
+          <w:left w:color="000000" w:space="0" w:sz="6" w:val="single"/>
+          <w:bottom w:color="000000" w:space="0" w:sz="6" w:val="single"/>
+          <w:right w:color="000000" w:space="0" w:sz="6" w:val="single"/>
+          <w:insideH w:color="000000" w:space="0" w:sz="6" w:val="single"/>
+          <w:insideV w:color="000000" w:space="0" w:sz="6" w:val="single"/>
         </w:tblBorders>
         <w:tblCellMar>
           <w:top w:type="dxa" w:w="57"/>
@@ -8757,8 +8757,8 @@
             <w:pPr>
               <w:pStyle w:val="Compact"/>
               <w:jc w:val="left"/>
-              <w:ind w:left="0" w:firstLine="0" w:right="0"/>
-              <w:spacing w:after="40" w:lineRule="auto" w:line="240" w:before="40"/>
+              <w:ind w:right="0" w:left="0" w:firstLine="0"/>
+              <w:spacing w:lineRule="auto" w:after="40" w:before="40" w:line="240"/>
             </w:pPr>
             <w:r>
               <w:rPr>
@@ -8776,8 +8776,8 @@
             <w:pPr>
               <w:pStyle w:val="Compact"/>
               <w:jc w:val="left"/>
-              <w:ind w:left="0" w:firstLine="0" w:right="0"/>
-              <w:spacing w:after="40" w:lineRule="auto" w:line="240" w:before="40"/>
+              <w:ind w:right="0" w:left="0" w:firstLine="0"/>
+              <w:spacing w:lineRule="auto" w:after="40" w:before="40" w:line="240"/>
             </w:pPr>
             <w:r>
               <w:rPr>
@@ -8795,8 +8795,8 @@
             <w:pPr>
               <w:pStyle w:val="Compact"/>
               <w:jc w:val="left"/>
-              <w:ind w:left="0" w:firstLine="0" w:right="0"/>
-              <w:spacing w:after="40" w:lineRule="auto" w:line="240" w:before="40"/>
+              <w:ind w:right="0" w:left="0" w:firstLine="0"/>
+              <w:spacing w:lineRule="auto" w:after="40" w:before="40" w:line="240"/>
             </w:pPr>
             <w:r>
               <w:rPr>
@@ -8814,8 +8814,8 @@
             <w:pPr>
               <w:pStyle w:val="Compact"/>
               <w:jc w:val="left"/>
-              <w:ind w:left="0" w:firstLine="0" w:right="0"/>
-              <w:spacing w:after="40" w:lineRule="auto" w:line="240" w:before="40"/>
+              <w:ind w:right="0" w:left="0" w:firstLine="0"/>
+              <w:spacing w:lineRule="auto" w:after="40" w:before="40" w:line="240"/>
             </w:pPr>
             <w:r>
               <w:t xml:space="preserve">STRING</w:t>
@@ -8828,8 +8828,8 @@
             <w:pPr>
               <w:pStyle w:val="Compact"/>
               <w:jc w:val="left"/>
-              <w:ind w:left="0" w:firstLine="0" w:right="0"/>
-              <w:spacing w:after="40" w:lineRule="auto" w:line="240" w:before="40"/>
+              <w:ind w:right="0" w:left="0" w:firstLine="0"/>
+              <w:spacing w:lineRule="auto" w:after="40" w:before="40" w:line="240"/>
             </w:pPr>
             <w:r>
               <w:t xml:space="preserve">Plain text</w:t>
@@ -8842,8 +8842,8 @@
             <w:pPr>
               <w:pStyle w:val="Compact"/>
               <w:jc w:val="left"/>
-              <w:ind w:left="0" w:firstLine="0" w:right="0"/>
-              <w:spacing w:after="40" w:lineRule="auto" w:line="240" w:before="40"/>
+              <w:ind w:right="0" w:left="0" w:firstLine="0"/>
+              <w:spacing w:lineRule="auto" w:after="40" w:before="40" w:line="240"/>
             </w:pPr>
             <w:r>
               <w:t xml:space="preserve">Unformatted text value</w:t>
@@ -8858,8 +8858,8 @@
             <w:pPr>
               <w:pStyle w:val="Compact"/>
               <w:jc w:val="left"/>
-              <w:ind w:left="0" w:firstLine="0" w:right="0"/>
-              <w:spacing w:after="40" w:lineRule="auto" w:line="240" w:before="40"/>
+              <w:ind w:right="0" w:left="0" w:firstLine="0"/>
+              <w:spacing w:lineRule="auto" w:after="40" w:before="40" w:line="240"/>
             </w:pPr>
             <w:r>
               <w:t xml:space="preserve">INTEGER</w:t>
@@ -8872,8 +8872,8 @@
             <w:pPr>
               <w:pStyle w:val="Compact"/>
               <w:jc w:val="left"/>
-              <w:ind w:left="0" w:firstLine="0" w:right="0"/>
-              <w:spacing w:after="40" w:lineRule="auto" w:line="240" w:before="40"/>
+              <w:ind w:right="0" w:left="0" w:firstLine="0"/>
+              <w:spacing w:lineRule="auto" w:after="40" w:before="40" w:line="240"/>
             </w:pPr>
             <w:r>
               <w:t xml:space="preserve">Whole number</w:t>
@@ -8886,8 +8886,8 @@
             <w:pPr>
               <w:pStyle w:val="Compact"/>
               <w:jc w:val="left"/>
-              <w:ind w:left="0" w:firstLine="0" w:right="0"/>
-              <w:spacing w:after="40" w:lineRule="auto" w:line="240" w:before="40"/>
+              <w:ind w:right="0" w:left="0" w:firstLine="0"/>
+              <w:spacing w:lineRule="auto" w:after="40" w:before="40" w:line="240"/>
             </w:pPr>
             <w:r>
               <w:t xml:space="preserve">Numeric value (supports min/max bounds)</w:t>
@@ -8902,8 +8902,8 @@
             <w:pPr>
               <w:pStyle w:val="Compact"/>
               <w:jc w:val="left"/>
-              <w:ind w:left="0" w:firstLine="0" w:right="0"/>
-              <w:spacing w:after="40" w:lineRule="auto" w:line="240" w:before="40"/>
+              <w:ind w:right="0" w:left="0" w:firstLine="0"/>
+              <w:spacing w:lineRule="auto" w:after="40" w:before="40" w:line="240"/>
             </w:pPr>
             <w:r>
               <w:t xml:space="preserve">REAL</w:t>
@@ -8916,8 +8916,8 @@
             <w:pPr>
               <w:pStyle w:val="Compact"/>
               <w:jc w:val="left"/>
-              <w:ind w:left="0" w:firstLine="0" w:right="0"/>
-              <w:spacing w:after="40" w:lineRule="auto" w:line="240" w:before="40"/>
+              <w:ind w:right="0" w:left="0" w:firstLine="0"/>
+              <w:spacing w:lineRule="auto" w:after="40" w:before="40" w:line="240"/>
             </w:pPr>
             <w:r>
               <w:t xml:space="preserve">Decimal number</w:t>
@@ -8930,8 +8930,8 @@
             <w:pPr>
               <w:pStyle w:val="Compact"/>
               <w:jc w:val="left"/>
-              <w:ind w:left="0" w:firstLine="0" w:right="0"/>
-              <w:spacing w:after="40" w:lineRule="auto" w:line="240" w:before="40"/>
+              <w:ind w:right="0" w:left="0" w:firstLine="0"/>
+              <w:spacing w:lineRule="auto" w:after="40" w:before="40" w:line="240"/>
             </w:pPr>
             <w:r>
               <w:t xml:space="preserve">Floating-point value (supports min/max bounds)</w:t>
@@ -8946,8 +8946,8 @@
             <w:pPr>
               <w:pStyle w:val="Compact"/>
               <w:jc w:val="left"/>
-              <w:ind w:left="0" w:firstLine="0" w:right="0"/>
-              <w:spacing w:after="40" w:lineRule="auto" w:line="240" w:before="40"/>
+              <w:ind w:right="0" w:left="0" w:firstLine="0"/>
+              <w:spacing w:lineRule="auto" w:after="40" w:before="40" w:line="240"/>
             </w:pPr>
             <w:r>
               <w:t xml:space="preserve">BOOLEAN</w:t>
@@ -8960,8 +8960,8 @@
             <w:pPr>
               <w:pStyle w:val="Compact"/>
               <w:jc w:val="left"/>
-              <w:ind w:left="0" w:firstLine="0" w:right="0"/>
-              <w:spacing w:after="40" w:lineRule="auto" w:line="240" w:before="40"/>
+              <w:ind w:right="0" w:left="0" w:firstLine="0"/>
+              <w:spacing w:lineRule="auto" w:after="40" w:before="40" w:line="240"/>
             </w:pPr>
             <w:r>
               <w:t xml:space="preserve">true / false</w:t>
@@ -8974,8 +8974,8 @@
             <w:pPr>
               <w:pStyle w:val="Compact"/>
               <w:jc w:val="left"/>
-              <w:ind w:left="0" w:firstLine="0" w:right="0"/>
-              <w:spacing w:after="40" w:lineRule="auto" w:line="240" w:before="40"/>
+              <w:ind w:right="0" w:left="0" w:firstLine="0"/>
+              <w:spacing w:lineRule="auto" w:after="40" w:before="40" w:line="240"/>
             </w:pPr>
             <w:r>
               <w:t xml:space="preserve">Boolean flag</w:t>
@@ -8990,8 +8990,8 @@
             <w:pPr>
               <w:pStyle w:val="Compact"/>
               <w:jc w:val="left"/>
-              <w:ind w:left="0" w:firstLine="0" w:right="0"/>
-              <w:spacing w:after="40" w:lineRule="auto" w:line="240" w:before="40"/>
+              <w:ind w:right="0" w:left="0" w:firstLine="0"/>
+              <w:spacing w:lineRule="auto" w:after="40" w:before="40" w:line="240"/>
             </w:pPr>
             <w:r>
               <w:t xml:space="preserve">DATE</w:t>
@@ -9004,8 +9004,8 @@
             <w:pPr>
               <w:pStyle w:val="Compact"/>
               <w:jc w:val="left"/>
-              <w:ind w:left="0" w:firstLine="0" w:right="0"/>
-              <w:spacing w:after="40" w:lineRule="auto" w:line="240" w:before="40"/>
+              <w:ind w:right="0" w:left="0" w:firstLine="0"/>
+              <w:spacing w:lineRule="auto" w:after="40" w:before="40" w:line="240"/>
             </w:pPr>
             <w:r>
               <w:t xml:space="preserve">YYYY-MM-DD</w:t>
@@ -9018,8 +9018,8 @@
             <w:pPr>
               <w:pStyle w:val="Compact"/>
               <w:jc w:val="left"/>
-              <w:ind w:left="0" w:firstLine="0" w:right="0"/>
-              <w:spacing w:after="40" w:lineRule="auto" w:line="240" w:before="40"/>
+              <w:ind w:right="0" w:left="0" w:firstLine="0"/>
+              <w:spacing w:lineRule="auto" w:after="40" w:before="40" w:line="240"/>
             </w:pPr>
             <w:r>
               <w:t xml:space="preserve">ISO 8601 date</w:t>
@@ -9034,8 +9034,8 @@
             <w:pPr>
               <w:pStyle w:val="Compact"/>
               <w:jc w:val="left"/>
-              <w:ind w:left="0" w:firstLine="0" w:right="0"/>
-              <w:spacing w:after="40" w:lineRule="auto" w:line="240" w:before="40"/>
+              <w:ind w:right="0" w:left="0" w:firstLine="0"/>
+              <w:spacing w:lineRule="auto" w:after="40" w:before="40" w:line="240"/>
             </w:pPr>
             <w:r>
               <w:t xml:space="preserve">ENUM</w:t>
@@ -9048,8 +9048,8 @@
             <w:pPr>
               <w:pStyle w:val="Compact"/>
               <w:jc w:val="left"/>
-              <w:ind w:left="0" w:firstLine="0" w:right="0"/>
-              <w:spacing w:after="40" w:lineRule="auto" w:line="240" w:before="40"/>
+              <w:ind w:right="0" w:left="0" w:firstLine="0"/>
+              <w:spacing w:lineRule="auto" w:after="40" w:before="40" w:line="240"/>
             </w:pPr>
             <w:r>
               <w:t xml:space="preserve">Named value</w:t>
@@ -9062,8 +9062,8 @@
             <w:pPr>
               <w:pStyle w:val="Compact"/>
               <w:jc w:val="left"/>
-              <w:ind w:left="0" w:firstLine="0" w:right="0"/>
-              <w:spacing w:after="40" w:lineRule="auto" w:line="240" w:before="40"/>
+              <w:ind w:right="0" w:left="0" w:firstLine="0"/>
+              <w:spacing w:lineRule="auto" w:after="40" w:before="40" w:line="240"/>
             </w:pPr>
             <w:r>
               <w:t xml:space="preserve">One of a model-declared set of values</w:t>
@@ -9078,8 +9078,8 @@
             <w:pPr>
               <w:pStyle w:val="Compact"/>
               <w:jc w:val="left"/>
-              <w:ind w:left="0" w:firstLine="0" w:right="0"/>
-              <w:spacing w:after="40" w:lineRule="auto" w:line="240" w:before="40"/>
+              <w:ind w:right="0" w:left="0" w:firstLine="0"/>
+              <w:spacing w:lineRule="auto" w:after="40" w:before="40" w:line="240"/>
             </w:pPr>
             <w:r>
               <w:t xml:space="preserve">XHTML</w:t>
@@ -9092,8 +9092,8 @@
             <w:pPr>
               <w:pStyle w:val="Compact"/>
               <w:jc w:val="left"/>
-              <w:ind w:left="0" w:firstLine="0" w:right="0"/>
-              <w:spacing w:after="40" w:lineRule="auto" w:line="240" w:before="40"/>
+              <w:ind w:right="0" w:left="0" w:firstLine="0"/>
+              <w:spacing w:lineRule="auto" w:after="40" w:before="40" w:line="240"/>
             </w:pPr>
             <w:r>
               <w:t xml:space="preserve">Markdown text</w:t>
@@ -9106,8 +9106,8 @@
             <w:pPr>
               <w:pStyle w:val="Compact"/>
               <w:jc w:val="left"/>
-              <w:ind w:left="0" w:firstLine="0" w:right="0"/>
-              <w:spacing w:after="40" w:lineRule="auto" w:line="240" w:before="40"/>
+              <w:ind w:right="0" w:left="0" w:firstLine="0"/>
+              <w:spacing w:lineRule="auto" w:after="40" w:before="40" w:line="240"/>
             </w:pPr>
             <w:r>
               <w:t xml:space="preserve">Rich text preserving block and inline formatting</w:t>
@@ -9643,17 +9643,17 @@
 </file>
 
 <file path=word/footer1.xml><?xml version="1.0" encoding="utf-8"?>
-<w:ftr xmlns:r="http://schemas.openxmlformats.org/officeDocument/2006/relationships" xmlns:w="http://schemas.openxmlformats.org/wordprocessingml/2006/main">
+<w:ftr xmlns:w="http://schemas.openxmlformats.org/wordprocessingml/2006/main" xmlns:r="http://schemas.openxmlformats.org/officeDocument/2006/relationships">
   <w:tbl>
     <w:tblPr>
       <w:tblW w:type="pct" w:w="5000"/>
       <w:tblBorders>
-        <w:top w:color="CCCCCC" w:sz="4" w:space="1" w:val="single"/>
-        <w:bottom w:color="auto" w:sz="0" w:space="0" w:val="none"/>
-        <w:left w:color="auto" w:sz="0" w:space="0" w:val="none"/>
-        <w:right w:color="auto" w:sz="0" w:space="0" w:val="none"/>
-        <w:insideH w:color="auto" w:sz="0" w:space="0" w:val="none"/>
-        <w:insideV w:color="auto" w:sz="0" w:space="0" w:val="none"/>
+        <w:top w:color="CCCCCC" w:space="1" w:sz="4" w:val="single"/>
+        <w:bottom w:color="auto" w:space="0" w:sz="0" w:val="none"/>
+        <w:left w:color="auto" w:space="0" w:sz="0" w:val="none"/>
+        <w:right w:color="auto" w:space="0" w:sz="0" w:val="none"/>
+        <w:insideH w:color="auto" w:space="0" w:sz="0" w:val="none"/>
+        <w:insideV w:color="auto" w:space="0" w:sz="0" w:val="none"/>
       </w:tblBorders>
       <w:tblLayout w:type="fixed"/>
     </w:tblPr>
@@ -9769,7 +9769,7 @@
 </file>
 
 <file path=word/header1.xml><?xml version="1.0" encoding="utf-8"?>
-<w:hdr xmlns:r="http://schemas.openxmlformats.org/officeDocument/2006/relationships" xmlns:w="http://schemas.openxmlformats.org/wordprocessingml/2006/main">
+<w:hdr xmlns:w="http://schemas.openxmlformats.org/wordprocessingml/2006/main" xmlns:r="http://schemas.openxmlformats.org/officeDocument/2006/relationships">
   <w:p>
     <w:pPr>
       <w:pStyle w:val="Header"/>
@@ -9779,7 +9779,7 @@
 </file>
 
 <file path=word/header2.xml><?xml version="1.0" encoding="utf-8"?>
-<w:hdr xmlns:r="http://schemas.openxmlformats.org/officeDocument/2006/relationships" xmlns:w="http://schemas.openxmlformats.org/wordprocessingml/2006/main">
+<w:hdr xmlns:w="http://schemas.openxmlformats.org/wordprocessingml/2006/main" xmlns:r="http://schemas.openxmlformats.org/officeDocument/2006/relationships">
   <w:p>
     <w:pPr>
       <w:pStyle w:val="Header"/>
@@ -9822,7 +9822,7 @@
       <w:lvlText w:val="%1"/>
       <w:lvlJc w:val="left"/>
       <w:pPr>
-        <w:ind w:left="0" w:hanging="0"/>
+        <w:ind w:hanging="0" w:left="0"/>
       </w:pPr>
     </w:lvl>
     <w:lvl w:ilvl="1">
@@ -9834,7 +9834,7 @@
       <w:lvlText w:val="%1.%2"/>
       <w:lvlJc w:val="left"/>
       <w:pPr>
-        <w:ind w:left="0" w:hanging="0"/>
+        <w:ind w:hanging="0" w:left="0"/>
       </w:pPr>
     </w:lvl>
     <w:lvl w:ilvl="2">
@@ -9846,7 +9846,7 @@
       <w:lvlText w:val="%1.%2.%3"/>
       <w:lvlJc w:val="left"/>
       <w:pPr>
-        <w:ind w:left="0" w:hanging="0"/>
+        <w:ind w:hanging="0" w:left="0"/>
       </w:pPr>
     </w:lvl>
     <w:lvl w:ilvl="3">
@@ -9858,7 +9858,7 @@
       <w:lvlText w:val="%1.%2.%3.%4"/>
       <w:lvlJc w:val="left"/>
       <w:pPr>
-        <w:ind w:left="0" w:hanging="0"/>
+        <w:ind w:hanging="0" w:left="0"/>
       </w:pPr>
     </w:lvl>
     <w:lvl w:ilvl="4">
@@ -9870,7 +9870,7 @@
       <w:lvlText w:val="%1.%2.%3.%4.%5"/>
       <w:lvlJc w:val="left"/>
       <w:pPr>
-        <w:ind w:left="0" w:hanging="0"/>
+        <w:ind w:hanging="0" w:left="0"/>
       </w:pPr>
     </w:lvl>
   </w:abstractNum>
@@ -11051,18 +11051,18 @@
     <w:basedOn w:val="VerbatimChar"/>
     <w:rPr/>
   </w:style>
-  <w:style w:type="paragraph" w:styleId="SpecObjectHeader" w:customStyle="1">
+  <w:style w:styleId="SpecObjectHeader" w:type="paragraph" w:customStyle="1">
     <w:name w:val="Spec Object Header"/>
     <w:basedOn w:val="Normal"/>
     <w:next w:val="FirstParagraph"/>
     <w:qFormat/>
     <w:pPr>
       <w:keepNext/>
-      <w:spacing w:after="120" w:lineRule="auto" w:line="276" w:before="280"/>
+      <w:spacing w:lineRule="auto" w:after="120" w:before="280" w:line="276"/>
       <w:outlineLvl w:val="0"/>
     </w:pPr>
     <w:rPr>
-      <w:rFonts w:hAnsi="Calibri Light" w:ascii="Calibri Light" w:cs="Calibri Light"/>
+      <w:rFonts w:ascii="Calibri Light" w:hAnsi="Calibri Light" w:cs="Calibri Light"/>
       <w:b/>
       <w:bCs/>
       <w:color w:val="0F4C64"/>

</xml_diff>

<commit_message>
Deploy documentation from main
</commit_message>
<xml_diff>
--- a/commonspec/downloads/commonspec.docx
+++ b/commonspec/downloads/commonspec.docx
@@ -1686,7 +1686,7 @@
     </w:p>
     <w:p>
       <w:pPr>
-        <w:spacing w:lineRule="exact" w:line="20" w:before="0" w:after="0"/>
+        <w:spacing w:line="20" w:before="0" w:lineRule="exact" w:after="0"/>
         <w:rPr>
           <w:sz w:val="2"/>
         </w:rPr>
@@ -2394,7 +2394,7 @@
     </w:p>
     <w:p>
       <w:pPr>
-        <w:spacing w:lineRule="exact" w:line="20" w:before="0" w:after="0"/>
+        <w:spacing w:line="20" w:before="0" w:lineRule="exact" w:after="0"/>
         <w:rPr>
           <w:sz w:val="2"/>
         </w:rPr>
@@ -2952,7 +2952,7 @@
         <w:pStyle w:val="FirstParagraph"/>
       </w:pPr>
       <w:r>
-        <w:t xml:space="preserve">A</w:t>
+        <w:t xml:space="preserve">Use</w:t>
       </w:r>
       <w:r>
         <w:t xml:space="preserve"> </w:t>
@@ -2967,37 +2967,7 @@
         <w:t xml:space="preserve"> </w:t>
       </w:r>
       <w:r>
-        <w:t xml:space="preserve">is the correct way to end a section without opening a new heading. It replaces the anti-pattern of an empty</w:t>
-      </w:r>
-      <w:r>
-        <w:t xml:space="preserve"> </w:t>
-      </w:r>
-      <w:r>
-        <w:rPr>
-          <w:rStyle w:val="VerbatimChar"/>
-        </w:rPr>
-        <w:t xml:space="preserve">##</w:t>
-      </w:r>
-      <w:r>
-        <w:t xml:space="preserve"> </w:t>
-      </w:r>
-      <w:r>
-        <w:t xml:space="preserve">used as a</w:t>
-      </w:r>
-      <w:r>
-        <w:t xml:space="preserve"> </w:t>
-      </w:r>
-      <w:r>
-        <w:t xml:space="preserve">“</w:t>
-      </w:r>
-      <w:r>
-        <w:t xml:space="preserve">section reset</w:t>
-      </w:r>
-      <w:r>
-        <w:t xml:space="preserve">”</w:t>
-      </w:r>
-      <w:r>
-        <w:t xml:space="preserve">: an</w:t>
+        <w:t xml:space="preserve">to end a section without opening another heading. CommonSpec rejects an</w:t>
       </w:r>
       <w:r>
         <w:t xml:space="preserve"> </w:t>
@@ -3013,7 +2983,7 @@
         <w:t xml:space="preserve"> </w:t>
       </w:r>
       <w:r>
-        <w:t xml:space="preserve">(a header with no title) is rejected, because it would render as a blank numbered heading and corrupt downstream numbering.</w:t>
+        <w:t xml:space="preserve">because it produces an invalid numbered section.</w:t>
       </w:r>
     </w:p>
     <w:p>
@@ -3398,7 +3368,7 @@
     </w:p>
     <w:p>
       <w:pPr>
-        <w:spacing w:lineRule="exact" w:line="20" w:before="0" w:after="0"/>
+        <w:spacing w:line="20" w:before="0" w:lineRule="exact" w:after="0"/>
         <w:rPr>
           <w:sz w:val="2"/>
         </w:rPr>
@@ -4294,7 +4264,7 @@
     </w:p>
     <w:p>
       <w:pPr>
-        <w:spacing w:lineRule="exact" w:line="20" w:before="0" w:after="0"/>
+        <w:spacing w:line="20" w:before="0" w:lineRule="exact" w:after="0"/>
         <w:rPr>
           <w:sz w:val="2"/>
         </w:rPr>
@@ -5440,7 +5410,7 @@
     </w:p>
     <w:p>
       <w:pPr>
-        <w:spacing w:lineRule="exact" w:line="20" w:before="0" w:after="0"/>
+        <w:spacing w:line="20" w:before="0" w:lineRule="exact" w:after="0"/>
         <w:rPr>
           <w:sz w:val="2"/>
         </w:rPr>
@@ -6214,18 +6184,18 @@
         <w:tblLook w:firstRow="1" w:lastRow="0" w:firstColumn="0" w:lastColumn="0" w:noHBand="0" w:noVBand="0" w:val="0020"/>
         <w:jc w:val="start"/>
         <w:tblBorders>
-          <w:top w:color="000000" w:space="0" w:sz="6" w:val="single"/>
-          <w:left w:color="000000" w:space="0" w:sz="6" w:val="single"/>
-          <w:bottom w:color="000000" w:space="0" w:sz="6" w:val="single"/>
-          <w:right w:color="000000" w:space="0" w:sz="6" w:val="single"/>
-          <w:insideH w:color="000000" w:space="0" w:sz="6" w:val="single"/>
-          <w:insideV w:color="000000" w:space="0" w:sz="6" w:val="single"/>
+          <w:top w:color="000000" w:val="single" w:space="0" w:sz="6"/>
+          <w:left w:color="000000" w:val="single" w:space="0" w:sz="6"/>
+          <w:bottom w:color="000000" w:val="single" w:space="0" w:sz="6"/>
+          <w:right w:color="000000" w:val="single" w:space="0" w:sz="6"/>
+          <w:insideH w:color="000000" w:val="single" w:space="0" w:sz="6"/>
+          <w:insideV w:color="000000" w:val="single" w:space="0" w:sz="6"/>
         </w:tblBorders>
         <w:tblCellMar>
-          <w:top w:type="dxa" w:w="57"/>
-          <w:left w:type="dxa" w:w="108"/>
-          <w:bottom w:type="dxa" w:w="57"/>
-          <w:right w:type="dxa" w:w="108"/>
+          <w:top w:w="57" w:type="dxa"/>
+          <w:left w:w="108" w:type="dxa"/>
+          <w:bottom w:w="57" w:type="dxa"/>
+          <w:right w:w="108" w:type="dxa"/>
         </w:tblCellMar>
       </w:tblPr>
       <w:tblGrid>
@@ -6242,14 +6212,14 @@
         </w:trPr>
         <w:tc>
           <w:tcPr>
-            <w:shd w:color="auto" w:fill="E8E8E8" w:val="clear"/>
+            <w:shd w:color="auto" w:val="clear" w:fill="E8E8E8"/>
           </w:tcPr>
           <w:p>
             <w:pPr>
               <w:pStyle w:val="Compact"/>
               <w:jc w:val="left"/>
-              <w:ind w:right="0" w:left="0" w:firstLine="0"/>
-              <w:spacing w:lineRule="auto" w:after="40" w:before="40" w:line="240"/>
+              <w:ind w:right="0" w:firstLine="0" w:left="0"/>
+              <w:spacing w:lineRule="auto" w:line="240" w:after="40" w:before="40"/>
             </w:pPr>
             <w:r>
               <w:rPr>
@@ -6261,14 +6231,14 @@
         </w:tc>
         <w:tc>
           <w:tcPr>
-            <w:shd w:color="auto" w:fill="E8E8E8" w:val="clear"/>
+            <w:shd w:color="auto" w:val="clear" w:fill="E8E8E8"/>
           </w:tcPr>
           <w:p>
             <w:pPr>
               <w:pStyle w:val="Compact"/>
               <w:jc w:val="left"/>
-              <w:ind w:right="0" w:left="0" w:firstLine="0"/>
-              <w:spacing w:lineRule="auto" w:after="40" w:before="40" w:line="240"/>
+              <w:ind w:right="0" w:firstLine="0" w:left="0"/>
+              <w:spacing w:lineRule="auto" w:line="240" w:after="40" w:before="40"/>
             </w:pPr>
             <w:r>
               <w:rPr>
@@ -6280,14 +6250,14 @@
         </w:tc>
         <w:tc>
           <w:tcPr>
-            <w:shd w:color="auto" w:fill="E8E8E8" w:val="clear"/>
+            <w:shd w:color="auto" w:val="clear" w:fill="E8E8E8"/>
           </w:tcPr>
           <w:p>
             <w:pPr>
               <w:pStyle w:val="Compact"/>
               <w:jc w:val="left"/>
-              <w:ind w:right="0" w:left="0" w:firstLine="0"/>
-              <w:spacing w:lineRule="auto" w:after="40" w:before="40" w:line="240"/>
+              <w:ind w:right="0" w:firstLine="0" w:left="0"/>
+              <w:spacing w:lineRule="auto" w:line="240" w:after="40" w:before="40"/>
             </w:pPr>
             <w:r>
               <w:rPr>
@@ -6299,14 +6269,14 @@
         </w:tc>
         <w:tc>
           <w:tcPr>
-            <w:shd w:color="auto" w:fill="E8E8E8" w:val="clear"/>
+            <w:shd w:color="auto" w:val="clear" w:fill="E8E8E8"/>
           </w:tcPr>
           <w:p>
             <w:pPr>
               <w:pStyle w:val="Compact"/>
               <w:jc w:val="left"/>
-              <w:ind w:right="0" w:left="0" w:firstLine="0"/>
-              <w:spacing w:lineRule="auto" w:after="40" w:before="40" w:line="240"/>
+              <w:ind w:right="0" w:firstLine="0" w:left="0"/>
+              <w:spacing w:lineRule="auto" w:line="240" w:after="40" w:before="40"/>
             </w:pPr>
             <w:r>
               <w:rPr>
@@ -6318,14 +6288,14 @@
         </w:tc>
         <w:tc>
           <w:tcPr>
-            <w:shd w:color="auto" w:fill="E8E8E8" w:val="clear"/>
+            <w:shd w:color="auto" w:val="clear" w:fill="E8E8E8"/>
           </w:tcPr>
           <w:p>
             <w:pPr>
               <w:pStyle w:val="Compact"/>
               <w:jc w:val="left"/>
-              <w:ind w:right="0" w:left="0" w:firstLine="0"/>
-              <w:spacing w:lineRule="auto" w:after="40" w:before="40" w:line="240"/>
+              <w:ind w:right="0" w:firstLine="0" w:left="0"/>
+              <w:spacing w:lineRule="auto" w:line="240" w:after="40" w:before="40"/>
             </w:pPr>
             <w:r>
               <w:rPr>
@@ -6337,14 +6307,14 @@
         </w:tc>
         <w:tc>
           <w:tcPr>
-            <w:shd w:color="auto" w:fill="E8E8E8" w:val="clear"/>
+            <w:shd w:color="auto" w:val="clear" w:fill="E8E8E8"/>
           </w:tcPr>
           <w:p>
             <w:pPr>
               <w:pStyle w:val="Compact"/>
               <w:jc w:val="left"/>
-              <w:ind w:right="0" w:left="0" w:firstLine="0"/>
-              <w:spacing w:lineRule="auto" w:after="40" w:before="40" w:line="240"/>
+              <w:ind w:right="0" w:firstLine="0" w:left="0"/>
+              <w:spacing w:lineRule="auto" w:line="240" w:after="40" w:before="40"/>
             </w:pPr>
             <w:r>
               <w:rPr>
@@ -6362,8 +6332,8 @@
             <w:pPr>
               <w:pStyle w:val="Compact"/>
               <w:jc w:val="left"/>
-              <w:ind w:right="0" w:left="0" w:firstLine="0"/>
-              <w:spacing w:lineRule="auto" w:after="40" w:before="40" w:line="240"/>
+              <w:ind w:right="0" w:firstLine="0" w:left="0"/>
+              <w:spacing w:lineRule="auto" w:line="240" w:after="40" w:before="40"/>
             </w:pPr>
             <w:r>
               <w:t xml:space="preserve">VERIFIES</w:t>
@@ -6376,8 +6346,8 @@
             <w:pPr>
               <w:pStyle w:val="Compact"/>
               <w:jc w:val="left"/>
-              <w:ind w:right="0" w:left="0" w:firstLine="0"/>
-              <w:spacing w:lineRule="auto" w:after="40" w:before="40" w:line="240"/>
+              <w:ind w:right="0" w:firstLine="0" w:left="0"/>
+              <w:spacing w:lineRule="auto" w:line="240" w:after="40" w:before="40"/>
             </w:pPr>
             <w:r>
               <w:rPr>
@@ -6393,8 +6363,8 @@
             <w:pPr>
               <w:pStyle w:val="Compact"/>
               <w:jc w:val="left"/>
-              <w:ind w:right="0" w:left="0" w:firstLine="0"/>
-              <w:spacing w:lineRule="auto" w:after="40" w:before="40" w:line="240"/>
+              <w:ind w:right="0" w:firstLine="0" w:left="0"/>
+              <w:spacing w:lineRule="auto" w:line="240" w:after="40" w:before="40"/>
             </w:pPr>
             <w:r>
               <w:rPr>
@@ -6410,8 +6380,8 @@
             <w:pPr>
               <w:pStyle w:val="Compact"/>
               <w:jc w:val="left"/>
-              <w:ind w:right="0" w:left="0" w:firstLine="0"/>
-              <w:spacing w:lineRule="auto" w:after="40" w:before="40" w:line="240"/>
+              <w:ind w:right="0" w:firstLine="0" w:left="0"/>
+              <w:spacing w:lineRule="auto" w:line="240" w:after="40" w:before="40"/>
             </w:pPr>
             <w:r>
               <w:rPr>
@@ -6427,8 +6397,8 @@
             <w:pPr>
               <w:pStyle w:val="Compact"/>
               <w:jc w:val="left"/>
-              <w:ind w:right="0" w:left="0" w:firstLine="0"/>
-              <w:spacing w:lineRule="auto" w:after="40" w:before="40" w:line="240"/>
+              <w:ind w:right="0" w:firstLine="0" w:left="0"/>
+              <w:spacing w:lineRule="auto" w:line="240" w:after="40" w:before="40"/>
             </w:pPr>
             <w:r>
               <w:rPr>
@@ -6444,8 +6414,8 @@
             <w:pPr>
               <w:pStyle w:val="Compact"/>
               <w:jc w:val="left"/>
-              <w:ind w:right="0" w:left="0" w:firstLine="0"/>
-              <w:spacing w:lineRule="auto" w:after="40" w:before="40" w:line="240"/>
+              <w:ind w:right="0" w:firstLine="0" w:left="0"/>
+              <w:spacing w:lineRule="auto" w:line="240" w:after="40" w:before="40"/>
             </w:pPr>
             <w:r>
               <w:rPr>
@@ -6464,8 +6434,8 @@
             <w:pPr>
               <w:pStyle w:val="Compact"/>
               <w:jc w:val="left"/>
-              <w:ind w:right="0" w:left="0" w:firstLine="0"/>
-              <w:spacing w:lineRule="auto" w:after="40" w:before="40" w:line="240"/>
+              <w:ind w:right="0" w:firstLine="0" w:left="0"/>
+              <w:spacing w:lineRule="auto" w:line="240" w:after="40" w:before="40"/>
             </w:pPr>
             <w:r>
               <w:t xml:space="preserve">TRACES_TO</w:t>
@@ -6478,8 +6448,8 @@
             <w:pPr>
               <w:pStyle w:val="Compact"/>
               <w:jc w:val="left"/>
-              <w:ind w:right="0" w:left="0" w:firstLine="0"/>
-              <w:spacing w:lineRule="auto" w:after="40" w:before="40" w:line="240"/>
+              <w:ind w:right="0" w:firstLine="0" w:left="0"/>
+              <w:spacing w:lineRule="auto" w:line="240" w:after="40" w:before="40"/>
             </w:pPr>
             <w:r>
               <w:rPr>
@@ -6495,8 +6465,8 @@
             <w:pPr>
               <w:pStyle w:val="Compact"/>
               <w:jc w:val="left"/>
-              <w:ind w:right="0" w:left="0" w:firstLine="0"/>
-              <w:spacing w:lineRule="auto" w:after="40" w:before="40" w:line="240"/>
+              <w:ind w:right="0" w:firstLine="0" w:left="0"/>
+              <w:spacing w:lineRule="auto" w:line="240" w:after="40" w:before="40"/>
             </w:pPr>
             <w:r>
               <w:t xml:space="preserve">—</w:t>
@@ -6509,8 +6479,8 @@
             <w:pPr>
               <w:pStyle w:val="Compact"/>
               <w:jc w:val="left"/>
-              <w:ind w:right="0" w:left="0" w:firstLine="0"/>
-              <w:spacing w:lineRule="auto" w:after="40" w:before="40" w:line="240"/>
+              <w:ind w:right="0" w:firstLine="0" w:left="0"/>
+              <w:spacing w:lineRule="auto" w:line="240" w:after="40" w:before="40"/>
             </w:pPr>
             <w:r>
               <w:t xml:space="preserve">—</w:t>
@@ -6523,8 +6493,8 @@
             <w:pPr>
               <w:pStyle w:val="Compact"/>
               <w:jc w:val="left"/>
-              <w:ind w:right="0" w:left="0" w:firstLine="0"/>
-              <w:spacing w:lineRule="auto" w:after="40" w:before="40" w:line="240"/>
+              <w:ind w:right="0" w:firstLine="0" w:left="0"/>
+              <w:spacing w:lineRule="auto" w:line="240" w:after="40" w:before="40"/>
             </w:pPr>
             <w:r>
               <w:t xml:space="preserve">—</w:t>
@@ -6537,8 +6507,8 @@
             <w:pPr>
               <w:pStyle w:val="Compact"/>
               <w:jc w:val="left"/>
-              <w:ind w:right="0" w:left="0" w:firstLine="0"/>
-              <w:spacing w:lineRule="auto" w:after="40" w:before="40" w:line="240"/>
+              <w:ind w:right="0" w:firstLine="0" w:left="0"/>
+              <w:spacing w:lineRule="auto" w:line="240" w:after="40" w:before="40"/>
             </w:pPr>
             <w:r>
               <w:t xml:space="preserve">1</w:t>
@@ -6553,8 +6523,8 @@
             <w:pPr>
               <w:pStyle w:val="Compact"/>
               <w:jc w:val="left"/>
-              <w:ind w:right="0" w:left="0" w:firstLine="0"/>
-              <w:spacing w:lineRule="auto" w:after="40" w:before="40" w:line="240"/>
+              <w:ind w:right="0" w:firstLine="0" w:left="0"/>
+              <w:spacing w:lineRule="auto" w:line="240" w:after="40" w:before="40"/>
             </w:pPr>
             <w:r>
               <w:t xml:space="preserve">XREF_SEC</w:t>
@@ -6567,8 +6537,8 @@
             <w:pPr>
               <w:pStyle w:val="Compact"/>
               <w:jc w:val="left"/>
-              <w:ind w:right="0" w:left="0" w:firstLine="0"/>
-              <w:spacing w:lineRule="auto" w:after="40" w:before="40" w:line="240"/>
+              <w:ind w:right="0" w:firstLine="0" w:left="0"/>
+              <w:spacing w:lineRule="auto" w:line="240" w:after="40" w:before="40"/>
             </w:pPr>
             <w:r>
               <w:rPr>
@@ -6584,8 +6554,8 @@
             <w:pPr>
               <w:pStyle w:val="Compact"/>
               <w:jc w:val="left"/>
-              <w:ind w:right="0" w:left="0" w:firstLine="0"/>
-              <w:spacing w:lineRule="auto" w:after="40" w:before="40" w:line="240"/>
+              <w:ind w:right="0" w:firstLine="0" w:left="0"/>
+              <w:spacing w:lineRule="auto" w:line="240" w:after="40" w:before="40"/>
             </w:pPr>
             <w:r>
               <w:t xml:space="preserve">—</w:t>
@@ -6598,8 +6568,8 @@
             <w:pPr>
               <w:pStyle w:val="Compact"/>
               <w:jc w:val="left"/>
-              <w:ind w:right="0" w:left="0" w:firstLine="0"/>
-              <w:spacing w:lineRule="auto" w:after="40" w:before="40" w:line="240"/>
+              <w:ind w:right="0" w:firstLine="0" w:left="0"/>
+              <w:spacing w:lineRule="auto" w:line="240" w:after="40" w:before="40"/>
             </w:pPr>
             <w:r>
               <w:t xml:space="preserve">—</w:t>
@@ -6612,8 +6582,8 @@
             <w:pPr>
               <w:pStyle w:val="Compact"/>
               <w:jc w:val="left"/>
-              <w:ind w:right="0" w:left="0" w:firstLine="0"/>
-              <w:spacing w:lineRule="auto" w:after="40" w:before="40" w:line="240"/>
+              <w:ind w:right="0" w:firstLine="0" w:left="0"/>
+              <w:spacing w:lineRule="auto" w:line="240" w:after="40" w:before="40"/>
             </w:pPr>
             <w:r>
               <w:rPr>
@@ -6630,8 +6600,8 @@
             <w:pPr>
               <w:pStyle w:val="Compact"/>
               <w:jc w:val="left"/>
-              <w:ind w:right="0" w:left="0" w:firstLine="0"/>
-              <w:spacing w:lineRule="auto" w:after="40" w:before="40" w:line="240"/>
+              <w:ind w:right="0" w:firstLine="0" w:left="0"/>
+              <w:spacing w:lineRule="auto" w:line="240" w:after="40" w:before="40"/>
             </w:pPr>
             <w:r>
               <w:t xml:space="preserve">eliminated</w:t>
@@ -6920,7 +6890,7 @@
     </w:p>
     <w:p>
       <w:pPr>
-        <w:spacing w:lineRule="exact" w:line="20" w:before="0" w:after="0"/>
+        <w:spacing w:line="20" w:before="0" w:lineRule="exact" w:after="0"/>
         <w:rPr>
           <w:sz w:val="2"/>
         </w:rPr>
@@ -7119,37 +7089,7 @@
         <w:t xml:space="preserve">abbrev:</w:t>
       </w:r>
       <w:r>
-        <w:t xml:space="preserve">) — abbreviation expansion (e.g.,</w:t>
-      </w:r>
-      <w:r>
-        <w:t xml:space="preserve"> </w:t>
-      </w:r>
-      <w:r>
-        <w:rPr>
-          <w:rStyle w:val="VerbatimChar"/>
-        </w:rPr>
-        <w:t xml:space="preserve">abbrev: PID</w:t>
-      </w:r>
-      <w:r>
-        <w:t xml:space="preserve"> </w:t>
-      </w:r>
-      <w:r>
-        <w:t xml:space="preserve">expands to</w:t>
-      </w:r>
-      <w:r>
-        <w:t xml:space="preserve"> </w:t>
-      </w:r>
-      <w:r>
-        <w:t xml:space="preserve">“</w:t>
-      </w:r>
-      <w:r>
-        <w:t xml:space="preserve">Project Identifier (PID)</w:t>
-      </w:r>
-      <w:r>
-        <w:t xml:space="preserve">”</w:t>
-      </w:r>
-      <w:r>
-        <w:t xml:space="preserve">).</w:t>
+        <w:t xml:space="preserve">) — abbreviation expansion (e.g., Project Identifier (PID)).</w:t>
       </w:r>
     </w:p>
     <w:p>
@@ -8684,7 +8624,7 @@
     </w:p>
     <w:p>
       <w:pPr>
-        <w:spacing w:lineRule="exact" w:line="20" w:before="0" w:after="0"/>
+        <w:spacing w:line="20" w:before="0" w:lineRule="exact" w:after="0"/>
         <w:rPr>
           <w:sz w:val="2"/>
         </w:rPr>
@@ -8726,18 +8666,18 @@
         <w:tblLook w:firstRow="1" w:lastRow="0" w:firstColumn="0" w:lastColumn="0" w:noHBand="0" w:noVBand="0" w:val="0020"/>
         <w:jc w:val="start"/>
         <w:tblBorders>
-          <w:top w:color="000000" w:space="0" w:sz="6" w:val="single"/>
-          <w:left w:color="000000" w:space="0" w:sz="6" w:val="single"/>
-          <w:bottom w:color="000000" w:space="0" w:sz="6" w:val="single"/>
-          <w:right w:color="000000" w:space="0" w:sz="6" w:val="single"/>
-          <w:insideH w:color="000000" w:space="0" w:sz="6" w:val="single"/>
-          <w:insideV w:color="000000" w:space="0" w:sz="6" w:val="single"/>
+          <w:top w:color="000000" w:val="single" w:space="0" w:sz="6"/>
+          <w:left w:color="000000" w:val="single" w:space="0" w:sz="6"/>
+          <w:bottom w:color="000000" w:val="single" w:space="0" w:sz="6"/>
+          <w:right w:color="000000" w:val="single" w:space="0" w:sz="6"/>
+          <w:insideH w:color="000000" w:val="single" w:space="0" w:sz="6"/>
+          <w:insideV w:color="000000" w:val="single" w:space="0" w:sz="6"/>
         </w:tblBorders>
         <w:tblCellMar>
-          <w:top w:type="dxa" w:w="57"/>
-          <w:left w:type="dxa" w:w="108"/>
-          <w:bottom w:type="dxa" w:w="57"/>
-          <w:right w:type="dxa" w:w="108"/>
+          <w:top w:w="57" w:type="dxa"/>
+          <w:left w:w="108" w:type="dxa"/>
+          <w:bottom w:w="57" w:type="dxa"/>
+          <w:right w:w="108" w:type="dxa"/>
         </w:tblCellMar>
       </w:tblPr>
       <w:tblGrid>
@@ -8751,14 +8691,14 @@
         </w:trPr>
         <w:tc>
           <w:tcPr>
-            <w:shd w:color="auto" w:fill="E8E8E8" w:val="clear"/>
+            <w:shd w:color="auto" w:val="clear" w:fill="E8E8E8"/>
           </w:tcPr>
           <w:p>
             <w:pPr>
               <w:pStyle w:val="Compact"/>
               <w:jc w:val="left"/>
-              <w:ind w:right="0" w:left="0" w:firstLine="0"/>
-              <w:spacing w:lineRule="auto" w:after="40" w:before="40" w:line="240"/>
+              <w:ind w:right="0" w:firstLine="0" w:left="0"/>
+              <w:spacing w:lineRule="auto" w:line="240" w:after="40" w:before="40"/>
             </w:pPr>
             <w:r>
               <w:rPr>
@@ -8770,14 +8710,14 @@
         </w:tc>
         <w:tc>
           <w:tcPr>
-            <w:shd w:color="auto" w:fill="E8E8E8" w:val="clear"/>
+            <w:shd w:color="auto" w:val="clear" w:fill="E8E8E8"/>
           </w:tcPr>
           <w:p>
             <w:pPr>
               <w:pStyle w:val="Compact"/>
               <w:jc w:val="left"/>
-              <w:ind w:right="0" w:left="0" w:firstLine="0"/>
-              <w:spacing w:lineRule="auto" w:after="40" w:before="40" w:line="240"/>
+              <w:ind w:right="0" w:firstLine="0" w:left="0"/>
+              <w:spacing w:lineRule="auto" w:line="240" w:after="40" w:before="40"/>
             </w:pPr>
             <w:r>
               <w:rPr>
@@ -8789,14 +8729,14 @@
         </w:tc>
         <w:tc>
           <w:tcPr>
-            <w:shd w:color="auto" w:fill="E8E8E8" w:val="clear"/>
+            <w:shd w:color="auto" w:val="clear" w:fill="E8E8E8"/>
           </w:tcPr>
           <w:p>
             <w:pPr>
               <w:pStyle w:val="Compact"/>
               <w:jc w:val="left"/>
-              <w:ind w:right="0" w:left="0" w:firstLine="0"/>
-              <w:spacing w:lineRule="auto" w:after="40" w:before="40" w:line="240"/>
+              <w:ind w:right="0" w:firstLine="0" w:left="0"/>
+              <w:spacing w:lineRule="auto" w:line="240" w:after="40" w:before="40"/>
             </w:pPr>
             <w:r>
               <w:rPr>
@@ -8814,8 +8754,8 @@
             <w:pPr>
               <w:pStyle w:val="Compact"/>
               <w:jc w:val="left"/>
-              <w:ind w:right="0" w:left="0" w:firstLine="0"/>
-              <w:spacing w:lineRule="auto" w:after="40" w:before="40" w:line="240"/>
+              <w:ind w:right="0" w:firstLine="0" w:left="0"/>
+              <w:spacing w:lineRule="auto" w:line="240" w:after="40" w:before="40"/>
             </w:pPr>
             <w:r>
               <w:t xml:space="preserve">STRING</w:t>
@@ -8828,8 +8768,8 @@
             <w:pPr>
               <w:pStyle w:val="Compact"/>
               <w:jc w:val="left"/>
-              <w:ind w:right="0" w:left="0" w:firstLine="0"/>
-              <w:spacing w:lineRule="auto" w:after="40" w:before="40" w:line="240"/>
+              <w:ind w:right="0" w:firstLine="0" w:left="0"/>
+              <w:spacing w:lineRule="auto" w:line="240" w:after="40" w:before="40"/>
             </w:pPr>
             <w:r>
               <w:t xml:space="preserve">Plain text</w:t>
@@ -8842,8 +8782,8 @@
             <w:pPr>
               <w:pStyle w:val="Compact"/>
               <w:jc w:val="left"/>
-              <w:ind w:right="0" w:left="0" w:firstLine="0"/>
-              <w:spacing w:lineRule="auto" w:after="40" w:before="40" w:line="240"/>
+              <w:ind w:right="0" w:firstLine="0" w:left="0"/>
+              <w:spacing w:lineRule="auto" w:line="240" w:after="40" w:before="40"/>
             </w:pPr>
             <w:r>
               <w:t xml:space="preserve">Unformatted text value</w:t>
@@ -8858,8 +8798,8 @@
             <w:pPr>
               <w:pStyle w:val="Compact"/>
               <w:jc w:val="left"/>
-              <w:ind w:right="0" w:left="0" w:firstLine="0"/>
-              <w:spacing w:lineRule="auto" w:after="40" w:before="40" w:line="240"/>
+              <w:ind w:right="0" w:firstLine="0" w:left="0"/>
+              <w:spacing w:lineRule="auto" w:line="240" w:after="40" w:before="40"/>
             </w:pPr>
             <w:r>
               <w:t xml:space="preserve">INTEGER</w:t>
@@ -8872,8 +8812,8 @@
             <w:pPr>
               <w:pStyle w:val="Compact"/>
               <w:jc w:val="left"/>
-              <w:ind w:right="0" w:left="0" w:firstLine="0"/>
-              <w:spacing w:lineRule="auto" w:after="40" w:before="40" w:line="240"/>
+              <w:ind w:right="0" w:firstLine="0" w:left="0"/>
+              <w:spacing w:lineRule="auto" w:line="240" w:after="40" w:before="40"/>
             </w:pPr>
             <w:r>
               <w:t xml:space="preserve">Whole number</w:t>
@@ -8886,8 +8826,8 @@
             <w:pPr>
               <w:pStyle w:val="Compact"/>
               <w:jc w:val="left"/>
-              <w:ind w:right="0" w:left="0" w:firstLine="0"/>
-              <w:spacing w:lineRule="auto" w:after="40" w:before="40" w:line="240"/>
+              <w:ind w:right="0" w:firstLine="0" w:left="0"/>
+              <w:spacing w:lineRule="auto" w:line="240" w:after="40" w:before="40"/>
             </w:pPr>
             <w:r>
               <w:t xml:space="preserve">Numeric value (supports min/max bounds)</w:t>
@@ -8902,8 +8842,8 @@
             <w:pPr>
               <w:pStyle w:val="Compact"/>
               <w:jc w:val="left"/>
-              <w:ind w:right="0" w:left="0" w:firstLine="0"/>
-              <w:spacing w:lineRule="auto" w:after="40" w:before="40" w:line="240"/>
+              <w:ind w:right="0" w:firstLine="0" w:left="0"/>
+              <w:spacing w:lineRule="auto" w:line="240" w:after="40" w:before="40"/>
             </w:pPr>
             <w:r>
               <w:t xml:space="preserve">REAL</w:t>
@@ -8916,8 +8856,8 @@
             <w:pPr>
               <w:pStyle w:val="Compact"/>
               <w:jc w:val="left"/>
-              <w:ind w:right="0" w:left="0" w:firstLine="0"/>
-              <w:spacing w:lineRule="auto" w:after="40" w:before="40" w:line="240"/>
+              <w:ind w:right="0" w:firstLine="0" w:left="0"/>
+              <w:spacing w:lineRule="auto" w:line="240" w:after="40" w:before="40"/>
             </w:pPr>
             <w:r>
               <w:t xml:space="preserve">Decimal number</w:t>
@@ -8930,8 +8870,8 @@
             <w:pPr>
               <w:pStyle w:val="Compact"/>
               <w:jc w:val="left"/>
-              <w:ind w:right="0" w:left="0" w:firstLine="0"/>
-              <w:spacing w:lineRule="auto" w:after="40" w:before="40" w:line="240"/>
+              <w:ind w:right="0" w:firstLine="0" w:left="0"/>
+              <w:spacing w:lineRule="auto" w:line="240" w:after="40" w:before="40"/>
             </w:pPr>
             <w:r>
               <w:t xml:space="preserve">Floating-point value (supports min/max bounds)</w:t>
@@ -8946,8 +8886,8 @@
             <w:pPr>
               <w:pStyle w:val="Compact"/>
               <w:jc w:val="left"/>
-              <w:ind w:right="0" w:left="0" w:firstLine="0"/>
-              <w:spacing w:lineRule="auto" w:after="40" w:before="40" w:line="240"/>
+              <w:ind w:right="0" w:firstLine="0" w:left="0"/>
+              <w:spacing w:lineRule="auto" w:line="240" w:after="40" w:before="40"/>
             </w:pPr>
             <w:r>
               <w:t xml:space="preserve">BOOLEAN</w:t>
@@ -8960,8 +8900,8 @@
             <w:pPr>
               <w:pStyle w:val="Compact"/>
               <w:jc w:val="left"/>
-              <w:ind w:right="0" w:left="0" w:firstLine="0"/>
-              <w:spacing w:lineRule="auto" w:after="40" w:before="40" w:line="240"/>
+              <w:ind w:right="0" w:firstLine="0" w:left="0"/>
+              <w:spacing w:lineRule="auto" w:line="240" w:after="40" w:before="40"/>
             </w:pPr>
             <w:r>
               <w:t xml:space="preserve">true / false</w:t>
@@ -8974,8 +8914,8 @@
             <w:pPr>
               <w:pStyle w:val="Compact"/>
               <w:jc w:val="left"/>
-              <w:ind w:right="0" w:left="0" w:firstLine="0"/>
-              <w:spacing w:lineRule="auto" w:after="40" w:before="40" w:line="240"/>
+              <w:ind w:right="0" w:firstLine="0" w:left="0"/>
+              <w:spacing w:lineRule="auto" w:line="240" w:after="40" w:before="40"/>
             </w:pPr>
             <w:r>
               <w:t xml:space="preserve">Boolean flag</w:t>
@@ -8990,8 +8930,8 @@
             <w:pPr>
               <w:pStyle w:val="Compact"/>
               <w:jc w:val="left"/>
-              <w:ind w:right="0" w:left="0" w:firstLine="0"/>
-              <w:spacing w:lineRule="auto" w:after="40" w:before="40" w:line="240"/>
+              <w:ind w:right="0" w:firstLine="0" w:left="0"/>
+              <w:spacing w:lineRule="auto" w:line="240" w:after="40" w:before="40"/>
             </w:pPr>
             <w:r>
               <w:t xml:space="preserve">DATE</w:t>
@@ -9004,8 +8944,8 @@
             <w:pPr>
               <w:pStyle w:val="Compact"/>
               <w:jc w:val="left"/>
-              <w:ind w:right="0" w:left="0" w:firstLine="0"/>
-              <w:spacing w:lineRule="auto" w:after="40" w:before="40" w:line="240"/>
+              <w:ind w:right="0" w:firstLine="0" w:left="0"/>
+              <w:spacing w:lineRule="auto" w:line="240" w:after="40" w:before="40"/>
             </w:pPr>
             <w:r>
               <w:t xml:space="preserve">YYYY-MM-DD</w:t>
@@ -9018,8 +8958,8 @@
             <w:pPr>
               <w:pStyle w:val="Compact"/>
               <w:jc w:val="left"/>
-              <w:ind w:right="0" w:left="0" w:firstLine="0"/>
-              <w:spacing w:lineRule="auto" w:after="40" w:before="40" w:line="240"/>
+              <w:ind w:right="0" w:firstLine="0" w:left="0"/>
+              <w:spacing w:lineRule="auto" w:line="240" w:after="40" w:before="40"/>
             </w:pPr>
             <w:r>
               <w:t xml:space="preserve">ISO 8601 date</w:t>
@@ -9034,8 +8974,8 @@
             <w:pPr>
               <w:pStyle w:val="Compact"/>
               <w:jc w:val="left"/>
-              <w:ind w:right="0" w:left="0" w:firstLine="0"/>
-              <w:spacing w:lineRule="auto" w:after="40" w:before="40" w:line="240"/>
+              <w:ind w:right="0" w:firstLine="0" w:left="0"/>
+              <w:spacing w:lineRule="auto" w:line="240" w:after="40" w:before="40"/>
             </w:pPr>
             <w:r>
               <w:t xml:space="preserve">ENUM</w:t>
@@ -9048,8 +8988,8 @@
             <w:pPr>
               <w:pStyle w:val="Compact"/>
               <w:jc w:val="left"/>
-              <w:ind w:right="0" w:left="0" w:firstLine="0"/>
-              <w:spacing w:lineRule="auto" w:after="40" w:before="40" w:line="240"/>
+              <w:ind w:right="0" w:firstLine="0" w:left="0"/>
+              <w:spacing w:lineRule="auto" w:line="240" w:after="40" w:before="40"/>
             </w:pPr>
             <w:r>
               <w:t xml:space="preserve">Named value</w:t>
@@ -9062,8 +9002,8 @@
             <w:pPr>
               <w:pStyle w:val="Compact"/>
               <w:jc w:val="left"/>
-              <w:ind w:right="0" w:left="0" w:firstLine="0"/>
-              <w:spacing w:lineRule="auto" w:after="40" w:before="40" w:line="240"/>
+              <w:ind w:right="0" w:firstLine="0" w:left="0"/>
+              <w:spacing w:lineRule="auto" w:line="240" w:after="40" w:before="40"/>
             </w:pPr>
             <w:r>
               <w:t xml:space="preserve">One of a model-declared set of values</w:t>
@@ -9078,8 +9018,8 @@
             <w:pPr>
               <w:pStyle w:val="Compact"/>
               <w:jc w:val="left"/>
-              <w:ind w:right="0" w:left="0" w:firstLine="0"/>
-              <w:spacing w:lineRule="auto" w:after="40" w:before="40" w:line="240"/>
+              <w:ind w:right="0" w:firstLine="0" w:left="0"/>
+              <w:spacing w:lineRule="auto" w:line="240" w:after="40" w:before="40"/>
             </w:pPr>
             <w:r>
               <w:t xml:space="preserve">XHTML</w:t>
@@ -9092,8 +9032,8 @@
             <w:pPr>
               <w:pStyle w:val="Compact"/>
               <w:jc w:val="left"/>
-              <w:ind w:right="0" w:left="0" w:firstLine="0"/>
-              <w:spacing w:lineRule="auto" w:after="40" w:before="40" w:line="240"/>
+              <w:ind w:right="0" w:firstLine="0" w:left="0"/>
+              <w:spacing w:lineRule="auto" w:line="240" w:after="40" w:before="40"/>
             </w:pPr>
             <w:r>
               <w:t xml:space="preserve">Markdown text</w:t>
@@ -9106,8 +9046,8 @@
             <w:pPr>
               <w:pStyle w:val="Compact"/>
               <w:jc w:val="left"/>
-              <w:ind w:right="0" w:left="0" w:firstLine="0"/>
-              <w:spacing w:lineRule="auto" w:after="40" w:before="40" w:line="240"/>
+              <w:ind w:right="0" w:firstLine="0" w:left="0"/>
+              <w:spacing w:lineRule="auto" w:line="240" w:after="40" w:before="40"/>
             </w:pPr>
             <w:r>
               <w:t xml:space="preserve">Rich text preserving block and inline formatting</w:t>
@@ -9629,9 +9569,9 @@
     </w:p>
     <w:bookmarkEnd w:id="90"/>
     <w:sectPr>
-      <w:footerReference r:id="rId9200" w:type="default"/>
-      <w:headerReference r:id="rId9101" w:type="default"/>
-      <w:headerReference r:id="rId9100" w:type="first"/>
+      <w:footerReference w:type="default" r:id="rId9200"/>
+      <w:headerReference w:type="default" r:id="rId9101"/>
+      <w:headerReference w:type="first" r:id="rId9100"/>
       <w:titlePg/>
     </w:sectPr>
   </w:body>
@@ -9643,17 +9583,17 @@
 </file>
 
 <file path=word/footer1.xml><?xml version="1.0" encoding="utf-8"?>
-<w:ftr xmlns:w="http://schemas.openxmlformats.org/wordprocessingml/2006/main" xmlns:r="http://schemas.openxmlformats.org/officeDocument/2006/relationships">
+<w:ftr xmlns:r="http://schemas.openxmlformats.org/officeDocument/2006/relationships" xmlns:w="http://schemas.openxmlformats.org/wordprocessingml/2006/main">
   <w:tbl>
     <w:tblPr>
-      <w:tblW w:type="pct" w:w="5000"/>
+      <w:tblW w:w="5000" w:type="pct"/>
       <w:tblBorders>
-        <w:top w:color="CCCCCC" w:space="1" w:sz="4" w:val="single"/>
-        <w:bottom w:color="auto" w:space="0" w:sz="0" w:val="none"/>
-        <w:left w:color="auto" w:space="0" w:sz="0" w:val="none"/>
-        <w:right w:color="auto" w:space="0" w:sz="0" w:val="none"/>
-        <w:insideH w:color="auto" w:space="0" w:sz="0" w:val="none"/>
-        <w:insideV w:color="auto" w:space="0" w:sz="0" w:val="none"/>
+        <w:top w:color="CCCCCC" w:val="single" w:space="1" w:sz="4"/>
+        <w:bottom w:color="auto" w:val="none" w:space="0" w:sz="0"/>
+        <w:left w:color="auto" w:val="none" w:space="0" w:sz="0"/>
+        <w:right w:color="auto" w:val="none" w:space="0" w:sz="0"/>
+        <w:insideH w:color="auto" w:val="none" w:space="0" w:sz="0"/>
+        <w:insideV w:color="auto" w:val="none" w:space="0" w:sz="0"/>
       </w:tblBorders>
       <w:tblLayout w:type="fixed"/>
     </w:tblPr>
@@ -9665,7 +9605,7 @@
     <w:tr>
       <w:tc>
         <w:tcPr>
-          <w:tcW w:type="pct" w:w="1667"/>
+          <w:tcW w:w="1667" w:type="pct"/>
         </w:tcPr>
         <w:p>
           <w:pPr>
@@ -9679,7 +9619,7 @@
       </w:tc>
       <w:tc>
         <w:tcPr>
-          <w:tcW w:type="pct" w:w="1667"/>
+          <w:tcW w:w="1667" w:type="pct"/>
         </w:tcPr>
         <w:p>
           <w:pPr>
@@ -9693,7 +9633,7 @@
       </w:tc>
       <w:tc>
         <w:tcPr>
-          <w:tcW w:type="pct" w:w="1667"/>
+          <w:tcW w:w="1667" w:type="pct"/>
         </w:tcPr>
         <w:p>
           <w:pPr>
@@ -9769,7 +9709,7 @@
 </file>
 
 <file path=word/header1.xml><?xml version="1.0" encoding="utf-8"?>
-<w:hdr xmlns:w="http://schemas.openxmlformats.org/wordprocessingml/2006/main" xmlns:r="http://schemas.openxmlformats.org/officeDocument/2006/relationships">
+<w:hdr xmlns:r="http://schemas.openxmlformats.org/officeDocument/2006/relationships" xmlns:w="http://schemas.openxmlformats.org/wordprocessingml/2006/main">
   <w:p>
     <w:pPr>
       <w:pStyle w:val="Header"/>
@@ -9779,7 +9719,7 @@
 </file>
 
 <file path=word/header2.xml><?xml version="1.0" encoding="utf-8"?>
-<w:hdr xmlns:w="http://schemas.openxmlformats.org/wordprocessingml/2006/main" xmlns:r="http://schemas.openxmlformats.org/officeDocument/2006/relationships">
+<w:hdr xmlns:r="http://schemas.openxmlformats.org/officeDocument/2006/relationships" xmlns:w="http://schemas.openxmlformats.org/wordprocessingml/2006/main">
   <w:p>
     <w:pPr>
       <w:pStyle w:val="Header"/>
@@ -11051,18 +10991,18 @@
     <w:basedOn w:val="VerbatimChar"/>
     <w:rPr/>
   </w:style>
-  <w:style w:styleId="SpecObjectHeader" w:type="paragraph" w:customStyle="1">
+  <w:style w:styleId="SpecObjectHeader" w:customStyle="1" w:type="paragraph">
     <w:name w:val="Spec Object Header"/>
     <w:basedOn w:val="Normal"/>
     <w:next w:val="FirstParagraph"/>
     <w:qFormat/>
     <w:pPr>
       <w:keepNext/>
-      <w:spacing w:lineRule="auto" w:after="120" w:before="280" w:line="276"/>
+      <w:spacing w:lineRule="auto" w:line="276" w:after="120" w:before="280"/>
       <w:outlineLvl w:val="0"/>
     </w:pPr>
     <w:rPr>
-      <w:rFonts w:ascii="Calibri Light" w:hAnsi="Calibri Light" w:cs="Calibri Light"/>
+      <w:rFonts w:ascii="Calibri Light" w:cs="Calibri Light" w:hAnsi="Calibri Light"/>
       <w:b/>
       <w:bCs/>
       <w:color w:val="0F4C64"/>

</xml_diff>

<commit_message>
Deploy documentation from v0.4
</commit_message>
<xml_diff>
--- a/commonspec/downloads/commonspec.docx
+++ b/commonspec/downloads/commonspec.docx
@@ -16,7 +16,7 @@
       <w:pPr>
         <w:pStyle w:val="TOCHeading"/>
       </w:pPr>
-      <w:bookmarkStart w:name="index" w:id="46067"/>
+      <w:bookmarkStart w:id="46067" w:name="index"/>
       <w:r>
         <w:rPr>
           <w:color w:val="000000"/>
@@ -1688,12 +1688,12 @@
     </w:p>
     <w:p>
       <w:pPr>
-        <w:spacing w:before="0" w:after="0" w:line="20" w:lineRule="exact"/>
+        <w:spacing w:before="0" w:line="20" w:lineRule="exact" w:after="0"/>
         <w:rPr>
           <w:sz w:val="2"/>
         </w:rPr>
       </w:pPr>
-      <w:bookmarkStart w:name="puml-grammar-spec" w:id="36907"/>
+      <w:bookmarkStart w:id="36907" w:name="puml-grammar-spec"/>
       <w:bookmarkEnd w:id="36907"/>
     </w:p>
     <w:p>
@@ -2396,12 +2396,12 @@
     </w:p>
     <w:p>
       <w:pPr>
-        <w:spacing w:before="0" w:after="0" w:line="20" w:lineRule="exact"/>
+        <w:spacing w:before="0" w:line="20" w:lineRule="exact" w:after="0"/>
         <w:rPr>
           <w:sz w:val="2"/>
         </w:rPr>
       </w:pPr>
-      <w:bookmarkStart w:name="puml-grammar-spec-object" w:id="45123"/>
+      <w:bookmarkStart w:id="45123" w:name="puml-grammar-spec-object"/>
       <w:bookmarkEnd w:id="45123"/>
     </w:p>
     <w:p>
@@ -3370,12 +3370,12 @@
     </w:p>
     <w:p>
       <w:pPr>
-        <w:spacing w:before="0" w:after="0" w:line="20" w:lineRule="exact"/>
+        <w:spacing w:before="0" w:line="20" w:lineRule="exact" w:after="0"/>
         <w:rPr>
           <w:sz w:val="2"/>
         </w:rPr>
       </w:pPr>
-      <w:bookmarkStart w:name="puml-grammar-spec-float" w:id="89146"/>
+      <w:bookmarkStart w:id="89146" w:name="puml-grammar-spec-float"/>
       <w:bookmarkEnd w:id="89146"/>
     </w:p>
     <w:p>
@@ -4266,12 +4266,12 @@
     </w:p>
     <w:p>
       <w:pPr>
-        <w:spacing w:before="0" w:after="0" w:line="20" w:lineRule="exact"/>
+        <w:spacing w:before="0" w:line="20" w:lineRule="exact" w:after="0"/>
         <w:rPr>
           <w:sz w:val="2"/>
         </w:rPr>
       </w:pPr>
-      <w:bookmarkStart w:name="puml-grammar-attribute" w:id="27150"/>
+      <w:bookmarkStart w:id="27150" w:name="puml-grammar-attribute"/>
       <w:bookmarkEnd w:id="27150"/>
     </w:p>
     <w:p>
@@ -5412,12 +5412,12 @@
     </w:p>
     <w:p>
       <w:pPr>
-        <w:spacing w:before="0" w:after="0" w:line="20" w:lineRule="exact"/>
+        <w:spacing w:before="0" w:line="20" w:lineRule="exact" w:after="0"/>
         <w:rPr>
           <w:sz w:val="2"/>
         </w:rPr>
       </w:pPr>
-      <w:bookmarkStart w:name="puml-grammar-spec-relation" w:id="79264"/>
+      <w:bookmarkStart w:id="79264" w:name="puml-grammar-spec-relation"/>
       <w:bookmarkEnd w:id="79264"/>
     </w:p>
     <w:p>
@@ -6186,18 +6186,18 @@
         <w:tblLook w:firstRow="1" w:lastRow="0" w:firstColumn="0" w:lastColumn="0" w:noHBand="0" w:noVBand="0" w:val="0020"/>
         <w:jc w:val="start"/>
         <w:tblBorders>
-          <w:top w:color="000000" w:val="single" w:space="0" w:sz="6"/>
-          <w:left w:color="000000" w:val="single" w:space="0" w:sz="6"/>
-          <w:bottom w:color="000000" w:val="single" w:space="0" w:sz="6"/>
-          <w:right w:color="000000" w:val="single" w:space="0" w:sz="6"/>
-          <w:insideH w:color="000000" w:val="single" w:space="0" w:sz="6"/>
-          <w:insideV w:color="000000" w:val="single" w:space="0" w:sz="6"/>
+          <w:top w:val="single" w:color="000000" w:sz="6" w:space="0"/>
+          <w:left w:val="single" w:color="000000" w:sz="6" w:space="0"/>
+          <w:bottom w:val="single" w:color="000000" w:sz="6" w:space="0"/>
+          <w:right w:val="single" w:color="000000" w:sz="6" w:space="0"/>
+          <w:insideH w:val="single" w:color="000000" w:sz="6" w:space="0"/>
+          <w:insideV w:val="single" w:color="000000" w:sz="6" w:space="0"/>
         </w:tblBorders>
         <w:tblCellMar>
-          <w:top w:type="dxa" w:w="57"/>
-          <w:left w:type="dxa" w:w="108"/>
-          <w:bottom w:type="dxa" w:w="57"/>
-          <w:right w:type="dxa" w:w="108"/>
+          <w:top w:w="57" w:type="dxa"/>
+          <w:left w:w="108" w:type="dxa"/>
+          <w:bottom w:w="57" w:type="dxa"/>
+          <w:right w:w="108" w:type="dxa"/>
         </w:tblCellMar>
       </w:tblPr>
       <w:tblGrid>
@@ -6214,14 +6214,14 @@
         </w:trPr>
         <w:tc>
           <w:tcPr>
-            <w:shd w:val="clear" w:color="auto" w:fill="E8E8E8"/>
+            <w:shd w:val="clear" w:fill="E8E8E8" w:color="auto"/>
           </w:tcPr>
           <w:p>
             <w:pPr>
               <w:pStyle w:val="Compact"/>
               <w:jc w:val="left"/>
               <w:ind w:firstLine="0" w:right="0" w:left="0"/>
-              <w:spacing w:line="240" w:lineRule="auto" w:before="40" w:after="40"/>
+              <w:spacing w:after="40" w:lineRule="auto" w:before="40" w:line="240"/>
             </w:pPr>
             <w:r>
               <w:rPr>
@@ -6233,14 +6233,14 @@
         </w:tc>
         <w:tc>
           <w:tcPr>
-            <w:shd w:val="clear" w:color="auto" w:fill="E8E8E8"/>
+            <w:shd w:val="clear" w:fill="E8E8E8" w:color="auto"/>
           </w:tcPr>
           <w:p>
             <w:pPr>
               <w:pStyle w:val="Compact"/>
               <w:jc w:val="left"/>
               <w:ind w:firstLine="0" w:right="0" w:left="0"/>
-              <w:spacing w:line="240" w:lineRule="auto" w:before="40" w:after="40"/>
+              <w:spacing w:after="40" w:lineRule="auto" w:before="40" w:line="240"/>
             </w:pPr>
             <w:r>
               <w:rPr>
@@ -6252,14 +6252,14 @@
         </w:tc>
         <w:tc>
           <w:tcPr>
-            <w:shd w:val="clear" w:color="auto" w:fill="E8E8E8"/>
+            <w:shd w:val="clear" w:fill="E8E8E8" w:color="auto"/>
           </w:tcPr>
           <w:p>
             <w:pPr>
               <w:pStyle w:val="Compact"/>
               <w:jc w:val="left"/>
               <w:ind w:firstLine="0" w:right="0" w:left="0"/>
-              <w:spacing w:line="240" w:lineRule="auto" w:before="40" w:after="40"/>
+              <w:spacing w:after="40" w:lineRule="auto" w:before="40" w:line="240"/>
             </w:pPr>
             <w:r>
               <w:rPr>
@@ -6271,14 +6271,14 @@
         </w:tc>
         <w:tc>
           <w:tcPr>
-            <w:shd w:val="clear" w:color="auto" w:fill="E8E8E8"/>
+            <w:shd w:val="clear" w:fill="E8E8E8" w:color="auto"/>
           </w:tcPr>
           <w:p>
             <w:pPr>
               <w:pStyle w:val="Compact"/>
               <w:jc w:val="left"/>
               <w:ind w:firstLine="0" w:right="0" w:left="0"/>
-              <w:spacing w:line="240" w:lineRule="auto" w:before="40" w:after="40"/>
+              <w:spacing w:after="40" w:lineRule="auto" w:before="40" w:line="240"/>
             </w:pPr>
             <w:r>
               <w:rPr>
@@ -6290,14 +6290,14 @@
         </w:tc>
         <w:tc>
           <w:tcPr>
-            <w:shd w:val="clear" w:color="auto" w:fill="E8E8E8"/>
+            <w:shd w:val="clear" w:fill="E8E8E8" w:color="auto"/>
           </w:tcPr>
           <w:p>
             <w:pPr>
               <w:pStyle w:val="Compact"/>
               <w:jc w:val="left"/>
               <w:ind w:firstLine="0" w:right="0" w:left="0"/>
-              <w:spacing w:line="240" w:lineRule="auto" w:before="40" w:after="40"/>
+              <w:spacing w:after="40" w:lineRule="auto" w:before="40" w:line="240"/>
             </w:pPr>
             <w:r>
               <w:rPr>
@@ -6309,14 +6309,14 @@
         </w:tc>
         <w:tc>
           <w:tcPr>
-            <w:shd w:val="clear" w:color="auto" w:fill="E8E8E8"/>
+            <w:shd w:val="clear" w:fill="E8E8E8" w:color="auto"/>
           </w:tcPr>
           <w:p>
             <w:pPr>
               <w:pStyle w:val="Compact"/>
               <w:jc w:val="left"/>
               <w:ind w:firstLine="0" w:right="0" w:left="0"/>
-              <w:spacing w:line="240" w:lineRule="auto" w:before="40" w:after="40"/>
+              <w:spacing w:after="40" w:lineRule="auto" w:before="40" w:line="240"/>
             </w:pPr>
             <w:r>
               <w:rPr>
@@ -6335,7 +6335,7 @@
               <w:pStyle w:val="Compact"/>
               <w:jc w:val="left"/>
               <w:ind w:firstLine="0" w:right="0" w:left="0"/>
-              <w:spacing w:line="240" w:lineRule="auto" w:before="40" w:after="40"/>
+              <w:spacing w:after="40" w:lineRule="auto" w:before="40" w:line="240"/>
             </w:pPr>
             <w:r>
               <w:t xml:space="preserve">VERIFIES</w:t>
@@ -6349,7 +6349,7 @@
               <w:pStyle w:val="Compact"/>
               <w:jc w:val="left"/>
               <w:ind w:firstLine="0" w:right="0" w:left="0"/>
-              <w:spacing w:line="240" w:lineRule="auto" w:before="40" w:after="40"/>
+              <w:spacing w:after="40" w:lineRule="auto" w:before="40" w:line="240"/>
             </w:pPr>
             <w:r>
               <w:rPr>
@@ -6366,7 +6366,7 @@
               <w:pStyle w:val="Compact"/>
               <w:jc w:val="left"/>
               <w:ind w:firstLine="0" w:right="0" w:left="0"/>
-              <w:spacing w:line="240" w:lineRule="auto" w:before="40" w:after="40"/>
+              <w:spacing w:after="40" w:lineRule="auto" w:before="40" w:line="240"/>
             </w:pPr>
             <w:r>
               <w:rPr>
@@ -6383,7 +6383,7 @@
               <w:pStyle w:val="Compact"/>
               <w:jc w:val="left"/>
               <w:ind w:firstLine="0" w:right="0" w:left="0"/>
-              <w:spacing w:line="240" w:lineRule="auto" w:before="40" w:after="40"/>
+              <w:spacing w:after="40" w:lineRule="auto" w:before="40" w:line="240"/>
             </w:pPr>
             <w:r>
               <w:rPr>
@@ -6400,7 +6400,7 @@
               <w:pStyle w:val="Compact"/>
               <w:jc w:val="left"/>
               <w:ind w:firstLine="0" w:right="0" w:left="0"/>
-              <w:spacing w:line="240" w:lineRule="auto" w:before="40" w:after="40"/>
+              <w:spacing w:after="40" w:lineRule="auto" w:before="40" w:line="240"/>
             </w:pPr>
             <w:r>
               <w:rPr>
@@ -6417,7 +6417,7 @@
               <w:pStyle w:val="Compact"/>
               <w:jc w:val="left"/>
               <w:ind w:firstLine="0" w:right="0" w:left="0"/>
-              <w:spacing w:line="240" w:lineRule="auto" w:before="40" w:after="40"/>
+              <w:spacing w:after="40" w:lineRule="auto" w:before="40" w:line="240"/>
             </w:pPr>
             <w:r>
               <w:rPr>
@@ -6437,7 +6437,7 @@
               <w:pStyle w:val="Compact"/>
               <w:jc w:val="left"/>
               <w:ind w:firstLine="0" w:right="0" w:left="0"/>
-              <w:spacing w:line="240" w:lineRule="auto" w:before="40" w:after="40"/>
+              <w:spacing w:after="40" w:lineRule="auto" w:before="40" w:line="240"/>
             </w:pPr>
             <w:r>
               <w:t xml:space="preserve">TRACES_TO</w:t>
@@ -6451,7 +6451,7 @@
               <w:pStyle w:val="Compact"/>
               <w:jc w:val="left"/>
               <w:ind w:firstLine="0" w:right="0" w:left="0"/>
-              <w:spacing w:line="240" w:lineRule="auto" w:before="40" w:after="40"/>
+              <w:spacing w:after="40" w:lineRule="auto" w:before="40" w:line="240"/>
             </w:pPr>
             <w:r>
               <w:rPr>
@@ -6468,7 +6468,7 @@
               <w:pStyle w:val="Compact"/>
               <w:jc w:val="left"/>
               <w:ind w:firstLine="0" w:right="0" w:left="0"/>
-              <w:spacing w:line="240" w:lineRule="auto" w:before="40" w:after="40"/>
+              <w:spacing w:after="40" w:lineRule="auto" w:before="40" w:line="240"/>
             </w:pPr>
             <w:r>
               <w:t xml:space="preserve">—</w:t>
@@ -6482,7 +6482,7 @@
               <w:pStyle w:val="Compact"/>
               <w:jc w:val="left"/>
               <w:ind w:firstLine="0" w:right="0" w:left="0"/>
-              <w:spacing w:line="240" w:lineRule="auto" w:before="40" w:after="40"/>
+              <w:spacing w:after="40" w:lineRule="auto" w:before="40" w:line="240"/>
             </w:pPr>
             <w:r>
               <w:t xml:space="preserve">—</w:t>
@@ -6496,7 +6496,7 @@
               <w:pStyle w:val="Compact"/>
               <w:jc w:val="left"/>
               <w:ind w:firstLine="0" w:right="0" w:left="0"/>
-              <w:spacing w:line="240" w:lineRule="auto" w:before="40" w:after="40"/>
+              <w:spacing w:after="40" w:lineRule="auto" w:before="40" w:line="240"/>
             </w:pPr>
             <w:r>
               <w:t xml:space="preserve">—</w:t>
@@ -6510,7 +6510,7 @@
               <w:pStyle w:val="Compact"/>
               <w:jc w:val="left"/>
               <w:ind w:firstLine="0" w:right="0" w:left="0"/>
-              <w:spacing w:line="240" w:lineRule="auto" w:before="40" w:after="40"/>
+              <w:spacing w:after="40" w:lineRule="auto" w:before="40" w:line="240"/>
             </w:pPr>
             <w:r>
               <w:t xml:space="preserve">1</w:t>
@@ -6526,7 +6526,7 @@
               <w:pStyle w:val="Compact"/>
               <w:jc w:val="left"/>
               <w:ind w:firstLine="0" w:right="0" w:left="0"/>
-              <w:spacing w:line="240" w:lineRule="auto" w:before="40" w:after="40"/>
+              <w:spacing w:after="40" w:lineRule="auto" w:before="40" w:line="240"/>
             </w:pPr>
             <w:r>
               <w:t xml:space="preserve">XREF_SEC</w:t>
@@ -6540,7 +6540,7 @@
               <w:pStyle w:val="Compact"/>
               <w:jc w:val="left"/>
               <w:ind w:firstLine="0" w:right="0" w:left="0"/>
-              <w:spacing w:line="240" w:lineRule="auto" w:before="40" w:after="40"/>
+              <w:spacing w:after="40" w:lineRule="auto" w:before="40" w:line="240"/>
             </w:pPr>
             <w:r>
               <w:rPr>
@@ -6557,7 +6557,7 @@
               <w:pStyle w:val="Compact"/>
               <w:jc w:val="left"/>
               <w:ind w:firstLine="0" w:right="0" w:left="0"/>
-              <w:spacing w:line="240" w:lineRule="auto" w:before="40" w:after="40"/>
+              <w:spacing w:after="40" w:lineRule="auto" w:before="40" w:line="240"/>
             </w:pPr>
             <w:r>
               <w:t xml:space="preserve">—</w:t>
@@ -6571,7 +6571,7 @@
               <w:pStyle w:val="Compact"/>
               <w:jc w:val="left"/>
               <w:ind w:firstLine="0" w:right="0" w:left="0"/>
-              <w:spacing w:line="240" w:lineRule="auto" w:before="40" w:after="40"/>
+              <w:spacing w:after="40" w:lineRule="auto" w:before="40" w:line="240"/>
             </w:pPr>
             <w:r>
               <w:t xml:space="preserve">—</w:t>
@@ -6585,7 +6585,7 @@
               <w:pStyle w:val="Compact"/>
               <w:jc w:val="left"/>
               <w:ind w:firstLine="0" w:right="0" w:left="0"/>
-              <w:spacing w:line="240" w:lineRule="auto" w:before="40" w:after="40"/>
+              <w:spacing w:after="40" w:lineRule="auto" w:before="40" w:line="240"/>
             </w:pPr>
             <w:r>
               <w:rPr>
@@ -6603,7 +6603,7 @@
               <w:pStyle w:val="Compact"/>
               <w:jc w:val="left"/>
               <w:ind w:firstLine="0" w:right="0" w:left="0"/>
-              <w:spacing w:line="240" w:lineRule="auto" w:before="40" w:after="40"/>
+              <w:spacing w:after="40" w:lineRule="auto" w:before="40" w:line="240"/>
             </w:pPr>
             <w:r>
               <w:t xml:space="preserve">eliminated</w:t>
@@ -6892,12 +6892,12 @@
     </w:p>
     <w:p>
       <w:pPr>
-        <w:spacing w:before="0" w:after="0" w:line="20" w:lineRule="exact"/>
+        <w:spacing w:before="0" w:line="20" w:lineRule="exact" w:after="0"/>
         <w:rPr>
           <w:sz w:val="2"/>
         </w:rPr>
       </w:pPr>
-      <w:bookmarkStart w:name="puml-grammar-spec-view" w:id="24745"/>
+      <w:bookmarkStart w:id="24745" w:name="puml-grammar-spec-view"/>
       <w:bookmarkEnd w:id="24745"/>
     </w:p>
     <w:p>
@@ -8626,12 +8626,12 @@
     </w:p>
     <w:p>
       <w:pPr>
-        <w:spacing w:before="0" w:after="0" w:line="20" w:lineRule="exact"/>
+        <w:spacing w:before="0" w:line="20" w:lineRule="exact" w:after="0"/>
         <w:rPr>
           <w:sz w:val="2"/>
         </w:rPr>
       </w:pPr>
-      <w:bookmarkStart w:name="csv-primitive-datatypes" w:id="46083"/>
+      <w:bookmarkStart w:id="46083" w:name="csv-primitive-datatypes"/>
       <w:bookmarkEnd w:id="46083"/>
     </w:p>
     <w:p>
@@ -8668,18 +8668,18 @@
         <w:tblLook w:firstRow="1" w:lastRow="0" w:firstColumn="0" w:lastColumn="0" w:noHBand="0" w:noVBand="0" w:val="0020"/>
         <w:jc w:val="start"/>
         <w:tblBorders>
-          <w:top w:color="000000" w:val="single" w:space="0" w:sz="6"/>
-          <w:left w:color="000000" w:val="single" w:space="0" w:sz="6"/>
-          <w:bottom w:color="000000" w:val="single" w:space="0" w:sz="6"/>
-          <w:right w:color="000000" w:val="single" w:space="0" w:sz="6"/>
-          <w:insideH w:color="000000" w:val="single" w:space="0" w:sz="6"/>
-          <w:insideV w:color="000000" w:val="single" w:space="0" w:sz="6"/>
+          <w:top w:val="single" w:color="000000" w:sz="6" w:space="0"/>
+          <w:left w:val="single" w:color="000000" w:sz="6" w:space="0"/>
+          <w:bottom w:val="single" w:color="000000" w:sz="6" w:space="0"/>
+          <w:right w:val="single" w:color="000000" w:sz="6" w:space="0"/>
+          <w:insideH w:val="single" w:color="000000" w:sz="6" w:space="0"/>
+          <w:insideV w:val="single" w:color="000000" w:sz="6" w:space="0"/>
         </w:tblBorders>
         <w:tblCellMar>
-          <w:top w:type="dxa" w:w="57"/>
-          <w:left w:type="dxa" w:w="108"/>
-          <w:bottom w:type="dxa" w:w="57"/>
-          <w:right w:type="dxa" w:w="108"/>
+          <w:top w:w="57" w:type="dxa"/>
+          <w:left w:w="108" w:type="dxa"/>
+          <w:bottom w:w="57" w:type="dxa"/>
+          <w:right w:w="108" w:type="dxa"/>
         </w:tblCellMar>
       </w:tblPr>
       <w:tblGrid>
@@ -8693,14 +8693,14 @@
         </w:trPr>
         <w:tc>
           <w:tcPr>
-            <w:shd w:val="clear" w:color="auto" w:fill="E8E8E8"/>
+            <w:shd w:val="clear" w:fill="E8E8E8" w:color="auto"/>
           </w:tcPr>
           <w:p>
             <w:pPr>
               <w:pStyle w:val="Compact"/>
               <w:jc w:val="left"/>
               <w:ind w:firstLine="0" w:right="0" w:left="0"/>
-              <w:spacing w:line="240" w:lineRule="auto" w:before="40" w:after="40"/>
+              <w:spacing w:after="40" w:lineRule="auto" w:before="40" w:line="240"/>
             </w:pPr>
             <w:r>
               <w:rPr>
@@ -8712,14 +8712,14 @@
         </w:tc>
         <w:tc>
           <w:tcPr>
-            <w:shd w:val="clear" w:color="auto" w:fill="E8E8E8"/>
+            <w:shd w:val="clear" w:fill="E8E8E8" w:color="auto"/>
           </w:tcPr>
           <w:p>
             <w:pPr>
               <w:pStyle w:val="Compact"/>
               <w:jc w:val="left"/>
               <w:ind w:firstLine="0" w:right="0" w:left="0"/>
-              <w:spacing w:line="240" w:lineRule="auto" w:before="40" w:after="40"/>
+              <w:spacing w:after="40" w:lineRule="auto" w:before="40" w:line="240"/>
             </w:pPr>
             <w:r>
               <w:rPr>
@@ -8731,14 +8731,14 @@
         </w:tc>
         <w:tc>
           <w:tcPr>
-            <w:shd w:val="clear" w:color="auto" w:fill="E8E8E8"/>
+            <w:shd w:val="clear" w:fill="E8E8E8" w:color="auto"/>
           </w:tcPr>
           <w:p>
             <w:pPr>
               <w:pStyle w:val="Compact"/>
               <w:jc w:val="left"/>
               <w:ind w:firstLine="0" w:right="0" w:left="0"/>
-              <w:spacing w:line="240" w:lineRule="auto" w:before="40" w:after="40"/>
+              <w:spacing w:after="40" w:lineRule="auto" w:before="40" w:line="240"/>
             </w:pPr>
             <w:r>
               <w:rPr>
@@ -8757,7 +8757,7 @@
               <w:pStyle w:val="Compact"/>
               <w:jc w:val="left"/>
               <w:ind w:firstLine="0" w:right="0" w:left="0"/>
-              <w:spacing w:line="240" w:lineRule="auto" w:before="40" w:after="40"/>
+              <w:spacing w:after="40" w:lineRule="auto" w:before="40" w:line="240"/>
             </w:pPr>
             <w:r>
               <w:t xml:space="preserve">STRING</w:t>
@@ -8771,7 +8771,7 @@
               <w:pStyle w:val="Compact"/>
               <w:jc w:val="left"/>
               <w:ind w:firstLine="0" w:right="0" w:left="0"/>
-              <w:spacing w:line="240" w:lineRule="auto" w:before="40" w:after="40"/>
+              <w:spacing w:after="40" w:lineRule="auto" w:before="40" w:line="240"/>
             </w:pPr>
             <w:r>
               <w:t xml:space="preserve">Plain text</w:t>
@@ -8785,7 +8785,7 @@
               <w:pStyle w:val="Compact"/>
               <w:jc w:val="left"/>
               <w:ind w:firstLine="0" w:right="0" w:left="0"/>
-              <w:spacing w:line="240" w:lineRule="auto" w:before="40" w:after="40"/>
+              <w:spacing w:after="40" w:lineRule="auto" w:before="40" w:line="240"/>
             </w:pPr>
             <w:r>
               <w:t xml:space="preserve">Unformatted text value</w:t>
@@ -8801,7 +8801,7 @@
               <w:pStyle w:val="Compact"/>
               <w:jc w:val="left"/>
               <w:ind w:firstLine="0" w:right="0" w:left="0"/>
-              <w:spacing w:line="240" w:lineRule="auto" w:before="40" w:after="40"/>
+              <w:spacing w:after="40" w:lineRule="auto" w:before="40" w:line="240"/>
             </w:pPr>
             <w:r>
               <w:t xml:space="preserve">INTEGER</w:t>
@@ -8815,7 +8815,7 @@
               <w:pStyle w:val="Compact"/>
               <w:jc w:val="left"/>
               <w:ind w:firstLine="0" w:right="0" w:left="0"/>
-              <w:spacing w:line="240" w:lineRule="auto" w:before="40" w:after="40"/>
+              <w:spacing w:after="40" w:lineRule="auto" w:before="40" w:line="240"/>
             </w:pPr>
             <w:r>
               <w:t xml:space="preserve">Whole number</w:t>
@@ -8829,7 +8829,7 @@
               <w:pStyle w:val="Compact"/>
               <w:jc w:val="left"/>
               <w:ind w:firstLine="0" w:right="0" w:left="0"/>
-              <w:spacing w:line="240" w:lineRule="auto" w:before="40" w:after="40"/>
+              <w:spacing w:after="40" w:lineRule="auto" w:before="40" w:line="240"/>
             </w:pPr>
             <w:r>
               <w:t xml:space="preserve">Numeric value (supports min/max bounds)</w:t>
@@ -8845,7 +8845,7 @@
               <w:pStyle w:val="Compact"/>
               <w:jc w:val="left"/>
               <w:ind w:firstLine="0" w:right="0" w:left="0"/>
-              <w:spacing w:line="240" w:lineRule="auto" w:before="40" w:after="40"/>
+              <w:spacing w:after="40" w:lineRule="auto" w:before="40" w:line="240"/>
             </w:pPr>
             <w:r>
               <w:t xml:space="preserve">REAL</w:t>
@@ -8859,7 +8859,7 @@
               <w:pStyle w:val="Compact"/>
               <w:jc w:val="left"/>
               <w:ind w:firstLine="0" w:right="0" w:left="0"/>
-              <w:spacing w:line="240" w:lineRule="auto" w:before="40" w:after="40"/>
+              <w:spacing w:after="40" w:lineRule="auto" w:before="40" w:line="240"/>
             </w:pPr>
             <w:r>
               <w:t xml:space="preserve">Decimal number</w:t>
@@ -8873,7 +8873,7 @@
               <w:pStyle w:val="Compact"/>
               <w:jc w:val="left"/>
               <w:ind w:firstLine="0" w:right="0" w:left="0"/>
-              <w:spacing w:line="240" w:lineRule="auto" w:before="40" w:after="40"/>
+              <w:spacing w:after="40" w:lineRule="auto" w:before="40" w:line="240"/>
             </w:pPr>
             <w:r>
               <w:t xml:space="preserve">Floating-point value (supports min/max bounds)</w:t>
@@ -8889,7 +8889,7 @@
               <w:pStyle w:val="Compact"/>
               <w:jc w:val="left"/>
               <w:ind w:firstLine="0" w:right="0" w:left="0"/>
-              <w:spacing w:line="240" w:lineRule="auto" w:before="40" w:after="40"/>
+              <w:spacing w:after="40" w:lineRule="auto" w:before="40" w:line="240"/>
             </w:pPr>
             <w:r>
               <w:t xml:space="preserve">BOOLEAN</w:t>
@@ -8903,7 +8903,7 @@
               <w:pStyle w:val="Compact"/>
               <w:jc w:val="left"/>
               <w:ind w:firstLine="0" w:right="0" w:left="0"/>
-              <w:spacing w:line="240" w:lineRule="auto" w:before="40" w:after="40"/>
+              <w:spacing w:after="40" w:lineRule="auto" w:before="40" w:line="240"/>
             </w:pPr>
             <w:r>
               <w:t xml:space="preserve">true / false</w:t>
@@ -8917,7 +8917,7 @@
               <w:pStyle w:val="Compact"/>
               <w:jc w:val="left"/>
               <w:ind w:firstLine="0" w:right="0" w:left="0"/>
-              <w:spacing w:line="240" w:lineRule="auto" w:before="40" w:after="40"/>
+              <w:spacing w:after="40" w:lineRule="auto" w:before="40" w:line="240"/>
             </w:pPr>
             <w:r>
               <w:t xml:space="preserve">Boolean flag</w:t>
@@ -8933,7 +8933,7 @@
               <w:pStyle w:val="Compact"/>
               <w:jc w:val="left"/>
               <w:ind w:firstLine="0" w:right="0" w:left="0"/>
-              <w:spacing w:line="240" w:lineRule="auto" w:before="40" w:after="40"/>
+              <w:spacing w:after="40" w:lineRule="auto" w:before="40" w:line="240"/>
             </w:pPr>
             <w:r>
               <w:t xml:space="preserve">DATE</w:t>
@@ -8947,7 +8947,7 @@
               <w:pStyle w:val="Compact"/>
               <w:jc w:val="left"/>
               <w:ind w:firstLine="0" w:right="0" w:left="0"/>
-              <w:spacing w:line="240" w:lineRule="auto" w:before="40" w:after="40"/>
+              <w:spacing w:after="40" w:lineRule="auto" w:before="40" w:line="240"/>
             </w:pPr>
             <w:r>
               <w:t xml:space="preserve">YYYY-MM-DD</w:t>
@@ -8961,7 +8961,7 @@
               <w:pStyle w:val="Compact"/>
               <w:jc w:val="left"/>
               <w:ind w:firstLine="0" w:right="0" w:left="0"/>
-              <w:spacing w:line="240" w:lineRule="auto" w:before="40" w:after="40"/>
+              <w:spacing w:after="40" w:lineRule="auto" w:before="40" w:line="240"/>
             </w:pPr>
             <w:r>
               <w:t xml:space="preserve">ISO 8601 date</w:t>
@@ -8977,7 +8977,7 @@
               <w:pStyle w:val="Compact"/>
               <w:jc w:val="left"/>
               <w:ind w:firstLine="0" w:right="0" w:left="0"/>
-              <w:spacing w:line="240" w:lineRule="auto" w:before="40" w:after="40"/>
+              <w:spacing w:after="40" w:lineRule="auto" w:before="40" w:line="240"/>
             </w:pPr>
             <w:r>
               <w:t xml:space="preserve">ENUM</w:t>
@@ -8991,7 +8991,7 @@
               <w:pStyle w:val="Compact"/>
               <w:jc w:val="left"/>
               <w:ind w:firstLine="0" w:right="0" w:left="0"/>
-              <w:spacing w:line="240" w:lineRule="auto" w:before="40" w:after="40"/>
+              <w:spacing w:after="40" w:lineRule="auto" w:before="40" w:line="240"/>
             </w:pPr>
             <w:r>
               <w:t xml:space="preserve">Named value</w:t>
@@ -9005,7 +9005,7 @@
               <w:pStyle w:val="Compact"/>
               <w:jc w:val="left"/>
               <w:ind w:firstLine="0" w:right="0" w:left="0"/>
-              <w:spacing w:line="240" w:lineRule="auto" w:before="40" w:after="40"/>
+              <w:spacing w:after="40" w:lineRule="auto" w:before="40" w:line="240"/>
             </w:pPr>
             <w:r>
               <w:t xml:space="preserve">One of a model-declared set of values</w:t>
@@ -9021,7 +9021,7 @@
               <w:pStyle w:val="Compact"/>
               <w:jc w:val="left"/>
               <w:ind w:firstLine="0" w:right="0" w:left="0"/>
-              <w:spacing w:line="240" w:lineRule="auto" w:before="40" w:after="40"/>
+              <w:spacing w:after="40" w:lineRule="auto" w:before="40" w:line="240"/>
             </w:pPr>
             <w:r>
               <w:t xml:space="preserve">XHTML</w:t>
@@ -9035,7 +9035,7 @@
               <w:pStyle w:val="Compact"/>
               <w:jc w:val="left"/>
               <w:ind w:firstLine="0" w:right="0" w:left="0"/>
-              <w:spacing w:line="240" w:lineRule="auto" w:before="40" w:after="40"/>
+              <w:spacing w:after="40" w:lineRule="auto" w:before="40" w:line="240"/>
             </w:pPr>
             <w:r>
               <w:t xml:space="preserve">Markdown text</w:t>
@@ -9049,7 +9049,7 @@
               <w:pStyle w:val="Compact"/>
               <w:jc w:val="left"/>
               <w:ind w:firstLine="0" w:right="0" w:left="0"/>
-              <w:spacing w:line="240" w:lineRule="auto" w:before="40" w:after="40"/>
+              <w:spacing w:after="40" w:lineRule="auto" w:before="40" w:line="240"/>
             </w:pPr>
             <w:r>
               <w:t xml:space="preserve">Rich text preserving block and inline formatting</w:t>
@@ -9585,17 +9585,17 @@
 </file>
 
 <file path=word/footer1.xml><?xml version="1.0" encoding="utf-8"?>
-<w:ftr xmlns:w="http://schemas.openxmlformats.org/wordprocessingml/2006/main" xmlns:r="http://schemas.openxmlformats.org/officeDocument/2006/relationships">
+<w:ftr xmlns:r="http://schemas.openxmlformats.org/officeDocument/2006/relationships" xmlns:w="http://schemas.openxmlformats.org/wordprocessingml/2006/main">
   <w:tbl>
     <w:tblPr>
-      <w:tblW w:type="pct" w:w="5000"/>
+      <w:tblW w:w="5000" w:type="pct"/>
       <w:tblBorders>
-        <w:top w:color="CCCCCC" w:val="single" w:space="1" w:sz="4"/>
-        <w:bottom w:color="auto" w:val="none" w:space="0" w:sz="0"/>
-        <w:left w:color="auto" w:val="none" w:space="0" w:sz="0"/>
-        <w:right w:color="auto" w:val="none" w:space="0" w:sz="0"/>
-        <w:insideH w:color="auto" w:val="none" w:space="0" w:sz="0"/>
-        <w:insideV w:color="auto" w:val="none" w:space="0" w:sz="0"/>
+        <w:top w:val="single" w:color="CCCCCC" w:sz="4" w:space="1"/>
+        <w:bottom w:val="none" w:color="auto" w:sz="0" w:space="0"/>
+        <w:left w:val="none" w:color="auto" w:sz="0" w:space="0"/>
+        <w:right w:val="none" w:color="auto" w:sz="0" w:space="0"/>
+        <w:insideH w:val="none" w:color="auto" w:sz="0" w:space="0"/>
+        <w:insideV w:val="none" w:color="auto" w:sz="0" w:space="0"/>
       </w:tblBorders>
       <w:tblLayout w:type="fixed"/>
     </w:tblPr>
@@ -9607,7 +9607,7 @@
     <w:tr>
       <w:tc>
         <w:tcPr>
-          <w:tcW w:type="pct" w:w="1667"/>
+          <w:tcW w:w="1667" w:type="pct"/>
         </w:tcPr>
         <w:p>
           <w:pPr>
@@ -9621,7 +9621,7 @@
       </w:tc>
       <w:tc>
         <w:tcPr>
-          <w:tcW w:type="pct" w:w="1667"/>
+          <w:tcW w:w="1667" w:type="pct"/>
         </w:tcPr>
         <w:p>
           <w:pPr>
@@ -9635,7 +9635,7 @@
       </w:tc>
       <w:tc>
         <w:tcPr>
-          <w:tcW w:type="pct" w:w="1667"/>
+          <w:tcW w:w="1667" w:type="pct"/>
         </w:tcPr>
         <w:p>
           <w:pPr>
@@ -9711,7 +9711,7 @@
 </file>
 
 <file path=word/header1.xml><?xml version="1.0" encoding="utf-8"?>
-<w:hdr xmlns:w="http://schemas.openxmlformats.org/wordprocessingml/2006/main" xmlns:r="http://schemas.openxmlformats.org/officeDocument/2006/relationships">
+<w:hdr xmlns:r="http://schemas.openxmlformats.org/officeDocument/2006/relationships" xmlns:w="http://schemas.openxmlformats.org/wordprocessingml/2006/main">
   <w:p>
     <w:pPr>
       <w:pStyle w:val="Header"/>
@@ -9721,7 +9721,7 @@
 </file>
 
 <file path=word/header2.xml><?xml version="1.0" encoding="utf-8"?>
-<w:hdr xmlns:w="http://schemas.openxmlformats.org/wordprocessingml/2006/main" xmlns:r="http://schemas.openxmlformats.org/officeDocument/2006/relationships">
+<w:hdr xmlns:r="http://schemas.openxmlformats.org/officeDocument/2006/relationships" xmlns:w="http://schemas.openxmlformats.org/wordprocessingml/2006/main">
   <w:p>
     <w:pPr>
       <w:pStyle w:val="Header"/>
@@ -9764,7 +9764,7 @@
       <w:lvlText w:val="%1"/>
       <w:lvlJc w:val="left"/>
       <w:pPr>
-        <w:ind w:hanging="0" w:left="0"/>
+        <w:ind w:left="0" w:hanging="0"/>
       </w:pPr>
     </w:lvl>
     <w:lvl w:ilvl="1">
@@ -9776,7 +9776,7 @@
       <w:lvlText w:val="%1.%2"/>
       <w:lvlJc w:val="left"/>
       <w:pPr>
-        <w:ind w:hanging="0" w:left="0"/>
+        <w:ind w:left="0" w:hanging="0"/>
       </w:pPr>
     </w:lvl>
     <w:lvl w:ilvl="2">
@@ -9788,7 +9788,7 @@
       <w:lvlText w:val="%1.%2.%3"/>
       <w:lvlJc w:val="left"/>
       <w:pPr>
-        <w:ind w:hanging="0" w:left="0"/>
+        <w:ind w:left="0" w:hanging="0"/>
       </w:pPr>
     </w:lvl>
     <w:lvl w:ilvl="3">
@@ -9800,7 +9800,7 @@
       <w:lvlText w:val="%1.%2.%3.%4"/>
       <w:lvlJc w:val="left"/>
       <w:pPr>
-        <w:ind w:hanging="0" w:left="0"/>
+        <w:ind w:left="0" w:hanging="0"/>
       </w:pPr>
     </w:lvl>
     <w:lvl w:ilvl="4">
@@ -9812,7 +9812,7 @@
       <w:lvlText w:val="%1.%2.%3.%4.%5"/>
       <w:lvlJc w:val="left"/>
       <w:pPr>
-        <w:ind w:hanging="0" w:left="0"/>
+        <w:ind w:left="0" w:hanging="0"/>
       </w:pPr>
     </w:lvl>
   </w:abstractNum>
@@ -11000,11 +11000,11 @@
     <w:qFormat/>
     <w:pPr>
       <w:keepNext/>
-      <w:spacing w:line="276" w:lineRule="auto" w:before="280" w:after="120"/>
+      <w:spacing w:after="120" w:lineRule="auto" w:before="280" w:line="276"/>
       <w:outlineLvl w:val="0"/>
     </w:pPr>
     <w:rPr>
-      <w:rFonts w:ascii="Calibri Light" w:cs="Calibri Light" w:hAnsi="Calibri Light"/>
+      <w:rFonts w:ascii="Calibri Light" w:hAnsi="Calibri Light" w:cs="Calibri Light"/>
       <w:b/>
       <w:bCs/>
       <w:color w:val="0F4C64"/>

</xml_diff>